<commit_message>
Instalação assistida: o próprio Claude instala Git/Python e clona o toolkit
- Apostila e COMO-INSTALAR reescritos para 3 passos: instalar o app,
  colar o prompt de instalação no </> Code (Claude instala tudo via
  winget com permissão do AFT), reiniciar e rodar /aft-setup
- /aft-setup Passo 1: instala Python/Git via winget em vez de mandar
  o AFT instalar manualmente; plano B manual mantido
- Atualizações viram 'peça ao Claude: Atualize o AFT Toolkit'

Co-Authored-By: Claude Fable 5 <noreply@anthropic.com>
</commit_message>
<xml_diff>
--- a/Apostila-AFT-Toolkit.docx
+++ b/Apostila-AFT-Toolkit.docx
@@ -280,7 +280,7 @@
         <w:pStyle w:val="Heading1"/>
       </w:pPr>
       <w:r>
-        <w:t xml:space="preserve">2. Instalação passo a passo (Windows)</w:t>
+        <w:t xml:space="preserve">2. Instalação em 3 passos (Windows)</w:t>
       </w:r>
     </w:p>
     <w:p>
@@ -294,7 +294,7 @@
           <w:sz w:val="22"/>
           <w:szCs w:val="22"/>
         </w:rPr>
-        <w:t xml:space="preserve">Tempo estimado: 20 minutos. Você só faz isso uma vez.</w:t>
+        <w:t xml:space="preserve">Tempo estimado: 15 minutos. Você só faz isso uma vez — e quem digita comando é o Claude, não você. A única coisa que você instala manualmente é o próprio aplicativo.</w:t>
       </w:r>
     </w:p>
     <w:p>
@@ -302,7 +302,7 @@
         <w:pStyle w:val="Heading2"/>
       </w:pPr>
       <w:r>
-        <w:t xml:space="preserve">2.1 Instale o Claude Code</w:t>
+        <w:t xml:space="preserve">2.1 Passo 1 — Instale o aplicativo Claude</w:t>
       </w:r>
     </w:p>
     <w:p>
@@ -322,7 +322,7 @@
         </w:rPr>
         <w:t xml:space="preserve">Baixe o aplicativo para Windows em </w:t>
       </w:r>
-      <w:hyperlink w:history="1" r:id="rIdhsflltsp42z4wljeml6lw">
+      <w:hyperlink w:history="1" r:id="rIdibyxb2n49l8txzzwkws6c">
         <w:r>
           <w:rPr>
             <w:rStyle w:val="Hyperlink"/>
@@ -362,14 +362,6 @@
     </w:p>
     <w:p>
       <w:pPr>
-        <w:pStyle w:val="Heading2"/>
-      </w:pPr>
-      <w:r>
-        <w:t xml:space="preserve">2.2 Instale o Git</w:t>
-      </w:r>
-    </w:p>
-    <w:p>
-      <w:pPr>
         <w:pStyle w:val="ListParagraph"/>
         <w:numPr>
           <w:ilvl w:val="0"/>
@@ -383,9 +375,482 @@
           <w:sz w:val="22"/>
           <w:szCs w:val="22"/>
         </w:rPr>
-        <w:t xml:space="preserve">Baixe em </w:t>
-      </w:r>
-      <w:hyperlink w:history="1" r:id="rIddnwdizxwkdciylgs4i-ei">
+        <w:t xml:space="preserve">Dentro do aplicativo, abra a interface de código: o botão </w:t>
+      </w:r>
+      <w:r>
+        <w:rPr>
+          <w:rFonts w:ascii="Arial" w:cs="Arial" w:eastAsia="Arial" w:hAnsi="Arial"/>
+          <w:b/>
+          <w:bCs/>
+          <w:sz w:val="22"/>
+          <w:szCs w:val="22"/>
+        </w:rPr>
+        <w:t xml:space="preserve">&lt;/&gt; Code</w:t>
+      </w:r>
+      <w:r>
+        <w:rPr>
+          <w:rFonts w:ascii="Arial" w:cs="Arial" w:eastAsia="Arial" w:hAnsi="Arial"/>
+          <w:sz w:val="22"/>
+          <w:szCs w:val="22"/>
+        </w:rPr>
+        <w:t xml:space="preserve">. É nela que tudo acontece daqui em diante.</w:t>
+      </w:r>
+    </w:p>
+    <w:p>
+      <w:pPr>
+        <w:pStyle w:val="Heading2"/>
+      </w:pPr>
+      <w:r>
+        <w:t xml:space="preserve">2.2 Passo 2 — Deixe o Claude instalar o resto</w:t>
+      </w:r>
+    </w:p>
+    <w:p>
+      <w:pPr>
+        <w:spacing w:after="120"/>
+        <w:jc w:val="both"/>
+      </w:pPr>
+      <w:r>
+        <w:rPr>
+          <w:rFonts w:ascii="Arial" w:cs="Arial" w:eastAsia="Arial" w:hAnsi="Arial"/>
+          <w:sz w:val="22"/>
+          <w:szCs w:val="22"/>
+        </w:rPr>
+        <w:t xml:space="preserve">O Claude Code é um assistente que executa comandos no seu computador (sempre pedindo a sua permissão antes). Então, em vez de você instalar programa por programa, cole a mensagem abaixo numa conversa nova do &lt;/&gt; Code e aperte Enter:</w:t>
+      </w:r>
+    </w:p>
+    <w:p>
+      <w:pPr>
+        <w:shd w:fill="F2F2F2" w:val="clear"/>
+        <w:spacing w:after="120"/>
+        <w:ind w:left="360"/>
+      </w:pPr>
+      <w:r>
+        <w:rPr>
+          <w:rFonts w:ascii="Consolas" w:cs="Consolas" w:eastAsia="Consolas" w:hAnsi="Consolas"/>
+          <w:sz w:val="20"/>
+          <w:szCs w:val="20"/>
+        </w:rPr>
+        <w:t xml:space="preserve">Prepare este computador para o AFT Toolkit. Faça nesta ordem, me explicando cada passo:</w:t>
+      </w:r>
+    </w:p>
+    <w:p>
+      <w:pPr>
+        <w:shd w:fill="F2F2F2" w:val="clear"/>
+        <w:spacing w:after="120"/>
+        <w:ind w:left="360"/>
+      </w:pPr>
+      <w:r>
+        <w:rPr>
+          <w:rFonts w:ascii="Consolas" w:cs="Consolas" w:eastAsia="Consolas" w:hAnsi="Consolas"/>
+          <w:sz w:val="20"/>
+          <w:szCs w:val="20"/>
+        </w:rPr>
+        <w:t xml:space="preserve">1. Verifique se o Git está instalado; se não estiver, instale com winget (pacote Git.Git).</w:t>
+      </w:r>
+    </w:p>
+    <w:p>
+      <w:pPr>
+        <w:shd w:fill="F2F2F2" w:val="clear"/>
+        <w:spacing w:after="120"/>
+        <w:ind w:left="360"/>
+      </w:pPr>
+      <w:r>
+        <w:rPr>
+          <w:rFonts w:ascii="Consolas" w:cs="Consolas" w:eastAsia="Consolas" w:hAnsi="Consolas"/>
+          <w:sz w:val="20"/>
+          <w:szCs w:val="20"/>
+        </w:rPr>
+        <w:t xml:space="preserve">2. Verifique se o Python 3 está instalado e funcionando no terminal; se não, instale com winget (pacote Python.Python.3.12).</w:t>
+      </w:r>
+    </w:p>
+    <w:p>
+      <w:pPr>
+        <w:shd w:fill="F2F2F2" w:val="clear"/>
+        <w:spacing w:after="120"/>
+        <w:ind w:left="360"/>
+      </w:pPr>
+      <w:r>
+        <w:rPr>
+          <w:rFonts w:ascii="Consolas" w:cs="Consolas" w:eastAsia="Consolas" w:hAnsi="Consolas"/>
+          <w:sz w:val="20"/>
+          <w:szCs w:val="20"/>
+        </w:rPr>
+        <w:t xml:space="preserve">3. Baixe o repositório https://github.com/ryckardo42/aft-toolkit.git para a pasta de skills do Claude Code (~/.claude/skills/aft-toolkit) usando git clone.</w:t>
+      </w:r>
+    </w:p>
+    <w:p>
+      <w:pPr>
+        <w:shd w:fill="F2F2F2" w:val="clear"/>
+        <w:spacing w:after="120"/>
+        <w:ind w:left="360"/>
+      </w:pPr>
+      <w:r>
+        <w:rPr>
+          <w:rFonts w:ascii="Consolas" w:cs="Consolas" w:eastAsia="Consolas" w:hAnsi="Consolas"/>
+          <w:sz w:val="20"/>
+          <w:szCs w:val="20"/>
+        </w:rPr>
+        <w:t xml:space="preserve">4. Confirme que a pasta foi criada, liste as skills instaladas e me diga se preciso reiniciar o aplicativo.</w:t>
+      </w:r>
+    </w:p>
+    <w:p>
+      <w:pPr>
+        <w:spacing w:after="120"/>
+        <w:jc w:val="both"/>
+      </w:pPr>
+      <w:r>
+        <w:rPr>
+          <w:rFonts w:ascii="Arial" w:cs="Arial" w:eastAsia="Arial" w:hAnsi="Arial"/>
+          <w:sz w:val="22"/>
+          <w:szCs w:val="22"/>
+        </w:rPr>
+        <w:t xml:space="preserve">Enquanto o Claude trabalha, ele vai pedir permissão para cada comando — basta clicar em “Permitir”. Isso é normal e desejável: nada roda no seu computador sem o seu OK.</w:t>
+      </w:r>
+    </w:p>
+    <w:p>
+      <w:pPr>
+        <w:spacing w:after="120"/>
+        <w:jc w:val="both"/>
+      </w:pPr>
+      <w:r>
+        <w:rPr>
+          <w:rFonts w:ascii="Arial" w:cs="Arial" w:eastAsia="Arial" w:hAnsi="Arial"/>
+          <w:b/>
+          <w:bCs/>
+          <w:sz w:val="22"/>
+          <w:szCs w:val="22"/>
+        </w:rPr>
+        <w:t xml:space="preserve">O que ele está instalando? </w:t>
+      </w:r>
+      <w:r>
+        <w:rPr>
+          <w:rFonts w:ascii="Arial" w:cs="Arial" w:eastAsia="Arial" w:hAnsi="Arial"/>
+          <w:sz w:val="22"/>
+          <w:szCs w:val="22"/>
+        </w:rPr>
+        <w:t xml:space="preserve">O </w:t>
+      </w:r>
+      <w:r>
+        <w:rPr>
+          <w:rFonts w:ascii="Arial" w:cs="Arial" w:eastAsia="Arial" w:hAnsi="Arial"/>
+          <w:b/>
+          <w:bCs/>
+          <w:sz w:val="22"/>
+          <w:szCs w:val="22"/>
+        </w:rPr>
+        <w:t xml:space="preserve">Git</w:t>
+      </w:r>
+      <w:r>
+        <w:rPr>
+          <w:rFonts w:ascii="Arial" w:cs="Arial" w:eastAsia="Arial" w:hAnsi="Arial"/>
+          <w:sz w:val="22"/>
+          <w:szCs w:val="22"/>
+        </w:rPr>
+        <w:t xml:space="preserve"> é a ferramenta que baixa o toolkit e busca as atualizações futuras (nada de programação — é só o “downloader”); de quebra, ele traz o Git Bash, o ambiente de terminal que o Claude Code prefere usar. O </w:t>
+      </w:r>
+      <w:r>
+        <w:rPr>
+          <w:rFonts w:ascii="Arial" w:cs="Arial" w:eastAsia="Arial" w:hAnsi="Arial"/>
+          <w:b/>
+          <w:bCs/>
+          <w:sz w:val="22"/>
+          <w:szCs w:val="22"/>
+        </w:rPr>
+        <w:t xml:space="preserve">Python</w:t>
+      </w:r>
+      <w:r>
+        <w:rPr>
+          <w:rFonts w:ascii="Arial" w:cs="Arial" w:eastAsia="Arial" w:hAnsi="Arial"/>
+          <w:sz w:val="22"/>
+          <w:szCs w:val="22"/>
+        </w:rPr>
+        <w:t xml:space="preserve"> roda os scripts locais do toolkit: conversão de fotos em PDF, geração do arquivo do Sistema Auditor e validação de arquivos de ponto.</w:t>
+      </w:r>
+    </w:p>
+    <w:p>
+      <w:pPr>
+        <w:pStyle w:val="Heading2"/>
+      </w:pPr>
+      <w:r>
+        <w:t xml:space="preserve">2.3 Passo 3 — Reinicie e configure com /aft-setup</w:t>
+      </w:r>
+    </w:p>
+    <w:p>
+      <w:pPr>
+        <w:pStyle w:val="ListParagraph"/>
+        <w:numPr>
+          <w:ilvl w:val="0"/>
+          <w:numId w:val="4"/>
+        </w:numPr>
+        <w:spacing w:after="80"/>
+      </w:pPr>
+      <w:r>
+        <w:rPr>
+          <w:rFonts w:ascii="Arial" w:cs="Arial" w:eastAsia="Arial" w:hAnsi="Arial"/>
+          <w:sz w:val="22"/>
+          <w:szCs w:val="22"/>
+        </w:rPr>
+        <w:t xml:space="preserve">Feche e reabra o aplicativo Claude (para ele reconhecer as skills novas e o Git).</w:t>
+      </w:r>
+    </w:p>
+    <w:p>
+      <w:pPr>
+        <w:pStyle w:val="ListParagraph"/>
+        <w:numPr>
+          <w:ilvl w:val="0"/>
+          <w:numId w:val="4"/>
+        </w:numPr>
+        <w:spacing w:after="80"/>
+      </w:pPr>
+      <w:r>
+        <w:rPr>
+          <w:rFonts w:ascii="Arial" w:cs="Arial" w:eastAsia="Arial" w:hAnsi="Arial"/>
+          <w:sz w:val="22"/>
+          <w:szCs w:val="22"/>
+        </w:rPr>
+        <w:t xml:space="preserve">Numa conversa nova do &lt;/&gt; Code, digite </w:t>
+      </w:r>
+      <w:r>
+        <w:rPr>
+          <w:rFonts w:ascii="Consolas" w:cs="Consolas" w:eastAsia="Consolas" w:hAnsi="Consolas"/>
+          <w:sz w:val="22"/>
+          <w:szCs w:val="22"/>
+        </w:rPr>
+        <w:t xml:space="preserve">/aft-setup</w:t>
+      </w:r>
+      <w:r>
+        <w:rPr>
+          <w:rFonts w:ascii="Arial" w:cs="Arial" w:eastAsia="Arial" w:hAnsi="Arial"/>
+          <w:sz w:val="22"/>
+          <w:szCs w:val="22"/>
+        </w:rPr>
+        <w:t xml:space="preserve">.</w:t>
+      </w:r>
+    </w:p>
+    <w:p>
+      <w:pPr>
+        <w:spacing w:after="120"/>
+        <w:jc w:val="both"/>
+      </w:pPr>
+      <w:r>
+        <w:rPr>
+          <w:rFonts w:ascii="Arial" w:cs="Arial" w:eastAsia="Arial" w:hAnsi="Arial"/>
+          <w:sz w:val="22"/>
+          <w:szCs w:val="22"/>
+        </w:rPr>
+        <w:t xml:space="preserve">A skill de configuração cria a sua pasta de trabalho (Documentos\AFT), pergunta seu nome, CIF e os dados da sua UORG (código, município, CEP), e instala as bibliotecas Python necessárias. Esses dados entram automaticamente em todos os arquivos do Sistema Auditor dali em diante — você nunca mais digita.</w:t>
+      </w:r>
+    </w:p>
+    <w:p>
+      <w:pPr>
+        <w:pStyle w:val="Heading2"/>
+      </w:pPr>
+      <w:r>
+        <w:t xml:space="preserve">2.4 Ative o NotebookLM (recomendado)</w:t>
+      </w:r>
+    </w:p>
+    <w:p>
+      <w:pPr>
+        <w:spacing w:after="120"/>
+        <w:jc w:val="both"/>
+      </w:pPr>
+      <w:r>
+        <w:rPr>
+          <w:rFonts w:ascii="Arial" w:cs="Arial" w:eastAsia="Arial" w:hAnsi="Arial"/>
+          <w:sz w:val="22"/>
+          <w:szCs w:val="22"/>
+        </w:rPr>
+        <w:t xml:space="preserve">Com o NotebookLM ativo, as skills encontram o código da ementa sozinhas, consultando ementários e NRs organizados em notebooks compartilhados.</w:t>
+      </w:r>
+    </w:p>
+    <w:p>
+      <w:pPr>
+        <w:pStyle w:val="ListParagraph"/>
+        <w:numPr>
+          <w:ilvl w:val="0"/>
+          <w:numId w:val="5"/>
+        </w:numPr>
+        <w:spacing w:after="80"/>
+      </w:pPr>
+      <w:r>
+        <w:rPr>
+          <w:rFonts w:ascii="Arial" w:cs="Arial" w:eastAsia="Arial" w:hAnsi="Arial"/>
+          <w:sz w:val="22"/>
+          <w:szCs w:val="22"/>
+        </w:rPr>
+        <w:t xml:space="preserve">Entre em </w:t>
+      </w:r>
+      <w:hyperlink w:history="1" r:id="rIduqeplbq5csfwvlb6zigen">
+        <w:r>
+          <w:rPr>
+            <w:rStyle w:val="Hyperlink"/>
+            <w:rFonts w:ascii="Arial" w:cs="Arial" w:eastAsia="Arial" w:hAnsi="Arial"/>
+            <w:sz w:val="22"/>
+            <w:szCs w:val="22"/>
+          </w:rPr>
+          <w:t xml:space="preserve">notebooks-aft.vercel.app</w:t>
+        </w:r>
+      </w:hyperlink>
+      <w:r>
+        <w:rPr>
+          <w:rFonts w:ascii="Arial" w:cs="Arial" w:eastAsia="Arial" w:hAnsi="Arial"/>
+          <w:sz w:val="22"/>
+          <w:szCs w:val="22"/>
+        </w:rPr>
+        <w:t xml:space="preserve"> com a sua conta Google e solicite acesso.</w:t>
+      </w:r>
+    </w:p>
+    <w:p>
+      <w:pPr>
+        <w:pStyle w:val="ListParagraph"/>
+        <w:numPr>
+          <w:ilvl w:val="0"/>
+          <w:numId w:val="5"/>
+        </w:numPr>
+        <w:spacing w:after="80"/>
+      </w:pPr>
+      <w:r>
+        <w:rPr>
+          <w:rFonts w:ascii="Arial" w:cs="Arial" w:eastAsia="Arial" w:hAnsi="Arial"/>
+          <w:sz w:val="22"/>
+          <w:szCs w:val="22"/>
+        </w:rPr>
+        <w:t xml:space="preserve">Aguarde a liberação pelo mantenedor.</w:t>
+      </w:r>
+    </w:p>
+    <w:p>
+      <w:pPr>
+        <w:pStyle w:val="ListParagraph"/>
+        <w:numPr>
+          <w:ilvl w:val="0"/>
+          <w:numId w:val="5"/>
+        </w:numPr>
+        <w:spacing w:after="80"/>
+      </w:pPr>
+      <w:r>
+        <w:rPr>
+          <w:rFonts w:ascii="Arial" w:cs="Arial" w:eastAsia="Arial" w:hAnsi="Arial"/>
+          <w:sz w:val="22"/>
+          <w:szCs w:val="22"/>
+        </w:rPr>
+        <w:t xml:space="preserve">O próprio /aft-setup instala e autentica o programa do NotebookLM (o login abre no seu navegador, com a sua conta Google).</w:t>
+      </w:r>
+    </w:p>
+    <w:p>
+      <w:pPr>
+        <w:spacing w:after="120"/>
+        <w:jc w:val="both"/>
+      </w:pPr>
+      <w:r>
+        <w:rPr>
+          <w:rFonts w:ascii="Arial" w:cs="Arial" w:eastAsia="Arial" w:hAnsi="Arial"/>
+          <w:sz w:val="22"/>
+          <w:szCs w:val="22"/>
+        </w:rPr>
+        <w:t xml:space="preserve">Sem o NotebookLM tudo continua funcionando: as skills indicam o ementário compartilhado no Google Drive ou pedem o código da ementa a você.</w:t>
+      </w:r>
+    </w:p>
+    <w:p>
+      <w:pPr>
+        <w:pStyle w:val="Heading2"/>
+      </w:pPr>
+      <w:r>
+        <w:t xml:space="preserve">2.5 Como receber atualizações</w:t>
+      </w:r>
+    </w:p>
+    <w:p>
+      <w:pPr>
+        <w:spacing w:after="120"/>
+        <w:jc w:val="both"/>
+      </w:pPr>
+      <w:r>
+        <w:rPr>
+          <w:rFonts w:ascii="Arial" w:cs="Arial" w:eastAsia="Arial" w:hAnsi="Arial"/>
+          <w:sz w:val="22"/>
+          <w:szCs w:val="22"/>
+        </w:rPr>
+        <w:t xml:space="preserve">Quando houver novidades no toolkit, basta pedir ao Claude, numa conversa qualquer:</w:t>
+      </w:r>
+    </w:p>
+    <w:p>
+      <w:pPr>
+        <w:shd w:fill="F2F2F2" w:val="clear"/>
+        <w:spacing w:after="120"/>
+        <w:ind w:left="360"/>
+      </w:pPr>
+      <w:r>
+        <w:rPr>
+          <w:rFonts w:ascii="Consolas" w:cs="Consolas" w:eastAsia="Consolas" w:hAnsi="Consolas"/>
+          <w:sz w:val="20"/>
+          <w:szCs w:val="20"/>
+        </w:rPr>
+        <w:t xml:space="preserve">Atualize o AFT Toolkit</w:t>
+      </w:r>
+    </w:p>
+    <w:p>
+      <w:pPr>
+        <w:spacing w:after="120"/>
+        <w:jc w:val="both"/>
+      </w:pPr>
+      <w:r>
+        <w:rPr>
+          <w:rFonts w:ascii="Arial" w:cs="Arial" w:eastAsia="Arial" w:hAnsi="Arial"/>
+          <w:sz w:val="22"/>
+          <w:szCs w:val="22"/>
+        </w:rPr>
+        <w:t xml:space="preserve">(Ele roda o git pull na pasta das skills e mostra o que mudou.)</w:t>
+      </w:r>
+    </w:p>
+    <w:p>
+      <w:pPr>
+        <w:pStyle w:val="Heading2"/>
+      </w:pPr>
+      <w:r>
+        <w:t xml:space="preserve">2.6 Plano B — instalação manual</w:t>
+      </w:r>
+    </w:p>
+    <w:p>
+      <w:pPr>
+        <w:spacing w:after="120"/>
+        <w:jc w:val="both"/>
+      </w:pPr>
+      <w:r>
+        <w:rPr>
+          <w:rFonts w:ascii="Arial" w:cs="Arial" w:eastAsia="Arial" w:hAnsi="Arial"/>
+          <w:sz w:val="22"/>
+          <w:szCs w:val="22"/>
+        </w:rPr>
+        <w:t xml:space="preserve">Se algo der errado no Passo 2 (ex.: computador sem o winget, rede corporativa bloqueando), instale manualmente e repita o restante:</w:t>
+      </w:r>
+    </w:p>
+    <w:p>
+      <w:pPr>
+        <w:pStyle w:val="ListParagraph"/>
+        <w:numPr>
+          <w:ilvl w:val="0"/>
+          <w:numId w:val="2"/>
+        </w:numPr>
+        <w:spacing w:after="80"/>
+      </w:pPr>
+      <w:r>
+        <w:rPr>
+          <w:rFonts w:ascii="Arial" w:cs="Arial" w:eastAsia="Arial" w:hAnsi="Arial"/>
+          <w:b/>
+          <w:bCs/>
+          <w:sz w:val="22"/>
+          <w:szCs w:val="22"/>
+        </w:rPr>
+        <w:t xml:space="preserve">Git: </w:t>
+      </w:r>
+      <w:r>
+        <w:rPr>
+          <w:rFonts w:ascii="Arial" w:cs="Arial" w:eastAsia="Arial" w:hAnsi="Arial"/>
+          <w:sz w:val="22"/>
+          <w:szCs w:val="22"/>
+        </w:rPr>
+        <w:t xml:space="preserve">baixe em </w:t>
+      </w:r>
+      <w:hyperlink w:history="1" r:id="rIdtauxuhebfy0fys8estnbm">
         <w:r>
           <w:rPr>
             <w:rStyle w:val="Hyperlink"/>
@@ -402,7 +867,7 @@
           <w:sz w:val="22"/>
           <w:szCs w:val="22"/>
         </w:rPr>
-        <w:t xml:space="preserve"> e instale com as opções padrão (basta clicar “Next” até o fim).</w:t>
+        <w:t xml:space="preserve"> e instale com as opções padrão (clicar “Next” até o fim).</w:t>
       </w:r>
     </w:p>
     <w:p>
@@ -410,95 +875,29 @@
         <w:pStyle w:val="ListParagraph"/>
         <w:numPr>
           <w:ilvl w:val="0"/>
-          <w:numId w:val="3"/>
+          <w:numId w:val="2"/>
         </w:numPr>
         <w:spacing w:after="80"/>
       </w:pPr>
       <w:r>
         <w:rPr>
           <w:rFonts w:ascii="Arial" w:cs="Arial" w:eastAsia="Arial" w:hAnsi="Arial"/>
-          <w:sz w:val="22"/>
-          <w:szCs w:val="22"/>
-        </w:rPr>
-        <w:t xml:space="preserve">Teste: aperte </w:t>
-      </w:r>
-      <w:r>
-        <w:rPr>
-          <w:rFonts w:ascii="Arial" w:cs="Arial" w:eastAsia="Arial" w:hAnsi="Arial"/>
           <w:b/>
           <w:bCs/>
           <w:sz w:val="22"/>
           <w:szCs w:val="22"/>
         </w:rPr>
-        <w:t xml:space="preserve">Win + R</w:t>
-      </w:r>
-      <w:r>
-        <w:rPr>
-          <w:rFonts w:ascii="Arial" w:cs="Arial" w:eastAsia="Arial" w:hAnsi="Arial"/>
-          <w:sz w:val="22"/>
-          <w:szCs w:val="22"/>
-        </w:rPr>
-        <w:t xml:space="preserve">, digite </w:t>
-      </w:r>
-      <w:r>
-        <w:rPr>
-          <w:rFonts w:ascii="Consolas" w:cs="Consolas" w:eastAsia="Consolas" w:hAnsi="Consolas"/>
-          <w:sz w:val="22"/>
-          <w:szCs w:val="22"/>
-        </w:rPr>
-        <w:t xml:space="preserve">cmd</w:t>
-      </w:r>
-      <w:r>
-        <w:rPr>
-          <w:rFonts w:ascii="Arial" w:cs="Arial" w:eastAsia="Arial" w:hAnsi="Arial"/>
-          <w:sz w:val="22"/>
-          <w:szCs w:val="22"/>
-        </w:rPr>
-        <w:t xml:space="preserve">, Enter, e digite </w:t>
-      </w:r>
-      <w:r>
-        <w:rPr>
-          <w:rFonts w:ascii="Consolas" w:cs="Consolas" w:eastAsia="Consolas" w:hAnsi="Consolas"/>
-          <w:sz w:val="22"/>
-          <w:szCs w:val="22"/>
-        </w:rPr>
-        <w:t xml:space="preserve">git --version</w:t>
-      </w:r>
-      <w:r>
-        <w:rPr>
-          <w:rFonts w:ascii="Arial" w:cs="Arial" w:eastAsia="Arial" w:hAnsi="Arial"/>
-          <w:sz w:val="22"/>
-          <w:szCs w:val="22"/>
-        </w:rPr>
-        <w:t xml:space="preserve">. Deve aparecer algo como “git version 2.x”.</w:t>
-      </w:r>
-    </w:p>
-    <w:p>
-      <w:pPr>
-        <w:pStyle w:val="Heading2"/>
-      </w:pPr>
-      <w:r>
-        <w:t xml:space="preserve">2.3 Instale o Python</w:t>
-      </w:r>
-    </w:p>
-    <w:p>
-      <w:pPr>
-        <w:pStyle w:val="ListParagraph"/>
-        <w:numPr>
-          <w:ilvl w:val="0"/>
-          <w:numId w:val="3"/>
-        </w:numPr>
-        <w:spacing w:after="80"/>
-      </w:pPr>
-      <w:r>
-        <w:rPr>
-          <w:rFonts w:ascii="Arial" w:cs="Arial" w:eastAsia="Arial" w:hAnsi="Arial"/>
-          <w:sz w:val="22"/>
-          <w:szCs w:val="22"/>
-        </w:rPr>
-        <w:t xml:space="preserve">Baixe em </w:t>
-      </w:r>
-      <w:hyperlink w:history="1" r:id="rIdgfqsffaouulv7skukeap5">
+        <w:t xml:space="preserve">Python: </w:t>
+      </w:r>
+      <w:r>
+        <w:rPr>
+          <w:rFonts w:ascii="Arial" w:cs="Arial" w:eastAsia="Arial" w:hAnsi="Arial"/>
+          <w:sz w:val="22"/>
+          <w:szCs w:val="22"/>
+        </w:rPr>
+        <w:t xml:space="preserve">baixe em </w:t>
+      </w:r>
+      <w:hyperlink w:history="1" r:id="rIdtje8nyyroktndbuk_1tpz">
         <w:r>
           <w:rPr>
             <w:rStyle w:val="Hyperlink"/>
@@ -515,7 +914,25 @@
           <w:sz w:val="22"/>
           <w:szCs w:val="22"/>
         </w:rPr>
-        <w:t xml:space="preserve"> (botão amarelo).</w:t>
+        <w:t xml:space="preserve"> e, na primeira tela do instalador, marque a caixa </w:t>
+      </w:r>
+      <w:r>
+        <w:rPr>
+          <w:rFonts w:ascii="Arial" w:cs="Arial" w:eastAsia="Arial" w:hAnsi="Arial"/>
+          <w:b/>
+          <w:bCs/>
+          <w:sz w:val="22"/>
+          <w:szCs w:val="22"/>
+        </w:rPr>
+        <w:t xml:space="preserve">“Add Python to PATH”</w:t>
+      </w:r>
+      <w:r>
+        <w:rPr>
+          <w:rFonts w:ascii="Arial" w:cs="Arial" w:eastAsia="Arial" w:hAnsi="Arial"/>
+          <w:sz w:val="22"/>
+          <w:szCs w:val="22"/>
+        </w:rPr>
+        <w:t xml:space="preserve">.</w:t>
       </w:r>
     </w:p>
     <w:p>
@@ -523,7 +940,7 @@
         <w:pStyle w:val="ListParagraph"/>
         <w:numPr>
           <w:ilvl w:val="0"/>
-          <w:numId w:val="3"/>
+          <w:numId w:val="2"/>
         </w:numPr>
         <w:spacing w:after="80"/>
       </w:pPr>
@@ -535,51 +952,15 @@
           <w:sz w:val="22"/>
           <w:szCs w:val="22"/>
         </w:rPr>
-        <w:t xml:space="preserve">Atenção: </w:t>
-      </w:r>
-      <w:r>
-        <w:rPr>
-          <w:rFonts w:ascii="Arial" w:cs="Arial" w:eastAsia="Arial" w:hAnsi="Arial"/>
-          <w:sz w:val="22"/>
-          <w:szCs w:val="22"/>
-        </w:rPr>
-        <w:t xml:space="preserve">na primeira tela do instalador, marque a caixa </w:t>
-      </w:r>
-      <w:r>
-        <w:rPr>
-          <w:rFonts w:ascii="Arial" w:cs="Arial" w:eastAsia="Arial" w:hAnsi="Arial"/>
-          <w:b/>
-          <w:bCs/>
-          <w:sz w:val="22"/>
-          <w:szCs w:val="22"/>
-        </w:rPr>
-        <w:t xml:space="preserve">“Add Python to PATH”</w:t>
-      </w:r>
-      <w:r>
-        <w:rPr>
-          <w:rFonts w:ascii="Arial" w:cs="Arial" w:eastAsia="Arial" w:hAnsi="Arial"/>
-          <w:sz w:val="22"/>
-          <w:szCs w:val="22"/>
-        </w:rPr>
-        <w:t xml:space="preserve"> antes de clicar em Install.</w:t>
-      </w:r>
-    </w:p>
-    <w:p>
-      <w:pPr>
-        <w:pStyle w:val="ListParagraph"/>
-        <w:numPr>
-          <w:ilvl w:val="0"/>
-          <w:numId w:val="3"/>
-        </w:numPr>
-        <w:spacing w:after="80"/>
-      </w:pPr>
-      <w:r>
-        <w:rPr>
-          <w:rFonts w:ascii="Arial" w:cs="Arial" w:eastAsia="Arial" w:hAnsi="Arial"/>
-          <w:sz w:val="22"/>
-          <w:szCs w:val="22"/>
-        </w:rPr>
-        <w:t xml:space="preserve">Teste no cmd: </w:t>
+        <w:t xml:space="preserve">Toolkit: </w:t>
+      </w:r>
+      <w:r>
+        <w:rPr>
+          <w:rFonts w:ascii="Arial" w:cs="Arial" w:eastAsia="Arial" w:hAnsi="Arial"/>
+          <w:sz w:val="22"/>
+          <w:szCs w:val="22"/>
+        </w:rPr>
+        <w:t xml:space="preserve">abra o Git Bash (menu Iniciar) e rode: </w:t>
       </w:r>
       <w:r>
         <w:rPr>
@@ -587,295 +968,7 @@
           <w:sz w:val="22"/>
           <w:szCs w:val="22"/>
         </w:rPr>
-        <w:t xml:space="preserve">python --version</w:t>
-      </w:r>
-      <w:r>
-        <w:rPr>
-          <w:rFonts w:ascii="Arial" w:cs="Arial" w:eastAsia="Arial" w:hAnsi="Arial"/>
-          <w:sz w:val="22"/>
-          <w:szCs w:val="22"/>
-        </w:rPr>
-        <w:t xml:space="preserve">.</w:t>
-      </w:r>
-    </w:p>
-    <w:p>
-      <w:pPr>
-        <w:pStyle w:val="Heading2"/>
-      </w:pPr>
-      <w:r>
-        <w:t xml:space="preserve">2.4 Instale o toolkit</w:t>
-      </w:r>
-    </w:p>
-    <w:p>
-      <w:pPr>
-        <w:spacing w:after="120"/>
-        <w:jc w:val="both"/>
-      </w:pPr>
-      <w:r>
-        <w:rPr>
-          <w:rFonts w:ascii="Arial" w:cs="Arial" w:eastAsia="Arial" w:hAnsi="Arial"/>
-          <w:sz w:val="22"/>
-          <w:szCs w:val="22"/>
-        </w:rPr>
-        <w:t xml:space="preserve">Abra o Git Bash (procure “Git Bash” no menu Iniciar — ele foi instalado junto com o Git), cole o comando abaixo e aperte Enter:</w:t>
-      </w:r>
-    </w:p>
-    <w:p>
-      <w:pPr>
-        <w:shd w:fill="F2F2F2" w:val="clear"/>
-        <w:spacing w:after="120"/>
-        <w:ind w:left="360"/>
-      </w:pPr>
-      <w:r>
-        <w:rPr>
-          <w:rFonts w:ascii="Consolas" w:cs="Consolas" w:eastAsia="Consolas" w:hAnsi="Consolas"/>
-          <w:sz w:val="20"/>
-          <w:szCs w:val="20"/>
-        </w:rPr>
         <w:t xml:space="preserve">git clone https://github.com/ryckardo42/aft-toolkit.git ~/.claude/skills/aft-toolkit</w:t>
-      </w:r>
-    </w:p>
-    <w:p>
-      <w:pPr>
-        <w:spacing w:after="120"/>
-        <w:jc w:val="both"/>
-      </w:pPr>
-      <w:r>
-        <w:rPr>
-          <w:rFonts w:ascii="Arial" w:cs="Arial" w:eastAsia="Arial" w:hAnsi="Arial"/>
-          <w:sz w:val="22"/>
-          <w:szCs w:val="22"/>
-        </w:rPr>
-        <w:t xml:space="preserve">Quando o comando terminar, o toolkit está instalado.</w:t>
-      </w:r>
-    </w:p>
-    <w:p>
-      <w:pPr>
-        <w:pStyle w:val="Heading2"/>
-      </w:pPr>
-      <w:r>
-        <w:t xml:space="preserve">2.5 Configure com /aft-setup</w:t>
-      </w:r>
-    </w:p>
-    <w:p>
-      <w:pPr>
-        <w:spacing w:after="120"/>
-        <w:jc w:val="both"/>
-      </w:pPr>
-      <w:r>
-        <w:rPr>
-          <w:rFonts w:ascii="Arial" w:cs="Arial" w:eastAsia="Arial" w:hAnsi="Arial"/>
-          <w:sz w:val="22"/>
-          <w:szCs w:val="22"/>
-        </w:rPr>
-        <w:t xml:space="preserve">Abra o Claude Code, inicie uma conversa e digite:</w:t>
-      </w:r>
-    </w:p>
-    <w:p>
-      <w:pPr>
-        <w:shd w:fill="F2F2F2" w:val="clear"/>
-        <w:spacing w:after="120"/>
-        <w:ind w:left="360"/>
-      </w:pPr>
-      <w:r>
-        <w:rPr>
-          <w:rFonts w:ascii="Consolas" w:cs="Consolas" w:eastAsia="Consolas" w:hAnsi="Consolas"/>
-          <w:sz w:val="20"/>
-          <w:szCs w:val="20"/>
-        </w:rPr>
-        <w:t xml:space="preserve">/aft-setup</w:t>
-      </w:r>
-    </w:p>
-    <w:p>
-      <w:pPr>
-        <w:spacing w:after="120"/>
-        <w:jc w:val="both"/>
-      </w:pPr>
-      <w:r>
-        <w:rPr>
-          <w:rFonts w:ascii="Arial" w:cs="Arial" w:eastAsia="Arial" w:hAnsi="Arial"/>
-          <w:sz w:val="22"/>
-          <w:szCs w:val="22"/>
-        </w:rPr>
-        <w:t xml:space="preserve">A skill de configuração cria a sua pasta de trabalho (Documentos\AFT), pergunta seu nome, CIF e os dados da sua UORG (código, município, CEP), e instala as bibliotecas Python necessárias. Esses dados entram automaticamente em todos os arquivos do Sistema Auditor dali em diante — você nunca mais digita.</w:t>
-      </w:r>
-    </w:p>
-    <w:p>
-      <w:pPr>
-        <w:pStyle w:val="Heading2"/>
-      </w:pPr>
-      <w:r>
-        <w:t xml:space="preserve">2.6 Ative o NotebookLM (recomendado)</w:t>
-      </w:r>
-    </w:p>
-    <w:p>
-      <w:pPr>
-        <w:spacing w:after="120"/>
-        <w:jc w:val="both"/>
-      </w:pPr>
-      <w:r>
-        <w:rPr>
-          <w:rFonts w:ascii="Arial" w:cs="Arial" w:eastAsia="Arial" w:hAnsi="Arial"/>
-          <w:sz w:val="22"/>
-          <w:szCs w:val="22"/>
-        </w:rPr>
-        <w:t xml:space="preserve">Com o NotebookLM ativo, as skills encontram o código da ementa sozinhas, consultando ementários e NRs organizados em notebooks compartilhados.</w:t>
-      </w:r>
-    </w:p>
-    <w:p>
-      <w:pPr>
-        <w:pStyle w:val="ListParagraph"/>
-        <w:numPr>
-          <w:ilvl w:val="0"/>
-          <w:numId w:val="4"/>
-        </w:numPr>
-        <w:spacing w:after="80"/>
-      </w:pPr>
-      <w:r>
-        <w:rPr>
-          <w:rFonts w:ascii="Arial" w:cs="Arial" w:eastAsia="Arial" w:hAnsi="Arial"/>
-          <w:sz w:val="22"/>
-          <w:szCs w:val="22"/>
-        </w:rPr>
-        <w:t xml:space="preserve">Entre em </w:t>
-      </w:r>
-      <w:hyperlink w:history="1" r:id="rIdxzu6yu3ju86tk7oi8mhsj">
-        <w:r>
-          <w:rPr>
-            <w:rStyle w:val="Hyperlink"/>
-            <w:rFonts w:ascii="Arial" w:cs="Arial" w:eastAsia="Arial" w:hAnsi="Arial"/>
-            <w:sz w:val="22"/>
-            <w:szCs w:val="22"/>
-          </w:rPr>
-          <w:t xml:space="preserve">notebooks-aft.vercel.app</w:t>
-        </w:r>
-      </w:hyperlink>
-      <w:r>
-        <w:rPr>
-          <w:rFonts w:ascii="Arial" w:cs="Arial" w:eastAsia="Arial" w:hAnsi="Arial"/>
-          <w:sz w:val="22"/>
-          <w:szCs w:val="22"/>
-        </w:rPr>
-        <w:t xml:space="preserve"> com a sua conta Google e solicite acesso.</w:t>
-      </w:r>
-    </w:p>
-    <w:p>
-      <w:pPr>
-        <w:pStyle w:val="ListParagraph"/>
-        <w:numPr>
-          <w:ilvl w:val="0"/>
-          <w:numId w:val="4"/>
-        </w:numPr>
-        <w:spacing w:after="80"/>
-      </w:pPr>
-      <w:r>
-        <w:rPr>
-          <w:rFonts w:ascii="Arial" w:cs="Arial" w:eastAsia="Arial" w:hAnsi="Arial"/>
-          <w:sz w:val="22"/>
-          <w:szCs w:val="22"/>
-        </w:rPr>
-        <w:t xml:space="preserve">Aguarde a liberação pelo mantenedor.</w:t>
-      </w:r>
-    </w:p>
-    <w:p>
-      <w:pPr>
-        <w:pStyle w:val="ListParagraph"/>
-        <w:numPr>
-          <w:ilvl w:val="0"/>
-          <w:numId w:val="4"/>
-        </w:numPr>
-        <w:spacing w:after="80"/>
-      </w:pPr>
-      <w:r>
-        <w:rPr>
-          <w:rFonts w:ascii="Arial" w:cs="Arial" w:eastAsia="Arial" w:hAnsi="Arial"/>
-          <w:sz w:val="22"/>
-          <w:szCs w:val="22"/>
-        </w:rPr>
-        <w:t xml:space="preserve">No Git Bash: </w:t>
-      </w:r>
-      <w:r>
-        <w:rPr>
-          <w:rFonts w:ascii="Consolas" w:cs="Consolas" w:eastAsia="Consolas" w:hAnsi="Consolas"/>
-          <w:sz w:val="22"/>
-          <w:szCs w:val="22"/>
-        </w:rPr>
-        <w:t xml:space="preserve">pip install notebooklm-py</w:t>
-      </w:r>
-      <w:r>
-        <w:rPr>
-          <w:rFonts w:ascii="Arial" w:cs="Arial" w:eastAsia="Arial" w:hAnsi="Arial"/>
-          <w:sz w:val="22"/>
-          <w:szCs w:val="22"/>
-        </w:rPr>
-        <w:t xml:space="preserve"> e depois </w:t>
-      </w:r>
-      <w:r>
-        <w:rPr>
-          <w:rFonts w:ascii="Consolas" w:cs="Consolas" w:eastAsia="Consolas" w:hAnsi="Consolas"/>
-          <w:sz w:val="22"/>
-          <w:szCs w:val="22"/>
-        </w:rPr>
-        <w:t xml:space="preserve">notebooklm login</w:t>
-      </w:r>
-      <w:r>
-        <w:rPr>
-          <w:rFonts w:ascii="Arial" w:cs="Arial" w:eastAsia="Arial" w:hAnsi="Arial"/>
-          <w:sz w:val="22"/>
-          <w:szCs w:val="22"/>
-        </w:rPr>
-        <w:t xml:space="preserve"> (abre o navegador para entrar com o Google). O /aft-setup também guia esse passo.</w:t>
-      </w:r>
-    </w:p>
-    <w:p>
-      <w:pPr>
-        <w:spacing w:after="120"/>
-        <w:jc w:val="both"/>
-      </w:pPr>
-      <w:r>
-        <w:rPr>
-          <w:rFonts w:ascii="Arial" w:cs="Arial" w:eastAsia="Arial" w:hAnsi="Arial"/>
-          <w:sz w:val="22"/>
-          <w:szCs w:val="22"/>
-        </w:rPr>
-        <w:t xml:space="preserve">Sem o NotebookLM tudo continua funcionando: as skills indicam o ementário compartilhado no Google Drive ou pedem o código da ementa a você.</w:t>
-      </w:r>
-    </w:p>
-    <w:p>
-      <w:pPr>
-        <w:pStyle w:val="Heading2"/>
-      </w:pPr>
-      <w:r>
-        <w:t xml:space="preserve">2.7 Como receber atualizações</w:t>
-      </w:r>
-    </w:p>
-    <w:p>
-      <w:pPr>
-        <w:spacing w:after="120"/>
-        <w:jc w:val="both"/>
-      </w:pPr>
-      <w:r>
-        <w:rPr>
-          <w:rFonts w:ascii="Arial" w:cs="Arial" w:eastAsia="Arial" w:hAnsi="Arial"/>
-          <w:sz w:val="22"/>
-          <w:szCs w:val="22"/>
-        </w:rPr>
-        <w:t xml:space="preserve">Quando houver novidades no toolkit, rode no Git Bash:</w:t>
-      </w:r>
-    </w:p>
-    <w:p>
-      <w:pPr>
-        <w:shd w:fill="F2F2F2" w:val="clear"/>
-        <w:spacing w:after="120"/>
-        <w:ind w:left="360"/>
-      </w:pPr>
-      <w:r>
-        <w:rPr>
-          <w:rFonts w:ascii="Consolas" w:cs="Consolas" w:eastAsia="Consolas" w:hAnsi="Consolas"/>
-          <w:sz w:val="20"/>
-          <w:szCs w:val="20"/>
-        </w:rPr>
-        <w:t xml:space="preserve">cd ~/.claude/skills/aft-toolkit &amp;&amp; git pull</w:t>
       </w:r>
     </w:p>
     <w:p>
@@ -2176,7 +2269,7 @@
         <w:pStyle w:val="ListParagraph"/>
         <w:numPr>
           <w:ilvl w:val="0"/>
-          <w:numId w:val="5"/>
+          <w:numId w:val="6"/>
         </w:numPr>
         <w:spacing w:after="80"/>
       </w:pPr>
@@ -2205,172 +2298,6 @@
           <w:szCs w:val="22"/>
         </w:rPr>
         <w:t xml:space="preserve"> (arquivo .depara na pasta da OS) que associa um código a cada dado real: [[TRAB_01]] para o nome, [[CPF_01]] para o CPF, [[AUTUADA]] para a razão social.</w:t>
-      </w:r>
-    </w:p>
-    <w:p>
-      <w:pPr>
-        <w:pStyle w:val="ListParagraph"/>
-        <w:numPr>
-          <w:ilvl w:val="0"/>
-          <w:numId w:val="5"/>
-        </w:numPr>
-        <w:spacing w:after="80"/>
-      </w:pPr>
-      <w:r>
-        <w:rPr>
-          <w:rFonts w:ascii="Arial" w:cs="Arial" w:eastAsia="Arial" w:hAnsi="Arial"/>
-          <w:sz w:val="22"/>
-          <w:szCs w:val="22"/>
-        </w:rPr>
-        <w:t xml:space="preserve">Dali em diante, os textos dos autos e os ecos no chat usam </w:t>
-      </w:r>
-      <w:r>
-        <w:rPr>
-          <w:rFonts w:ascii="Arial" w:cs="Arial" w:eastAsia="Arial" w:hAnsi="Arial"/>
-          <w:b/>
-          <w:bCs/>
-          <w:sz w:val="22"/>
-          <w:szCs w:val="22"/>
-        </w:rPr>
-        <w:t xml:space="preserve">apenas os códigos</w:t>
-      </w:r>
-      <w:r>
-        <w:rPr>
-          <w:rFonts w:ascii="Arial" w:cs="Arial" w:eastAsia="Arial" w:hAnsi="Arial"/>
-          <w:sz w:val="22"/>
-          <w:szCs w:val="22"/>
-        </w:rPr>
-        <w:t xml:space="preserve">. É assim que o texto circula durante a redação e revisão.</w:t>
-      </w:r>
-    </w:p>
-    <w:p>
-      <w:pPr>
-        <w:pStyle w:val="ListParagraph"/>
-        <w:numPr>
-          <w:ilvl w:val="0"/>
-          <w:numId w:val="5"/>
-        </w:numPr>
-        <w:spacing w:after="80"/>
-      </w:pPr>
-      <w:r>
-        <w:rPr>
-          <w:rFonts w:ascii="Arial" w:cs="Arial" w:eastAsia="Arial" w:hAnsi="Arial"/>
-          <w:sz w:val="22"/>
-          <w:szCs w:val="22"/>
-        </w:rPr>
-        <w:t xml:space="preserve">Na hora de gerar o TXT do Sistema Auditor, um </w:t>
-      </w:r>
-      <w:r>
-        <w:rPr>
-          <w:rFonts w:ascii="Arial" w:cs="Arial" w:eastAsia="Arial" w:hAnsi="Arial"/>
-          <w:b/>
-          <w:bCs/>
-          <w:sz w:val="22"/>
-          <w:szCs w:val="22"/>
-        </w:rPr>
-        <w:t xml:space="preserve">script Python local (rehydrate.py)</w:t>
-      </w:r>
-      <w:r>
-        <w:rPr>
-          <w:rFonts w:ascii="Arial" w:cs="Arial" w:eastAsia="Arial" w:hAnsi="Arial"/>
-          <w:sz w:val="22"/>
-          <w:szCs w:val="22"/>
-        </w:rPr>
-        <w:t xml:space="preserve"> substitui os códigos pelos dados reais, por correspondência exata. A IA nunca digita um CPF no documento final — quem o faz é o script, que confere o formato e aborta se algo estiver errado. Num documento legal, um nome ou CPF trocado é inaceitável; por isso essa etapa não é feita pelo modelo.</w:t>
-      </w:r>
-    </w:p>
-    <w:p>
-      <w:pPr>
-        <w:pStyle w:val="ListParagraph"/>
-        <w:numPr>
-          <w:ilvl w:val="0"/>
-          <w:numId w:val="5"/>
-        </w:numPr>
-        <w:spacing w:after="80"/>
-      </w:pPr>
-      <w:r>
-        <w:rPr>
-          <w:rFonts w:ascii="Arial" w:cs="Arial" w:eastAsia="Arial" w:hAnsi="Arial"/>
-          <w:sz w:val="22"/>
-          <w:szCs w:val="22"/>
-        </w:rPr>
-        <w:t xml:space="preserve">Ficam na pasta da lavratura: o </w:t>
-      </w:r>
-      <w:r>
-        <w:rPr>
-          <w:rFonts w:ascii="Arial" w:cs="Arial" w:eastAsia="Arial" w:hAnsi="Arial"/>
-          <w:b/>
-          <w:bCs/>
-          <w:sz w:val="22"/>
-          <w:szCs w:val="22"/>
-        </w:rPr>
-        <w:t xml:space="preserve">TXT real</w:t>
-      </w:r>
-      <w:r>
-        <w:rPr>
-          <w:rFonts w:ascii="Arial" w:cs="Arial" w:eastAsia="Arial" w:hAnsi="Arial"/>
-          <w:sz w:val="22"/>
-          <w:szCs w:val="22"/>
-        </w:rPr>
-        <w:t xml:space="preserve"> (para importar), a </w:t>
-      </w:r>
-      <w:r>
-        <w:rPr>
-          <w:rFonts w:ascii="Arial" w:cs="Arial" w:eastAsia="Arial" w:hAnsi="Arial"/>
-          <w:b/>
-          <w:bCs/>
-          <w:sz w:val="22"/>
-          <w:szCs w:val="22"/>
-        </w:rPr>
-        <w:t xml:space="preserve">cópia tokenizada</w:t>
-      </w:r>
-      <w:r>
-        <w:rPr>
-          <w:rFonts w:ascii="Arial" w:cs="Arial" w:eastAsia="Arial" w:hAnsi="Arial"/>
-          <w:sz w:val="22"/>
-          <w:szCs w:val="22"/>
-        </w:rPr>
-        <w:t xml:space="preserve"> (segura para compartilhar com colegas) e o </w:t>
-      </w:r>
-      <w:r>
-        <w:rPr>
-          <w:rFonts w:ascii="Arial" w:cs="Arial" w:eastAsia="Arial" w:hAnsi="Arial"/>
-          <w:b/>
-          <w:bCs/>
-          <w:sz w:val="22"/>
-          <w:szCs w:val="22"/>
-        </w:rPr>
-        <w:t xml:space="preserve">mapa de-para</w:t>
-      </w:r>
-      <w:r>
-        <w:rPr>
-          <w:rFonts w:ascii="Arial" w:cs="Arial" w:eastAsia="Arial" w:hAnsi="Arial"/>
-          <w:sz w:val="22"/>
-          <w:szCs w:val="22"/>
-        </w:rPr>
-        <w:t xml:space="preserve"> (sensível — nunca compartilhe).</w:t>
-      </w:r>
-    </w:p>
-    <w:p>
-      <w:pPr>
-        <w:spacing w:after="120"/>
-        <w:jc w:val="both"/>
-      </w:pPr>
-      <w:r>
-        <w:rPr>
-          <w:rFonts w:ascii="Arial" w:cs="Arial" w:eastAsia="Arial" w:hAnsi="Arial"/>
-          <w:sz w:val="22"/>
-          <w:szCs w:val="22"/>
-        </w:rPr>
-        <w:t xml:space="preserve">O CNPJ da empresa não é tokenizado: ele é a chave que organiza as pastas, os anexos e a importação no Sistema Auditor.</w:t>
-      </w:r>
-    </w:p>
-    <w:p>
-      <w:pPr>
-        <w:pStyle w:val="Heading1"/>
-      </w:pPr>
-      <w:r>
-        <w:t xml:space="preserve">5. Fluxo típico de uma fiscalização</w:t>
       </w:r>
     </w:p>
     <w:p>
@@ -2388,7 +2315,25 @@
           <w:sz w:val="22"/>
           <w:szCs w:val="22"/>
         </w:rPr>
-        <w:t xml:space="preserve">Visita ao estabelecimento.</w:t>
+        <w:t xml:space="preserve">Dali em diante, os textos dos autos e os ecos no chat usam </w:t>
+      </w:r>
+      <w:r>
+        <w:rPr>
+          <w:rFonts w:ascii="Arial" w:cs="Arial" w:eastAsia="Arial" w:hAnsi="Arial"/>
+          <w:b/>
+          <w:bCs/>
+          <w:sz w:val="22"/>
+          <w:szCs w:val="22"/>
+        </w:rPr>
+        <w:t xml:space="preserve">apenas os códigos</w:t>
+      </w:r>
+      <w:r>
+        <w:rPr>
+          <w:rFonts w:ascii="Arial" w:cs="Arial" w:eastAsia="Arial" w:hAnsi="Arial"/>
+          <w:sz w:val="22"/>
+          <w:szCs w:val="22"/>
+        </w:rPr>
+        <w:t xml:space="preserve">. É assim que o texto circula durante a redação e revisão.</w:t>
       </w:r>
     </w:p>
     <w:p>
@@ -2402,19 +2347,29 @@
       </w:pPr>
       <w:r>
         <w:rPr>
-          <w:rFonts w:ascii="Consolas" w:cs="Consolas" w:eastAsia="Consolas" w:hAnsi="Consolas"/>
-          <w:sz w:val="22"/>
-          <w:szCs w:val="22"/>
-        </w:rPr>
-        <w:t xml:space="preserve">/inspecao-fisica</w:t>
-      </w:r>
-      <w:r>
-        <w:rPr>
-          <w:rFonts w:ascii="Arial" w:cs="Arial" w:eastAsia="Arial" w:hAnsi="Arial"/>
-          <w:sz w:val="22"/>
-          <w:szCs w:val="22"/>
-        </w:rPr>
-        <w:t xml:space="preserve"> — você narra (pode ditar por voz no celular e colar) e a skill organiza o relato em tópicos fiéis, salvos na pasta da OS. Você confere antes de salvar.</w:t>
+          <w:rFonts w:ascii="Arial" w:cs="Arial" w:eastAsia="Arial" w:hAnsi="Arial"/>
+          <w:sz w:val="22"/>
+          <w:szCs w:val="22"/>
+        </w:rPr>
+        <w:t xml:space="preserve">Na hora de gerar o TXT do Sistema Auditor, um </w:t>
+      </w:r>
+      <w:r>
+        <w:rPr>
+          <w:rFonts w:ascii="Arial" w:cs="Arial" w:eastAsia="Arial" w:hAnsi="Arial"/>
+          <w:b/>
+          <w:bCs/>
+          <w:sz w:val="22"/>
+          <w:szCs w:val="22"/>
+        </w:rPr>
+        <w:t xml:space="preserve">script Python local (rehydrate.py)</w:t>
+      </w:r>
+      <w:r>
+        <w:rPr>
+          <w:rFonts w:ascii="Arial" w:cs="Arial" w:eastAsia="Arial" w:hAnsi="Arial"/>
+          <w:sz w:val="22"/>
+          <w:szCs w:val="22"/>
+        </w:rPr>
+        <w:t xml:space="preserve"> substitui os códigos pelos dados reais, por correspondência exata. A IA nunca digita um CPF no documento final — quem o faz é o script, que confere o formato e aborta se algo estiver errado. Num documento legal, um nome ou CPF trocado é inaceitável; por isso essa etapa não é feita pelo modelo.</w:t>
       </w:r>
     </w:p>
     <w:p>
@@ -2428,19 +2383,87 @@
       </w:pPr>
       <w:r>
         <w:rPr>
-          <w:rFonts w:ascii="Consolas" w:cs="Consolas" w:eastAsia="Consolas" w:hAnsi="Consolas"/>
-          <w:sz w:val="22"/>
-          <w:szCs w:val="22"/>
-        </w:rPr>
-        <w:t xml:space="preserve">/inspecao-inicial</w:t>
-      </w:r>
-      <w:r>
-        <w:rPr>
-          <w:rFonts w:ascii="Arial" w:cs="Arial" w:eastAsia="Arial" w:hAnsi="Arial"/>
-          <w:sz w:val="22"/>
-          <w:szCs w:val="22"/>
-        </w:rPr>
-        <w:t xml:space="preserve"> — a skill enquadra cada achado (NR, item, ementa), confirma com você e redige os autos. Se houver trabalhador sem registro, chama /registro; se houver risco grave e iminente, chama /aft-rt-rgi; o PGR entregue vai para /PGR-analise.</w:t>
+          <w:rFonts w:ascii="Arial" w:cs="Arial" w:eastAsia="Arial" w:hAnsi="Arial"/>
+          <w:sz w:val="22"/>
+          <w:szCs w:val="22"/>
+        </w:rPr>
+        <w:t xml:space="preserve">Ficam na pasta da lavratura: o </w:t>
+      </w:r>
+      <w:r>
+        <w:rPr>
+          <w:rFonts w:ascii="Arial" w:cs="Arial" w:eastAsia="Arial" w:hAnsi="Arial"/>
+          <w:b/>
+          <w:bCs/>
+          <w:sz w:val="22"/>
+          <w:szCs w:val="22"/>
+        </w:rPr>
+        <w:t xml:space="preserve">TXT real</w:t>
+      </w:r>
+      <w:r>
+        <w:rPr>
+          <w:rFonts w:ascii="Arial" w:cs="Arial" w:eastAsia="Arial" w:hAnsi="Arial"/>
+          <w:sz w:val="22"/>
+          <w:szCs w:val="22"/>
+        </w:rPr>
+        <w:t xml:space="preserve"> (para importar), a </w:t>
+      </w:r>
+      <w:r>
+        <w:rPr>
+          <w:rFonts w:ascii="Arial" w:cs="Arial" w:eastAsia="Arial" w:hAnsi="Arial"/>
+          <w:b/>
+          <w:bCs/>
+          <w:sz w:val="22"/>
+          <w:szCs w:val="22"/>
+        </w:rPr>
+        <w:t xml:space="preserve">cópia tokenizada</w:t>
+      </w:r>
+      <w:r>
+        <w:rPr>
+          <w:rFonts w:ascii="Arial" w:cs="Arial" w:eastAsia="Arial" w:hAnsi="Arial"/>
+          <w:sz w:val="22"/>
+          <w:szCs w:val="22"/>
+        </w:rPr>
+        <w:t xml:space="preserve"> (segura para compartilhar com colegas) e o </w:t>
+      </w:r>
+      <w:r>
+        <w:rPr>
+          <w:rFonts w:ascii="Arial" w:cs="Arial" w:eastAsia="Arial" w:hAnsi="Arial"/>
+          <w:b/>
+          <w:bCs/>
+          <w:sz w:val="22"/>
+          <w:szCs w:val="22"/>
+        </w:rPr>
+        <w:t xml:space="preserve">mapa de-para</w:t>
+      </w:r>
+      <w:r>
+        <w:rPr>
+          <w:rFonts w:ascii="Arial" w:cs="Arial" w:eastAsia="Arial" w:hAnsi="Arial"/>
+          <w:sz w:val="22"/>
+          <w:szCs w:val="22"/>
+        </w:rPr>
+        <w:t xml:space="preserve"> (sensível — nunca compartilhe).</w:t>
+      </w:r>
+    </w:p>
+    <w:p>
+      <w:pPr>
+        <w:spacing w:after="120"/>
+        <w:jc w:val="both"/>
+      </w:pPr>
+      <w:r>
+        <w:rPr>
+          <w:rFonts w:ascii="Arial" w:cs="Arial" w:eastAsia="Arial" w:hAnsi="Arial"/>
+          <w:sz w:val="22"/>
+          <w:szCs w:val="22"/>
+        </w:rPr>
+        <w:t xml:space="preserve">O CNPJ da empresa não é tokenizado: ele é a chave que organiza as pastas, os anexos e a importação no Sistema Auditor.</w:t>
+      </w:r>
+    </w:p>
+    <w:p>
+      <w:pPr>
+        <w:pStyle w:val="Heading1"/>
+      </w:pPr>
+      <w:r>
+        <w:t xml:space="preserve">5. Fluxo típico de uma fiscalização</w:t>
       </w:r>
     </w:p>
     <w:p>
@@ -2448,25 +2471,17 @@
         <w:pStyle w:val="ListParagraph"/>
         <w:numPr>
           <w:ilvl w:val="0"/>
-          <w:numId w:val="6"/>
+          <w:numId w:val="7"/>
         </w:numPr>
         <w:spacing w:after="80"/>
       </w:pPr>
       <w:r>
         <w:rPr>
-          <w:rFonts w:ascii="Consolas" w:cs="Consolas" w:eastAsia="Consolas" w:hAnsi="Consolas"/>
-          <w:sz w:val="22"/>
-          <w:szCs w:val="22"/>
-        </w:rPr>
-        <w:t xml:space="preserve">/gera-ai</w:t>
-      </w:r>
-      <w:r>
-        <w:rPr>
-          <w:rFonts w:ascii="Arial" w:cs="Arial" w:eastAsia="Arial" w:hAnsi="Arial"/>
-          <w:sz w:val="22"/>
-          <w:szCs w:val="22"/>
-        </w:rPr>
-        <w:t xml:space="preserve"> — empacota tudo no TXT importável, com as fotos de evidência convertidas em PDF e nomeadas na convenção do Sistema Auditor.</w:t>
+          <w:rFonts w:ascii="Arial" w:cs="Arial" w:eastAsia="Arial" w:hAnsi="Arial"/>
+          <w:sz w:val="22"/>
+          <w:szCs w:val="22"/>
+        </w:rPr>
+        <w:t xml:space="preserve">Visita ao estabelecimento.</w:t>
       </w:r>
     </w:p>
     <w:p>
@@ -2474,35 +2489,25 @@
         <w:pStyle w:val="ListParagraph"/>
         <w:numPr>
           <w:ilvl w:val="0"/>
-          <w:numId w:val="6"/>
+          <w:numId w:val="7"/>
         </w:numPr>
         <w:spacing w:after="80"/>
       </w:pPr>
       <w:r>
         <w:rPr>
-          <w:rFonts w:ascii="Arial" w:cs="Arial" w:eastAsia="Arial" w:hAnsi="Arial"/>
-          <w:sz w:val="22"/>
-          <w:szCs w:val="22"/>
-        </w:rPr>
-        <w:t xml:space="preserve">No </w:t>
-      </w:r>
-      <w:r>
-        <w:rPr>
-          <w:rFonts w:ascii="Arial" w:cs="Arial" w:eastAsia="Arial" w:hAnsi="Arial"/>
-          <w:b/>
-          <w:bCs/>
-          <w:sz w:val="22"/>
-          <w:szCs w:val="22"/>
-        </w:rPr>
-        <w:t xml:space="preserve">Sistema Auditor</w:t>
-      </w:r>
-      <w:r>
-        <w:rPr>
-          <w:rFonts w:ascii="Arial" w:cs="Arial" w:eastAsia="Arial" w:hAnsi="Arial"/>
-          <w:sz w:val="22"/>
-          <w:szCs w:val="22"/>
-        </w:rPr>
-        <w:t xml:space="preserve">: botão “imp. txt”, conferência pela lupa, revisão final e transmissão.</w:t>
+          <w:rFonts w:ascii="Consolas" w:cs="Consolas" w:eastAsia="Consolas" w:hAnsi="Consolas"/>
+          <w:sz w:val="22"/>
+          <w:szCs w:val="22"/>
+        </w:rPr>
+        <w:t xml:space="preserve">/inspecao-fisica</w:t>
+      </w:r>
+      <w:r>
+        <w:rPr>
+          <w:rFonts w:ascii="Arial" w:cs="Arial" w:eastAsia="Arial" w:hAnsi="Arial"/>
+          <w:sz w:val="22"/>
+          <w:szCs w:val="22"/>
+        </w:rPr>
+        <w:t xml:space="preserve"> — você narra (pode ditar por voz no celular e colar) e a skill organiza o relato em tópicos fiéis, salvos na pasta da OS. Você confere antes de salvar.</w:t>
       </w:r>
     </w:p>
     <w:p>
@@ -2510,7 +2515,95 @@
         <w:pStyle w:val="ListParagraph"/>
         <w:numPr>
           <w:ilvl w:val="0"/>
-          <w:numId w:val="6"/>
+          <w:numId w:val="7"/>
+        </w:numPr>
+        <w:spacing w:after="80"/>
+      </w:pPr>
+      <w:r>
+        <w:rPr>
+          <w:rFonts w:ascii="Consolas" w:cs="Consolas" w:eastAsia="Consolas" w:hAnsi="Consolas"/>
+          <w:sz w:val="22"/>
+          <w:szCs w:val="22"/>
+        </w:rPr>
+        <w:t xml:space="preserve">/inspecao-inicial</w:t>
+      </w:r>
+      <w:r>
+        <w:rPr>
+          <w:rFonts w:ascii="Arial" w:cs="Arial" w:eastAsia="Arial" w:hAnsi="Arial"/>
+          <w:sz w:val="22"/>
+          <w:szCs w:val="22"/>
+        </w:rPr>
+        <w:t xml:space="preserve"> — a skill enquadra cada achado (NR, item, ementa), confirma com você e redige os autos. Se houver trabalhador sem registro, chama /registro; se houver risco grave e iminente, chama /aft-rt-rgi; o PGR entregue vai para /PGR-analise.</w:t>
+      </w:r>
+    </w:p>
+    <w:p>
+      <w:pPr>
+        <w:pStyle w:val="ListParagraph"/>
+        <w:numPr>
+          <w:ilvl w:val="0"/>
+          <w:numId w:val="7"/>
+        </w:numPr>
+        <w:spacing w:after="80"/>
+      </w:pPr>
+      <w:r>
+        <w:rPr>
+          <w:rFonts w:ascii="Consolas" w:cs="Consolas" w:eastAsia="Consolas" w:hAnsi="Consolas"/>
+          <w:sz w:val="22"/>
+          <w:szCs w:val="22"/>
+        </w:rPr>
+        <w:t xml:space="preserve">/gera-ai</w:t>
+      </w:r>
+      <w:r>
+        <w:rPr>
+          <w:rFonts w:ascii="Arial" w:cs="Arial" w:eastAsia="Arial" w:hAnsi="Arial"/>
+          <w:sz w:val="22"/>
+          <w:szCs w:val="22"/>
+        </w:rPr>
+        <w:t xml:space="preserve"> — empacota tudo no TXT importável, com as fotos de evidência convertidas em PDF e nomeadas na convenção do Sistema Auditor.</w:t>
+      </w:r>
+    </w:p>
+    <w:p>
+      <w:pPr>
+        <w:pStyle w:val="ListParagraph"/>
+        <w:numPr>
+          <w:ilvl w:val="0"/>
+          <w:numId w:val="7"/>
+        </w:numPr>
+        <w:spacing w:after="80"/>
+      </w:pPr>
+      <w:r>
+        <w:rPr>
+          <w:rFonts w:ascii="Arial" w:cs="Arial" w:eastAsia="Arial" w:hAnsi="Arial"/>
+          <w:sz w:val="22"/>
+          <w:szCs w:val="22"/>
+        </w:rPr>
+        <w:t xml:space="preserve">No </w:t>
+      </w:r>
+      <w:r>
+        <w:rPr>
+          <w:rFonts w:ascii="Arial" w:cs="Arial" w:eastAsia="Arial" w:hAnsi="Arial"/>
+          <w:b/>
+          <w:bCs/>
+          <w:sz w:val="22"/>
+          <w:szCs w:val="22"/>
+        </w:rPr>
+        <w:t xml:space="preserve">Sistema Auditor</w:t>
+      </w:r>
+      <w:r>
+        <w:rPr>
+          <w:rFonts w:ascii="Arial" w:cs="Arial" w:eastAsia="Arial" w:hAnsi="Arial"/>
+          <w:sz w:val="22"/>
+          <w:szCs w:val="22"/>
+        </w:rPr>
+        <w:t xml:space="preserve">: botão “imp. txt”, conferência pela lupa, revisão final e transmissão.</w:t>
+      </w:r>
+    </w:p>
+    <w:p>
+      <w:pPr>
+        <w:pStyle w:val="ListParagraph"/>
+        <w:numPr>
+          <w:ilvl w:val="0"/>
+          <w:numId w:val="7"/>
         </w:numPr>
         <w:spacing w:after="80"/>
       </w:pPr>
@@ -2872,6 +2965,20 @@
       </w:pPr>
       <w:r>
         <w:t xml:space="preserve">7. Problemas comuns</w:t>
+      </w:r>
+    </w:p>
+    <w:p>
+      <w:pPr>
+        <w:spacing w:after="120"/>
+        <w:jc w:val="both"/>
+      </w:pPr>
+      <w:r>
+        <w:rPr>
+          <w:rFonts w:ascii="Arial" w:cs="Arial" w:eastAsia="Arial" w:hAnsi="Arial"/>
+          <w:sz w:val="22"/>
+          <w:szCs w:val="22"/>
+        </w:rPr>
+        <w:t xml:space="preserve">Regra geral: descreva o problema ao próprio Claude no &lt;/&gt; Code (“o comando X deu este erro: ...”) — ele diagnostica e corrige na hora. A tabela abaixo cobre os casos mais comuns:</w:t>
       </w:r>
     </w:p>
     <w:tbl>
@@ -2991,7 +3098,7 @@
                 <w:sz w:val="22"/>
                 <w:szCs w:val="22"/>
               </w:rPr>
-              <w:t xml:space="preserve">git: command not found</w:t>
+              <w:t xml:space="preserve">Git ou Python “não encontrado”</w:t>
             </w:r>
           </w:p>
         </w:tc>
@@ -3022,7 +3129,7 @@
                 <w:sz w:val="22"/>
                 <w:szCs w:val="22"/>
               </w:rPr>
-              <w:t xml:space="preserve">Instale o Git (seção 2.2) e feche/reabra o terminal.</w:t>
+              <w:t xml:space="preserve">Peça ao Claude: “instale o Git e o Python com winget”. Se a rede bloquear, use o plano B manual (seção 2.6) e reinicie o aplicativo.</w:t>
             </w:r>
           </w:p>
         </w:tc>
@@ -3055,7 +3162,7 @@
                 <w:sz w:val="22"/>
                 <w:szCs w:val="22"/>
               </w:rPr>
-              <w:t xml:space="preserve">python: command not found</w:t>
+              <w:t xml:space="preserve">A skill não aparece ao digitar /</w:t>
             </w:r>
           </w:p>
         </w:tc>
@@ -3086,7 +3193,7 @@
                 <w:sz w:val="22"/>
                 <w:szCs w:val="22"/>
               </w:rPr>
-              <w:t xml:space="preserve">Reinstale o Python marcando “Add Python to PATH” (seção 2.3).</w:t>
+              <w:t xml:space="preserve">Feche e reabra o Claude Code; peça a ele: “confirme se a pasta ~/.claude/skills/aft-toolkit existe”.</w:t>
             </w:r>
           </w:p>
         </w:tc>
@@ -3119,7 +3226,7 @@
                 <w:sz w:val="22"/>
                 <w:szCs w:val="22"/>
               </w:rPr>
-              <w:t xml:space="preserve">A skill não aparece ao digitar /</w:t>
+              <w:t xml:space="preserve">notebooklm: command not found</w:t>
             </w:r>
           </w:p>
         </w:tc>
@@ -3150,7 +3257,7 @@
                 <w:sz w:val="22"/>
                 <w:szCs w:val="22"/>
               </w:rPr>
-              <w:t xml:space="preserve">Feche e reabra o Claude Code; confirme que a pasta ~/.claude/skills/aft-toolkit existe (Git Bash: ls ~/.claude/skills).</w:t>
+              <w:t xml:space="preserve">Peça ao Claude: “instale o notebooklm-py com pip”.</w:t>
             </w:r>
           </w:p>
         </w:tc>
@@ -3183,7 +3290,7 @@
                 <w:sz w:val="22"/>
                 <w:szCs w:val="22"/>
               </w:rPr>
-              <w:t xml:space="preserve">notebooklm: command not found</w:t>
+              <w:t xml:space="preserve">NotebookLM responde “sem acesso”</w:t>
             </w:r>
           </w:p>
         </w:tc>
@@ -3214,7 +3321,7 @@
                 <w:sz w:val="22"/>
                 <w:szCs w:val="22"/>
               </w:rPr>
-              <w:t xml:space="preserve">No Git Bash: pip install notebooklm-py</w:t>
+              <w:t xml:space="preserve">Solicite acesso em notebooks-aft.vercel.app e aguarde a liberação.</w:t>
             </w:r>
           </w:p>
         </w:tc>
@@ -3247,7 +3354,7 @@
                 <w:sz w:val="22"/>
                 <w:szCs w:val="22"/>
               </w:rPr>
-              <w:t xml:space="preserve">NotebookLM responde “sem acesso”</w:t>
+              <w:t xml:space="preserve">Foto HEIC (iPhone) não converte</w:t>
             </w:r>
           </w:p>
         </w:tc>
@@ -3278,7 +3385,7 @@
                 <w:sz w:val="22"/>
                 <w:szCs w:val="22"/>
               </w:rPr>
-              <w:t xml:space="preserve">Solicite acesso em notebooks-aft.vercel.app e aguarde a liberação.</w:t>
+              <w:t xml:space="preserve">Peça ao Claude: “instale o pillow-heif” (ou converta a foto para JPG).</w:t>
             </w:r>
           </w:p>
         </w:tc>
@@ -3311,70 +3418,6 @@
                 <w:sz w:val="22"/>
                 <w:szCs w:val="22"/>
               </w:rPr>
-              <w:t xml:space="preserve">Foto HEIC (iPhone) não converte</w:t>
-            </w:r>
-          </w:p>
-        </w:tc>
-        <w:tc>
-          <w:tcPr>
-            <w:tcW w:type="dxa" w:w="5860"/>
-            <w:tcBorders>
-              <w:top w:val="single" w:color="BFBFBF" w:sz="1"/>
-              <w:left w:val="single" w:color="BFBFBF" w:sz="1"/>
-              <w:bottom w:val="single" w:color="BFBFBF" w:sz="1"/>
-              <w:right w:val="single" w:color="BFBFBF" w:sz="1"/>
-            </w:tcBorders>
-            <w:tcMar>
-              <w:top w:type="dxa" w:w="80"/>
-              <w:left w:type="dxa" w:w="120"/>
-              <w:bottom w:type="dxa" w:w="80"/>
-              <w:right w:type="dxa" w:w="120"/>
-            </w:tcMar>
-          </w:tcPr>
-          <w:p>
-            <w:pPr>
-              <w:spacing w:after="0"/>
-              <w:jc w:val="left"/>
-            </w:pPr>
-            <w:r>
-              <w:rPr>
-                <w:rFonts w:ascii="Arial" w:cs="Arial" w:eastAsia="Arial" w:hAnsi="Arial"/>
-                <w:sz w:val="22"/>
-                <w:szCs w:val="22"/>
-              </w:rPr>
-              <w:t xml:space="preserve">No Git Bash: pip install pillow-heif (ou converta a foto para JPG).</w:t>
-            </w:r>
-          </w:p>
-        </w:tc>
-      </w:tr>
-      <w:tr>
-        <w:tc>
-          <w:tcPr>
-            <w:tcW w:type="dxa" w:w="3500"/>
-            <w:tcBorders>
-              <w:top w:val="single" w:color="BFBFBF" w:sz="1"/>
-              <w:left w:val="single" w:color="BFBFBF" w:sz="1"/>
-              <w:bottom w:val="single" w:color="BFBFBF" w:sz="1"/>
-              <w:right w:val="single" w:color="BFBFBF" w:sz="1"/>
-            </w:tcBorders>
-            <w:tcMar>
-              <w:top w:type="dxa" w:w="80"/>
-              <w:left w:type="dxa" w:w="120"/>
-              <w:bottom w:type="dxa" w:w="80"/>
-              <w:right w:type="dxa" w:w="120"/>
-            </w:tcMar>
-          </w:tcPr>
-          <w:p>
-            <w:pPr>
-              <w:spacing w:after="0"/>
-              <w:jc w:val="left"/>
-            </w:pPr>
-            <w:r>
-              <w:rPr>
-                <w:rFonts w:ascii="Arial" w:cs="Arial" w:eastAsia="Arial" w:hAnsi="Arial"/>
-                <w:sz w:val="22"/>
-                <w:szCs w:val="22"/>
-              </w:rPr>
               <w:t xml:space="preserve">Sistema Auditor não acha o anexo</w:t>
             </w:r>
           </w:p>
@@ -3456,7 +3499,7 @@
         </w:rPr>
         <w:t xml:space="preserve"> — ou abra uma Issue em </w:t>
       </w:r>
-      <w:hyperlink w:history="1" r:id="rIdl1cngtic7kw0bcsmrbfjp">
+      <w:hyperlink w:history="1" r:id="rIdqlwwj7sa_jxgqibavgf_n">
         <w:r>
           <w:rPr>
             <w:rStyle w:val="Hyperlink"/>
@@ -3776,6 +3819,18 @@
       </w:pPr>
     </w:lvl>
   </w:abstractNum>
+  <w:abstractNum w:abstractNumId="7" w15:restartNumberingAfterBreak="0">
+    <w:multiLevelType w:val="hybridMultilevel"/>
+    <w:lvl w:ilvl="0" w15:tentative="1">
+      <w:start w:val="1"/>
+      <w:numFmt w:val="decimal"/>
+      <w:lvlText w:val="%1."/>
+      <w:lvlJc w:val="left"/>
+      <w:pPr>
+        <w:ind w:left="720" w:hanging="360"/>
+      </w:pPr>
+    </w:lvl>
+  </w:abstractNum>
   <w:num w:numId="1">
     <w:abstractNumId w:val="1"/>
     <w:lvlOverride w:ilvl="0">
@@ -3801,12 +3856,18 @@
     </w:lvlOverride>
   </w:num>
   <w:num w:numId="5">
+    <w:abstractNumId w:val="7"/>
+    <w:lvlOverride w:ilvl="0">
+      <w:startOverride w:val="1"/>
+    </w:lvlOverride>
+  </w:num>
+  <w:num w:numId="6">
     <w:abstractNumId w:val="6"/>
     <w:lvlOverride w:ilvl="0">
       <w:startOverride w:val="1"/>
     </w:lvlOverride>
   </w:num>
-  <w:num w:numId="6">
+  <w:num w:numId="7">
     <w:abstractNumId w:val="4"/>
     <w:lvlOverride w:ilvl="0">
       <w:startOverride w:val="1"/>

</xml_diff>

<commit_message>
Apostila/COMO-INSTALAR: orienta a escolha da pasta da sessão no </> Code
Instalação: escolher Documentos. Dia a dia: Documentos\AFT.

Co-Authored-By: Claude Fable 5 <noreply@anthropic.com>
</commit_message>
<xml_diff>
--- a/Apostila-AFT-Toolkit.docx
+++ b/Apostila-AFT-Toolkit.docx
@@ -322,7 +322,7 @@
         </w:rPr>
         <w:t xml:space="preserve">Baixe o aplicativo para Windows em </w:t>
       </w:r>
-      <w:hyperlink w:history="1" r:id="rIdibyxb2n49l8txzzwkws6c">
+      <w:hyperlink w:history="1" r:id="rIdwrjn1enoyx9cayq_xzy-4">
         <w:r>
           <w:rPr>
             <w:rStyle w:val="Hyperlink"/>
@@ -415,7 +415,57 @@
           <w:sz w:val="22"/>
           <w:szCs w:val="22"/>
         </w:rPr>
-        <w:t xml:space="preserve">O Claude Code é um assistente que executa comandos no seu computador (sempre pedindo a sua permissão antes). Então, em vez de você instalar programa por programa, cole a mensagem abaixo numa conversa nova do &lt;/&gt; Code e aperte Enter:</w:t>
+        <w:t xml:space="preserve">Ao iniciar uma conversa nova no &lt;/&gt; Code, o Claude pede para você </w:t>
+      </w:r>
+      <w:r>
+        <w:rPr>
+          <w:rFonts w:ascii="Arial" w:cs="Arial" w:eastAsia="Arial" w:hAnsi="Arial"/>
+          <w:b/>
+          <w:bCs/>
+          <w:sz w:val="22"/>
+          <w:szCs w:val="22"/>
+        </w:rPr>
+        <w:t xml:space="preserve">escolher uma pasta para a sessão</w:t>
+      </w:r>
+      <w:r>
+        <w:rPr>
+          <w:rFonts w:ascii="Arial" w:cs="Arial" w:eastAsia="Arial" w:hAnsi="Arial"/>
+          <w:sz w:val="22"/>
+          <w:szCs w:val="22"/>
+        </w:rPr>
+        <w:t xml:space="preserve"> (é a pasta do computador em que ele vai trabalhar). Escolha a pasta </w:t>
+      </w:r>
+      <w:r>
+        <w:rPr>
+          <w:rFonts w:ascii="Arial" w:cs="Arial" w:eastAsia="Arial" w:hAnsi="Arial"/>
+          <w:b/>
+          <w:bCs/>
+          <w:sz w:val="22"/>
+          <w:szCs w:val="22"/>
+        </w:rPr>
+        <w:t xml:space="preserve">Documentos</w:t>
+      </w:r>
+      <w:r>
+        <w:rPr>
+          <w:rFonts w:ascii="Arial" w:cs="Arial" w:eastAsia="Arial" w:hAnsi="Arial"/>
+          <w:sz w:val="22"/>
+          <w:szCs w:val="22"/>
+        </w:rPr>
+        <w:t xml:space="preserve"> (C:\Users\seu-nome\Documents). Depois da instalação, quando a pasta Documentos\AFT existir, prefira escolhê-la nas conversas do dia a dia — é onde ficam as suas fiscalizações.</w:t>
+      </w:r>
+    </w:p>
+    <w:p>
+      <w:pPr>
+        <w:spacing w:after="120"/>
+        <w:jc w:val="both"/>
+      </w:pPr>
+      <w:r>
+        <w:rPr>
+          <w:rFonts w:ascii="Arial" w:cs="Arial" w:eastAsia="Arial" w:hAnsi="Arial"/>
+          <w:sz w:val="22"/>
+          <w:szCs w:val="22"/>
+        </w:rPr>
+        <w:t xml:space="preserve">O Claude Code é um assistente que executa comandos no seu computador (sempre pedindo a sua permissão antes). Então, em vez de você instalar programa por programa, cole a mensagem abaixo na conversa e aperte Enter:</w:t>
       </w:r>
     </w:p>
     <w:p>
@@ -608,7 +658,25 @@
           <w:sz w:val="22"/>
           <w:szCs w:val="22"/>
         </w:rPr>
-        <w:t xml:space="preserve">Numa conversa nova do &lt;/&gt; Code, digite </w:t>
+        <w:t xml:space="preserve">Numa conversa nova do &lt;/&gt; Code (pasta da sessão: </w:t>
+      </w:r>
+      <w:r>
+        <w:rPr>
+          <w:rFonts w:ascii="Arial" w:cs="Arial" w:eastAsia="Arial" w:hAnsi="Arial"/>
+          <w:b/>
+          <w:bCs/>
+          <w:sz w:val="22"/>
+          <w:szCs w:val="22"/>
+        </w:rPr>
+        <w:t xml:space="preserve">Documentos</w:t>
+      </w:r>
+      <w:r>
+        <w:rPr>
+          <w:rFonts w:ascii="Arial" w:cs="Arial" w:eastAsia="Arial" w:hAnsi="Arial"/>
+          <w:sz w:val="22"/>
+          <w:szCs w:val="22"/>
+        </w:rPr>
+        <w:t xml:space="preserve">), digite </w:t>
       </w:r>
       <w:r>
         <w:rPr>
@@ -639,6 +707,48 @@
           <w:szCs w:val="22"/>
         </w:rPr>
         <w:t xml:space="preserve">A skill de configuração cria a sua pasta de trabalho (Documentos\AFT), pergunta seu nome, CIF e os dados da sua UORG (código, município, CEP), e instala as bibliotecas Python necessárias. Esses dados entram automaticamente em todos os arquivos do Sistema Auditor dali em diante — você nunca mais digita.</w:t>
+      </w:r>
+    </w:p>
+    <w:p>
+      <w:pPr>
+        <w:spacing w:after="120"/>
+        <w:jc w:val="both"/>
+      </w:pPr>
+      <w:r>
+        <w:rPr>
+          <w:rFonts w:ascii="Arial" w:cs="Arial" w:eastAsia="Arial" w:hAnsi="Arial"/>
+          <w:b/>
+          <w:bCs/>
+          <w:sz w:val="22"/>
+          <w:szCs w:val="22"/>
+        </w:rPr>
+        <w:t xml:space="preserve">Dica para o dia a dia: </w:t>
+      </w:r>
+      <w:r>
+        <w:rPr>
+          <w:rFonts w:ascii="Arial" w:cs="Arial" w:eastAsia="Arial" w:hAnsi="Arial"/>
+          <w:sz w:val="22"/>
+          <w:szCs w:val="22"/>
+        </w:rPr>
+        <w:t xml:space="preserve">a partir daqui, ao abrir conversas novas, escolha </w:t>
+      </w:r>
+      <w:r>
+        <w:rPr>
+          <w:rFonts w:ascii="Arial" w:cs="Arial" w:eastAsia="Arial" w:hAnsi="Arial"/>
+          <w:b/>
+          <w:bCs/>
+          <w:sz w:val="22"/>
+          <w:szCs w:val="22"/>
+        </w:rPr>
+        <w:t xml:space="preserve">Documentos\AFT</w:t>
+      </w:r>
+      <w:r>
+        <w:rPr>
+          <w:rFonts w:ascii="Arial" w:cs="Arial" w:eastAsia="Arial" w:hAnsi="Arial"/>
+          <w:sz w:val="22"/>
+          <w:szCs w:val="22"/>
+        </w:rPr>
+        <w:t xml:space="preserve"> como pasta da sessão.</w:t>
       </w:r>
     </w:p>
     <w:p>
@@ -680,7 +790,7 @@
         </w:rPr>
         <w:t xml:space="preserve">Entre em </w:t>
       </w:r>
-      <w:hyperlink w:history="1" r:id="rIduqeplbq5csfwvlb6zigen">
+      <w:hyperlink w:history="1" r:id="rIdlpl_q2qw3i1pcn7bdhjxh">
         <w:r>
           <w:rPr>
             <w:rStyle w:val="Hyperlink"/>
@@ -850,7 +960,7 @@
         </w:rPr>
         <w:t xml:space="preserve">baixe em </w:t>
       </w:r>
-      <w:hyperlink w:history="1" r:id="rIdtauxuhebfy0fys8estnbm">
+      <w:hyperlink w:history="1" r:id="rId6mq0sl-awj2mdkrjli1tu">
         <w:r>
           <w:rPr>
             <w:rStyle w:val="Hyperlink"/>
@@ -897,7 +1007,7 @@
         </w:rPr>
         <w:t xml:space="preserve">baixe em </w:t>
       </w:r>
-      <w:hyperlink w:history="1" r:id="rIdtje8nyyroktndbuk_1tpz">
+      <w:hyperlink w:history="1" r:id="rIdnyqexqzvhw95ohcvwilkb">
         <w:r>
           <w:rPr>
             <w:rStyle w:val="Hyperlink"/>
@@ -3499,7 +3609,7 @@
         </w:rPr>
         <w:t xml:space="preserve"> — ou abra uma Issue em </w:t>
       </w:r>
-      <w:hyperlink w:history="1" r:id="rIdqlwwj7sa_jxgqibavgf_n">
+      <w:hyperlink w:history="1" r:id="rId-s8vgts9qxvwz3sqatb9i">
         <w:r>
           <w:rPr>
             <w:rStyle w:val="Hyperlink"/>

</xml_diff>

<commit_message>
Git vira passo manual: app desktop Windows exige Git para sessões locais
Descoberto em teste real no Windows: o </> Code não abre sessão local sem
o Git instalado, então o Claude não pode instalá-lo para si mesmo.
- Apostila e COMO-INSTALAR: agora 4 passos (app → Git manual, com o
  detalhe de sair pela bandeja → prompt instala Python/toolkit → /aft-setup)
- Prompt de instalação só verifica o Git (não tenta instalar)
- Troubleshooting: linha para 'Git is required for local sessions'

Co-Authored-By: Claude Fable 5 <noreply@anthropic.com>
</commit_message>
<xml_diff>
--- a/Apostila-AFT-Toolkit.docx
+++ b/Apostila-AFT-Toolkit.docx
@@ -280,7 +280,7 @@
         <w:pStyle w:val="Heading1"/>
       </w:pPr>
       <w:r>
-        <w:t xml:space="preserve">2. Instalação em 3 passos (Windows)</w:t>
+        <w:t xml:space="preserve">2. Instalação em 4 passos (Windows)</w:t>
       </w:r>
     </w:p>
     <w:p>
@@ -294,7 +294,7 @@
           <w:sz w:val="22"/>
           <w:szCs w:val="22"/>
         </w:rPr>
-        <w:t xml:space="preserve">Tempo estimado: 15 minutos. Você só faz isso uma vez — e quem digita comando é o Claude, não você. A única coisa que você instala manualmente é o próprio aplicativo.</w:t>
+        <w:t xml:space="preserve">Tempo estimado: 15 minutos. Você só faz isso uma vez. Você instala manualmente apenas o aplicativo e o Git (passos 1 e 2); do Python em diante, quem digita comando é o Claude.</w:t>
       </w:r>
     </w:p>
     <w:p>
@@ -322,7 +322,7 @@
         </w:rPr>
         <w:t xml:space="preserve">Baixe o aplicativo para Windows em </w:t>
       </w:r>
-      <w:hyperlink w:history="1" r:id="rIdwrjn1enoyx9cayq_xzy-4">
+      <w:hyperlink w:history="1" r:id="rIdskgyuwszedf_pnrtiizgm">
         <w:r>
           <w:rPr>
             <w:rStyle w:val="Hyperlink"/>
@@ -362,20 +362,24 @@
     </w:p>
     <w:p>
       <w:pPr>
-        <w:pStyle w:val="ListParagraph"/>
-        <w:numPr>
-          <w:ilvl w:val="0"/>
-          <w:numId w:val="3"/>
-        </w:numPr>
-        <w:spacing w:after="80"/>
-      </w:pPr>
-      <w:r>
-        <w:rPr>
-          <w:rFonts w:ascii="Arial" w:cs="Arial" w:eastAsia="Arial" w:hAnsi="Arial"/>
-          <w:sz w:val="22"/>
-          <w:szCs w:val="22"/>
-        </w:rPr>
-        <w:t xml:space="preserve">Dentro do aplicativo, abra a interface de código: o botão </w:t>
+        <w:pStyle w:val="Heading2"/>
+      </w:pPr>
+      <w:r>
+        <w:t xml:space="preserve">2.2 Passo 2 — Instale o Git</w:t>
+      </w:r>
+    </w:p>
+    <w:p>
+      <w:pPr>
+        <w:spacing w:after="120"/>
+        <w:jc w:val="both"/>
+      </w:pPr>
+      <w:r>
+        <w:rPr>
+          <w:rFonts w:ascii="Arial" w:cs="Arial" w:eastAsia="Arial" w:hAnsi="Arial"/>
+          <w:sz w:val="22"/>
+          <w:szCs w:val="22"/>
+        </w:rPr>
+        <w:t xml:space="preserve">No Windows, o aplicativo </w:t>
       </w:r>
       <w:r>
         <w:rPr>
@@ -385,244 +389,15 @@
           <w:sz w:val="22"/>
           <w:szCs w:val="22"/>
         </w:rPr>
-        <w:t xml:space="preserve">&lt;/&gt; Code</w:t>
-      </w:r>
-      <w:r>
-        <w:rPr>
-          <w:rFonts w:ascii="Arial" w:cs="Arial" w:eastAsia="Arial" w:hAnsi="Arial"/>
-          <w:sz w:val="22"/>
-          <w:szCs w:val="22"/>
-        </w:rPr>
-        <w:t xml:space="preserve">. É nela que tudo acontece daqui em diante.</w:t>
-      </w:r>
-    </w:p>
-    <w:p>
-      <w:pPr>
-        <w:pStyle w:val="Heading2"/>
-      </w:pPr>
-      <w:r>
-        <w:t xml:space="preserve">2.2 Passo 2 — Deixe o Claude instalar o resto</w:t>
-      </w:r>
-    </w:p>
-    <w:p>
-      <w:pPr>
-        <w:spacing w:after="120"/>
-        <w:jc w:val="both"/>
-      </w:pPr>
-      <w:r>
-        <w:rPr>
-          <w:rFonts w:ascii="Arial" w:cs="Arial" w:eastAsia="Arial" w:hAnsi="Arial"/>
-          <w:sz w:val="22"/>
-          <w:szCs w:val="22"/>
-        </w:rPr>
-        <w:t xml:space="preserve">Ao iniciar uma conversa nova no &lt;/&gt; Code, o Claude pede para você </w:t>
-      </w:r>
-      <w:r>
-        <w:rPr>
-          <w:rFonts w:ascii="Arial" w:cs="Arial" w:eastAsia="Arial" w:hAnsi="Arial"/>
-          <w:b/>
-          <w:bCs/>
-          <w:sz w:val="22"/>
-          <w:szCs w:val="22"/>
-        </w:rPr>
-        <w:t xml:space="preserve">escolher uma pasta para a sessão</w:t>
-      </w:r>
-      <w:r>
-        <w:rPr>
-          <w:rFonts w:ascii="Arial" w:cs="Arial" w:eastAsia="Arial" w:hAnsi="Arial"/>
-          <w:sz w:val="22"/>
-          <w:szCs w:val="22"/>
-        </w:rPr>
-        <w:t xml:space="preserve"> (é a pasta do computador em que ele vai trabalhar). Escolha a pasta </w:t>
-      </w:r>
-      <w:r>
-        <w:rPr>
-          <w:rFonts w:ascii="Arial" w:cs="Arial" w:eastAsia="Arial" w:hAnsi="Arial"/>
-          <w:b/>
-          <w:bCs/>
-          <w:sz w:val="22"/>
-          <w:szCs w:val="22"/>
-        </w:rPr>
-        <w:t xml:space="preserve">Documentos</w:t>
-      </w:r>
-      <w:r>
-        <w:rPr>
-          <w:rFonts w:ascii="Arial" w:cs="Arial" w:eastAsia="Arial" w:hAnsi="Arial"/>
-          <w:sz w:val="22"/>
-          <w:szCs w:val="22"/>
-        </w:rPr>
-        <w:t xml:space="preserve"> (C:\Users\seu-nome\Documents). Depois da instalação, quando a pasta Documentos\AFT existir, prefira escolhê-la nas conversas do dia a dia — é onde ficam as suas fiscalizações.</w:t>
-      </w:r>
-    </w:p>
-    <w:p>
-      <w:pPr>
-        <w:spacing w:after="120"/>
-        <w:jc w:val="both"/>
-      </w:pPr>
-      <w:r>
-        <w:rPr>
-          <w:rFonts w:ascii="Arial" w:cs="Arial" w:eastAsia="Arial" w:hAnsi="Arial"/>
-          <w:sz w:val="22"/>
-          <w:szCs w:val="22"/>
-        </w:rPr>
-        <w:t xml:space="preserve">O Claude Code é um assistente que executa comandos no seu computador (sempre pedindo a sua permissão antes). Então, em vez de você instalar programa por programa, cole a mensagem abaixo na conversa e aperte Enter:</w:t>
-      </w:r>
-    </w:p>
-    <w:p>
-      <w:pPr>
-        <w:shd w:fill="F2F2F2" w:val="clear"/>
-        <w:spacing w:after="120"/>
-        <w:ind w:left="360"/>
-      </w:pPr>
-      <w:r>
-        <w:rPr>
-          <w:rFonts w:ascii="Consolas" w:cs="Consolas" w:eastAsia="Consolas" w:hAnsi="Consolas"/>
-          <w:sz w:val="20"/>
-          <w:szCs w:val="20"/>
-        </w:rPr>
-        <w:t xml:space="preserve">Prepare este computador para o AFT Toolkit. Faça nesta ordem, me explicando cada passo:</w:t>
-      </w:r>
-    </w:p>
-    <w:p>
-      <w:pPr>
-        <w:shd w:fill="F2F2F2" w:val="clear"/>
-        <w:spacing w:after="120"/>
-        <w:ind w:left="360"/>
-      </w:pPr>
-      <w:r>
-        <w:rPr>
-          <w:rFonts w:ascii="Consolas" w:cs="Consolas" w:eastAsia="Consolas" w:hAnsi="Consolas"/>
-          <w:sz w:val="20"/>
-          <w:szCs w:val="20"/>
-        </w:rPr>
-        <w:t xml:space="preserve">1. Verifique se o Git está instalado; se não estiver, instale com winget (pacote Git.Git).</w:t>
-      </w:r>
-    </w:p>
-    <w:p>
-      <w:pPr>
-        <w:shd w:fill="F2F2F2" w:val="clear"/>
-        <w:spacing w:after="120"/>
-        <w:ind w:left="360"/>
-      </w:pPr>
-      <w:r>
-        <w:rPr>
-          <w:rFonts w:ascii="Consolas" w:cs="Consolas" w:eastAsia="Consolas" w:hAnsi="Consolas"/>
-          <w:sz w:val="20"/>
-          <w:szCs w:val="20"/>
-        </w:rPr>
-        <w:t xml:space="preserve">2. Verifique se o Python 3 está instalado e funcionando no terminal; se não, instale com winget (pacote Python.Python.3.12).</w:t>
-      </w:r>
-    </w:p>
-    <w:p>
-      <w:pPr>
-        <w:shd w:fill="F2F2F2" w:val="clear"/>
-        <w:spacing w:after="120"/>
-        <w:ind w:left="360"/>
-      </w:pPr>
-      <w:r>
-        <w:rPr>
-          <w:rFonts w:ascii="Consolas" w:cs="Consolas" w:eastAsia="Consolas" w:hAnsi="Consolas"/>
-          <w:sz w:val="20"/>
-          <w:szCs w:val="20"/>
-        </w:rPr>
-        <w:t xml:space="preserve">3. Baixe o repositório https://github.com/ryckardo42/aft-toolkit.git para a pasta de skills do Claude Code (~/.claude/skills/aft-toolkit) usando git clone.</w:t>
-      </w:r>
-    </w:p>
-    <w:p>
-      <w:pPr>
-        <w:shd w:fill="F2F2F2" w:val="clear"/>
-        <w:spacing w:after="120"/>
-        <w:ind w:left="360"/>
-      </w:pPr>
-      <w:r>
-        <w:rPr>
-          <w:rFonts w:ascii="Consolas" w:cs="Consolas" w:eastAsia="Consolas" w:hAnsi="Consolas"/>
-          <w:sz w:val="20"/>
-          <w:szCs w:val="20"/>
-        </w:rPr>
-        <w:t xml:space="preserve">4. Confirme que a pasta foi criada, liste as skills instaladas e me diga se preciso reiniciar o aplicativo.</w:t>
-      </w:r>
-    </w:p>
-    <w:p>
-      <w:pPr>
-        <w:spacing w:after="120"/>
-        <w:jc w:val="both"/>
-      </w:pPr>
-      <w:r>
-        <w:rPr>
-          <w:rFonts w:ascii="Arial" w:cs="Arial" w:eastAsia="Arial" w:hAnsi="Arial"/>
-          <w:sz w:val="22"/>
-          <w:szCs w:val="22"/>
-        </w:rPr>
-        <w:t xml:space="preserve">Enquanto o Claude trabalha, ele vai pedir permissão para cada comando — basta clicar em “Permitir”. Isso é normal e desejável: nada roda no seu computador sem o seu OK.</w:t>
-      </w:r>
-    </w:p>
-    <w:p>
-      <w:pPr>
-        <w:spacing w:after="120"/>
-        <w:jc w:val="both"/>
-      </w:pPr>
-      <w:r>
-        <w:rPr>
-          <w:rFonts w:ascii="Arial" w:cs="Arial" w:eastAsia="Arial" w:hAnsi="Arial"/>
-          <w:b/>
-          <w:bCs/>
-          <w:sz w:val="22"/>
-          <w:szCs w:val="22"/>
-        </w:rPr>
-        <w:t xml:space="preserve">O que ele está instalando? </w:t>
-      </w:r>
-      <w:r>
-        <w:rPr>
-          <w:rFonts w:ascii="Arial" w:cs="Arial" w:eastAsia="Arial" w:hAnsi="Arial"/>
-          <w:sz w:val="22"/>
-          <w:szCs w:val="22"/>
-        </w:rPr>
-        <w:t xml:space="preserve">O </w:t>
-      </w:r>
-      <w:r>
-        <w:rPr>
-          <w:rFonts w:ascii="Arial" w:cs="Arial" w:eastAsia="Arial" w:hAnsi="Arial"/>
-          <w:b/>
-          <w:bCs/>
-          <w:sz w:val="22"/>
-          <w:szCs w:val="22"/>
-        </w:rPr>
-        <w:t xml:space="preserve">Git</w:t>
-      </w:r>
-      <w:r>
-        <w:rPr>
-          <w:rFonts w:ascii="Arial" w:cs="Arial" w:eastAsia="Arial" w:hAnsi="Arial"/>
-          <w:sz w:val="22"/>
-          <w:szCs w:val="22"/>
-        </w:rPr>
-        <w:t xml:space="preserve"> é a ferramenta que baixa o toolkit e busca as atualizações futuras (nada de programação — é só o “downloader”); de quebra, ele traz o Git Bash, o ambiente de terminal que o Claude Code prefere usar. O </w:t>
-      </w:r>
-      <w:r>
-        <w:rPr>
-          <w:rFonts w:ascii="Arial" w:cs="Arial" w:eastAsia="Arial" w:hAnsi="Arial"/>
-          <w:b/>
-          <w:bCs/>
-          <w:sz w:val="22"/>
-          <w:szCs w:val="22"/>
-        </w:rPr>
-        <w:t xml:space="preserve">Python</w:t>
-      </w:r>
-      <w:r>
-        <w:rPr>
-          <w:rFonts w:ascii="Arial" w:cs="Arial" w:eastAsia="Arial" w:hAnsi="Arial"/>
-          <w:sz w:val="22"/>
-          <w:szCs w:val="22"/>
-        </w:rPr>
-        <w:t xml:space="preserve"> roda os scripts locais do toolkit: conversão de fotos em PDF, geração do arquivo do Sistema Auditor e validação de arquivos de ponto.</w:t>
-      </w:r>
-    </w:p>
-    <w:p>
-      <w:pPr>
-        <w:pStyle w:val="Heading2"/>
-      </w:pPr>
-      <w:r>
-        <w:t xml:space="preserve">2.3 Passo 3 — Reinicie e configure com /aft-setup</w:t>
+        <w:t xml:space="preserve">exige o Git para abrir sessões locais</w:t>
+      </w:r>
+      <w:r>
+        <w:rPr>
+          <w:rFonts w:ascii="Arial" w:cs="Arial" w:eastAsia="Arial" w:hAnsi="Arial"/>
+          <w:sz w:val="22"/>
+          <w:szCs w:val="22"/>
+        </w:rPr>
+        <w:t xml:space="preserve"> na aba &lt;/&gt; Code — sem ele, aparece a mensagem “Git is required for local sessions”. Por isso este é o único programa que você instala à mão:</w:t>
       </w:r>
     </w:p>
     <w:p>
@@ -640,7 +415,26 @@
           <w:sz w:val="22"/>
           <w:szCs w:val="22"/>
         </w:rPr>
-        <w:t xml:space="preserve">Feche e reabra o aplicativo Claude (para ele reconhecer as skills novas e o Git).</w:t>
+        <w:t xml:space="preserve">Baixe em </w:t>
+      </w:r>
+      <w:hyperlink w:history="1" r:id="rIdxzfamkubo8m7a8ymxxl5d">
+        <w:r>
+          <w:rPr>
+            <w:rStyle w:val="Hyperlink"/>
+            <w:rFonts w:ascii="Arial" w:cs="Arial" w:eastAsia="Arial" w:hAnsi="Arial"/>
+            <w:sz w:val="22"/>
+            <w:szCs w:val="22"/>
+          </w:rPr>
+          <w:t xml:space="preserve">git-scm.com/download/win</w:t>
+        </w:r>
+      </w:hyperlink>
+      <w:r>
+        <w:rPr>
+          <w:rFonts w:ascii="Arial" w:cs="Arial" w:eastAsia="Arial" w:hAnsi="Arial"/>
+          <w:sz w:val="22"/>
+          <w:szCs w:val="22"/>
+        </w:rPr>
+        <w:t xml:space="preserve"> e instale com as opções padrão (basta clicar “Next” até o fim).</w:t>
       </w:r>
     </w:p>
     <w:p>
@@ -658,7 +452,7 @@
           <w:sz w:val="22"/>
           <w:szCs w:val="22"/>
         </w:rPr>
-        <w:t xml:space="preserve">Numa conversa nova do &lt;/&gt; Code (pasta da sessão: </w:t>
+        <w:t xml:space="preserve">Feche o aplicativo Claude </w:t>
       </w:r>
       <w:r>
         <w:rPr>
@@ -668,31 +462,51 @@
           <w:sz w:val="22"/>
           <w:szCs w:val="22"/>
         </w:rPr>
-        <w:t xml:space="preserve">Documentos</w:t>
-      </w:r>
-      <w:r>
-        <w:rPr>
-          <w:rFonts w:ascii="Arial" w:cs="Arial" w:eastAsia="Arial" w:hAnsi="Arial"/>
-          <w:sz w:val="22"/>
-          <w:szCs w:val="22"/>
-        </w:rPr>
-        <w:t xml:space="preserve">), digite </w:t>
-      </w:r>
-      <w:r>
-        <w:rPr>
-          <w:rFonts w:ascii="Consolas" w:cs="Consolas" w:eastAsia="Consolas" w:hAnsi="Consolas"/>
-          <w:sz w:val="22"/>
-          <w:szCs w:val="22"/>
-        </w:rPr>
-        <w:t xml:space="preserve">/aft-setup</w:t>
-      </w:r>
-      <w:r>
-        <w:rPr>
-          <w:rFonts w:ascii="Arial" w:cs="Arial" w:eastAsia="Arial" w:hAnsi="Arial"/>
-          <w:sz w:val="22"/>
-          <w:szCs w:val="22"/>
-        </w:rPr>
-        <w:t xml:space="preserve">.</w:t>
+        <w:t xml:space="preserve">de verdade</w:t>
+      </w:r>
+      <w:r>
+        <w:rPr>
+          <w:rFonts w:ascii="Arial" w:cs="Arial" w:eastAsia="Arial" w:hAnsi="Arial"/>
+          <w:sz w:val="22"/>
+          <w:szCs w:val="22"/>
+        </w:rPr>
+        <w:t xml:space="preserve">: ele continua rodando na bandeja do sistema (ícones perto do relógio). Clique com o botão direito no ícone do Claude na bandeja e escolha </w:t>
+      </w:r>
+      <w:r>
+        <w:rPr>
+          <w:rFonts w:ascii="Arial" w:cs="Arial" w:eastAsia="Arial" w:hAnsi="Arial"/>
+          <w:b/>
+          <w:bCs/>
+          <w:sz w:val="22"/>
+          <w:szCs w:val="22"/>
+        </w:rPr>
+        <w:t xml:space="preserve">Sair</w:t>
+      </w:r>
+      <w:r>
+        <w:rPr>
+          <w:rFonts w:ascii="Arial" w:cs="Arial" w:eastAsia="Arial" w:hAnsi="Arial"/>
+          <w:sz w:val="22"/>
+          <w:szCs w:val="22"/>
+        </w:rPr>
+        <w:t xml:space="preserve"> — fechar só a janela no X não basta.</w:t>
+      </w:r>
+    </w:p>
+    <w:p>
+      <w:pPr>
+        <w:pStyle w:val="ListParagraph"/>
+        <w:numPr>
+          <w:ilvl w:val="0"/>
+          <w:numId w:val="4"/>
+        </w:numPr>
+        <w:spacing w:after="80"/>
+      </w:pPr>
+      <w:r>
+        <w:rPr>
+          <w:rFonts w:ascii="Arial" w:cs="Arial" w:eastAsia="Arial" w:hAnsi="Arial"/>
+          <w:sz w:val="22"/>
+          <w:szCs w:val="22"/>
+        </w:rPr>
+        <w:t xml:space="preserve">Abra o aplicativo de novo.</w:t>
       </w:r>
     </w:p>
     <w:p>
@@ -703,10 +517,28 @@
       <w:r>
         <w:rPr>
           <w:rFonts w:ascii="Arial" w:cs="Arial" w:eastAsia="Arial" w:hAnsi="Arial"/>
-          <w:sz w:val="22"/>
-          <w:szCs w:val="22"/>
-        </w:rPr>
-        <w:t xml:space="preserve">A skill de configuração cria a sua pasta de trabalho (Documentos\AFT), pergunta seu nome, CIF e os dados da sua UORG (código, município, CEP), e instala as bibliotecas Python necessárias. Esses dados entram automaticamente em todos os arquivos do Sistema Auditor dali em diante — você nunca mais digita.</w:t>
+          <w:b/>
+          <w:bCs/>
+          <w:sz w:val="22"/>
+          <w:szCs w:val="22"/>
+        </w:rPr>
+        <w:t xml:space="preserve">Para que serve o Git? </w:t>
+      </w:r>
+      <w:r>
+        <w:rPr>
+          <w:rFonts w:ascii="Arial" w:cs="Arial" w:eastAsia="Arial" w:hAnsi="Arial"/>
+          <w:sz w:val="22"/>
+          <w:szCs w:val="22"/>
+        </w:rPr>
+        <w:t xml:space="preserve">Nada de programação — é a ferramenta que baixa o toolkit e busca as atualizações futuras (o “downloader”), e traz o Git Bash, o ambiente de terminal que o Claude Code usa no Windows.</w:t>
+      </w:r>
+    </w:p>
+    <w:p>
+      <w:pPr>
+        <w:pStyle w:val="Heading2"/>
+      </w:pPr>
+      <w:r>
+        <w:t xml:space="preserve">2.3 Passo 3 — Deixe o Claude instalar o resto</w:t>
       </w:r>
     </w:p>
     <w:p>
@@ -717,20 +549,28 @@
       <w:r>
         <w:rPr>
           <w:rFonts w:ascii="Arial" w:cs="Arial" w:eastAsia="Arial" w:hAnsi="Arial"/>
+          <w:sz w:val="22"/>
+          <w:szCs w:val="22"/>
+        </w:rPr>
+        <w:t xml:space="preserve">Abra a interface de código (botão </w:t>
+      </w:r>
+      <w:r>
+        <w:rPr>
+          <w:rFonts w:ascii="Arial" w:cs="Arial" w:eastAsia="Arial" w:hAnsi="Arial"/>
           <w:b/>
           <w:bCs/>
           <w:sz w:val="22"/>
           <w:szCs w:val="22"/>
         </w:rPr>
-        <w:t xml:space="preserve">Dica para o dia a dia: </w:t>
-      </w:r>
-      <w:r>
-        <w:rPr>
-          <w:rFonts w:ascii="Arial" w:cs="Arial" w:eastAsia="Arial" w:hAnsi="Arial"/>
-          <w:sz w:val="22"/>
-          <w:szCs w:val="22"/>
-        </w:rPr>
-        <w:t xml:space="preserve">a partir daqui, ao abrir conversas novas, escolha </w:t>
+        <w:t xml:space="preserve">&lt;/&gt; Code</w:t>
+      </w:r>
+      <w:r>
+        <w:rPr>
+          <w:rFonts w:ascii="Arial" w:cs="Arial" w:eastAsia="Arial" w:hAnsi="Arial"/>
+          <w:sz w:val="22"/>
+          <w:szCs w:val="22"/>
+        </w:rPr>
+        <w:t xml:space="preserve">) e inicie uma conversa nova. O Claude pede para você </w:t>
       </w:r>
       <w:r>
         <w:rPr>
@@ -740,23 +580,33 @@
           <w:sz w:val="22"/>
           <w:szCs w:val="22"/>
         </w:rPr>
-        <w:t xml:space="preserve">Documentos\AFT</w:t>
-      </w:r>
-      <w:r>
-        <w:rPr>
-          <w:rFonts w:ascii="Arial" w:cs="Arial" w:eastAsia="Arial" w:hAnsi="Arial"/>
-          <w:sz w:val="22"/>
-          <w:szCs w:val="22"/>
-        </w:rPr>
-        <w:t xml:space="preserve"> como pasta da sessão.</w:t>
-      </w:r>
-    </w:p>
-    <w:p>
-      <w:pPr>
-        <w:pStyle w:val="Heading2"/>
-      </w:pPr>
-      <w:r>
-        <w:t xml:space="preserve">2.4 Ative o NotebookLM (recomendado)</w:t>
+        <w:t xml:space="preserve">escolher uma pasta para a sessão</w:t>
+      </w:r>
+      <w:r>
+        <w:rPr>
+          <w:rFonts w:ascii="Arial" w:cs="Arial" w:eastAsia="Arial" w:hAnsi="Arial"/>
+          <w:sz w:val="22"/>
+          <w:szCs w:val="22"/>
+        </w:rPr>
+        <w:t xml:space="preserve"> (é a pasta do computador em que ele vai trabalhar). Escolha a pasta </w:t>
+      </w:r>
+      <w:r>
+        <w:rPr>
+          <w:rFonts w:ascii="Arial" w:cs="Arial" w:eastAsia="Arial" w:hAnsi="Arial"/>
+          <w:b/>
+          <w:bCs/>
+          <w:sz w:val="22"/>
+          <w:szCs w:val="22"/>
+        </w:rPr>
+        <w:t xml:space="preserve">Documentos</w:t>
+      </w:r>
+      <w:r>
+        <w:rPr>
+          <w:rFonts w:ascii="Arial" w:cs="Arial" w:eastAsia="Arial" w:hAnsi="Arial"/>
+          <w:sz w:val="22"/>
+          <w:szCs w:val="22"/>
+        </w:rPr>
+        <w:t xml:space="preserve"> (C:\Users\seu-nome\Documents). Depois da instalação, quando a pasta Documentos\AFT existir, prefira escolhê-la nas conversas do dia a dia — é onde ficam as suas fiscalizações.</w:t>
       </w:r>
     </w:p>
     <w:p>
@@ -770,7 +620,146 @@
           <w:sz w:val="22"/>
           <w:szCs w:val="22"/>
         </w:rPr>
-        <w:t xml:space="preserve">Com o NotebookLM ativo, as skills encontram o código da ementa sozinhas, consultando ementários e NRs organizados em notebooks compartilhados.</w:t>
+        <w:t xml:space="preserve">O Claude Code é um assistente que executa comandos no seu computador (sempre pedindo a sua permissão antes). Então, em vez de você instalar programa por programa, cole a mensagem abaixo na conversa e aperte Enter:</w:t>
+      </w:r>
+    </w:p>
+    <w:p>
+      <w:pPr>
+        <w:shd w:fill="F2F2F2" w:val="clear"/>
+        <w:spacing w:after="120"/>
+        <w:ind w:left="360"/>
+      </w:pPr>
+      <w:r>
+        <w:rPr>
+          <w:rFonts w:ascii="Consolas" w:cs="Consolas" w:eastAsia="Consolas" w:hAnsi="Consolas"/>
+          <w:sz w:val="20"/>
+          <w:szCs w:val="20"/>
+        </w:rPr>
+        <w:t xml:space="preserve">Prepare este computador para o AFT Toolkit. Faça nesta ordem, me explicando cada passo:</w:t>
+      </w:r>
+    </w:p>
+    <w:p>
+      <w:pPr>
+        <w:shd w:fill="F2F2F2" w:val="clear"/>
+        <w:spacing w:after="120"/>
+        <w:ind w:left="360"/>
+      </w:pPr>
+      <w:r>
+        <w:rPr>
+          <w:rFonts w:ascii="Consolas" w:cs="Consolas" w:eastAsia="Consolas" w:hAnsi="Consolas"/>
+          <w:sz w:val="20"/>
+          <w:szCs w:val="20"/>
+        </w:rPr>
+        <w:t xml:space="preserve">1. Confirme que o Git está instalado e funcionando (git --version).</w:t>
+      </w:r>
+    </w:p>
+    <w:p>
+      <w:pPr>
+        <w:shd w:fill="F2F2F2" w:val="clear"/>
+        <w:spacing w:after="120"/>
+        <w:ind w:left="360"/>
+      </w:pPr>
+      <w:r>
+        <w:rPr>
+          <w:rFonts w:ascii="Consolas" w:cs="Consolas" w:eastAsia="Consolas" w:hAnsi="Consolas"/>
+          <w:sz w:val="20"/>
+          <w:szCs w:val="20"/>
+        </w:rPr>
+        <w:t xml:space="preserve">2. Verifique se o Python 3 está instalado e funcionando no terminal; se não, instale com winget (pacote Python.Python.3.12).</w:t>
+      </w:r>
+    </w:p>
+    <w:p>
+      <w:pPr>
+        <w:shd w:fill="F2F2F2" w:val="clear"/>
+        <w:spacing w:after="120"/>
+        <w:ind w:left="360"/>
+      </w:pPr>
+      <w:r>
+        <w:rPr>
+          <w:rFonts w:ascii="Consolas" w:cs="Consolas" w:eastAsia="Consolas" w:hAnsi="Consolas"/>
+          <w:sz w:val="20"/>
+          <w:szCs w:val="20"/>
+        </w:rPr>
+        <w:t xml:space="preserve">3. Baixe o repositório https://github.com/ryckardo42/aft-toolkit.git para a pasta de skills do Claude Code (~/.claude/skills/aft-toolkit) usando git clone.</w:t>
+      </w:r>
+    </w:p>
+    <w:p>
+      <w:pPr>
+        <w:shd w:fill="F2F2F2" w:val="clear"/>
+        <w:spacing w:after="120"/>
+        <w:ind w:left="360"/>
+      </w:pPr>
+      <w:r>
+        <w:rPr>
+          <w:rFonts w:ascii="Consolas" w:cs="Consolas" w:eastAsia="Consolas" w:hAnsi="Consolas"/>
+          <w:sz w:val="20"/>
+          <w:szCs w:val="20"/>
+        </w:rPr>
+        <w:t xml:space="preserve">4. Confirme que a pasta foi criada, liste as skills instaladas e me diga se preciso reiniciar o aplicativo.</w:t>
+      </w:r>
+    </w:p>
+    <w:p>
+      <w:pPr>
+        <w:spacing w:after="120"/>
+        <w:jc w:val="both"/>
+      </w:pPr>
+      <w:r>
+        <w:rPr>
+          <w:rFonts w:ascii="Arial" w:cs="Arial" w:eastAsia="Arial" w:hAnsi="Arial"/>
+          <w:sz w:val="22"/>
+          <w:szCs w:val="22"/>
+        </w:rPr>
+        <w:t xml:space="preserve">Enquanto o Claude trabalha, ele vai pedir permissão para cada comando — basta clicar em “Permitir”. Isso é normal e desejável: nada roda no seu computador sem o seu OK.</w:t>
+      </w:r>
+    </w:p>
+    <w:p>
+      <w:pPr>
+        <w:spacing w:after="120"/>
+        <w:jc w:val="both"/>
+      </w:pPr>
+      <w:r>
+        <w:rPr>
+          <w:rFonts w:ascii="Arial" w:cs="Arial" w:eastAsia="Arial" w:hAnsi="Arial"/>
+          <w:b/>
+          <w:bCs/>
+          <w:sz w:val="22"/>
+          <w:szCs w:val="22"/>
+        </w:rPr>
+        <w:t xml:space="preserve">O que ele está instalando? </w:t>
+      </w:r>
+      <w:r>
+        <w:rPr>
+          <w:rFonts w:ascii="Arial" w:cs="Arial" w:eastAsia="Arial" w:hAnsi="Arial"/>
+          <w:sz w:val="22"/>
+          <w:szCs w:val="22"/>
+        </w:rPr>
+        <w:t xml:space="preserve">O </w:t>
+      </w:r>
+      <w:r>
+        <w:rPr>
+          <w:rFonts w:ascii="Arial" w:cs="Arial" w:eastAsia="Arial" w:hAnsi="Arial"/>
+          <w:b/>
+          <w:bCs/>
+          <w:sz w:val="22"/>
+          <w:szCs w:val="22"/>
+        </w:rPr>
+        <w:t xml:space="preserve">Python</w:t>
+      </w:r>
+      <w:r>
+        <w:rPr>
+          <w:rFonts w:ascii="Arial" w:cs="Arial" w:eastAsia="Arial" w:hAnsi="Arial"/>
+          <w:sz w:val="22"/>
+          <w:szCs w:val="22"/>
+        </w:rPr>
+        <w:t xml:space="preserve"> roda os scripts locais do toolkit: conversão de fotos em PDF, geração do arquivo do Sistema Auditor e validação de arquivos de ponto.</w:t>
+      </w:r>
+    </w:p>
+    <w:p>
+      <w:pPr>
+        <w:pStyle w:val="Heading2"/>
+      </w:pPr>
+      <w:r>
+        <w:t xml:space="preserve">2.4 Passo 4 — Reinicie e configure com /aft-setup</w:t>
       </w:r>
     </w:p>
     <w:p>
@@ -788,9 +777,157 @@
           <w:sz w:val="22"/>
           <w:szCs w:val="22"/>
         </w:rPr>
+        <w:t xml:space="preserve">Feche e reabra o aplicativo Claude (para ele reconhecer as skills novas e o Git).</w:t>
+      </w:r>
+    </w:p>
+    <w:p>
+      <w:pPr>
+        <w:pStyle w:val="ListParagraph"/>
+        <w:numPr>
+          <w:ilvl w:val="0"/>
+          <w:numId w:val="5"/>
+        </w:numPr>
+        <w:spacing w:after="80"/>
+      </w:pPr>
+      <w:r>
+        <w:rPr>
+          <w:rFonts w:ascii="Arial" w:cs="Arial" w:eastAsia="Arial" w:hAnsi="Arial"/>
+          <w:sz w:val="22"/>
+          <w:szCs w:val="22"/>
+        </w:rPr>
+        <w:t xml:space="preserve">Numa conversa nova do &lt;/&gt; Code (pasta da sessão: </w:t>
+      </w:r>
+      <w:r>
+        <w:rPr>
+          <w:rFonts w:ascii="Arial" w:cs="Arial" w:eastAsia="Arial" w:hAnsi="Arial"/>
+          <w:b/>
+          <w:bCs/>
+          <w:sz w:val="22"/>
+          <w:szCs w:val="22"/>
+        </w:rPr>
+        <w:t xml:space="preserve">Documentos</w:t>
+      </w:r>
+      <w:r>
+        <w:rPr>
+          <w:rFonts w:ascii="Arial" w:cs="Arial" w:eastAsia="Arial" w:hAnsi="Arial"/>
+          <w:sz w:val="22"/>
+          <w:szCs w:val="22"/>
+        </w:rPr>
+        <w:t xml:space="preserve">), digite </w:t>
+      </w:r>
+      <w:r>
+        <w:rPr>
+          <w:rFonts w:ascii="Consolas" w:cs="Consolas" w:eastAsia="Consolas" w:hAnsi="Consolas"/>
+          <w:sz w:val="22"/>
+          <w:szCs w:val="22"/>
+        </w:rPr>
+        <w:t xml:space="preserve">/aft-setup</w:t>
+      </w:r>
+      <w:r>
+        <w:rPr>
+          <w:rFonts w:ascii="Arial" w:cs="Arial" w:eastAsia="Arial" w:hAnsi="Arial"/>
+          <w:sz w:val="22"/>
+          <w:szCs w:val="22"/>
+        </w:rPr>
+        <w:t xml:space="preserve">.</w:t>
+      </w:r>
+    </w:p>
+    <w:p>
+      <w:pPr>
+        <w:spacing w:after="120"/>
+        <w:jc w:val="both"/>
+      </w:pPr>
+      <w:r>
+        <w:rPr>
+          <w:rFonts w:ascii="Arial" w:cs="Arial" w:eastAsia="Arial" w:hAnsi="Arial"/>
+          <w:sz w:val="22"/>
+          <w:szCs w:val="22"/>
+        </w:rPr>
+        <w:t xml:space="preserve">A skill de configuração cria a sua pasta de trabalho (Documentos\AFT), pergunta seu nome, CIF e os dados da sua UORG (código, município, CEP), e instala as bibliotecas Python necessárias. Esses dados entram automaticamente em todos os arquivos do Sistema Auditor dali em diante — você nunca mais digita.</w:t>
+      </w:r>
+    </w:p>
+    <w:p>
+      <w:pPr>
+        <w:spacing w:after="120"/>
+        <w:jc w:val="both"/>
+      </w:pPr>
+      <w:r>
+        <w:rPr>
+          <w:rFonts w:ascii="Arial" w:cs="Arial" w:eastAsia="Arial" w:hAnsi="Arial"/>
+          <w:b/>
+          <w:bCs/>
+          <w:sz w:val="22"/>
+          <w:szCs w:val="22"/>
+        </w:rPr>
+        <w:t xml:space="preserve">Dica para o dia a dia: </w:t>
+      </w:r>
+      <w:r>
+        <w:rPr>
+          <w:rFonts w:ascii="Arial" w:cs="Arial" w:eastAsia="Arial" w:hAnsi="Arial"/>
+          <w:sz w:val="22"/>
+          <w:szCs w:val="22"/>
+        </w:rPr>
+        <w:t xml:space="preserve">a partir daqui, ao abrir conversas novas, escolha </w:t>
+      </w:r>
+      <w:r>
+        <w:rPr>
+          <w:rFonts w:ascii="Arial" w:cs="Arial" w:eastAsia="Arial" w:hAnsi="Arial"/>
+          <w:b/>
+          <w:bCs/>
+          <w:sz w:val="22"/>
+          <w:szCs w:val="22"/>
+        </w:rPr>
+        <w:t xml:space="preserve">Documentos\AFT</w:t>
+      </w:r>
+      <w:r>
+        <w:rPr>
+          <w:rFonts w:ascii="Arial" w:cs="Arial" w:eastAsia="Arial" w:hAnsi="Arial"/>
+          <w:sz w:val="22"/>
+          <w:szCs w:val="22"/>
+        </w:rPr>
+        <w:t xml:space="preserve"> como pasta da sessão.</w:t>
+      </w:r>
+    </w:p>
+    <w:p>
+      <w:pPr>
+        <w:pStyle w:val="Heading2"/>
+      </w:pPr>
+      <w:r>
+        <w:t xml:space="preserve">2.5 Ative o NotebookLM (recomendado)</w:t>
+      </w:r>
+    </w:p>
+    <w:p>
+      <w:pPr>
+        <w:spacing w:after="120"/>
+        <w:jc w:val="both"/>
+      </w:pPr>
+      <w:r>
+        <w:rPr>
+          <w:rFonts w:ascii="Arial" w:cs="Arial" w:eastAsia="Arial" w:hAnsi="Arial"/>
+          <w:sz w:val="22"/>
+          <w:szCs w:val="22"/>
+        </w:rPr>
+        <w:t xml:space="preserve">Com o NotebookLM ativo, as skills encontram o código da ementa sozinhas, consultando ementários e NRs organizados em notebooks compartilhados.</w:t>
+      </w:r>
+    </w:p>
+    <w:p>
+      <w:pPr>
+        <w:pStyle w:val="ListParagraph"/>
+        <w:numPr>
+          <w:ilvl w:val="0"/>
+          <w:numId w:val="6"/>
+        </w:numPr>
+        <w:spacing w:after="80"/>
+      </w:pPr>
+      <w:r>
+        <w:rPr>
+          <w:rFonts w:ascii="Arial" w:cs="Arial" w:eastAsia="Arial" w:hAnsi="Arial"/>
+          <w:sz w:val="22"/>
+          <w:szCs w:val="22"/>
+        </w:rPr>
         <w:t xml:space="preserve">Entre em </w:t>
       </w:r>
-      <w:hyperlink w:history="1" r:id="rIdlpl_q2qw3i1pcn7bdhjxh">
+      <w:hyperlink w:history="1" r:id="rIdemfc51-mfpyu1zpjacb_k">
         <w:r>
           <w:rPr>
             <w:rStyle w:val="Hyperlink"/>
@@ -815,7 +952,7 @@
         <w:pStyle w:val="ListParagraph"/>
         <w:numPr>
           <w:ilvl w:val="0"/>
-          <w:numId w:val="5"/>
+          <w:numId w:val="6"/>
         </w:numPr>
         <w:spacing w:after="80"/>
       </w:pPr>
@@ -833,7 +970,7 @@
         <w:pStyle w:val="ListParagraph"/>
         <w:numPr>
           <w:ilvl w:val="0"/>
-          <w:numId w:val="5"/>
+          <w:numId w:val="6"/>
         </w:numPr>
         <w:spacing w:after="80"/>
       </w:pPr>
@@ -865,7 +1002,7 @@
         <w:pStyle w:val="Heading2"/>
       </w:pPr>
       <w:r>
-        <w:t xml:space="preserve">2.5 Como receber atualizações</w:t>
+        <w:t xml:space="preserve">2.6 Como receber atualizações</w:t>
       </w:r>
     </w:p>
     <w:p>
@@ -916,7 +1053,7 @@
         <w:pStyle w:val="Heading2"/>
       </w:pPr>
       <w:r>
-        <w:t xml:space="preserve">2.6 Plano B — instalação manual</w:t>
+        <w:t xml:space="preserve">2.7 Plano B — instalação manual</w:t>
       </w:r>
     </w:p>
     <w:p>
@@ -930,7 +1067,7 @@
           <w:sz w:val="22"/>
           <w:szCs w:val="22"/>
         </w:rPr>
-        <w:t xml:space="preserve">Se algo der errado no Passo 2 (ex.: computador sem o winget, rede corporativa bloqueando), instale manualmente e repita o restante:</w:t>
+        <w:t xml:space="preserve">Se algo der errado no Passo 3 (ex.: computador sem o winget, rede corporativa bloqueando), instale manualmente e repita o restante:</w:t>
       </w:r>
     </w:p>
     <w:p>
@@ -950,7 +1087,7 @@
           <w:sz w:val="22"/>
           <w:szCs w:val="22"/>
         </w:rPr>
-        <w:t xml:space="preserve">Git: </w:t>
+        <w:t xml:space="preserve">Python: </w:t>
       </w:r>
       <w:r>
         <w:rPr>
@@ -960,54 +1097,7 @@
         </w:rPr>
         <w:t xml:space="preserve">baixe em </w:t>
       </w:r>
-      <w:hyperlink w:history="1" r:id="rId6mq0sl-awj2mdkrjli1tu">
-        <w:r>
-          <w:rPr>
-            <w:rStyle w:val="Hyperlink"/>
-            <w:rFonts w:ascii="Arial" w:cs="Arial" w:eastAsia="Arial" w:hAnsi="Arial"/>
-            <w:sz w:val="22"/>
-            <w:szCs w:val="22"/>
-          </w:rPr>
-          <w:t xml:space="preserve">git-scm.com/download/win</w:t>
-        </w:r>
-      </w:hyperlink>
-      <w:r>
-        <w:rPr>
-          <w:rFonts w:ascii="Arial" w:cs="Arial" w:eastAsia="Arial" w:hAnsi="Arial"/>
-          <w:sz w:val="22"/>
-          <w:szCs w:val="22"/>
-        </w:rPr>
-        <w:t xml:space="preserve"> e instale com as opções padrão (clicar “Next” até o fim).</w:t>
-      </w:r>
-    </w:p>
-    <w:p>
-      <w:pPr>
-        <w:pStyle w:val="ListParagraph"/>
-        <w:numPr>
-          <w:ilvl w:val="0"/>
-          <w:numId w:val="2"/>
-        </w:numPr>
-        <w:spacing w:after="80"/>
-      </w:pPr>
-      <w:r>
-        <w:rPr>
-          <w:rFonts w:ascii="Arial" w:cs="Arial" w:eastAsia="Arial" w:hAnsi="Arial"/>
-          <w:b/>
-          <w:bCs/>
-          <w:sz w:val="22"/>
-          <w:szCs w:val="22"/>
-        </w:rPr>
-        <w:t xml:space="preserve">Python: </w:t>
-      </w:r>
-      <w:r>
-        <w:rPr>
-          <w:rFonts w:ascii="Arial" w:cs="Arial" w:eastAsia="Arial" w:hAnsi="Arial"/>
-          <w:sz w:val="22"/>
-          <w:szCs w:val="22"/>
-        </w:rPr>
-        <w:t xml:space="preserve">baixe em </w:t>
-      </w:r>
-      <w:hyperlink w:history="1" r:id="rIdnyqexqzvhw95ohcvwilkb">
+      <w:hyperlink w:history="1" r:id="rIdgvc3ew109zsjirb2akcw_">
         <w:r>
           <w:rPr>
             <w:rStyle w:val="Hyperlink"/>
@@ -2379,7 +2469,7 @@
         <w:pStyle w:val="ListParagraph"/>
         <w:numPr>
           <w:ilvl w:val="0"/>
-          <w:numId w:val="6"/>
+          <w:numId w:val="7"/>
         </w:numPr>
         <w:spacing w:after="80"/>
       </w:pPr>
@@ -2408,172 +2498,6 @@
           <w:szCs w:val="22"/>
         </w:rPr>
         <w:t xml:space="preserve"> (arquivo .depara na pasta da OS) que associa um código a cada dado real: [[TRAB_01]] para o nome, [[CPF_01]] para o CPF, [[AUTUADA]] para a razão social.</w:t>
-      </w:r>
-    </w:p>
-    <w:p>
-      <w:pPr>
-        <w:pStyle w:val="ListParagraph"/>
-        <w:numPr>
-          <w:ilvl w:val="0"/>
-          <w:numId w:val="6"/>
-        </w:numPr>
-        <w:spacing w:after="80"/>
-      </w:pPr>
-      <w:r>
-        <w:rPr>
-          <w:rFonts w:ascii="Arial" w:cs="Arial" w:eastAsia="Arial" w:hAnsi="Arial"/>
-          <w:sz w:val="22"/>
-          <w:szCs w:val="22"/>
-        </w:rPr>
-        <w:t xml:space="preserve">Dali em diante, os textos dos autos e os ecos no chat usam </w:t>
-      </w:r>
-      <w:r>
-        <w:rPr>
-          <w:rFonts w:ascii="Arial" w:cs="Arial" w:eastAsia="Arial" w:hAnsi="Arial"/>
-          <w:b/>
-          <w:bCs/>
-          <w:sz w:val="22"/>
-          <w:szCs w:val="22"/>
-        </w:rPr>
-        <w:t xml:space="preserve">apenas os códigos</w:t>
-      </w:r>
-      <w:r>
-        <w:rPr>
-          <w:rFonts w:ascii="Arial" w:cs="Arial" w:eastAsia="Arial" w:hAnsi="Arial"/>
-          <w:sz w:val="22"/>
-          <w:szCs w:val="22"/>
-        </w:rPr>
-        <w:t xml:space="preserve">. É assim que o texto circula durante a redação e revisão.</w:t>
-      </w:r>
-    </w:p>
-    <w:p>
-      <w:pPr>
-        <w:pStyle w:val="ListParagraph"/>
-        <w:numPr>
-          <w:ilvl w:val="0"/>
-          <w:numId w:val="6"/>
-        </w:numPr>
-        <w:spacing w:after="80"/>
-      </w:pPr>
-      <w:r>
-        <w:rPr>
-          <w:rFonts w:ascii="Arial" w:cs="Arial" w:eastAsia="Arial" w:hAnsi="Arial"/>
-          <w:sz w:val="22"/>
-          <w:szCs w:val="22"/>
-        </w:rPr>
-        <w:t xml:space="preserve">Na hora de gerar o TXT do Sistema Auditor, um </w:t>
-      </w:r>
-      <w:r>
-        <w:rPr>
-          <w:rFonts w:ascii="Arial" w:cs="Arial" w:eastAsia="Arial" w:hAnsi="Arial"/>
-          <w:b/>
-          <w:bCs/>
-          <w:sz w:val="22"/>
-          <w:szCs w:val="22"/>
-        </w:rPr>
-        <w:t xml:space="preserve">script Python local (rehydrate.py)</w:t>
-      </w:r>
-      <w:r>
-        <w:rPr>
-          <w:rFonts w:ascii="Arial" w:cs="Arial" w:eastAsia="Arial" w:hAnsi="Arial"/>
-          <w:sz w:val="22"/>
-          <w:szCs w:val="22"/>
-        </w:rPr>
-        <w:t xml:space="preserve"> substitui os códigos pelos dados reais, por correspondência exata. A IA nunca digita um CPF no documento final — quem o faz é o script, que confere o formato e aborta se algo estiver errado. Num documento legal, um nome ou CPF trocado é inaceitável; por isso essa etapa não é feita pelo modelo.</w:t>
-      </w:r>
-    </w:p>
-    <w:p>
-      <w:pPr>
-        <w:pStyle w:val="ListParagraph"/>
-        <w:numPr>
-          <w:ilvl w:val="0"/>
-          <w:numId w:val="6"/>
-        </w:numPr>
-        <w:spacing w:after="80"/>
-      </w:pPr>
-      <w:r>
-        <w:rPr>
-          <w:rFonts w:ascii="Arial" w:cs="Arial" w:eastAsia="Arial" w:hAnsi="Arial"/>
-          <w:sz w:val="22"/>
-          <w:szCs w:val="22"/>
-        </w:rPr>
-        <w:t xml:space="preserve">Ficam na pasta da lavratura: o </w:t>
-      </w:r>
-      <w:r>
-        <w:rPr>
-          <w:rFonts w:ascii="Arial" w:cs="Arial" w:eastAsia="Arial" w:hAnsi="Arial"/>
-          <w:b/>
-          <w:bCs/>
-          <w:sz w:val="22"/>
-          <w:szCs w:val="22"/>
-        </w:rPr>
-        <w:t xml:space="preserve">TXT real</w:t>
-      </w:r>
-      <w:r>
-        <w:rPr>
-          <w:rFonts w:ascii="Arial" w:cs="Arial" w:eastAsia="Arial" w:hAnsi="Arial"/>
-          <w:sz w:val="22"/>
-          <w:szCs w:val="22"/>
-        </w:rPr>
-        <w:t xml:space="preserve"> (para importar), a </w:t>
-      </w:r>
-      <w:r>
-        <w:rPr>
-          <w:rFonts w:ascii="Arial" w:cs="Arial" w:eastAsia="Arial" w:hAnsi="Arial"/>
-          <w:b/>
-          <w:bCs/>
-          <w:sz w:val="22"/>
-          <w:szCs w:val="22"/>
-        </w:rPr>
-        <w:t xml:space="preserve">cópia tokenizada</w:t>
-      </w:r>
-      <w:r>
-        <w:rPr>
-          <w:rFonts w:ascii="Arial" w:cs="Arial" w:eastAsia="Arial" w:hAnsi="Arial"/>
-          <w:sz w:val="22"/>
-          <w:szCs w:val="22"/>
-        </w:rPr>
-        <w:t xml:space="preserve"> (segura para compartilhar com colegas) e o </w:t>
-      </w:r>
-      <w:r>
-        <w:rPr>
-          <w:rFonts w:ascii="Arial" w:cs="Arial" w:eastAsia="Arial" w:hAnsi="Arial"/>
-          <w:b/>
-          <w:bCs/>
-          <w:sz w:val="22"/>
-          <w:szCs w:val="22"/>
-        </w:rPr>
-        <w:t xml:space="preserve">mapa de-para</w:t>
-      </w:r>
-      <w:r>
-        <w:rPr>
-          <w:rFonts w:ascii="Arial" w:cs="Arial" w:eastAsia="Arial" w:hAnsi="Arial"/>
-          <w:sz w:val="22"/>
-          <w:szCs w:val="22"/>
-        </w:rPr>
-        <w:t xml:space="preserve"> (sensível — nunca compartilhe).</w:t>
-      </w:r>
-    </w:p>
-    <w:p>
-      <w:pPr>
-        <w:spacing w:after="120"/>
-        <w:jc w:val="both"/>
-      </w:pPr>
-      <w:r>
-        <w:rPr>
-          <w:rFonts w:ascii="Arial" w:cs="Arial" w:eastAsia="Arial" w:hAnsi="Arial"/>
-          <w:sz w:val="22"/>
-          <w:szCs w:val="22"/>
-        </w:rPr>
-        <w:t xml:space="preserve">O CNPJ da empresa não é tokenizado: ele é a chave que organiza as pastas, os anexos e a importação no Sistema Auditor.</w:t>
-      </w:r>
-    </w:p>
-    <w:p>
-      <w:pPr>
-        <w:pStyle w:val="Heading1"/>
-      </w:pPr>
-      <w:r>
-        <w:t xml:space="preserve">5. Fluxo típico de uma fiscalização</w:t>
       </w:r>
     </w:p>
     <w:p>
@@ -2591,7 +2515,25 @@
           <w:sz w:val="22"/>
           <w:szCs w:val="22"/>
         </w:rPr>
-        <w:t xml:space="preserve">Visita ao estabelecimento.</w:t>
+        <w:t xml:space="preserve">Dali em diante, os textos dos autos e os ecos no chat usam </w:t>
+      </w:r>
+      <w:r>
+        <w:rPr>
+          <w:rFonts w:ascii="Arial" w:cs="Arial" w:eastAsia="Arial" w:hAnsi="Arial"/>
+          <w:b/>
+          <w:bCs/>
+          <w:sz w:val="22"/>
+          <w:szCs w:val="22"/>
+        </w:rPr>
+        <w:t xml:space="preserve">apenas os códigos</w:t>
+      </w:r>
+      <w:r>
+        <w:rPr>
+          <w:rFonts w:ascii="Arial" w:cs="Arial" w:eastAsia="Arial" w:hAnsi="Arial"/>
+          <w:sz w:val="22"/>
+          <w:szCs w:val="22"/>
+        </w:rPr>
+        <w:t xml:space="preserve">. É assim que o texto circula durante a redação e revisão.</w:t>
       </w:r>
     </w:p>
     <w:p>
@@ -2605,19 +2547,29 @@
       </w:pPr>
       <w:r>
         <w:rPr>
-          <w:rFonts w:ascii="Consolas" w:cs="Consolas" w:eastAsia="Consolas" w:hAnsi="Consolas"/>
-          <w:sz w:val="22"/>
-          <w:szCs w:val="22"/>
-        </w:rPr>
-        <w:t xml:space="preserve">/inspecao-fisica</w:t>
-      </w:r>
-      <w:r>
-        <w:rPr>
-          <w:rFonts w:ascii="Arial" w:cs="Arial" w:eastAsia="Arial" w:hAnsi="Arial"/>
-          <w:sz w:val="22"/>
-          <w:szCs w:val="22"/>
-        </w:rPr>
-        <w:t xml:space="preserve"> — você narra (pode ditar por voz no celular e colar) e a skill organiza o relato em tópicos fiéis, salvos na pasta da OS. Você confere antes de salvar.</w:t>
+          <w:rFonts w:ascii="Arial" w:cs="Arial" w:eastAsia="Arial" w:hAnsi="Arial"/>
+          <w:sz w:val="22"/>
+          <w:szCs w:val="22"/>
+        </w:rPr>
+        <w:t xml:space="preserve">Na hora de gerar o TXT do Sistema Auditor, um </w:t>
+      </w:r>
+      <w:r>
+        <w:rPr>
+          <w:rFonts w:ascii="Arial" w:cs="Arial" w:eastAsia="Arial" w:hAnsi="Arial"/>
+          <w:b/>
+          <w:bCs/>
+          <w:sz w:val="22"/>
+          <w:szCs w:val="22"/>
+        </w:rPr>
+        <w:t xml:space="preserve">script Python local (rehydrate.py)</w:t>
+      </w:r>
+      <w:r>
+        <w:rPr>
+          <w:rFonts w:ascii="Arial" w:cs="Arial" w:eastAsia="Arial" w:hAnsi="Arial"/>
+          <w:sz w:val="22"/>
+          <w:szCs w:val="22"/>
+        </w:rPr>
+        <w:t xml:space="preserve"> substitui os códigos pelos dados reais, por correspondência exata. A IA nunca digita um CPF no documento final — quem o faz é o script, que confere o formato e aborta se algo estiver errado. Num documento legal, um nome ou CPF trocado é inaceitável; por isso essa etapa não é feita pelo modelo.</w:t>
       </w:r>
     </w:p>
     <w:p>
@@ -2631,19 +2583,87 @@
       </w:pPr>
       <w:r>
         <w:rPr>
-          <w:rFonts w:ascii="Consolas" w:cs="Consolas" w:eastAsia="Consolas" w:hAnsi="Consolas"/>
-          <w:sz w:val="22"/>
-          <w:szCs w:val="22"/>
-        </w:rPr>
-        <w:t xml:space="preserve">/inspecao-inicial</w:t>
-      </w:r>
-      <w:r>
-        <w:rPr>
-          <w:rFonts w:ascii="Arial" w:cs="Arial" w:eastAsia="Arial" w:hAnsi="Arial"/>
-          <w:sz w:val="22"/>
-          <w:szCs w:val="22"/>
-        </w:rPr>
-        <w:t xml:space="preserve"> — a skill enquadra cada achado (NR, item, ementa), confirma com você e redige os autos. Se houver trabalhador sem registro, chama /registro; se houver risco grave e iminente, chama /aft-rt-rgi; o PGR entregue vai para /PGR-analise.</w:t>
+          <w:rFonts w:ascii="Arial" w:cs="Arial" w:eastAsia="Arial" w:hAnsi="Arial"/>
+          <w:sz w:val="22"/>
+          <w:szCs w:val="22"/>
+        </w:rPr>
+        <w:t xml:space="preserve">Ficam na pasta da lavratura: o </w:t>
+      </w:r>
+      <w:r>
+        <w:rPr>
+          <w:rFonts w:ascii="Arial" w:cs="Arial" w:eastAsia="Arial" w:hAnsi="Arial"/>
+          <w:b/>
+          <w:bCs/>
+          <w:sz w:val="22"/>
+          <w:szCs w:val="22"/>
+        </w:rPr>
+        <w:t xml:space="preserve">TXT real</w:t>
+      </w:r>
+      <w:r>
+        <w:rPr>
+          <w:rFonts w:ascii="Arial" w:cs="Arial" w:eastAsia="Arial" w:hAnsi="Arial"/>
+          <w:sz w:val="22"/>
+          <w:szCs w:val="22"/>
+        </w:rPr>
+        <w:t xml:space="preserve"> (para importar), a </w:t>
+      </w:r>
+      <w:r>
+        <w:rPr>
+          <w:rFonts w:ascii="Arial" w:cs="Arial" w:eastAsia="Arial" w:hAnsi="Arial"/>
+          <w:b/>
+          <w:bCs/>
+          <w:sz w:val="22"/>
+          <w:szCs w:val="22"/>
+        </w:rPr>
+        <w:t xml:space="preserve">cópia tokenizada</w:t>
+      </w:r>
+      <w:r>
+        <w:rPr>
+          <w:rFonts w:ascii="Arial" w:cs="Arial" w:eastAsia="Arial" w:hAnsi="Arial"/>
+          <w:sz w:val="22"/>
+          <w:szCs w:val="22"/>
+        </w:rPr>
+        <w:t xml:space="preserve"> (segura para compartilhar com colegas) e o </w:t>
+      </w:r>
+      <w:r>
+        <w:rPr>
+          <w:rFonts w:ascii="Arial" w:cs="Arial" w:eastAsia="Arial" w:hAnsi="Arial"/>
+          <w:b/>
+          <w:bCs/>
+          <w:sz w:val="22"/>
+          <w:szCs w:val="22"/>
+        </w:rPr>
+        <w:t xml:space="preserve">mapa de-para</w:t>
+      </w:r>
+      <w:r>
+        <w:rPr>
+          <w:rFonts w:ascii="Arial" w:cs="Arial" w:eastAsia="Arial" w:hAnsi="Arial"/>
+          <w:sz w:val="22"/>
+          <w:szCs w:val="22"/>
+        </w:rPr>
+        <w:t xml:space="preserve"> (sensível — nunca compartilhe).</w:t>
+      </w:r>
+    </w:p>
+    <w:p>
+      <w:pPr>
+        <w:spacing w:after="120"/>
+        <w:jc w:val="both"/>
+      </w:pPr>
+      <w:r>
+        <w:rPr>
+          <w:rFonts w:ascii="Arial" w:cs="Arial" w:eastAsia="Arial" w:hAnsi="Arial"/>
+          <w:sz w:val="22"/>
+          <w:szCs w:val="22"/>
+        </w:rPr>
+        <w:t xml:space="preserve">O CNPJ da empresa não é tokenizado: ele é a chave que organiza as pastas, os anexos e a importação no Sistema Auditor.</w:t>
+      </w:r>
+    </w:p>
+    <w:p>
+      <w:pPr>
+        <w:pStyle w:val="Heading1"/>
+      </w:pPr>
+      <w:r>
+        <w:t xml:space="preserve">5. Fluxo típico de uma fiscalização</w:t>
       </w:r>
     </w:p>
     <w:p>
@@ -2651,25 +2671,17 @@
         <w:pStyle w:val="ListParagraph"/>
         <w:numPr>
           <w:ilvl w:val="0"/>
-          <w:numId w:val="7"/>
+          <w:numId w:val="8"/>
         </w:numPr>
         <w:spacing w:after="80"/>
       </w:pPr>
       <w:r>
         <w:rPr>
-          <w:rFonts w:ascii="Consolas" w:cs="Consolas" w:eastAsia="Consolas" w:hAnsi="Consolas"/>
-          <w:sz w:val="22"/>
-          <w:szCs w:val="22"/>
-        </w:rPr>
-        <w:t xml:space="preserve">/gera-ai</w:t>
-      </w:r>
-      <w:r>
-        <w:rPr>
-          <w:rFonts w:ascii="Arial" w:cs="Arial" w:eastAsia="Arial" w:hAnsi="Arial"/>
-          <w:sz w:val="22"/>
-          <w:szCs w:val="22"/>
-        </w:rPr>
-        <w:t xml:space="preserve"> — empacota tudo no TXT importável, com as fotos de evidência convertidas em PDF e nomeadas na convenção do Sistema Auditor.</w:t>
+          <w:rFonts w:ascii="Arial" w:cs="Arial" w:eastAsia="Arial" w:hAnsi="Arial"/>
+          <w:sz w:val="22"/>
+          <w:szCs w:val="22"/>
+        </w:rPr>
+        <w:t xml:space="preserve">Visita ao estabelecimento.</w:t>
       </w:r>
     </w:p>
     <w:p>
@@ -2677,35 +2689,25 @@
         <w:pStyle w:val="ListParagraph"/>
         <w:numPr>
           <w:ilvl w:val="0"/>
-          <w:numId w:val="7"/>
+          <w:numId w:val="8"/>
         </w:numPr>
         <w:spacing w:after="80"/>
       </w:pPr>
       <w:r>
         <w:rPr>
-          <w:rFonts w:ascii="Arial" w:cs="Arial" w:eastAsia="Arial" w:hAnsi="Arial"/>
-          <w:sz w:val="22"/>
-          <w:szCs w:val="22"/>
-        </w:rPr>
-        <w:t xml:space="preserve">No </w:t>
-      </w:r>
-      <w:r>
-        <w:rPr>
-          <w:rFonts w:ascii="Arial" w:cs="Arial" w:eastAsia="Arial" w:hAnsi="Arial"/>
-          <w:b/>
-          <w:bCs/>
-          <w:sz w:val="22"/>
-          <w:szCs w:val="22"/>
-        </w:rPr>
-        <w:t xml:space="preserve">Sistema Auditor</w:t>
-      </w:r>
-      <w:r>
-        <w:rPr>
-          <w:rFonts w:ascii="Arial" w:cs="Arial" w:eastAsia="Arial" w:hAnsi="Arial"/>
-          <w:sz w:val="22"/>
-          <w:szCs w:val="22"/>
-        </w:rPr>
-        <w:t xml:space="preserve">: botão “imp. txt”, conferência pela lupa, revisão final e transmissão.</w:t>
+          <w:rFonts w:ascii="Consolas" w:cs="Consolas" w:eastAsia="Consolas" w:hAnsi="Consolas"/>
+          <w:sz w:val="22"/>
+          <w:szCs w:val="22"/>
+        </w:rPr>
+        <w:t xml:space="preserve">/inspecao-fisica</w:t>
+      </w:r>
+      <w:r>
+        <w:rPr>
+          <w:rFonts w:ascii="Arial" w:cs="Arial" w:eastAsia="Arial" w:hAnsi="Arial"/>
+          <w:sz w:val="22"/>
+          <w:szCs w:val="22"/>
+        </w:rPr>
+        <w:t xml:space="preserve"> — você narra (pode ditar por voz no celular e colar) e a skill organiza o relato em tópicos fiéis, salvos na pasta da OS. Você confere antes de salvar.</w:t>
       </w:r>
     </w:p>
     <w:p>
@@ -2713,7 +2715,95 @@
         <w:pStyle w:val="ListParagraph"/>
         <w:numPr>
           <w:ilvl w:val="0"/>
-          <w:numId w:val="7"/>
+          <w:numId w:val="8"/>
+        </w:numPr>
+        <w:spacing w:after="80"/>
+      </w:pPr>
+      <w:r>
+        <w:rPr>
+          <w:rFonts w:ascii="Consolas" w:cs="Consolas" w:eastAsia="Consolas" w:hAnsi="Consolas"/>
+          <w:sz w:val="22"/>
+          <w:szCs w:val="22"/>
+        </w:rPr>
+        <w:t xml:space="preserve">/inspecao-inicial</w:t>
+      </w:r>
+      <w:r>
+        <w:rPr>
+          <w:rFonts w:ascii="Arial" w:cs="Arial" w:eastAsia="Arial" w:hAnsi="Arial"/>
+          <w:sz w:val="22"/>
+          <w:szCs w:val="22"/>
+        </w:rPr>
+        <w:t xml:space="preserve"> — a skill enquadra cada achado (NR, item, ementa), confirma com você e redige os autos. Se houver trabalhador sem registro, chama /registro; se houver risco grave e iminente, chama /aft-rt-rgi; o PGR entregue vai para /PGR-analise.</w:t>
+      </w:r>
+    </w:p>
+    <w:p>
+      <w:pPr>
+        <w:pStyle w:val="ListParagraph"/>
+        <w:numPr>
+          <w:ilvl w:val="0"/>
+          <w:numId w:val="8"/>
+        </w:numPr>
+        <w:spacing w:after="80"/>
+      </w:pPr>
+      <w:r>
+        <w:rPr>
+          <w:rFonts w:ascii="Consolas" w:cs="Consolas" w:eastAsia="Consolas" w:hAnsi="Consolas"/>
+          <w:sz w:val="22"/>
+          <w:szCs w:val="22"/>
+        </w:rPr>
+        <w:t xml:space="preserve">/gera-ai</w:t>
+      </w:r>
+      <w:r>
+        <w:rPr>
+          <w:rFonts w:ascii="Arial" w:cs="Arial" w:eastAsia="Arial" w:hAnsi="Arial"/>
+          <w:sz w:val="22"/>
+          <w:szCs w:val="22"/>
+        </w:rPr>
+        <w:t xml:space="preserve"> — empacota tudo no TXT importável, com as fotos de evidência convertidas em PDF e nomeadas na convenção do Sistema Auditor.</w:t>
+      </w:r>
+    </w:p>
+    <w:p>
+      <w:pPr>
+        <w:pStyle w:val="ListParagraph"/>
+        <w:numPr>
+          <w:ilvl w:val="0"/>
+          <w:numId w:val="8"/>
+        </w:numPr>
+        <w:spacing w:after="80"/>
+      </w:pPr>
+      <w:r>
+        <w:rPr>
+          <w:rFonts w:ascii="Arial" w:cs="Arial" w:eastAsia="Arial" w:hAnsi="Arial"/>
+          <w:sz w:val="22"/>
+          <w:szCs w:val="22"/>
+        </w:rPr>
+        <w:t xml:space="preserve">No </w:t>
+      </w:r>
+      <w:r>
+        <w:rPr>
+          <w:rFonts w:ascii="Arial" w:cs="Arial" w:eastAsia="Arial" w:hAnsi="Arial"/>
+          <w:b/>
+          <w:bCs/>
+          <w:sz w:val="22"/>
+          <w:szCs w:val="22"/>
+        </w:rPr>
+        <w:t xml:space="preserve">Sistema Auditor</w:t>
+      </w:r>
+      <w:r>
+        <w:rPr>
+          <w:rFonts w:ascii="Arial" w:cs="Arial" w:eastAsia="Arial" w:hAnsi="Arial"/>
+          <w:sz w:val="22"/>
+          <w:szCs w:val="22"/>
+        </w:rPr>
+        <w:t xml:space="preserve">: botão “imp. txt”, conferência pela lupa, revisão final e transmissão.</w:t>
+      </w:r>
+    </w:p>
+    <w:p>
+      <w:pPr>
+        <w:pStyle w:val="ListParagraph"/>
+        <w:numPr>
+          <w:ilvl w:val="0"/>
+          <w:numId w:val="8"/>
         </w:numPr>
         <w:spacing w:after="80"/>
       </w:pPr>
@@ -3208,7 +3298,7 @@
                 <w:sz w:val="22"/>
                 <w:szCs w:val="22"/>
               </w:rPr>
-              <w:t xml:space="preserve">Git ou Python “não encontrado”</w:t>
+              <w:t xml:space="preserve">“Git is required for local sessions”</w:t>
             </w:r>
           </w:p>
         </w:tc>
@@ -3239,7 +3329,7 @@
                 <w:sz w:val="22"/>
                 <w:szCs w:val="22"/>
               </w:rPr>
-              <w:t xml:space="preserve">Peça ao Claude: “instale o Git e o Python com winget”. Se a rede bloquear, use o plano B manual (seção 2.6) e reinicie o aplicativo.</w:t>
+              <w:t xml:space="preserve">Instale o Git (seção 2.2) e feche o aplicativo de verdade: botão direito no ícone do Claude na bandeja (perto do relógio) → Sair; reabra. Se persistir, reinicie o computador.</w:t>
             </w:r>
           </w:p>
         </w:tc>
@@ -3272,7 +3362,7 @@
                 <w:sz w:val="22"/>
                 <w:szCs w:val="22"/>
               </w:rPr>
-              <w:t xml:space="preserve">A skill não aparece ao digitar /</w:t>
+              <w:t xml:space="preserve">Python “não encontrado”</w:t>
             </w:r>
           </w:p>
         </w:tc>
@@ -3303,7 +3393,7 @@
                 <w:sz w:val="22"/>
                 <w:szCs w:val="22"/>
               </w:rPr>
-              <w:t xml:space="preserve">Feche e reabra o Claude Code; peça a ele: “confirme se a pasta ~/.claude/skills/aft-toolkit existe”.</w:t>
+              <w:t xml:space="preserve">Peça ao Claude: “instale o Python com winget”. Se a rede bloquear, use o plano B manual (seção 2.7) e reinicie o aplicativo.</w:t>
             </w:r>
           </w:p>
         </w:tc>
@@ -3336,7 +3426,7 @@
                 <w:sz w:val="22"/>
                 <w:szCs w:val="22"/>
               </w:rPr>
-              <w:t xml:space="preserve">notebooklm: command not found</w:t>
+              <w:t xml:space="preserve">A skill não aparece ao digitar /</w:t>
             </w:r>
           </w:p>
         </w:tc>
@@ -3367,7 +3457,7 @@
                 <w:sz w:val="22"/>
                 <w:szCs w:val="22"/>
               </w:rPr>
-              <w:t xml:space="preserve">Peça ao Claude: “instale o notebooklm-py com pip”.</w:t>
+              <w:t xml:space="preserve">Feche e reabra o Claude Code; peça a ele: “confirme se a pasta ~/.claude/skills/aft-toolkit existe”.</w:t>
             </w:r>
           </w:p>
         </w:tc>
@@ -3400,7 +3490,7 @@
                 <w:sz w:val="22"/>
                 <w:szCs w:val="22"/>
               </w:rPr>
-              <w:t xml:space="preserve">NotebookLM responde “sem acesso”</w:t>
+              <w:t xml:space="preserve">notebooklm: command not found</w:t>
             </w:r>
           </w:p>
         </w:tc>
@@ -3431,7 +3521,7 @@
                 <w:sz w:val="22"/>
                 <w:szCs w:val="22"/>
               </w:rPr>
-              <w:t xml:space="preserve">Solicite acesso em notebooks-aft.vercel.app e aguarde a liberação.</w:t>
+              <w:t xml:space="preserve">Peça ao Claude: “instale o notebooklm-py com pip”.</w:t>
             </w:r>
           </w:p>
         </w:tc>
@@ -3464,7 +3554,7 @@
                 <w:sz w:val="22"/>
                 <w:szCs w:val="22"/>
               </w:rPr>
-              <w:t xml:space="preserve">Foto HEIC (iPhone) não converte</w:t>
+              <w:t xml:space="preserve">NotebookLM responde “sem acesso”</w:t>
             </w:r>
           </w:p>
         </w:tc>
@@ -3495,7 +3585,7 @@
                 <w:sz w:val="22"/>
                 <w:szCs w:val="22"/>
               </w:rPr>
-              <w:t xml:space="preserve">Peça ao Claude: “instale o pillow-heif” (ou converta a foto para JPG).</w:t>
+              <w:t xml:space="preserve">Solicite acesso em notebooks-aft.vercel.app e aguarde a liberação.</w:t>
             </w:r>
           </w:p>
         </w:tc>
@@ -3528,6 +3618,70 @@
                 <w:sz w:val="22"/>
                 <w:szCs w:val="22"/>
               </w:rPr>
+              <w:t xml:space="preserve">Foto HEIC (iPhone) não converte</w:t>
+            </w:r>
+          </w:p>
+        </w:tc>
+        <w:tc>
+          <w:tcPr>
+            <w:tcW w:type="dxa" w:w="5860"/>
+            <w:tcBorders>
+              <w:top w:val="single" w:color="BFBFBF" w:sz="1"/>
+              <w:left w:val="single" w:color="BFBFBF" w:sz="1"/>
+              <w:bottom w:val="single" w:color="BFBFBF" w:sz="1"/>
+              <w:right w:val="single" w:color="BFBFBF" w:sz="1"/>
+            </w:tcBorders>
+            <w:tcMar>
+              <w:top w:type="dxa" w:w="80"/>
+              <w:left w:type="dxa" w:w="120"/>
+              <w:bottom w:type="dxa" w:w="80"/>
+              <w:right w:type="dxa" w:w="120"/>
+            </w:tcMar>
+          </w:tcPr>
+          <w:p>
+            <w:pPr>
+              <w:spacing w:after="0"/>
+              <w:jc w:val="left"/>
+            </w:pPr>
+            <w:r>
+              <w:rPr>
+                <w:rFonts w:ascii="Arial" w:cs="Arial" w:eastAsia="Arial" w:hAnsi="Arial"/>
+                <w:sz w:val="22"/>
+                <w:szCs w:val="22"/>
+              </w:rPr>
+              <w:t xml:space="preserve">Peça ao Claude: “instale o pillow-heif” (ou converta a foto para JPG).</w:t>
+            </w:r>
+          </w:p>
+        </w:tc>
+      </w:tr>
+      <w:tr>
+        <w:tc>
+          <w:tcPr>
+            <w:tcW w:type="dxa" w:w="3500"/>
+            <w:tcBorders>
+              <w:top w:val="single" w:color="BFBFBF" w:sz="1"/>
+              <w:left w:val="single" w:color="BFBFBF" w:sz="1"/>
+              <w:bottom w:val="single" w:color="BFBFBF" w:sz="1"/>
+              <w:right w:val="single" w:color="BFBFBF" w:sz="1"/>
+            </w:tcBorders>
+            <w:tcMar>
+              <w:top w:type="dxa" w:w="80"/>
+              <w:left w:type="dxa" w:w="120"/>
+              <w:bottom w:type="dxa" w:w="80"/>
+              <w:right w:type="dxa" w:w="120"/>
+            </w:tcMar>
+          </w:tcPr>
+          <w:p>
+            <w:pPr>
+              <w:spacing w:after="0"/>
+              <w:jc w:val="left"/>
+            </w:pPr>
+            <w:r>
+              <w:rPr>
+                <w:rFonts w:ascii="Arial" w:cs="Arial" w:eastAsia="Arial" w:hAnsi="Arial"/>
+                <w:sz w:val="22"/>
+                <w:szCs w:val="22"/>
+              </w:rPr>
               <w:t xml:space="preserve">Sistema Auditor não acha o anexo</w:t>
             </w:r>
           </w:p>
@@ -3609,7 +3763,7 @@
         </w:rPr>
         <w:t xml:space="preserve"> — ou abra uma Issue em </w:t>
       </w:r>
-      <w:hyperlink w:history="1" r:id="rId-s8vgts9qxvwz3sqatb9i">
+      <w:hyperlink w:history="1" r:id="rIdl1auebna3djs6oswczb9c">
         <w:r>
           <w:rPr>
             <w:rStyle w:val="Hyperlink"/>
@@ -3941,6 +4095,18 @@
       </w:pPr>
     </w:lvl>
   </w:abstractNum>
+  <w:abstractNum w:abstractNumId="8" w15:restartNumberingAfterBreak="0">
+    <w:multiLevelType w:val="hybridMultilevel"/>
+    <w:lvl w:ilvl="0" w15:tentative="1">
+      <w:start w:val="1"/>
+      <w:numFmt w:val="decimal"/>
+      <w:lvlText w:val="%1."/>
+      <w:lvlJc w:val="left"/>
+      <w:pPr>
+        <w:ind w:left="720" w:hanging="360"/>
+      </w:pPr>
+    </w:lvl>
+  </w:abstractNum>
   <w:num w:numId="1">
     <w:abstractNumId w:val="1"/>
     <w:lvlOverride w:ilvl="0">
@@ -3960,25 +4126,31 @@
     </w:lvlOverride>
   </w:num>
   <w:num w:numId="4">
-    <w:abstractNumId w:val="5"/>
+    <w:abstractNumId w:val="4"/>
     <w:lvlOverride w:ilvl="0">
       <w:startOverride w:val="1"/>
     </w:lvlOverride>
   </w:num>
   <w:num w:numId="5">
+    <w:abstractNumId w:val="6"/>
+    <w:lvlOverride w:ilvl="0">
+      <w:startOverride w:val="1"/>
+    </w:lvlOverride>
+  </w:num>
+  <w:num w:numId="6">
+    <w:abstractNumId w:val="8"/>
+    <w:lvlOverride w:ilvl="0">
+      <w:startOverride w:val="1"/>
+    </w:lvlOverride>
+  </w:num>
+  <w:num w:numId="7">
     <w:abstractNumId w:val="7"/>
     <w:lvlOverride w:ilvl="0">
       <w:startOverride w:val="1"/>
     </w:lvlOverride>
   </w:num>
-  <w:num w:numId="6">
-    <w:abstractNumId w:val="6"/>
-    <w:lvlOverride w:ilvl="0">
-      <w:startOverride w:val="1"/>
-    </w:lvlOverride>
-  </w:num>
-  <w:num w:numId="7">
-    <w:abstractNumId w:val="4"/>
+  <w:num w:numId="8">
+    <w:abstractNumId w:val="5"/>
     <w:lvlOverride w:ilvl="0">
       <w:startOverride w:val="1"/>
     </w:lvlOverride>

</xml_diff>

<commit_message>
Corrige descoberta das skills: repo passa a ser a própria pasta ~/.claude/skills
Teste real no Windows: o Claude Code só descobre skills pessoais no
primeiro nível de ~/.claude/skills — o clone aninhado em
skills/aft-toolkit/<skill> deixava todas invisíveis.
- Instalação agora clona o repo direto como ~/.claude/skills
  (fallback: clonar em pasta temporária e mover o conteúdo)
- Todos os caminhos internos das skills perderam o nível aft-toolkit/
- Apostila, COMO-INSTALAR e README atualizados, com troubleshooting
  para quem instalou no layout antigo

Co-Authored-By: Claude Fable 5 <noreply@anthropic.com>
</commit_message>
<xml_diff>
--- a/Apostila-AFT-Toolkit.docx
+++ b/Apostila-AFT-Toolkit.docx
@@ -322,7 +322,7 @@
         </w:rPr>
         <w:t xml:space="preserve">Baixe o aplicativo para Windows em </w:t>
       </w:r>
-      <w:hyperlink w:history="1" r:id="rIdskgyuwszedf_pnrtiizgm">
+      <w:hyperlink w:history="1" r:id="rIdu1jpgw_a1fyc12ic02ywr">
         <w:r>
           <w:rPr>
             <w:rStyle w:val="Hyperlink"/>
@@ -417,7 +417,7 @@
         </w:rPr>
         <w:t xml:space="preserve">Baixe em </w:t>
       </w:r>
-      <w:hyperlink w:history="1" r:id="rIdxzfamkubo8m7a8ymxxl5d">
+      <w:hyperlink w:history="1" r:id="rIdaz3wyqcfx4g_mwgf7kosa">
         <w:r>
           <w:rPr>
             <w:rStyle w:val="Hyperlink"/>
@@ -680,7 +680,7 @@
           <w:sz w:val="20"/>
           <w:szCs w:val="20"/>
         </w:rPr>
-        <w:t xml:space="preserve">3. Baixe o repositório https://github.com/ryckardo42/aft-toolkit.git para a pasta de skills do Claude Code (~/.claude/skills/aft-toolkit) usando git clone.</w:t>
+        <w:t xml:space="preserve">3. Baixe o repositório https://github.com/ryckardo42/aft-toolkit.git fazendo dele a própria pasta de skills: git clone https://github.com/ryckardo42/aft-toolkit.git ~/.claude/skills. Se a pasta ~/.claude/skills já existir com conteúdo, clone numa pasta temporária e mova todo o conteúdo do repositório (incluindo a pasta oculta .git) para dentro dela.</w:t>
       </w:r>
     </w:p>
     <w:p>
@@ -695,7 +695,7 @@
           <w:sz w:val="20"/>
           <w:szCs w:val="20"/>
         </w:rPr>
-        <w:t xml:space="preserve">4. Confirme que a pasta foi criada, liste as skills instaladas e me diga se preciso reiniciar o aplicativo.</w:t>
+        <w:t xml:space="preserve">4. Confirme que as skills ficaram diretamente em ~/.claude/skills (deve existir, por exemplo, ~/.claude/skills/aft-setup/SKILL.md), liste-as e me diga se preciso reiniciar o aplicativo.</w:t>
       </w:r>
     </w:p>
     <w:p>
@@ -927,7 +927,7 @@
         </w:rPr>
         <w:t xml:space="preserve">Entre em </w:t>
       </w:r>
-      <w:hyperlink w:history="1" r:id="rIdemfc51-mfpyu1zpjacb_k">
+      <w:hyperlink w:history="1" r:id="rIdqayscykll7btifgnc0vhp">
         <w:r>
           <w:rPr>
             <w:rStyle w:val="Hyperlink"/>
@@ -1097,7 +1097,7 @@
         </w:rPr>
         <w:t xml:space="preserve">baixe em </w:t>
       </w:r>
-      <w:hyperlink w:history="1" r:id="rIdgvc3ew109zsjirb2akcw_">
+      <w:hyperlink w:history="1" r:id="rIdyerp_vgu5elvl-2qxyygd">
         <w:r>
           <w:rPr>
             <w:rStyle w:val="Hyperlink"/>
@@ -1168,7 +1168,15 @@
           <w:sz w:val="22"/>
           <w:szCs w:val="22"/>
         </w:rPr>
-        <w:t xml:space="preserve">git clone https://github.com/ryckardo42/aft-toolkit.git ~/.claude/skills/aft-toolkit</w:t>
+        <w:t xml:space="preserve">git clone https://github.com/ryckardo42/aft-toolkit.git ~/.claude/skills</w:t>
+      </w:r>
+      <w:r>
+        <w:rPr>
+          <w:rFonts w:ascii="Arial" w:cs="Arial" w:eastAsia="Arial" w:hAnsi="Arial"/>
+          <w:sz w:val="22"/>
+          <w:szCs w:val="22"/>
+        </w:rPr>
+        <w:t xml:space="preserve"> (as skills precisam ficar diretamente dentro de ~/.claude/skills, ex.: ~/.claude/skills/aft-setup).</w:t>
       </w:r>
     </w:p>
     <w:p>
@@ -3457,7 +3465,7 @@
                 <w:sz w:val="22"/>
                 <w:szCs w:val="22"/>
               </w:rPr>
-              <w:t xml:space="preserve">Feche e reabra o Claude Code; peça a ele: “confirme se a pasta ~/.claude/skills/aft-toolkit existe”.</w:t>
+              <w:t xml:space="preserve">Feche e reabra o Claude Code. Se persistir, peça a ele: “as skills estão diretamente em ~/.claude/skills (ex.: ~/.claude/skills/aft-setup)? Se estiverem dentro de uma subpasta aft-toolkit, mova todo o conteúdo um nível acima”.</w:t>
             </w:r>
           </w:p>
         </w:tc>
@@ -3763,7 +3771,7 @@
         </w:rPr>
         <w:t xml:space="preserve"> — ou abra uma Issue em </w:t>
       </w:r>
-      <w:hyperlink w:history="1" r:id="rIdl1auebna3djs6oswczb9c">
+      <w:hyperlink w:history="1" r:id="rIdanlfvl-w6ek6dofaocgvd">
         <w:r>
           <w:rPr>
             <w:rStyle w:val="Hyperlink"/>

</xml_diff>

<commit_message>
aft-setup: resolve a UORG pela cidade (AFT não precisa saber o código)
- config/uorgs.csv: tabela oficial de UORGs (1012 unidades, UTF-8 limpo,
  ;-delimitado) convertida da planilha do MTE
- Passo 3 do /aft-setup: pede só nome+CIF+lotação; busca a cidade/nome
  na tabela (com e sem acento), lista candidatos para o AFT escolher
  (desambigua Superintendência/Gerência/Agência) e preenche código de
  9 dígitos, bairro, CEP, município e UF automaticamente; fallback p/
  código manual quando a unidade não está na tabela
- README e apostila atualizados

Co-Authored-By: Claude Fable 5 <noreply@anthropic.com>
</commit_message>
<xml_diff>
--- a/Apostila-AFT-Toolkit.docx
+++ b/Apostila-AFT-Toolkit.docx
@@ -322,7 +322,7 @@
         </w:rPr>
         <w:t xml:space="preserve">Baixe o aplicativo para Windows em </w:t>
       </w:r>
-      <w:hyperlink w:history="1" r:id="rIdu1jpgw_a1fyc12ic02ywr">
+      <w:hyperlink w:history="1" r:id="rIdry_hjldyejabywqhetppr">
         <w:r>
           <w:rPr>
             <w:rStyle w:val="Hyperlink"/>
@@ -417,7 +417,7 @@
         </w:rPr>
         <w:t xml:space="preserve">Baixe em </w:t>
       </w:r>
-      <w:hyperlink w:history="1" r:id="rIdaz3wyqcfx4g_mwgf7kosa">
+      <w:hyperlink w:history="1" r:id="rIddmnbhrd8ijye4exg-vx-o">
         <w:r>
           <w:rPr>
             <w:rStyle w:val="Hyperlink"/>
@@ -843,7 +843,31 @@
           <w:sz w:val="22"/>
           <w:szCs w:val="22"/>
         </w:rPr>
-        <w:t xml:space="preserve">A skill de configuração cria a sua pasta de trabalho (Documentos\AFT), pergunta seu nome, CIF e os dados da sua UORG (código, município, CEP), e instala as bibliotecas Python necessárias. Esses dados entram automaticamente em todos os arquivos do Sistema Auditor dali em diante — você nunca mais digita.</w:t>
+        <w:t xml:space="preserve">A skill de configuração cria a sua pasta de trabalho (Documentos\AFT), pergunta seu nome, sua CIF e a sua lotação, e instala as bibliotecas Python necessárias. Esses dados entram automaticamente em todos os arquivos do Sistema Auditor dali em diante — você nunca mais digita.</w:t>
+      </w:r>
+    </w:p>
+    <w:p>
+      <w:pPr>
+        <w:spacing w:after="120"/>
+        <w:jc w:val="both"/>
+      </w:pPr>
+      <w:r>
+        <w:rPr>
+          <w:rFonts w:ascii="Arial" w:cs="Arial" w:eastAsia="Arial" w:hAnsi="Arial"/>
+          <w:b/>
+          <w:bCs/>
+          <w:sz w:val="22"/>
+          <w:szCs w:val="22"/>
+        </w:rPr>
+        <w:t xml:space="preserve">Você não precisa saber o código da sua unidade. </w:t>
+      </w:r>
+      <w:r>
+        <w:rPr>
+          <w:rFonts w:ascii="Arial" w:cs="Arial" w:eastAsia="Arial" w:hAnsi="Arial"/>
+          <w:sz w:val="22"/>
+          <w:szCs w:val="22"/>
+        </w:rPr>
+        <w:t xml:space="preserve">Basta dizer a cidade (ex.: “Anápolis”) ou o nome da unidade: o toolkit traz a tabela oficial das UORGs do país e descobre sozinho o código de 9 dígitos, o município e o CEP. Como pode haver mais de uma unidade na mesma cidade (Superintendência, Gerência, Agência), o Claude lista as opções e você só escolhe a sua.</w:t>
       </w:r>
     </w:p>
     <w:p>
@@ -927,7 +951,7 @@
         </w:rPr>
         <w:t xml:space="preserve">Entre em </w:t>
       </w:r>
-      <w:hyperlink w:history="1" r:id="rIdqayscykll7btifgnc0vhp">
+      <w:hyperlink w:history="1" r:id="rIdqkgpaeoejpg2ng00zpi2b">
         <w:r>
           <w:rPr>
             <w:rStyle w:val="Hyperlink"/>
@@ -1097,7 +1121,7 @@
         </w:rPr>
         <w:t xml:space="preserve">baixe em </w:t>
       </w:r>
-      <w:hyperlink w:history="1" r:id="rIdyerp_vgu5elvl-2qxyygd">
+      <w:hyperlink w:history="1" r:id="rIdfhkk-c-kfysqk5tc7wgbf">
         <w:r>
           <w:rPr>
             <w:rStyle w:val="Hyperlink"/>
@@ -3771,7 +3795,7 @@
         </w:rPr>
         <w:t xml:space="preserve"> — ou abra uma Issue em </w:t>
       </w:r>
-      <w:hyperlink w:history="1" r:id="rIdanlfvl-w6ek6dofaocgvd">
+      <w:hyperlink w:history="1" r:id="rId4pa1eq_bexkd23gbabl1h">
         <w:r>
           <w:rPr>
             <w:rStyle w:val="Hyperlink"/>

</xml_diff>

<commit_message>
Porta a skill /autos-lavrados para o toolkit (Windows)
- Lê os PDFs lavrados em C:\SistemasAFT\Auditor\Docs\AutosDeInfracao\PRO
  (caminho padrão Windows; aceita override por 3o argumento ou env)
- Extração de PDF via pypdf (puro Python, instalado pelo /aft-setup);
  usa pdftotext/poppler automaticamente se estiver no PATH (fidelidade maior)
- Parser dos autos idêntico ao original (mesmo Sistema Auditor)
- memory.md simplificado do toolkit: edita ## Autos lavrados marcando
  [x] lavrado / [ ] pendente, sem validador/compressor do ecossistema
- /aft-setup passa a instalar pypdf; README e apostila atualizados
- Aviso de calibração: extrator pypdf nao testado contra PDF real do
  Sistema Auditor — primeira execução deve ser conferida

Co-Authored-By: Claude Fable 5 <noreply@anthropic.com>
</commit_message>
<xml_diff>
--- a/Apostila-AFT-Toolkit.docx
+++ b/Apostila-AFT-Toolkit.docx
@@ -322,7 +322,7 @@
         </w:rPr>
         <w:t xml:space="preserve">Baixe o aplicativo para Windows em </w:t>
       </w:r>
-      <w:hyperlink w:history="1" r:id="rIdry_hjldyejabywqhetppr">
+      <w:hyperlink w:history="1" r:id="rIdfmjyyfb2a3yaybb9qlu3u">
         <w:r>
           <w:rPr>
             <w:rStyle w:val="Hyperlink"/>
@@ -417,7 +417,7 @@
         </w:rPr>
         <w:t xml:space="preserve">Baixe em </w:t>
       </w:r>
-      <w:hyperlink w:history="1" r:id="rIddmnbhrd8ijye4exg-vx-o">
+      <w:hyperlink w:history="1" r:id="rIduf_7bkrwgmjpo_8wfq9oc">
         <w:r>
           <w:rPr>
             <w:rStyle w:val="Hyperlink"/>
@@ -951,7 +951,7 @@
         </w:rPr>
         <w:t xml:space="preserve">Entre em </w:t>
       </w:r>
-      <w:hyperlink w:history="1" r:id="rIdqkgpaeoejpg2ng00zpi2b">
+      <w:hyperlink w:history="1" r:id="rId_syr6lftbkvfuj3itttwz">
         <w:r>
           <w:rPr>
             <w:rStyle w:val="Hyperlink"/>
@@ -1121,7 +1121,7 @@
         </w:rPr>
         <w:t xml:space="preserve">baixe em </w:t>
       </w:r>
-      <w:hyperlink w:history="1" r:id="rIdfhkk-c-kfysqk5tc7wgbf">
+      <w:hyperlink w:history="1" r:id="rIdk3xq9jgsgyxezh5it41ng">
         <w:r>
           <w:rPr>
             <w:rStyle w:val="Hyperlink"/>
@@ -2248,7 +2248,7 @@
         <w:pStyle w:val="Heading2"/>
       </w:pPr>
       <w:r>
-        <w:t xml:space="preserve">3.4 Empacotamento e relatórios</w:t>
+        <w:t xml:space="preserve">3.4 Empacotamento, rastreamento e relatórios</w:t>
       </w:r>
     </w:p>
     <w:tbl>
@@ -2432,6 +2432,70 @@
                 <w:sz w:val="22"/>
                 <w:szCs w:val="22"/>
               </w:rPr>
+              <w:t xml:space="preserve">/autos-lavrados</w:t>
+            </w:r>
+          </w:p>
+        </w:tc>
+        <w:tc>
+          <w:tcPr>
+            <w:tcW w:type="dxa" w:w="6760"/>
+            <w:tcBorders>
+              <w:top w:val="single" w:color="BFBFBF" w:sz="1"/>
+              <w:left w:val="single" w:color="BFBFBF" w:sz="1"/>
+              <w:bottom w:val="single" w:color="BFBFBF" w:sz="1"/>
+              <w:right w:val="single" w:color="BFBFBF" w:sz="1"/>
+            </w:tcBorders>
+            <w:tcMar>
+              <w:top w:type="dxa" w:w="80"/>
+              <w:left w:type="dxa" w:w="120"/>
+              <w:bottom w:type="dxa" w:w="80"/>
+              <w:right w:type="dxa" w:w="120"/>
+            </w:tcMar>
+          </w:tcPr>
+          <w:p>
+            <w:pPr>
+              <w:spacing w:after="0"/>
+              <w:jc w:val="left"/>
+            </w:pPr>
+            <w:r>
+              <w:rPr>
+                <w:rFonts w:ascii="Arial" w:cs="Arial" w:eastAsia="Arial" w:hAnsi="Arial"/>
+                <w:sz w:val="22"/>
+                <w:szCs w:val="22"/>
+              </w:rPr>
+              <w:t xml:space="preserve">Depois de transmitir, lê os PDFs dos autos já lavrados na pasta do Sistema Auditor (C:\SistemasAFT\...\PRO), cruza com os rascunhos e marca na ficha da empresa o que foi transmitido e o que ainda está pendente. Só lê o Sistema Auditor, nunca altera nada nele.</w:t>
+            </w:r>
+          </w:p>
+        </w:tc>
+      </w:tr>
+      <w:tr>
+        <w:tc>
+          <w:tcPr>
+            <w:tcW w:type="dxa" w:w="2600"/>
+            <w:tcBorders>
+              <w:top w:val="single" w:color="BFBFBF" w:sz="1"/>
+              <w:left w:val="single" w:color="BFBFBF" w:sz="1"/>
+              <w:bottom w:val="single" w:color="BFBFBF" w:sz="1"/>
+              <w:right w:val="single" w:color="BFBFBF" w:sz="1"/>
+            </w:tcBorders>
+            <w:tcMar>
+              <w:top w:type="dxa" w:w="80"/>
+              <w:left w:type="dxa" w:w="120"/>
+              <w:bottom w:type="dxa" w:w="80"/>
+              <w:right w:type="dxa" w:w="120"/>
+            </w:tcMar>
+          </w:tcPr>
+          <w:p>
+            <w:pPr>
+              <w:spacing w:after="0"/>
+              <w:jc w:val="both"/>
+            </w:pPr>
+            <w:r>
+              <w:rPr>
+                <w:rFonts w:ascii="Consolas" w:cs="Consolas" w:eastAsia="Consolas" w:hAnsi="Consolas"/>
+                <w:sz w:val="22"/>
+                <w:szCs w:val="22"/>
+              </w:rPr>
               <w:t xml:space="preserve">/sfitweb-rel</w:t>
             </w:r>
           </w:p>
@@ -2828,6 +2892,32 @@
           <w:szCs w:val="22"/>
         </w:rPr>
         <w:t xml:space="preserve">: botão “imp. txt”, conferência pela lupa, revisão final e transmissão.</w:t>
+      </w:r>
+    </w:p>
+    <w:p>
+      <w:pPr>
+        <w:pStyle w:val="ListParagraph"/>
+        <w:numPr>
+          <w:ilvl w:val="0"/>
+          <w:numId w:val="8"/>
+        </w:numPr>
+        <w:spacing w:after="80"/>
+      </w:pPr>
+      <w:r>
+        <w:rPr>
+          <w:rFonts w:ascii="Consolas" w:cs="Consolas" w:eastAsia="Consolas" w:hAnsi="Consolas"/>
+          <w:sz w:val="22"/>
+          <w:szCs w:val="22"/>
+        </w:rPr>
+        <w:t xml:space="preserve">/autos-lavrados</w:t>
+      </w:r>
+      <w:r>
+        <w:rPr>
+          <w:rFonts w:ascii="Arial" w:cs="Arial" w:eastAsia="Arial" w:hAnsi="Arial"/>
+          <w:sz w:val="22"/>
+          <w:szCs w:val="22"/>
+        </w:rPr>
+        <w:t xml:space="preserve"> — depois de transmitir, confere o que efetivamente foi lavrado e marca na ficha da empresa o que está pendente.</w:t>
       </w:r>
     </w:p>
     <w:p>
@@ -3795,7 +3885,7 @@
         </w:rPr>
         <w:t xml:space="preserve"> — ou abra uma Issue em </w:t>
       </w:r>
-      <w:hyperlink w:history="1" r:id="rId4pa1eq_bexkd23gbabl1h">
+      <w:hyperlink w:history="1" r:id="rIdhgltu-oqmh3893nofayxs">
         <w:r>
           <w:rPr>
             <w:rStyle w:val="Hyperlink"/>

</xml_diff>

<commit_message>
Adiciona painel local (SISOS-lite): skills /nova-os e /painel
v1 sem servidor, tudo local e offline:
- /nova-os: cadastra a auditoria (empregador, CNPJ, município, DET com prazo)
  e cria a pasta + memory.md no esquema padrão — o começo do fluxo
- /painel: _scripts/gerar_painel.py varre os memory.md e gera painel.html
  autocontido (abre por duplo-clique) com contadores e prazos de DET
  coloridos por urgência; só leitura, nunca altera os memory.md
- memory.md padronizado (front-matter leve + ## Notificações DET) em
  /nova-os, gera-ai, inspecao-inicial e det-630; parser do painel é
  tolerante a memory.md antigos
- README, COMO-INSTALAR, aft-setup e apostila atualizados (fluxo passo 0
  = /nova-os, /painel a qualquer momento)

Co-Authored-By: Claude Fable 5 <noreply@anthropic.com>
</commit_message>
<xml_diff>
--- a/Apostila-AFT-Toolkit.docx
+++ b/Apostila-AFT-Toolkit.docx
@@ -322,7 +322,7 @@
         </w:rPr>
         <w:t xml:space="preserve">Baixe o aplicativo para Windows em </w:t>
       </w:r>
-      <w:hyperlink w:history="1" r:id="rIdfmjyyfb2a3yaybb9qlu3u">
+      <w:hyperlink w:history="1" r:id="rIdh-i2d3wzramwdkuhkcnlg">
         <w:r>
           <w:rPr>
             <w:rStyle w:val="Hyperlink"/>
@@ -417,7 +417,7 @@
         </w:rPr>
         <w:t xml:space="preserve">Baixe em </w:t>
       </w:r>
-      <w:hyperlink w:history="1" r:id="rIduf_7bkrwgmjpo_8wfq9oc">
+      <w:hyperlink w:history="1" r:id="rIdddauugae8oanb_h44s0sv">
         <w:r>
           <w:rPr>
             <w:rStyle w:val="Hyperlink"/>
@@ -951,7 +951,7 @@
         </w:rPr>
         <w:t xml:space="preserve">Entre em </w:t>
       </w:r>
-      <w:hyperlink w:history="1" r:id="rId_syr6lftbkvfuj3itttwz">
+      <w:hyperlink w:history="1" r:id="rIdmdp_pvl5bvaj16zutqtfu">
         <w:r>
           <w:rPr>
             <w:rStyle w:val="Hyperlink"/>
@@ -1121,7 +1121,7 @@
         </w:rPr>
         <w:t xml:space="preserve">baixe em </w:t>
       </w:r>
-      <w:hyperlink w:history="1" r:id="rIdk3xq9jgsgyxezh5it41ng">
+      <w:hyperlink w:history="1" r:id="rIdvlrzvgeoaczdcnyst4sw6">
         <w:r>
           <w:rPr>
             <w:rStyle w:val="Hyperlink"/>
@@ -1235,7 +1235,7 @@
         <w:pStyle w:val="Heading2"/>
       </w:pPr>
       <w:r>
-        <w:t xml:space="preserve">3.1 Configuração</w:t>
+        <w:t xml:space="preserve">3.1 Configuração e visão geral</w:t>
       </w:r>
     </w:p>
     <w:tbl>
@@ -1386,7 +1386,135 @@
                 <w:sz w:val="22"/>
                 <w:szCs w:val="22"/>
               </w:rPr>
-              <w:t xml:space="preserve">Configuração inicial: cria as pastas de trabalho, registra seus dados (nome, CIF, UORG) e instala as dependências. Roda uma única vez.</w:t>
+              <w:t xml:space="preserve">Configuração inicial: cria as pastas de trabalho, registra seus dados (nome, CIF, lotação) e instala as dependências. Roda uma única vez.</w:t>
+            </w:r>
+          </w:p>
+        </w:tc>
+      </w:tr>
+      <w:tr>
+        <w:tc>
+          <w:tcPr>
+            <w:tcW w:type="dxa" w:w="2600"/>
+            <w:tcBorders>
+              <w:top w:val="single" w:color="BFBFBF" w:sz="1"/>
+              <w:left w:val="single" w:color="BFBFBF" w:sz="1"/>
+              <w:bottom w:val="single" w:color="BFBFBF" w:sz="1"/>
+              <w:right w:val="single" w:color="BFBFBF" w:sz="1"/>
+            </w:tcBorders>
+            <w:tcMar>
+              <w:top w:type="dxa" w:w="80"/>
+              <w:left w:type="dxa" w:w="120"/>
+              <w:bottom w:type="dxa" w:w="80"/>
+              <w:right w:type="dxa" w:w="120"/>
+            </w:tcMar>
+          </w:tcPr>
+          <w:p>
+            <w:pPr>
+              <w:spacing w:after="0"/>
+              <w:jc w:val="both"/>
+            </w:pPr>
+            <w:r>
+              <w:rPr>
+                <w:rFonts w:ascii="Consolas" w:cs="Consolas" w:eastAsia="Consolas" w:hAnsi="Consolas"/>
+                <w:sz w:val="22"/>
+                <w:szCs w:val="22"/>
+              </w:rPr>
+              <w:t xml:space="preserve">/nova-os</w:t>
+            </w:r>
+          </w:p>
+        </w:tc>
+        <w:tc>
+          <w:tcPr>
+            <w:tcW w:type="dxa" w:w="6760"/>
+            <w:tcBorders>
+              <w:top w:val="single" w:color="BFBFBF" w:sz="1"/>
+              <w:left w:val="single" w:color="BFBFBF" w:sz="1"/>
+              <w:bottom w:val="single" w:color="BFBFBF" w:sz="1"/>
+              <w:right w:val="single" w:color="BFBFBF" w:sz="1"/>
+            </w:tcBorders>
+            <w:tcMar>
+              <w:top w:type="dxa" w:w="80"/>
+              <w:left w:type="dxa" w:w="120"/>
+              <w:bottom w:type="dxa" w:w="80"/>
+              <w:right w:type="dxa" w:w="120"/>
+            </w:tcMar>
+          </w:tcPr>
+          <w:p>
+            <w:pPr>
+              <w:spacing w:after="0"/>
+              <w:jc w:val="left"/>
+            </w:pPr>
+            <w:r>
+              <w:rPr>
+                <w:rFonts w:ascii="Arial" w:cs="Arial" w:eastAsia="Arial" w:hAnsi="Arial"/>
+                <w:sz w:val="22"/>
+                <w:szCs w:val="22"/>
+              </w:rPr>
+              <w:t xml:space="preserve">Cadastra uma auditoria: empregador, CNPJ, município e, se já houver, a notificação do DET com o prazo. É o começo do fluxo — cria a pasta da empresa e a ficha dela.</w:t>
+            </w:r>
+          </w:p>
+        </w:tc>
+      </w:tr>
+      <w:tr>
+        <w:tc>
+          <w:tcPr>
+            <w:tcW w:type="dxa" w:w="2600"/>
+            <w:tcBorders>
+              <w:top w:val="single" w:color="BFBFBF" w:sz="1"/>
+              <w:left w:val="single" w:color="BFBFBF" w:sz="1"/>
+              <w:bottom w:val="single" w:color="BFBFBF" w:sz="1"/>
+              <w:right w:val="single" w:color="BFBFBF" w:sz="1"/>
+            </w:tcBorders>
+            <w:tcMar>
+              <w:top w:type="dxa" w:w="80"/>
+              <w:left w:type="dxa" w:w="120"/>
+              <w:bottom w:type="dxa" w:w="80"/>
+              <w:right w:type="dxa" w:w="120"/>
+            </w:tcMar>
+          </w:tcPr>
+          <w:p>
+            <w:pPr>
+              <w:spacing w:after="0"/>
+              <w:jc w:val="both"/>
+            </w:pPr>
+            <w:r>
+              <w:rPr>
+                <w:rFonts w:ascii="Consolas" w:cs="Consolas" w:eastAsia="Consolas" w:hAnsi="Consolas"/>
+                <w:sz w:val="22"/>
+                <w:szCs w:val="22"/>
+              </w:rPr>
+              <w:t xml:space="preserve">/painel</w:t>
+            </w:r>
+          </w:p>
+        </w:tc>
+        <w:tc>
+          <w:tcPr>
+            <w:tcW w:type="dxa" w:w="6760"/>
+            <w:tcBorders>
+              <w:top w:val="single" w:color="BFBFBF" w:sz="1"/>
+              <w:left w:val="single" w:color="BFBFBF" w:sz="1"/>
+              <w:bottom w:val="single" w:color="BFBFBF" w:sz="1"/>
+              <w:right w:val="single" w:color="BFBFBF" w:sz="1"/>
+            </w:tcBorders>
+            <w:tcMar>
+              <w:top w:type="dxa" w:w="80"/>
+              <w:left w:type="dxa" w:w="120"/>
+              <w:bottom w:type="dxa" w:w="80"/>
+              <w:right w:type="dxa" w:w="120"/>
+            </w:tcMar>
+          </w:tcPr>
+          <w:p>
+            <w:pPr>
+              <w:spacing w:after="0"/>
+              <w:jc w:val="left"/>
+            </w:pPr>
+            <w:r>
+              <w:rPr>
+                <w:rFonts w:ascii="Arial" w:cs="Arial" w:eastAsia="Arial" w:hAnsi="Arial"/>
+                <w:sz w:val="22"/>
+                <w:szCs w:val="22"/>
+              </w:rPr>
+              <w:t xml:space="preserve">Gera um painel (página que abre no navegador) com todas as suas auditorias em andamento e os prazos de DET coloridos por urgência (vencido, vencendo, no prazo). É um “SISOS local”: roda no seu computador, sem internet nem servidor. Só mostra; quem cadastra é o /nova-os.</w:t>
             </w:r>
           </w:p>
         </w:tc>
@@ -2773,11 +2901,35 @@
       </w:pPr>
       <w:r>
         <w:rPr>
-          <w:rFonts w:ascii="Arial" w:cs="Arial" w:eastAsia="Arial" w:hAnsi="Arial"/>
-          <w:sz w:val="22"/>
-          <w:szCs w:val="22"/>
-        </w:rPr>
-        <w:t xml:space="preserve">Visita ao estabelecimento.</w:t>
+          <w:rFonts w:ascii="Consolas" w:cs="Consolas" w:eastAsia="Consolas" w:hAnsi="Consolas"/>
+          <w:sz w:val="22"/>
+          <w:szCs w:val="22"/>
+        </w:rPr>
+        <w:t xml:space="preserve">/nova-os</w:t>
+      </w:r>
+      <w:r>
+        <w:rPr>
+          <w:rFonts w:ascii="Arial" w:cs="Arial" w:eastAsia="Arial" w:hAnsi="Arial"/>
+          <w:sz w:val="22"/>
+          <w:szCs w:val="22"/>
+        </w:rPr>
+        <w:t xml:space="preserve"> — cadastra a empresa e, se já notificou pelo DET, o prazo de entrega. A qualquer momento, </w:t>
+      </w:r>
+      <w:r>
+        <w:rPr>
+          <w:rFonts w:ascii="Consolas" w:cs="Consolas" w:eastAsia="Consolas" w:hAnsi="Consolas"/>
+          <w:sz w:val="22"/>
+          <w:szCs w:val="22"/>
+        </w:rPr>
+        <w:t xml:space="preserve">/painel</w:t>
+      </w:r>
+      <w:r>
+        <w:rPr>
+          <w:rFonts w:ascii="Arial" w:cs="Arial" w:eastAsia="Arial" w:hAnsi="Arial"/>
+          <w:sz w:val="22"/>
+          <w:szCs w:val="22"/>
+        </w:rPr>
+        <w:t xml:space="preserve"> mostra todas as OS e o que está vencendo.</w:t>
       </w:r>
     </w:p>
     <w:p>
@@ -2791,19 +2943,11 @@
       </w:pPr>
       <w:r>
         <w:rPr>
-          <w:rFonts w:ascii="Consolas" w:cs="Consolas" w:eastAsia="Consolas" w:hAnsi="Consolas"/>
-          <w:sz w:val="22"/>
-          <w:szCs w:val="22"/>
-        </w:rPr>
-        <w:t xml:space="preserve">/inspecao-fisica</w:t>
-      </w:r>
-      <w:r>
-        <w:rPr>
-          <w:rFonts w:ascii="Arial" w:cs="Arial" w:eastAsia="Arial" w:hAnsi="Arial"/>
-          <w:sz w:val="22"/>
-          <w:szCs w:val="22"/>
-        </w:rPr>
-        <w:t xml:space="preserve"> — você narra (pode ditar por voz no celular e colar) e a skill organiza o relato em tópicos fiéis, salvos na pasta da OS. Você confere antes de salvar.</w:t>
+          <w:rFonts w:ascii="Arial" w:cs="Arial" w:eastAsia="Arial" w:hAnsi="Arial"/>
+          <w:sz w:val="22"/>
+          <w:szCs w:val="22"/>
+        </w:rPr>
+        <w:t xml:space="preserve">Visita ao estabelecimento.</w:t>
       </w:r>
     </w:p>
     <w:p>
@@ -2821,15 +2965,15 @@
           <w:sz w:val="22"/>
           <w:szCs w:val="22"/>
         </w:rPr>
-        <w:t xml:space="preserve">/inspecao-inicial</w:t>
-      </w:r>
-      <w:r>
-        <w:rPr>
-          <w:rFonts w:ascii="Arial" w:cs="Arial" w:eastAsia="Arial" w:hAnsi="Arial"/>
-          <w:sz w:val="22"/>
-          <w:szCs w:val="22"/>
-        </w:rPr>
-        <w:t xml:space="preserve"> — a skill enquadra cada achado (NR, item, ementa), confirma com você e redige os autos. Se houver trabalhador sem registro, chama /registro; se houver risco grave e iminente, chama /aft-rt-rgi; o PGR entregue vai para /PGR-analise.</w:t>
+        <w:t xml:space="preserve">/inspecao-fisica</w:t>
+      </w:r>
+      <w:r>
+        <w:rPr>
+          <w:rFonts w:ascii="Arial" w:cs="Arial" w:eastAsia="Arial" w:hAnsi="Arial"/>
+          <w:sz w:val="22"/>
+          <w:szCs w:val="22"/>
+        </w:rPr>
+        <w:t xml:space="preserve"> — você narra (pode ditar por voz no celular e colar) e a skill organiza o relato em tópicos fiéis, salvos na pasta da OS. Você confere antes de salvar.</w:t>
       </w:r>
     </w:p>
     <w:p>
@@ -2847,15 +2991,15 @@
           <w:sz w:val="22"/>
           <w:szCs w:val="22"/>
         </w:rPr>
-        <w:t xml:space="preserve">/gera-ai</w:t>
-      </w:r>
-      <w:r>
-        <w:rPr>
-          <w:rFonts w:ascii="Arial" w:cs="Arial" w:eastAsia="Arial" w:hAnsi="Arial"/>
-          <w:sz w:val="22"/>
-          <w:szCs w:val="22"/>
-        </w:rPr>
-        <w:t xml:space="preserve"> — empacota tudo no TXT importável, com as fotos de evidência convertidas em PDF e nomeadas na convenção do Sistema Auditor.</w:t>
+        <w:t xml:space="preserve">/inspecao-inicial</w:t>
+      </w:r>
+      <w:r>
+        <w:rPr>
+          <w:rFonts w:ascii="Arial" w:cs="Arial" w:eastAsia="Arial" w:hAnsi="Arial"/>
+          <w:sz w:val="22"/>
+          <w:szCs w:val="22"/>
+        </w:rPr>
+        <w:t xml:space="preserve"> — a skill enquadra cada achado (NR, item, ementa), confirma com você e redige os autos. Se houver trabalhador sem registro, chama /registro; se houver risco grave e iminente, chama /aft-rt-rgi; o PGR entregue vai para /PGR-analise.</w:t>
       </w:r>
     </w:p>
     <w:p>
@@ -2869,29 +3013,19 @@
       </w:pPr>
       <w:r>
         <w:rPr>
-          <w:rFonts w:ascii="Arial" w:cs="Arial" w:eastAsia="Arial" w:hAnsi="Arial"/>
-          <w:sz w:val="22"/>
-          <w:szCs w:val="22"/>
-        </w:rPr>
-        <w:t xml:space="preserve">No </w:t>
-      </w:r>
-      <w:r>
-        <w:rPr>
-          <w:rFonts w:ascii="Arial" w:cs="Arial" w:eastAsia="Arial" w:hAnsi="Arial"/>
-          <w:b/>
-          <w:bCs/>
-          <w:sz w:val="22"/>
-          <w:szCs w:val="22"/>
-        </w:rPr>
-        <w:t xml:space="preserve">Sistema Auditor</w:t>
-      </w:r>
-      <w:r>
-        <w:rPr>
-          <w:rFonts w:ascii="Arial" w:cs="Arial" w:eastAsia="Arial" w:hAnsi="Arial"/>
-          <w:sz w:val="22"/>
-          <w:szCs w:val="22"/>
-        </w:rPr>
-        <w:t xml:space="preserve">: botão “imp. txt”, conferência pela lupa, revisão final e transmissão.</w:t>
+          <w:rFonts w:ascii="Consolas" w:cs="Consolas" w:eastAsia="Consolas" w:hAnsi="Consolas"/>
+          <w:sz w:val="22"/>
+          <w:szCs w:val="22"/>
+        </w:rPr>
+        <w:t xml:space="preserve">/gera-ai</w:t>
+      </w:r>
+      <w:r>
+        <w:rPr>
+          <w:rFonts w:ascii="Arial" w:cs="Arial" w:eastAsia="Arial" w:hAnsi="Arial"/>
+          <w:sz w:val="22"/>
+          <w:szCs w:val="22"/>
+        </w:rPr>
+        <w:t xml:space="preserve"> — empacota tudo no TXT importável, com as fotos de evidência convertidas em PDF e nomeadas na convenção do Sistema Auditor.</w:t>
       </w:r>
     </w:p>
     <w:p>
@@ -2905,19 +3039,29 @@
       </w:pPr>
       <w:r>
         <w:rPr>
-          <w:rFonts w:ascii="Consolas" w:cs="Consolas" w:eastAsia="Consolas" w:hAnsi="Consolas"/>
-          <w:sz w:val="22"/>
-          <w:szCs w:val="22"/>
-        </w:rPr>
-        <w:t xml:space="preserve">/autos-lavrados</w:t>
-      </w:r>
-      <w:r>
-        <w:rPr>
-          <w:rFonts w:ascii="Arial" w:cs="Arial" w:eastAsia="Arial" w:hAnsi="Arial"/>
-          <w:sz w:val="22"/>
-          <w:szCs w:val="22"/>
-        </w:rPr>
-        <w:t xml:space="preserve"> — depois de transmitir, confere o que efetivamente foi lavrado e marca na ficha da empresa o que está pendente.</w:t>
+          <w:rFonts w:ascii="Arial" w:cs="Arial" w:eastAsia="Arial" w:hAnsi="Arial"/>
+          <w:sz w:val="22"/>
+          <w:szCs w:val="22"/>
+        </w:rPr>
+        <w:t xml:space="preserve">No </w:t>
+      </w:r>
+      <w:r>
+        <w:rPr>
+          <w:rFonts w:ascii="Arial" w:cs="Arial" w:eastAsia="Arial" w:hAnsi="Arial"/>
+          <w:b/>
+          <w:bCs/>
+          <w:sz w:val="22"/>
+          <w:szCs w:val="22"/>
+        </w:rPr>
+        <w:t xml:space="preserve">Sistema Auditor</w:t>
+      </w:r>
+      <w:r>
+        <w:rPr>
+          <w:rFonts w:ascii="Arial" w:cs="Arial" w:eastAsia="Arial" w:hAnsi="Arial"/>
+          <w:sz w:val="22"/>
+          <w:szCs w:val="22"/>
+        </w:rPr>
+        <w:t xml:space="preserve">: botão “imp. txt”, conferência pela lupa, revisão final e transmissão.</w:t>
       </w:r>
     </w:p>
     <w:p>
@@ -2935,6 +3079,32 @@
           <w:sz w:val="22"/>
           <w:szCs w:val="22"/>
         </w:rPr>
+        <w:t xml:space="preserve">/autos-lavrados</w:t>
+      </w:r>
+      <w:r>
+        <w:rPr>
+          <w:rFonts w:ascii="Arial" w:cs="Arial" w:eastAsia="Arial" w:hAnsi="Arial"/>
+          <w:sz w:val="22"/>
+          <w:szCs w:val="22"/>
+        </w:rPr>
+        <w:t xml:space="preserve"> — depois de transmitir, confere o que efetivamente foi lavrado e marca na ficha da empresa o que está pendente.</w:t>
+      </w:r>
+    </w:p>
+    <w:p>
+      <w:pPr>
+        <w:pStyle w:val="ListParagraph"/>
+        <w:numPr>
+          <w:ilvl w:val="0"/>
+          <w:numId w:val="8"/>
+        </w:numPr>
+        <w:spacing w:after="80"/>
+      </w:pPr>
+      <w:r>
+        <w:rPr>
+          <w:rFonts w:ascii="Consolas" w:cs="Consolas" w:eastAsia="Consolas" w:hAnsi="Consolas"/>
+          <w:sz w:val="22"/>
+          <w:szCs w:val="22"/>
+        </w:rPr>
         <w:t xml:space="preserve">/sfitweb-rel</w:t>
       </w:r>
       <w:r>
@@ -3007,7 +3177,7 @@
           <w:sz w:val="20"/>
           <w:szCs w:val="20"/>
         </w:rPr>
-        <w:t xml:space="preserve">├── OS ATIVAS\</w:t>
+        <w:t xml:space="preserve">├── painel.html                        (visão geral das OS — gerado pelo /painel)</w:t>
       </w:r>
     </w:p>
     <w:p>
@@ -3022,7 +3192,7 @@
           <w:sz w:val="20"/>
           <w:szCs w:val="20"/>
         </w:rPr>
-        <w:t xml:space="preserve">│   └── EMPRESA X 12345678000190\</w:t>
+        <w:t xml:space="preserve">├── OS ATIVAS\</w:t>
       </w:r>
     </w:p>
     <w:p>
@@ -3037,7 +3207,22 @@
           <w:sz w:val="20"/>
           <w:szCs w:val="20"/>
         </w:rPr>
-        <w:t xml:space="preserve">│       ├── memory.md                  (ficha da fiscalização)</w:t>
+        <w:t xml:space="preserve">│   └── EMPRESA X 12345678000190\</w:t>
+      </w:r>
+    </w:p>
+    <w:p>
+      <w:pPr>
+        <w:shd w:fill="F2F2F2" w:val="clear"/>
+        <w:spacing w:after="120"/>
+        <w:ind w:left="360"/>
+      </w:pPr>
+      <w:r>
+        <w:rPr>
+          <w:rFonts w:ascii="Consolas" w:cs="Consolas" w:eastAsia="Consolas" w:hAnsi="Consolas"/>
+          <w:sz w:val="20"/>
+          <w:szCs w:val="20"/>
+        </w:rPr>
+        <w:t xml:space="preserve">│       ├── memory.md                  (ficha da fiscalização — criada pelo /nova-os)</w:t>
       </w:r>
     </w:p>
     <w:p>
@@ -3885,7 +4070,7 @@
         </w:rPr>
         <w:t xml:space="preserve"> — ou abra uma Issue em </w:t>
       </w:r>
-      <w:hyperlink w:history="1" r:id="rIdhgltu-oqmh3893nofayxs">
+      <w:hyperlink w:history="1" r:id="rIdppwr4z0dn4ovucladv8eo">
         <w:r>
           <w:rPr>
             <w:rStyle w:val="Hyperlink"/>

</xml_diff>

<commit_message>
Instala o CLI notebooklm na instalação (corrige pacote e método)
Bug: as docs mandavam 'pip install notebooklm-py', que não põe o comando
notebooklm no PATH (e faltava o extra [browser] da automação de navegador).
- Prompt de instalação (apostila/COMO-INSTALAR) ganha um passo: instalar
  notebooklm-py[browser] do repo teng-lin via pipx (pip como fallback),
  confirmando 'notebooklm --help' — fica pronto para todos
- Seção NotebookLM passa a ser só pedir acesso + login + testar
- /aft-setup: verifica o CLI e instala via pipx[browser] se faltar
- Troubleshooting atualizado

Co-Authored-By: Claude Fable 5 <noreply@anthropic.com>
</commit_message>
<xml_diff>
--- a/Apostila-AFT-Toolkit.docx
+++ b/Apostila-AFT-Toolkit.docx
@@ -322,7 +322,7 @@
         </w:rPr>
         <w:t xml:space="preserve">Baixe o aplicativo para Windows em </w:t>
       </w:r>
-      <w:hyperlink w:history="1" r:id="rIdh-i2d3wzramwdkuhkcnlg">
+      <w:hyperlink w:history="1" r:id="rIdg7tidoobjqvnpmmwwsmlu">
         <w:r>
           <w:rPr>
             <w:rStyle w:val="Hyperlink"/>
@@ -417,7 +417,7 @@
         </w:rPr>
         <w:t xml:space="preserve">Baixe em </w:t>
       </w:r>
-      <w:hyperlink w:history="1" r:id="rIdddauugae8oanb_h44s0sv">
+      <w:hyperlink w:history="1" r:id="rIdcfeood6ven81ctette5sp">
         <w:r>
           <w:rPr>
             <w:rStyle w:val="Hyperlink"/>
@@ -680,7 +680,7 @@
           <w:sz w:val="20"/>
           <w:szCs w:val="20"/>
         </w:rPr>
-        <w:t xml:space="preserve">3. Baixe o repositório https://github.com/ryckardo42/aft-toolkit.git fazendo dele a própria pasta de skills: git clone https://github.com/ryckardo42/aft-toolkit.git ~/.claude/skills. Se a pasta ~/.claude/skills já existir com conteúdo, clone numa pasta temporária e mova todo o conteúdo do repositório (incluindo a pasta oculta .git) para dentro dela.</w:t>
+        <w:t xml:space="preserve">3. Instale a ferramenta de linha de comando do NotebookLM a partir do repositório https://github.com/teng-lin/notebooklm-py (pacote notebooklm-py com o extra browser), de modo que o comando notebooklm fique disponível no terminal. Use pipx se possível (instale o pipx antes, se faltar), senão pip. Ao final, confirme que o comando notebooklm responde (notebooklm --help).</w:t>
       </w:r>
     </w:p>
     <w:p>
@@ -695,7 +695,22 @@
           <w:sz w:val="20"/>
           <w:szCs w:val="20"/>
         </w:rPr>
-        <w:t xml:space="preserve">4. Confirme que as skills ficaram diretamente em ~/.claude/skills (deve existir, por exemplo, ~/.claude/skills/aft-setup/SKILL.md), liste-as e me diga se preciso reiniciar o aplicativo.</w:t>
+        <w:t xml:space="preserve">4. Baixe o repositório https://github.com/ryckardo42/aft-toolkit.git fazendo dele a própria pasta de skills: git clone https://github.com/ryckardo42/aft-toolkit.git ~/.claude/skills. Se a pasta ~/.claude/skills já existir com conteúdo, clone numa pasta temporária e mova todo o conteúdo do repositório (incluindo a pasta oculta .git) para dentro dela.</w:t>
+      </w:r>
+    </w:p>
+    <w:p>
+      <w:pPr>
+        <w:shd w:fill="F2F2F2" w:val="clear"/>
+        <w:spacing w:after="120"/>
+        <w:ind w:left="360"/>
+      </w:pPr>
+      <w:r>
+        <w:rPr>
+          <w:rFonts w:ascii="Consolas" w:cs="Consolas" w:eastAsia="Consolas" w:hAnsi="Consolas"/>
+          <w:sz w:val="20"/>
+          <w:szCs w:val="20"/>
+        </w:rPr>
+        <w:t xml:space="preserve">5. Confirme que as skills ficaram diretamente em ~/.claude/skills (deve existir, por exemplo, ~/.claude/skills/aft-setup/SKILL.md), liste-as e me diga se preciso reiniciar o aplicativo.</w:t>
       </w:r>
     </w:p>
     <w:p>
@@ -751,7 +766,25 @@
           <w:sz w:val="22"/>
           <w:szCs w:val="22"/>
         </w:rPr>
-        <w:t xml:space="preserve"> roda os scripts locais do toolkit: conversão de fotos em PDF, geração do arquivo do Sistema Auditor e validação de arquivos de ponto.</w:t>
+        <w:t xml:space="preserve"> roda os scripts locais do toolkit (fotos em PDF, arquivo do Sistema Auditor, validação de ponto). O </w:t>
+      </w:r>
+      <w:r>
+        <w:rPr>
+          <w:rFonts w:ascii="Arial" w:cs="Arial" w:eastAsia="Arial" w:hAnsi="Arial"/>
+          <w:b/>
+          <w:bCs/>
+          <w:sz w:val="22"/>
+          <w:szCs w:val="22"/>
+        </w:rPr>
+        <w:t xml:space="preserve">notebooklm</w:t>
+      </w:r>
+      <w:r>
+        <w:rPr>
+          <w:rFonts w:ascii="Arial" w:cs="Arial" w:eastAsia="Arial" w:hAnsi="Arial"/>
+          <w:sz w:val="22"/>
+          <w:szCs w:val="22"/>
+        </w:rPr>
+        <w:t xml:space="preserve"> é a ferramenta que consulta os ementários no NotebookLM para achar o código da ementa sozinho — você ainda vai pedir acesso e fazer login no passo seguinte.</w:t>
       </w:r>
     </w:p>
     <w:p>
@@ -931,7 +964,7 @@
           <w:sz w:val="22"/>
           <w:szCs w:val="22"/>
         </w:rPr>
-        <w:t xml:space="preserve">Com o NotebookLM ativo, as skills encontram o código da ementa sozinhas, consultando ementários e NRs organizados em notebooks compartilhados.</w:t>
+        <w:t xml:space="preserve">A ferramenta notebooklm já foi instalada no Passo 3. Falta liberar o acesso e fazer login para as skills encontrarem o código da ementa sozinhas, consultando os ementários e NRs em notebooks compartilhados:</w:t>
       </w:r>
     </w:p>
     <w:p>
@@ -951,7 +984,7 @@
         </w:rPr>
         <w:t xml:space="preserve">Entre em </w:t>
       </w:r>
-      <w:hyperlink w:history="1" r:id="rIdmdp_pvl5bvaj16zutqtfu">
+      <w:hyperlink w:history="1" r:id="rIdfh6rcf3vrdmnmtu8dwveo">
         <w:r>
           <w:rPr>
             <w:rStyle w:val="Hyperlink"/>
@@ -1004,7 +1037,55 @@
           <w:sz w:val="22"/>
           <w:szCs w:val="22"/>
         </w:rPr>
-        <w:t xml:space="preserve">O próprio /aft-setup instala e autentica o programa do NotebookLM (o login abre no seu navegador, com a sua conta Google).</w:t>
+        <w:t xml:space="preserve">Faça login (abre o navegador, com a sua conta Google): peça ao Claude para rodar </w:t>
+      </w:r>
+      <w:r>
+        <w:rPr>
+          <w:rFonts w:ascii="Consolas" w:cs="Consolas" w:eastAsia="Consolas" w:hAnsi="Consolas"/>
+          <w:sz w:val="22"/>
+          <w:szCs w:val="22"/>
+        </w:rPr>
+        <w:t xml:space="preserve">notebooklm login</w:t>
+      </w:r>
+      <w:r>
+        <w:rPr>
+          <w:rFonts w:ascii="Arial" w:cs="Arial" w:eastAsia="Arial" w:hAnsi="Arial"/>
+          <w:sz w:val="22"/>
+          <w:szCs w:val="22"/>
+        </w:rPr>
+        <w:t xml:space="preserve"> e depois </w:t>
+      </w:r>
+      <w:r>
+        <w:rPr>
+          <w:rFonts w:ascii="Consolas" w:cs="Consolas" w:eastAsia="Consolas" w:hAnsi="Consolas"/>
+          <w:sz w:val="22"/>
+          <w:szCs w:val="22"/>
+        </w:rPr>
+        <w:t xml:space="preserve">notebooklm list</w:t>
+      </w:r>
+      <w:r>
+        <w:rPr>
+          <w:rFonts w:ascii="Arial" w:cs="Arial" w:eastAsia="Arial" w:hAnsi="Arial"/>
+          <w:sz w:val="22"/>
+          <w:szCs w:val="22"/>
+        </w:rPr>
+        <w:t xml:space="preserve"> para confirmar que os notebooks aparecem. O </w:t>
+      </w:r>
+      <w:r>
+        <w:rPr>
+          <w:rFonts w:ascii="Consolas" w:cs="Consolas" w:eastAsia="Consolas" w:hAnsi="Consolas"/>
+          <w:sz w:val="22"/>
+          <w:szCs w:val="22"/>
+        </w:rPr>
+        <w:t xml:space="preserve">/aft-setup</w:t>
+      </w:r>
+      <w:r>
+        <w:rPr>
+          <w:rFonts w:ascii="Arial" w:cs="Arial" w:eastAsia="Arial" w:hAnsi="Arial"/>
+          <w:sz w:val="22"/>
+          <w:szCs w:val="22"/>
+        </w:rPr>
+        <w:t xml:space="preserve"> também conduz esse passo.</w:t>
       </w:r>
     </w:p>
     <w:p>
@@ -1121,7 +1202,7 @@
         </w:rPr>
         <w:t xml:space="preserve">baixe em </w:t>
       </w:r>
-      <w:hyperlink w:history="1" r:id="rIdvlrzvgeoaczdcnyst4sw6">
+      <w:hyperlink w:history="1" r:id="rIda8yffclsknrnlvnu784ge">
         <w:r>
           <w:rPr>
             <w:rStyle w:val="Hyperlink"/>
@@ -3828,7 +3909,7 @@
                 <w:sz w:val="22"/>
                 <w:szCs w:val="22"/>
               </w:rPr>
-              <w:t xml:space="preserve">Peça ao Claude: “instale o notebooklm-py com pip”.</w:t>
+              <w:t xml:space="preserve">Peça ao Claude: “instale o notebooklm-py[browser] do repositório teng-lin com pipx e garanta que o comando notebooklm fique no PATH”; reinicie o terminal/app.</w:t>
             </w:r>
           </w:p>
         </w:tc>
@@ -4070,7 +4151,7 @@
         </w:rPr>
         <w:t xml:space="preserve"> — ou abra uma Issue em </w:t>
       </w:r>
-      <w:hyperlink w:history="1" r:id="rIdppwr4z0dn4ovucladv8eo">
+      <w:hyperlink w:history="1" r:id="rIdioo2d69wgqxljjs6r_hs5">
         <w:r>
           <w:rPr>
             <w:rStyle w:val="Hyperlink"/>

</xml_diff>

<commit_message>
Adiciona skills /tn-nco, /NR12 e /NR18 ao toolkit
- /tn-nco: redige a Notificação para Correção de Irregularidades (texto
  para colar no DET, item por item); ementas via NotebookLM+Drive; sem
  dependência de /nad-tn (preenchimento do DET é manual)
- /NR12 e /NR18: consultoras especializadas, com catálogos curados
  (references/ementas-comuns.md: 16 ementas NR-12, 29 NR-18) + fallback
  NotebookLM; entregam bloco 2) IRREGULARIDADE e linha do RT
- Adaptações p/ Windows/toolkit: paths ~/Documents/AFT e config/notebooks.json;
  /essencial-ai e /inspecao-completa → /inspecao-inicial; removido o path
  pessoal do NR MD; tokenização [[TRAB_NN]]/[[CPF_NN]]
- README, CLAUDE-aft e apostila atualizados (nova seção de consultoras por NR)

Co-Authored-By: Claude Fable 5 <noreply@anthropic.com>
</commit_message>
<xml_diff>
--- a/Apostila-AFT-Toolkit.docx
+++ b/Apostila-AFT-Toolkit.docx
@@ -322,7 +322,7 @@
         </w:rPr>
         <w:t xml:space="preserve">Baixe o aplicativo para Windows em </w:t>
       </w:r>
-      <w:hyperlink w:history="1" r:id="rIdg7tidoobjqvnpmmwwsmlu">
+      <w:hyperlink w:history="1" r:id="rIdjwnm6amm66whhc5rpe6az">
         <w:r>
           <w:rPr>
             <w:rStyle w:val="Hyperlink"/>
@@ -417,7 +417,7 @@
         </w:rPr>
         <w:t xml:space="preserve">Baixe em </w:t>
       </w:r>
-      <w:hyperlink w:history="1" r:id="rIdcfeood6ven81ctette5sp">
+      <w:hyperlink w:history="1" r:id="rIdejyfo-nmi9hdlkmdlqsr2">
         <w:r>
           <w:rPr>
             <w:rStyle w:val="Hyperlink"/>
@@ -984,7 +984,7 @@
         </w:rPr>
         <w:t xml:space="preserve">Entre em </w:t>
       </w:r>
-      <w:hyperlink w:history="1" r:id="rIdfh6rcf3vrdmnmtu8dwveo">
+      <w:hyperlink w:history="1" r:id="rIdc4s72sqrzafedvvsp9wtw">
         <w:r>
           <w:rPr>
             <w:rStyle w:val="Hyperlink"/>
@@ -1202,7 +1202,7 @@
         </w:rPr>
         <w:t xml:space="preserve">baixe em </w:t>
       </w:r>
-      <w:hyperlink w:history="1" r:id="rIda8yffclsknrnlvnu784ge">
+      <w:hyperlink w:history="1" r:id="rIdiriaz_68aqxuxxlzh0npq">
         <w:r>
           <w:rPr>
             <w:rStyle w:val="Hyperlink"/>
@@ -2051,6 +2051,70 @@
                 <w:sz w:val="22"/>
                 <w:szCs w:val="22"/>
               </w:rPr>
+              <w:t xml:space="preserve">/tn-nco</w:t>
+            </w:r>
+          </w:p>
+        </w:tc>
+        <w:tc>
+          <w:tcPr>
+            <w:tcW w:type="dxa" w:w="6760"/>
+            <w:tcBorders>
+              <w:top w:val="single" w:color="BFBFBF" w:sz="1"/>
+              <w:left w:val="single" w:color="BFBFBF" w:sz="1"/>
+              <w:bottom w:val="single" w:color="BFBFBF" w:sz="1"/>
+              <w:right w:val="single" w:color="BFBFBF" w:sz="1"/>
+            </w:tcBorders>
+            <w:tcMar>
+              <w:top w:type="dxa" w:w="80"/>
+              <w:left w:type="dxa" w:w="120"/>
+              <w:bottom w:type="dxa" w:w="80"/>
+              <w:right w:type="dxa" w:w="120"/>
+            </w:tcMar>
+          </w:tcPr>
+          <w:p>
+            <w:pPr>
+              <w:spacing w:after="0"/>
+              <w:jc w:val="left"/>
+            </w:pPr>
+            <w:r>
+              <w:rPr>
+                <w:rFonts w:ascii="Arial" w:cs="Arial" w:eastAsia="Arial" w:hAnsi="Arial"/>
+                <w:sz w:val="22"/>
+                <w:szCs w:val="22"/>
+              </w:rPr>
+              <w:t xml:space="preserve">Redige a Notificação para Correção de Irregularidades — o texto que você cola no DET para a empresa sanar as irregularidades (introdução fixa + um item por irregularidade + observações), pronto bloco a bloco. Não é o auto de infração; é a notificação para corrigir.</w:t>
+            </w:r>
+          </w:p>
+        </w:tc>
+      </w:tr>
+      <w:tr>
+        <w:tc>
+          <w:tcPr>
+            <w:tcW w:type="dxa" w:w="2600"/>
+            <w:tcBorders>
+              <w:top w:val="single" w:color="BFBFBF" w:sz="1"/>
+              <w:left w:val="single" w:color="BFBFBF" w:sz="1"/>
+              <w:bottom w:val="single" w:color="BFBFBF" w:sz="1"/>
+              <w:right w:val="single" w:color="BFBFBF" w:sz="1"/>
+            </w:tcBorders>
+            <w:tcMar>
+              <w:top w:type="dxa" w:w="80"/>
+              <w:left w:type="dxa" w:w="120"/>
+              <w:bottom w:type="dxa" w:w="80"/>
+              <w:right w:type="dxa" w:w="120"/>
+            </w:tcMar>
+          </w:tcPr>
+          <w:p>
+            <w:pPr>
+              <w:spacing w:after="0"/>
+              <w:jc w:val="both"/>
+            </w:pPr>
+            <w:r>
+              <w:rPr>
+                <w:rFonts w:ascii="Consolas" w:cs="Consolas" w:eastAsia="Consolas" w:hAnsi="Consolas"/>
+                <w:sz w:val="22"/>
+                <w:szCs w:val="22"/>
+              </w:rPr>
               <w:t xml:space="preserve">/aft-rt-rgi</w:t>
             </w:r>
           </w:p>
@@ -2098,7 +2162,21 @@
         <w:pStyle w:val="Heading2"/>
       </w:pPr>
       <w:r>
-        <w:t xml:space="preserve">3.3 Jornada e ponto eletrônico (Portaria MTP 671/2021)</w:t>
+        <w:t xml:space="preserve">3.3 Consultoras especializadas por NR</w:t>
+      </w:r>
+    </w:p>
+    <w:p>
+      <w:pPr>
+        <w:spacing w:after="120"/>
+        <w:jc w:val="both"/>
+      </w:pPr>
+      <w:r>
+        <w:rPr>
+          <w:rFonts w:ascii="Arial" w:cs="Arial" w:eastAsia="Arial" w:hAnsi="Arial"/>
+          <w:sz w:val="22"/>
+          <w:szCs w:val="22"/>
+        </w:rPr>
+        <w:t xml:space="preserve">Quando a irregularidade é de máquinas ou de obra, estas consultoras conhecem as ementas mais lavradas e entregam o texto pronto para a /inspecao-inicial e o /aft-rt-rgi. A /inspecao-inicial as aciona sozinha quando identifica a NR; você também pode chamá-las direto.</w:t>
       </w:r>
     </w:p>
     <w:tbl>
@@ -2218,7 +2296,7 @@
                 <w:sz w:val="22"/>
                 <w:szCs w:val="22"/>
               </w:rPr>
-              <w:t xml:space="preserve">/jornada-analise</w:t>
+              <w:t xml:space="preserve">/NR12</w:t>
             </w:r>
           </w:p>
         </w:tc>
@@ -2249,7 +2327,7 @@
                 <w:sz w:val="22"/>
                 <w:szCs w:val="22"/>
               </w:rPr>
-              <w:t xml:space="preserve">Recebeu o pacote de ponto da empresa (AFD, AEJ, atestados)? Esta skill tria os arquivos, aciona os especialistas e consolida tudo num único relatório.</w:t>
+              <w:t xml:space="preserve">Máquinas e equipamentos: a partir da sua descrição (ex.: “injetora sem proteção e sem parada de emergência”), identifica a ementa (catálogo das 16 mais comuns + NotebookLM) e entrega o bloco da irregularidade, a linha do Relatório Técnico e o fragmento para o Termo de Interdição.</w:t>
             </w:r>
           </w:p>
         </w:tc>
@@ -2282,7 +2360,7 @@
                 <w:sz w:val="22"/>
                 <w:szCs w:val="22"/>
               </w:rPr>
-              <w:t xml:space="preserve">/jornada-valida-afd-aej</w:t>
+              <w:t xml:space="preserve">/NR18</w:t>
             </w:r>
           </w:p>
         </w:tc>
@@ -2313,135 +2391,7 @@
                 <w:sz w:val="22"/>
                 <w:szCs w:val="22"/>
               </w:rPr>
-              <w:t xml:space="preserve">Valida tecnicamente o arquivo AEJ com um script Python local: estrutura, formatos, trailer e integridade referencial. Detecta arquivo editado ou montado à mão.</w:t>
-            </w:r>
-          </w:p>
-        </w:tc>
-      </w:tr>
-      <w:tr>
-        <w:tc>
-          <w:tcPr>
-            <w:tcW w:type="dxa" w:w="2600"/>
-            <w:tcBorders>
-              <w:top w:val="single" w:color="BFBFBF" w:sz="1"/>
-              <w:left w:val="single" w:color="BFBFBF" w:sz="1"/>
-              <w:bottom w:val="single" w:color="BFBFBF" w:sz="1"/>
-              <w:right w:val="single" w:color="BFBFBF" w:sz="1"/>
-            </w:tcBorders>
-            <w:tcMar>
-              <w:top w:type="dxa" w:w="80"/>
-              <w:left w:type="dxa" w:w="120"/>
-              <w:bottom w:type="dxa" w:w="80"/>
-              <w:right w:type="dxa" w:w="120"/>
-            </w:tcMar>
-          </w:tcPr>
-          <w:p>
-            <w:pPr>
-              <w:spacing w:after="0"/>
-              <w:jc w:val="both"/>
-            </w:pPr>
-            <w:r>
-              <w:rPr>
-                <w:rFonts w:ascii="Consolas" w:cs="Consolas" w:eastAsia="Consolas" w:hAnsi="Consolas"/>
-                <w:sz w:val="22"/>
-                <w:szCs w:val="22"/>
-              </w:rPr>
-              <w:t xml:space="preserve">/jornada-atestado</w:t>
-            </w:r>
-          </w:p>
-        </w:tc>
-        <w:tc>
-          <w:tcPr>
-            <w:tcW w:type="dxa" w:w="6760"/>
-            <w:tcBorders>
-              <w:top w:val="single" w:color="BFBFBF" w:sz="1"/>
-              <w:left w:val="single" w:color="BFBFBF" w:sz="1"/>
-              <w:bottom w:val="single" w:color="BFBFBF" w:sz="1"/>
-              <w:right w:val="single" w:color="BFBFBF" w:sz="1"/>
-            </w:tcBorders>
-            <w:tcMar>
-              <w:top w:type="dxa" w:w="80"/>
-              <w:left w:type="dxa" w:w="120"/>
-              <w:bottom w:type="dxa" w:w="80"/>
-              <w:right w:type="dxa" w:w="120"/>
-            </w:tcMar>
-          </w:tcPr>
-          <w:p>
-            <w:pPr>
-              <w:spacing w:after="0"/>
-              <w:jc w:val="left"/>
-            </w:pPr>
-            <w:r>
-              <w:rPr>
-                <w:rFonts w:ascii="Arial" w:cs="Arial" w:eastAsia="Arial" w:hAnsi="Arial"/>
-                <w:sz w:val="22"/>
-                <w:szCs w:val="22"/>
-              </w:rPr>
-              <w:t xml:space="preserve">Confere o Atestado Técnico e Termo de Responsabilidade do REP/PTRP item a item contra o art. 89, inclusive a estrutura da assinatura digital do PDF (padrão PAdES).</w:t>
-            </w:r>
-          </w:p>
-        </w:tc>
-      </w:tr>
-      <w:tr>
-        <w:tc>
-          <w:tcPr>
-            <w:tcW w:type="dxa" w:w="2600"/>
-            <w:tcBorders>
-              <w:top w:val="single" w:color="BFBFBF" w:sz="1"/>
-              <w:left w:val="single" w:color="BFBFBF" w:sz="1"/>
-              <w:bottom w:val="single" w:color="BFBFBF" w:sz="1"/>
-              <w:right w:val="single" w:color="BFBFBF" w:sz="1"/>
-            </w:tcBorders>
-            <w:tcMar>
-              <w:top w:type="dxa" w:w="80"/>
-              <w:left w:type="dxa" w:w="120"/>
-              <w:bottom w:type="dxa" w:w="80"/>
-              <w:right w:type="dxa" w:w="120"/>
-            </w:tcMar>
-          </w:tcPr>
-          <w:p>
-            <w:pPr>
-              <w:spacing w:after="0"/>
-              <w:jc w:val="both"/>
-            </w:pPr>
-            <w:r>
-              <w:rPr>
-                <w:rFonts w:ascii="Consolas" w:cs="Consolas" w:eastAsia="Consolas" w:hAnsi="Consolas"/>
-                <w:sz w:val="22"/>
-                <w:szCs w:val="22"/>
-              </w:rPr>
-              <w:t xml:space="preserve">/jornada-auto-afd-aej</w:t>
-            </w:r>
-          </w:p>
-        </w:tc>
-        <w:tc>
-          <w:tcPr>
-            <w:tcW w:type="dxa" w:w="6760"/>
-            <w:tcBorders>
-              <w:top w:val="single" w:color="BFBFBF" w:sz="1"/>
-              <w:left w:val="single" w:color="BFBFBF" w:sz="1"/>
-              <w:bottom w:val="single" w:color="BFBFBF" w:sz="1"/>
-              <w:right w:val="single" w:color="BFBFBF" w:sz="1"/>
-            </w:tcBorders>
-            <w:tcMar>
-              <w:top w:type="dxa" w:w="80"/>
-              <w:left w:type="dxa" w:w="120"/>
-              <w:bottom w:type="dxa" w:w="80"/>
-              <w:right w:type="dxa" w:w="120"/>
-            </w:tcMar>
-          </w:tcPr>
-          <w:p>
-            <w:pPr>
-              <w:spacing w:after="0"/>
-              <w:jc w:val="left"/>
-            </w:pPr>
-            <w:r>
-              <w:rPr>
-                <w:rFonts w:ascii="Arial" w:cs="Arial" w:eastAsia="Arial" w:hAnsi="Arial"/>
-                <w:sz w:val="22"/>
-                <w:szCs w:val="22"/>
-              </w:rPr>
-              <w:t xml:space="preserve">Redige os autos por AFD/AEJ ausente ou fora do padrão (ementas 002279-9 e 002280-2), descrevendo o defeito tecnicamente constatado.</w:t>
+              <w:t xml:space="preserve">Indústria da construção: separa as várias ementas de uma inspeção de obra (catálogo das 29 mais comuns + NotebookLM) — periferia sem guarda-corpo, elevador sem cancela, andaime, instalações elétricas, área de vivência — e entrega o bloco da irregularidade e a linha do RT de cada uma.</w:t>
             </w:r>
           </w:p>
         </w:tc>
@@ -2457,7 +2407,7 @@
         <w:pStyle w:val="Heading2"/>
       </w:pPr>
       <w:r>
-        <w:t xml:space="preserve">3.4 Empacotamento, rastreamento e relatórios</w:t>
+        <w:t xml:space="preserve">3.4 Jornada e ponto eletrônico (Portaria MTP 671/2021)</w:t>
       </w:r>
     </w:p>
     <w:tbl>
@@ -2577,6 +2527,365 @@
                 <w:sz w:val="22"/>
                 <w:szCs w:val="22"/>
               </w:rPr>
+              <w:t xml:space="preserve">/jornada-analise</w:t>
+            </w:r>
+          </w:p>
+        </w:tc>
+        <w:tc>
+          <w:tcPr>
+            <w:tcW w:type="dxa" w:w="6760"/>
+            <w:tcBorders>
+              <w:top w:val="single" w:color="BFBFBF" w:sz="1"/>
+              <w:left w:val="single" w:color="BFBFBF" w:sz="1"/>
+              <w:bottom w:val="single" w:color="BFBFBF" w:sz="1"/>
+              <w:right w:val="single" w:color="BFBFBF" w:sz="1"/>
+            </w:tcBorders>
+            <w:tcMar>
+              <w:top w:type="dxa" w:w="80"/>
+              <w:left w:type="dxa" w:w="120"/>
+              <w:bottom w:type="dxa" w:w="80"/>
+              <w:right w:type="dxa" w:w="120"/>
+            </w:tcMar>
+          </w:tcPr>
+          <w:p>
+            <w:pPr>
+              <w:spacing w:after="0"/>
+              <w:jc w:val="left"/>
+            </w:pPr>
+            <w:r>
+              <w:rPr>
+                <w:rFonts w:ascii="Arial" w:cs="Arial" w:eastAsia="Arial" w:hAnsi="Arial"/>
+                <w:sz w:val="22"/>
+                <w:szCs w:val="22"/>
+              </w:rPr>
+              <w:t xml:space="preserve">Recebeu o pacote de ponto da empresa (AFD, AEJ, atestados)? Esta skill tria os arquivos, aciona os especialistas e consolida tudo num único relatório.</w:t>
+            </w:r>
+          </w:p>
+        </w:tc>
+      </w:tr>
+      <w:tr>
+        <w:tc>
+          <w:tcPr>
+            <w:tcW w:type="dxa" w:w="2600"/>
+            <w:tcBorders>
+              <w:top w:val="single" w:color="BFBFBF" w:sz="1"/>
+              <w:left w:val="single" w:color="BFBFBF" w:sz="1"/>
+              <w:bottom w:val="single" w:color="BFBFBF" w:sz="1"/>
+              <w:right w:val="single" w:color="BFBFBF" w:sz="1"/>
+            </w:tcBorders>
+            <w:tcMar>
+              <w:top w:type="dxa" w:w="80"/>
+              <w:left w:type="dxa" w:w="120"/>
+              <w:bottom w:type="dxa" w:w="80"/>
+              <w:right w:type="dxa" w:w="120"/>
+            </w:tcMar>
+          </w:tcPr>
+          <w:p>
+            <w:pPr>
+              <w:spacing w:after="0"/>
+              <w:jc w:val="both"/>
+            </w:pPr>
+            <w:r>
+              <w:rPr>
+                <w:rFonts w:ascii="Consolas" w:cs="Consolas" w:eastAsia="Consolas" w:hAnsi="Consolas"/>
+                <w:sz w:val="22"/>
+                <w:szCs w:val="22"/>
+              </w:rPr>
+              <w:t xml:space="preserve">/jornada-valida-afd-aej</w:t>
+            </w:r>
+          </w:p>
+        </w:tc>
+        <w:tc>
+          <w:tcPr>
+            <w:tcW w:type="dxa" w:w="6760"/>
+            <w:tcBorders>
+              <w:top w:val="single" w:color="BFBFBF" w:sz="1"/>
+              <w:left w:val="single" w:color="BFBFBF" w:sz="1"/>
+              <w:bottom w:val="single" w:color="BFBFBF" w:sz="1"/>
+              <w:right w:val="single" w:color="BFBFBF" w:sz="1"/>
+            </w:tcBorders>
+            <w:tcMar>
+              <w:top w:type="dxa" w:w="80"/>
+              <w:left w:type="dxa" w:w="120"/>
+              <w:bottom w:type="dxa" w:w="80"/>
+              <w:right w:type="dxa" w:w="120"/>
+            </w:tcMar>
+          </w:tcPr>
+          <w:p>
+            <w:pPr>
+              <w:spacing w:after="0"/>
+              <w:jc w:val="left"/>
+            </w:pPr>
+            <w:r>
+              <w:rPr>
+                <w:rFonts w:ascii="Arial" w:cs="Arial" w:eastAsia="Arial" w:hAnsi="Arial"/>
+                <w:sz w:val="22"/>
+                <w:szCs w:val="22"/>
+              </w:rPr>
+              <w:t xml:space="preserve">Valida tecnicamente o arquivo AEJ com um script Python local: estrutura, formatos, trailer e integridade referencial. Detecta arquivo editado ou montado à mão.</w:t>
+            </w:r>
+          </w:p>
+        </w:tc>
+      </w:tr>
+      <w:tr>
+        <w:tc>
+          <w:tcPr>
+            <w:tcW w:type="dxa" w:w="2600"/>
+            <w:tcBorders>
+              <w:top w:val="single" w:color="BFBFBF" w:sz="1"/>
+              <w:left w:val="single" w:color="BFBFBF" w:sz="1"/>
+              <w:bottom w:val="single" w:color="BFBFBF" w:sz="1"/>
+              <w:right w:val="single" w:color="BFBFBF" w:sz="1"/>
+            </w:tcBorders>
+            <w:tcMar>
+              <w:top w:type="dxa" w:w="80"/>
+              <w:left w:type="dxa" w:w="120"/>
+              <w:bottom w:type="dxa" w:w="80"/>
+              <w:right w:type="dxa" w:w="120"/>
+            </w:tcMar>
+          </w:tcPr>
+          <w:p>
+            <w:pPr>
+              <w:spacing w:after="0"/>
+              <w:jc w:val="both"/>
+            </w:pPr>
+            <w:r>
+              <w:rPr>
+                <w:rFonts w:ascii="Consolas" w:cs="Consolas" w:eastAsia="Consolas" w:hAnsi="Consolas"/>
+                <w:sz w:val="22"/>
+                <w:szCs w:val="22"/>
+              </w:rPr>
+              <w:t xml:space="preserve">/jornada-atestado</w:t>
+            </w:r>
+          </w:p>
+        </w:tc>
+        <w:tc>
+          <w:tcPr>
+            <w:tcW w:type="dxa" w:w="6760"/>
+            <w:tcBorders>
+              <w:top w:val="single" w:color="BFBFBF" w:sz="1"/>
+              <w:left w:val="single" w:color="BFBFBF" w:sz="1"/>
+              <w:bottom w:val="single" w:color="BFBFBF" w:sz="1"/>
+              <w:right w:val="single" w:color="BFBFBF" w:sz="1"/>
+            </w:tcBorders>
+            <w:tcMar>
+              <w:top w:type="dxa" w:w="80"/>
+              <w:left w:type="dxa" w:w="120"/>
+              <w:bottom w:type="dxa" w:w="80"/>
+              <w:right w:type="dxa" w:w="120"/>
+            </w:tcMar>
+          </w:tcPr>
+          <w:p>
+            <w:pPr>
+              <w:spacing w:after="0"/>
+              <w:jc w:val="left"/>
+            </w:pPr>
+            <w:r>
+              <w:rPr>
+                <w:rFonts w:ascii="Arial" w:cs="Arial" w:eastAsia="Arial" w:hAnsi="Arial"/>
+                <w:sz w:val="22"/>
+                <w:szCs w:val="22"/>
+              </w:rPr>
+              <w:t xml:space="preserve">Confere o Atestado Técnico e Termo de Responsabilidade do REP/PTRP item a item contra o art. 89, inclusive a estrutura da assinatura digital do PDF (padrão PAdES).</w:t>
+            </w:r>
+          </w:p>
+        </w:tc>
+      </w:tr>
+      <w:tr>
+        <w:tc>
+          <w:tcPr>
+            <w:tcW w:type="dxa" w:w="2600"/>
+            <w:tcBorders>
+              <w:top w:val="single" w:color="BFBFBF" w:sz="1"/>
+              <w:left w:val="single" w:color="BFBFBF" w:sz="1"/>
+              <w:bottom w:val="single" w:color="BFBFBF" w:sz="1"/>
+              <w:right w:val="single" w:color="BFBFBF" w:sz="1"/>
+            </w:tcBorders>
+            <w:tcMar>
+              <w:top w:type="dxa" w:w="80"/>
+              <w:left w:type="dxa" w:w="120"/>
+              <w:bottom w:type="dxa" w:w="80"/>
+              <w:right w:type="dxa" w:w="120"/>
+            </w:tcMar>
+          </w:tcPr>
+          <w:p>
+            <w:pPr>
+              <w:spacing w:after="0"/>
+              <w:jc w:val="both"/>
+            </w:pPr>
+            <w:r>
+              <w:rPr>
+                <w:rFonts w:ascii="Consolas" w:cs="Consolas" w:eastAsia="Consolas" w:hAnsi="Consolas"/>
+                <w:sz w:val="22"/>
+                <w:szCs w:val="22"/>
+              </w:rPr>
+              <w:t xml:space="preserve">/jornada-auto-afd-aej</w:t>
+            </w:r>
+          </w:p>
+        </w:tc>
+        <w:tc>
+          <w:tcPr>
+            <w:tcW w:type="dxa" w:w="6760"/>
+            <w:tcBorders>
+              <w:top w:val="single" w:color="BFBFBF" w:sz="1"/>
+              <w:left w:val="single" w:color="BFBFBF" w:sz="1"/>
+              <w:bottom w:val="single" w:color="BFBFBF" w:sz="1"/>
+              <w:right w:val="single" w:color="BFBFBF" w:sz="1"/>
+            </w:tcBorders>
+            <w:tcMar>
+              <w:top w:type="dxa" w:w="80"/>
+              <w:left w:type="dxa" w:w="120"/>
+              <w:bottom w:type="dxa" w:w="80"/>
+              <w:right w:type="dxa" w:w="120"/>
+            </w:tcMar>
+          </w:tcPr>
+          <w:p>
+            <w:pPr>
+              <w:spacing w:after="0"/>
+              <w:jc w:val="left"/>
+            </w:pPr>
+            <w:r>
+              <w:rPr>
+                <w:rFonts w:ascii="Arial" w:cs="Arial" w:eastAsia="Arial" w:hAnsi="Arial"/>
+                <w:sz w:val="22"/>
+                <w:szCs w:val="22"/>
+              </w:rPr>
+              <w:t xml:space="preserve">Redige os autos por AFD/AEJ ausente ou fora do padrão (ementas 002279-9 e 002280-2), descrevendo o defeito tecnicamente constatado.</w:t>
+            </w:r>
+          </w:p>
+        </w:tc>
+      </w:tr>
+    </w:tbl>
+    <w:p>
+      <w:pPr>
+        <w:spacing w:after="120"/>
+      </w:pPr>
+    </w:p>
+    <w:p>
+      <w:pPr>
+        <w:pStyle w:val="Heading2"/>
+      </w:pPr>
+      <w:r>
+        <w:t xml:space="preserve">3.5 Empacotamento, rastreamento e relatórios</w:t>
+      </w:r>
+    </w:p>
+    <w:tbl>
+      <w:tblPr>
+        <w:tblW w:type="dxa" w:w="9360"/>
+        <w:tblBorders>
+          <w:top w:val="single" w:color="auto" w:sz="4"/>
+          <w:left w:val="single" w:color="auto" w:sz="4"/>
+          <w:bottom w:val="single" w:color="auto" w:sz="4"/>
+          <w:right w:val="single" w:color="auto" w:sz="4"/>
+          <w:insideH w:val="single" w:color="auto" w:sz="4"/>
+          <w:insideV w:val="single" w:color="auto" w:sz="4"/>
+        </w:tblBorders>
+      </w:tblPr>
+      <w:tblGrid>
+        <w:gridCol w:w="2600"/>
+        <w:gridCol w:w="6760"/>
+      </w:tblGrid>
+      <w:tr>
+        <w:trPr>
+          <w:tblHeader/>
+        </w:trPr>
+        <w:tc>
+          <w:tcPr>
+            <w:tcW w:type="dxa" w:w="2600"/>
+            <w:tcBorders>
+              <w:top w:val="single" w:color="BFBFBF" w:sz="1"/>
+              <w:left w:val="single" w:color="BFBFBF" w:sz="1"/>
+              <w:bottom w:val="single" w:color="BFBFBF" w:sz="1"/>
+              <w:right w:val="single" w:color="BFBFBF" w:sz="1"/>
+            </w:tcBorders>
+            <w:shd w:fill="D9E2F3" w:val="clear"/>
+            <w:tcMar>
+              <w:top w:type="dxa" w:w="80"/>
+              <w:left w:type="dxa" w:w="120"/>
+              <w:bottom w:type="dxa" w:w="80"/>
+              <w:right w:type="dxa" w:w="120"/>
+            </w:tcMar>
+          </w:tcPr>
+          <w:p>
+            <w:pPr>
+              <w:spacing w:after="0"/>
+              <w:jc w:val="both"/>
+            </w:pPr>
+            <w:r>
+              <w:rPr>
+                <w:rFonts w:ascii="Arial" w:cs="Arial" w:eastAsia="Arial" w:hAnsi="Arial"/>
+                <w:b/>
+                <w:bCs/>
+                <w:sz w:val="22"/>
+                <w:szCs w:val="22"/>
+              </w:rPr>
+              <w:t xml:space="preserve">Skill</w:t>
+            </w:r>
+          </w:p>
+        </w:tc>
+        <w:tc>
+          <w:tcPr>
+            <w:tcW w:type="dxa" w:w="6760"/>
+            <w:tcBorders>
+              <w:top w:val="single" w:color="BFBFBF" w:sz="1"/>
+              <w:left w:val="single" w:color="BFBFBF" w:sz="1"/>
+              <w:bottom w:val="single" w:color="BFBFBF" w:sz="1"/>
+              <w:right w:val="single" w:color="BFBFBF" w:sz="1"/>
+            </w:tcBorders>
+            <w:shd w:fill="D9E2F3" w:val="clear"/>
+            <w:tcMar>
+              <w:top w:type="dxa" w:w="80"/>
+              <w:left w:type="dxa" w:w="120"/>
+              <w:bottom w:type="dxa" w:w="80"/>
+              <w:right w:type="dxa" w:w="120"/>
+            </w:tcMar>
+          </w:tcPr>
+          <w:p>
+            <w:pPr>
+              <w:spacing w:after="0"/>
+              <w:jc w:val="both"/>
+            </w:pPr>
+            <w:r>
+              <w:rPr>
+                <w:rFonts w:ascii="Arial" w:cs="Arial" w:eastAsia="Arial" w:hAnsi="Arial"/>
+                <w:b/>
+                <w:bCs/>
+                <w:sz w:val="22"/>
+                <w:szCs w:val="22"/>
+              </w:rPr>
+              <w:t xml:space="preserve">O que faz</w:t>
+            </w:r>
+          </w:p>
+        </w:tc>
+      </w:tr>
+      <w:tr>
+        <w:tc>
+          <w:tcPr>
+            <w:tcW w:type="dxa" w:w="2600"/>
+            <w:tcBorders>
+              <w:top w:val="single" w:color="BFBFBF" w:sz="1"/>
+              <w:left w:val="single" w:color="BFBFBF" w:sz="1"/>
+              <w:bottom w:val="single" w:color="BFBFBF" w:sz="1"/>
+              <w:right w:val="single" w:color="BFBFBF" w:sz="1"/>
+            </w:tcBorders>
+            <w:tcMar>
+              <w:top w:type="dxa" w:w="80"/>
+              <w:left w:type="dxa" w:w="120"/>
+              <w:bottom w:type="dxa" w:w="80"/>
+              <w:right w:type="dxa" w:w="120"/>
+            </w:tcMar>
+          </w:tcPr>
+          <w:p>
+            <w:pPr>
+              <w:spacing w:after="0"/>
+              <w:jc w:val="both"/>
+            </w:pPr>
+            <w:r>
+              <w:rPr>
+                <w:rFonts w:ascii="Consolas" w:cs="Consolas" w:eastAsia="Consolas" w:hAnsi="Consolas"/>
+                <w:sz w:val="22"/>
+                <w:szCs w:val="22"/>
+              </w:rPr>
               <w:t xml:space="preserve">/gera-ai</w:t>
             </w:r>
           </w:p>
@@ -4151,7 +4460,7 @@
         </w:rPr>
         <w:t xml:space="preserve"> — ou abra uma Issue em </w:t>
       </w:r>
-      <w:hyperlink w:history="1" r:id="rIdioo2d69wgqxljjs6r_hs5">
+      <w:hyperlink w:history="1" r:id="rIdbjpimay2btx35-1txnvxt">
         <w:r>
           <w:rPr>
             <w:rStyle w:val="Hyperlink"/>

</xml_diff>

<commit_message>
Adiciona skill /aft-doctor (verificacao pos-instalacao)
Check-up so-leitura que confere Python, Git, descoberta das skills,
config do repo, perfil do auditor, pasta de trabalho, bibliotecas e
NotebookLM, e relata em linguagem simples o que falta e como resolver.
Nasceu de oportunidade do /insights (atrito recorrente: falha silenciosa
na instalacao). Inclui _scripts/aft_doctor.py (stdlib).

Docs: README (catalogo + fluxo), CLAUDE-aft (mapa de skills), aft-setup
(sugere /aft-doctor ao fim), apostila (instalacao 2.4, catalogo 3.1 e
problemas comuns) e mapa de arquitetura (19 -> 20 skills).

Co-Authored-By: Claude Opus 4.8 (1M context) <noreply@anthropic.com>
</commit_message>
<xml_diff>
--- a/Apostila-AFT-Toolkit.docx
+++ b/Apostila-AFT-Toolkit.docx
@@ -322,7 +322,7 @@
         </w:rPr>
         <w:t xml:space="preserve">Baixe o aplicativo para Windows em </w:t>
       </w:r>
-      <w:hyperlink w:history="1" r:id="rIdjwnm6amm66whhc5rpe6az">
+      <w:hyperlink w:history="1" r:id="rIdwb5xw4nqrk17r4jfhyhvz">
         <w:r>
           <w:rPr>
             <w:rStyle w:val="Hyperlink"/>
@@ -417,7 +417,7 @@
         </w:rPr>
         <w:t xml:space="preserve">Baixe em </w:t>
       </w:r>
-      <w:hyperlink w:history="1" r:id="rIdejyfo-nmi9hdlkmdlqsr2">
+      <w:hyperlink w:history="1" r:id="rIdzjrwkbhycxhq7qnjd1w7p">
         <w:r>
           <w:rPr>
             <w:rStyle w:val="Hyperlink"/>
@@ -947,6 +947,46 @@
     </w:p>
     <w:p>
       <w:pPr>
+        <w:spacing w:after="120"/>
+        <w:jc w:val="both"/>
+      </w:pPr>
+      <w:r>
+        <w:rPr>
+          <w:rFonts w:ascii="Arial" w:cs="Arial" w:eastAsia="Arial" w:hAnsi="Arial"/>
+          <w:b/>
+          <w:bCs/>
+          <w:sz w:val="22"/>
+          <w:szCs w:val="22"/>
+        </w:rPr>
+        <w:t xml:space="preserve">Confira se está tudo certo: </w:t>
+      </w:r>
+      <w:r>
+        <w:rPr>
+          <w:rFonts w:ascii="Arial" w:cs="Arial" w:eastAsia="Arial" w:hAnsi="Arial"/>
+          <w:sz w:val="22"/>
+          <w:szCs w:val="22"/>
+        </w:rPr>
+        <w:t xml:space="preserve">digite </w:t>
+      </w:r>
+      <w:r>
+        <w:rPr>
+          <w:rFonts w:ascii="Consolas" w:cs="Consolas" w:eastAsia="Consolas" w:hAnsi="Consolas"/>
+          <w:sz w:val="22"/>
+          <w:szCs w:val="22"/>
+        </w:rPr>
+        <w:t xml:space="preserve">/aft-doctor</w:t>
+      </w:r>
+      <w:r>
+        <w:rPr>
+          <w:rFonts w:ascii="Arial" w:cs="Arial" w:eastAsia="Arial" w:hAnsi="Arial"/>
+          <w:sz w:val="22"/>
+          <w:szCs w:val="22"/>
+        </w:rPr>
+        <w:t xml:space="preserve">. Ele faz um check-up da instalação (Python, Git, se as skills foram reconhecidas, sua configuração e as bibliotecas) e responde, em linguagem simples, o que está OK e o que falta — com a solução de cada item. Rode-o agora, logo após o /aft-setup, e sempre que algo parar de funcionar. É só diagnóstico: não altera nada.</w:t>
+      </w:r>
+    </w:p>
+    <w:p>
+      <w:pPr>
         <w:pStyle w:val="Heading2"/>
       </w:pPr>
       <w:r>
@@ -984,7 +1024,7 @@
         </w:rPr>
         <w:t xml:space="preserve">Entre em </w:t>
       </w:r>
-      <w:hyperlink w:history="1" r:id="rIdc4s72sqrzafedvvsp9wtw">
+      <w:hyperlink w:history="1" r:id="rId6q2w4xousnyygku1jyrx6">
         <w:r>
           <w:rPr>
             <w:rStyle w:val="Hyperlink"/>
@@ -1202,7 +1242,7 @@
         </w:rPr>
         <w:t xml:space="preserve">baixe em </w:t>
       </w:r>
-      <w:hyperlink w:history="1" r:id="rIdiriaz_68aqxuxxlzh0npq">
+      <w:hyperlink w:history="1" r:id="rIdjm6hgzrsvxvukk8nyc-st">
         <w:r>
           <w:rPr>
             <w:rStyle w:val="Hyperlink"/>
@@ -1500,6 +1540,70 @@
                 <w:sz w:val="22"/>
                 <w:szCs w:val="22"/>
               </w:rPr>
+              <w:t xml:space="preserve">/aft-doctor</w:t>
+            </w:r>
+          </w:p>
+        </w:tc>
+        <w:tc>
+          <w:tcPr>
+            <w:tcW w:type="dxa" w:w="6760"/>
+            <w:tcBorders>
+              <w:top w:val="single" w:color="BFBFBF" w:sz="1"/>
+              <w:left w:val="single" w:color="BFBFBF" w:sz="1"/>
+              <w:bottom w:val="single" w:color="BFBFBF" w:sz="1"/>
+              <w:right w:val="single" w:color="BFBFBF" w:sz="1"/>
+            </w:tcBorders>
+            <w:tcMar>
+              <w:top w:type="dxa" w:w="80"/>
+              <w:left w:type="dxa" w:w="120"/>
+              <w:bottom w:type="dxa" w:w="80"/>
+              <w:right w:type="dxa" w:w="120"/>
+            </w:tcMar>
+          </w:tcPr>
+          <w:p>
+            <w:pPr>
+              <w:spacing w:after="0"/>
+              <w:jc w:val="left"/>
+            </w:pPr>
+            <w:r>
+              <w:rPr>
+                <w:rFonts w:ascii="Arial" w:cs="Arial" w:eastAsia="Arial" w:hAnsi="Arial"/>
+                <w:sz w:val="22"/>
+                <w:szCs w:val="22"/>
+              </w:rPr>
+              <w:t xml:space="preserve">Check-up da instalação: confere se Python, Git, as skills, a configuração, o seu perfil, a pasta de trabalho e as bibliotecas estão no lugar — e diz, em linguagem simples, o que falta e como resolver. Rode logo após o /aft-setup e sempre que algo não funcionar. Só diagnostica; não altera nada.</w:t>
+            </w:r>
+          </w:p>
+        </w:tc>
+      </w:tr>
+      <w:tr>
+        <w:tc>
+          <w:tcPr>
+            <w:tcW w:type="dxa" w:w="2600"/>
+            <w:tcBorders>
+              <w:top w:val="single" w:color="BFBFBF" w:sz="1"/>
+              <w:left w:val="single" w:color="BFBFBF" w:sz="1"/>
+              <w:bottom w:val="single" w:color="BFBFBF" w:sz="1"/>
+              <w:right w:val="single" w:color="BFBFBF" w:sz="1"/>
+            </w:tcBorders>
+            <w:tcMar>
+              <w:top w:type="dxa" w:w="80"/>
+              <w:left w:type="dxa" w:w="120"/>
+              <w:bottom w:type="dxa" w:w="80"/>
+              <w:right w:type="dxa" w:w="120"/>
+            </w:tcMar>
+          </w:tcPr>
+          <w:p>
+            <w:pPr>
+              <w:spacing w:after="0"/>
+              <w:jc w:val="both"/>
+            </w:pPr>
+            <w:r>
+              <w:rPr>
+                <w:rFonts w:ascii="Consolas" w:cs="Consolas" w:eastAsia="Consolas" w:hAnsi="Consolas"/>
+                <w:sz w:val="22"/>
+                <w:szCs w:val="22"/>
+              </w:rPr>
               <w:t xml:space="preserve">/nova-os</w:t>
             </w:r>
           </w:p>
@@ -3995,7 +4099,7 @@
                 <w:sz w:val="22"/>
                 <w:szCs w:val="22"/>
               </w:rPr>
-              <w:t xml:space="preserve">“Git is required for local sessions”</w:t>
+              <w:t xml:space="preserve">Não sei se está tudo certo / algo parou de funcionar</w:t>
             </w:r>
           </w:p>
         </w:tc>
@@ -4026,7 +4130,7 @@
                 <w:sz w:val="22"/>
                 <w:szCs w:val="22"/>
               </w:rPr>
-              <w:t xml:space="preserve">Instale o Git (seção 2.2) e feche o aplicativo de verdade: botão direito no ícone do Claude na bandeja (perto do relógio) → Sair; reabra. Se persistir, reinicie o computador.</w:t>
+              <w:t xml:space="preserve">Rode /aft-doctor: ele faz o check-up completo da instalação e aponta exatamente o que falta e como resolver. É sempre o primeiro a tentar.</w:t>
             </w:r>
           </w:p>
         </w:tc>
@@ -4059,7 +4163,7 @@
                 <w:sz w:val="22"/>
                 <w:szCs w:val="22"/>
               </w:rPr>
-              <w:t xml:space="preserve">Python “não encontrado”</w:t>
+              <w:t xml:space="preserve">“Git is required for local sessions”</w:t>
             </w:r>
           </w:p>
         </w:tc>
@@ -4090,7 +4194,7 @@
                 <w:sz w:val="22"/>
                 <w:szCs w:val="22"/>
               </w:rPr>
-              <w:t xml:space="preserve">Peça ao Claude: “instale o Python com winget”. Se a rede bloquear, use o plano B manual (seção 2.7) e reinicie o aplicativo.</w:t>
+              <w:t xml:space="preserve">Instale o Git (seção 2.2) e feche o aplicativo de verdade: botão direito no ícone do Claude na bandeja (perto do relógio) → Sair; reabra. Se persistir, reinicie o computador.</w:t>
             </w:r>
           </w:p>
         </w:tc>
@@ -4123,7 +4227,7 @@
                 <w:sz w:val="22"/>
                 <w:szCs w:val="22"/>
               </w:rPr>
-              <w:t xml:space="preserve">A skill não aparece ao digitar /</w:t>
+              <w:t xml:space="preserve">Python “não encontrado”</w:t>
             </w:r>
           </w:p>
         </w:tc>
@@ -4154,7 +4258,7 @@
                 <w:sz w:val="22"/>
                 <w:szCs w:val="22"/>
               </w:rPr>
-              <w:t xml:space="preserve">Feche e reabra o Claude Code. Se persistir, peça a ele: “as skills estão diretamente em ~/.claude/skills (ex.: ~/.claude/skills/aft-setup)? Se estiverem dentro de uma subpasta aft-toolkit, mova todo o conteúdo um nível acima”.</w:t>
+              <w:t xml:space="preserve">Peça ao Claude: “instale o Python com winget”. Se a rede bloquear, use o plano B manual (seção 2.7) e reinicie o aplicativo.</w:t>
             </w:r>
           </w:p>
         </w:tc>
@@ -4187,7 +4291,7 @@
                 <w:sz w:val="22"/>
                 <w:szCs w:val="22"/>
               </w:rPr>
-              <w:t xml:space="preserve">notebooklm: command not found</w:t>
+              <w:t xml:space="preserve">A skill não aparece ao digitar /</w:t>
             </w:r>
           </w:p>
         </w:tc>
@@ -4218,7 +4322,7 @@
                 <w:sz w:val="22"/>
                 <w:szCs w:val="22"/>
               </w:rPr>
-              <w:t xml:space="preserve">Peça ao Claude: “instale o notebooklm-py[browser] do repositório teng-lin com pipx e garanta que o comando notebooklm fique no PATH”; reinicie o terminal/app.</w:t>
+              <w:t xml:space="preserve">Feche e reabra o Claude Code. Se persistir, peça a ele: “as skills estão diretamente em ~/.claude/skills (ex.: ~/.claude/skills/aft-setup)? Se estiverem dentro de uma subpasta aft-toolkit, mova todo o conteúdo um nível acima”.</w:t>
             </w:r>
           </w:p>
         </w:tc>
@@ -4251,7 +4355,7 @@
                 <w:sz w:val="22"/>
                 <w:szCs w:val="22"/>
               </w:rPr>
-              <w:t xml:space="preserve">NotebookLM responde “sem acesso”</w:t>
+              <w:t xml:space="preserve">notebooklm: command not found</w:t>
             </w:r>
           </w:p>
         </w:tc>
@@ -4282,7 +4386,7 @@
                 <w:sz w:val="22"/>
                 <w:szCs w:val="22"/>
               </w:rPr>
-              <w:t xml:space="preserve">Solicite acesso em notebooks-aft.vercel.app e aguarde a liberação.</w:t>
+              <w:t xml:space="preserve">Peça ao Claude: “instale o notebooklm-py[browser] do repositório teng-lin com pipx e garanta que o comando notebooklm fique no PATH”; reinicie o terminal/app.</w:t>
             </w:r>
           </w:p>
         </w:tc>
@@ -4315,7 +4419,7 @@
                 <w:sz w:val="22"/>
                 <w:szCs w:val="22"/>
               </w:rPr>
-              <w:t xml:space="preserve">Foto HEIC (iPhone) não converte</w:t>
+              <w:t xml:space="preserve">NotebookLM responde “sem acesso”</w:t>
             </w:r>
           </w:p>
         </w:tc>
@@ -4346,7 +4450,7 @@
                 <w:sz w:val="22"/>
                 <w:szCs w:val="22"/>
               </w:rPr>
-              <w:t xml:space="preserve">Peça ao Claude: “instale o pillow-heif” (ou converta a foto para JPG).</w:t>
+              <w:t xml:space="preserve">Solicite acesso em notebooks-aft.vercel.app e aguarde a liberação.</w:t>
             </w:r>
           </w:p>
         </w:tc>
@@ -4379,6 +4483,70 @@
                 <w:sz w:val="22"/>
                 <w:szCs w:val="22"/>
               </w:rPr>
+              <w:t xml:space="preserve">Foto HEIC (iPhone) não converte</w:t>
+            </w:r>
+          </w:p>
+        </w:tc>
+        <w:tc>
+          <w:tcPr>
+            <w:tcW w:type="dxa" w:w="5860"/>
+            <w:tcBorders>
+              <w:top w:val="single" w:color="BFBFBF" w:sz="1"/>
+              <w:left w:val="single" w:color="BFBFBF" w:sz="1"/>
+              <w:bottom w:val="single" w:color="BFBFBF" w:sz="1"/>
+              <w:right w:val="single" w:color="BFBFBF" w:sz="1"/>
+            </w:tcBorders>
+            <w:tcMar>
+              <w:top w:type="dxa" w:w="80"/>
+              <w:left w:type="dxa" w:w="120"/>
+              <w:bottom w:type="dxa" w:w="80"/>
+              <w:right w:type="dxa" w:w="120"/>
+            </w:tcMar>
+          </w:tcPr>
+          <w:p>
+            <w:pPr>
+              <w:spacing w:after="0"/>
+              <w:jc w:val="left"/>
+            </w:pPr>
+            <w:r>
+              <w:rPr>
+                <w:rFonts w:ascii="Arial" w:cs="Arial" w:eastAsia="Arial" w:hAnsi="Arial"/>
+                <w:sz w:val="22"/>
+                <w:szCs w:val="22"/>
+              </w:rPr>
+              <w:t xml:space="preserve">Peça ao Claude: “instale o pillow-heif” (ou converta a foto para JPG).</w:t>
+            </w:r>
+          </w:p>
+        </w:tc>
+      </w:tr>
+      <w:tr>
+        <w:tc>
+          <w:tcPr>
+            <w:tcW w:type="dxa" w:w="3500"/>
+            <w:tcBorders>
+              <w:top w:val="single" w:color="BFBFBF" w:sz="1"/>
+              <w:left w:val="single" w:color="BFBFBF" w:sz="1"/>
+              <w:bottom w:val="single" w:color="BFBFBF" w:sz="1"/>
+              <w:right w:val="single" w:color="BFBFBF" w:sz="1"/>
+            </w:tcBorders>
+            <w:tcMar>
+              <w:top w:type="dxa" w:w="80"/>
+              <w:left w:type="dxa" w:w="120"/>
+              <w:bottom w:type="dxa" w:w="80"/>
+              <w:right w:type="dxa" w:w="120"/>
+            </w:tcMar>
+          </w:tcPr>
+          <w:p>
+            <w:pPr>
+              <w:spacing w:after="0"/>
+              <w:jc w:val="left"/>
+            </w:pPr>
+            <w:r>
+              <w:rPr>
+                <w:rFonts w:ascii="Arial" w:cs="Arial" w:eastAsia="Arial" w:hAnsi="Arial"/>
+                <w:sz w:val="22"/>
+                <w:szCs w:val="22"/>
+              </w:rPr>
               <w:t xml:space="preserve">Sistema Auditor não acha o anexo</w:t>
             </w:r>
           </w:p>
@@ -4460,7 +4628,7 @@
         </w:rPr>
         <w:t xml:space="preserve"> — ou abra uma Issue em </w:t>
       </w:r>
-      <w:hyperlink w:history="1" r:id="rIdbjpimay2btx35-1txnvxt">
+      <w:hyperlink w:history="1" r:id="rIdv5xmgb-hn3wwpwkze82ff">
         <w:r>
           <w:rPr>
             <w:rStyle w:val="Hyperlink"/>

</xml_diff>

<commit_message>
docs: adiciona a skill /consulta ao README e a apostila
- README.md: nova linha na tabela "Inspecao e lavratura" (apos /inspecao-fisica),
  inclusao em "Estrutura do repositorio" e mencao na secao de ementarios.
- Apostila-AFT-Toolkit.docx: nova linha do /consulta na tabela de skills de
  inspecao/lavratura.

Co-Authored-By: Claude Opus 4.8 <noreply@anthropic.com>
</commit_message>
<xml_diff>
--- a/Apostila-AFT-Toolkit.docx
+++ b/Apostila-AFT-Toolkit.docx
@@ -1867,6 +1867,70 @@
                 <w:szCs w:val="22"/>
               </w:rPr>
               <w:t xml:space="preserve">Transforma a narrativa ditada da visita (por voz ou texto corrido) num relato de campo estruturado e fiel, salvo na pasta da OS. Puramente descritivo: sem NR, sem ementa. É a memória de campo que alimenta as outras skills.</w:t>
+            </w:r>
+          </w:p>
+        </w:tc>
+      </w:tr>
+      <w:tr>
+        <w:tc>
+          <w:tcPr>
+            <w:tcW w:type="dxa" w:w="2600"/>
+            <w:tcBorders>
+              <w:top w:val="single" w:color="BFBFBF" w:sz="1"/>
+              <w:left w:val="single" w:color="BFBFBF" w:sz="1"/>
+              <w:bottom w:val="single" w:color="BFBFBF" w:sz="1"/>
+              <w:right w:val="single" w:color="BFBFBF" w:sz="1"/>
+            </w:tcBorders>
+            <w:tcMar>
+              <w:top w:type="dxa" w:w="80"/>
+              <w:left w:type="dxa" w:w="120"/>
+              <w:bottom w:type="dxa" w:w="80"/>
+              <w:right w:type="dxa" w:w="120"/>
+            </w:tcMar>
+          </w:tcPr>
+          <w:p>
+            <w:pPr>
+              <w:spacing w:after="0"/>
+              <w:jc w:val="both"/>
+            </w:pPr>
+            <w:r>
+              <w:rPr>
+                <w:rFonts w:ascii="Consolas" w:cs="Consolas" w:eastAsia="Consolas" w:hAnsi="Consolas"/>
+                <w:sz w:val="22"/>
+                <w:szCs w:val="22"/>
+              </w:rPr>
+              <w:t>/consulta</w:t>
+            </w:r>
+          </w:p>
+        </w:tc>
+        <w:tc>
+          <w:tcPr>
+            <w:tcW w:type="dxa" w:w="6760"/>
+            <w:tcBorders>
+              <w:top w:val="single" w:color="BFBFBF" w:sz="1"/>
+              <w:left w:val="single" w:color="BFBFBF" w:sz="1"/>
+              <w:bottom w:val="single" w:color="BFBFBF" w:sz="1"/>
+              <w:right w:val="single" w:color="BFBFBF" w:sz="1"/>
+            </w:tcBorders>
+            <w:tcMar>
+              <w:top w:type="dxa" w:w="80"/>
+              <w:left w:type="dxa" w:w="120"/>
+              <w:bottom w:type="dxa" w:w="80"/>
+              <w:right w:type="dxa" w:w="120"/>
+            </w:tcMar>
+          </w:tcPr>
+          <w:p>
+            <w:pPr>
+              <w:spacing w:after="0"/>
+              <w:jc w:val="left"/>
+            </w:pPr>
+            <w:r>
+              <w:rPr>
+                <w:rFonts w:ascii="Arial" w:cs="Arial" w:eastAsia="Arial" w:hAnsi="Arial"/>
+                <w:sz w:val="22"/>
+                <w:szCs w:val="22"/>
+              </w:rPr>
+              <w:t>Consulta os ementarios/notebooks para tirar uma duvida tecnico-juridica ou enquadrar um fato: identifica a ementa (codigo e descricao), apresenta a capitulacao e a gradacao (e notas tecnicas), e ainda sugere o texto do campo Historico do auto, com metodologia que evita nulidades. So consulta - nao lavra (isso e com /inspecao-inicial e /gera-ai).</w:t>
             </w:r>
           </w:p>
         </w:tc>

</xml_diff>

<commit_message>
Documenta o passo `notebooklm skill install` que faltava na instalação
Instalar o pacote notebooklm-py via pip/pipx só registra o comando de
terminal; sem rodar `notebooklm skill install` (ou npx skills add), a
skill /notebooklm não aparece no Claude Code, mesmo com o CLI
funcionando — era o caso de uma instalação Windows recente. Adiciona o
passo e o sintoma em COMO-INSTALAR.md e aft-setup/SKILL.md, e documenta
a skill /notebooklm (o que faz e como difere de /notebooklm-login) na
apostila.

Co-Authored-By: Claude Sonnet 4.6 <noreply@anthropic.com>
</commit_message>
<xml_diff>
--- a/Apostila-AFT-Toolkit.docx
+++ b/Apostila-AFT-Toolkit.docx
@@ -680,7 +680,7 @@
           <w:sz w:val="20"/>
           <w:szCs w:val="20"/>
         </w:rPr>
-        <w:t xml:space="preserve">3. Instale a ferramenta de linha de comando do NotebookLM a partir do repositório https://github.com/teng-lin/notebooklm-py (pacote notebooklm-py com o extra browser), de modo que o comando notebooklm fique disponível no terminal. Use pipx se possível (instale o pipx antes, se faltar), senão pip. Ao final, confirme que o comando notebooklm responde (notebooklm --help).</w:t>
+        <w:t xml:space="preserve">3. Instale a ferramenta de linha de comando do NotebookLM a partir do repositório https://github.com/teng-lin/notebooklm-py (pacote notebooklm-py com o extra browser), de modo que o comando notebooklm fique disponível no terminal. Use pipx se possível (instale o pipx antes, se faltar), senão pip. Ao final, confirme que o comando notebooklm responde (notebooklm --help). Em seguida, rode notebooklm skill install para registrar a skill /notebooklm no Claude Code — sem esse passo extra, ela não aparece mesmo com o comando funcionando.</w:t>
       </w:r>
     </w:p>
     <w:p>
@@ -784,7 +784,7 @@
           <w:sz w:val="22"/>
           <w:szCs w:val="22"/>
         </w:rPr>
-        <w:t xml:space="preserve"> é a ferramenta que consulta os ementários no NotebookLM para achar o código da ementa sozinho — você ainda vai pedir acesso e fazer login no passo seguinte.</w:t>
+        <w:t xml:space="preserve"> é a ferramenta que consulta os ementários no NotebookLM para achar o código da ementa sozinho — instala o comando de terminal e a skill /notebooklm (catálogo na seção 3.1). Você ainda vai pedir acesso e fazer login no passo seguinte.</w:t>
       </w:r>
     </w:p>
     <w:p>
@@ -1704,6 +1704,70 @@
           </w:p>
         </w:tc>
       </w:tr>
+      <w:tr>
+        <w:tc>
+          <w:tcPr>
+            <w:tcW w:type="dxa" w:w="2600"/>
+            <w:tcBorders>
+              <w:top w:val="single" w:color="BFBFBF" w:sz="1"/>
+              <w:left w:val="single" w:color="BFBFBF" w:sz="1"/>
+              <w:bottom w:val="single" w:color="BFBFBF" w:sz="1"/>
+              <w:right w:val="single" w:color="BFBFBF" w:sz="1"/>
+            </w:tcBorders>
+            <w:tcMar>
+              <w:top w:type="dxa" w:w="80"/>
+              <w:left w:type="dxa" w:w="120"/>
+              <w:bottom w:type="dxa" w:w="80"/>
+              <w:right w:type="dxa" w:w="120"/>
+            </w:tcMar>
+          </w:tcPr>
+          <w:p>
+            <w:pPr>
+              <w:spacing w:after="0"/>
+              <w:jc w:val="both"/>
+            </w:pPr>
+            <w:r>
+              <w:rPr>
+                <w:rFonts w:ascii="Consolas" w:cs="Consolas" w:eastAsia="Consolas" w:hAnsi="Consolas"/>
+                <w:sz w:val="22"/>
+                <w:szCs w:val="22"/>
+              </w:rPr>
+              <w:t xml:space="preserve">/notebooklm</w:t>
+            </w:r>
+          </w:p>
+        </w:tc>
+        <w:tc>
+          <w:tcPr>
+            <w:tcW w:type="dxa" w:w="6760"/>
+            <w:tcBorders>
+              <w:top w:val="single" w:color="BFBFBF" w:sz="1"/>
+              <w:left w:val="single" w:color="BFBFBF" w:sz="1"/>
+              <w:bottom w:val="single" w:color="BFBFBF" w:sz="1"/>
+              <w:right w:val="single" w:color="BFBFBF" w:sz="1"/>
+            </w:tcBorders>
+            <w:tcMar>
+              <w:top w:type="dxa" w:w="80"/>
+              <w:left w:type="dxa" w:w="120"/>
+              <w:bottom w:type="dxa" w:w="80"/>
+              <w:right w:type="dxa" w:w="120"/>
+            </w:tcMar>
+          </w:tcPr>
+          <w:p>
+            <w:pPr>
+              <w:spacing w:after="0"/>
+              <w:jc w:val="left"/>
+            </w:pPr>
+            <w:r>
+              <w:rPr>
+                <w:rFonts w:ascii="Arial" w:cs="Arial" w:eastAsia="Arial" w:hAnsi="Arial"/>
+                <w:sz w:val="22"/>
+                <w:szCs w:val="22"/>
+              </w:rPr>
+              <w:t xml:space="preserve">Acesso completo à API do NotebookLM: criar notebooks, adicionar fontes (PDF, URL, YouTube, áudio), gerar resumos/podcasts/relatórios e baixar os artefatos — recursos que nem a interface web do NotebookLM oferece. É diferente do que as skills de lavratura já fazem por trás dos panos (apenas consulta de ementa, autenticada pela /notebooklm-login): use o /notebooklm quando você mesmo quiser criar ou organizar notebooks e fontes, não para autuar. Skill do projeto teng-lin/notebooklm-py, fora do aft-toolkit — depois de instalar o pacote (seção 2.3), é preciso rodar notebooklm skill install (uma única vez) para ela aparecer.</w:t>
+            </w:r>
+          </w:p>
+        </w:tc>
+      </w:tr>
     </w:tbl>
     <w:p>
       <w:pPr>
@@ -4451,6 +4515,70 @@
                 <w:szCs w:val="22"/>
               </w:rPr>
               <w:t xml:space="preserve">Peça ao Claude: “instale o notebooklm-py[browser] do repositório teng-lin com pipx e garanta que o comando notebooklm fique no PATH”; reinicie o terminal/app.</w:t>
+            </w:r>
+          </w:p>
+        </w:tc>
+      </w:tr>
+      <w:tr>
+        <w:tc>
+          <w:tcPr>
+            <w:tcW w:type="dxa" w:w="3500"/>
+            <w:tcBorders>
+              <w:top w:val="single" w:color="BFBFBF" w:sz="1"/>
+              <w:left w:val="single" w:color="BFBFBF" w:sz="1"/>
+              <w:bottom w:val="single" w:color="BFBFBF" w:sz="1"/>
+              <w:right w:val="single" w:color="BFBFBF" w:sz="1"/>
+            </w:tcBorders>
+            <w:tcMar>
+              <w:top w:type="dxa" w:w="80"/>
+              <w:left w:type="dxa" w:w="120"/>
+              <w:bottom w:type="dxa" w:w="80"/>
+              <w:right w:type="dxa" w:w="120"/>
+            </w:tcMar>
+          </w:tcPr>
+          <w:p>
+            <w:pPr>
+              <w:spacing w:after="0"/>
+              <w:jc w:val="left"/>
+            </w:pPr>
+            <w:r>
+              <w:rPr>
+                <w:rFonts w:ascii="Arial" w:cs="Arial" w:eastAsia="Arial" w:hAnsi="Arial"/>
+                <w:sz w:val="22"/>
+                <w:szCs w:val="22"/>
+              </w:rPr>
+              <w:t xml:space="preserve">Skill /notebooklm não aparece (mas notebooklm --help funciona)</w:t>
+            </w:r>
+          </w:p>
+        </w:tc>
+        <w:tc>
+          <w:tcPr>
+            <w:tcW w:type="dxa" w:w="5860"/>
+            <w:tcBorders>
+              <w:top w:val="single" w:color="BFBFBF" w:sz="1"/>
+              <w:left w:val="single" w:color="BFBFBF" w:sz="1"/>
+              <w:bottom w:val="single" w:color="BFBFBF" w:sz="1"/>
+              <w:right w:val="single" w:color="BFBFBF" w:sz="1"/>
+            </w:tcBorders>
+            <w:tcMar>
+              <w:top w:type="dxa" w:w="80"/>
+              <w:left w:type="dxa" w:w="120"/>
+              <w:bottom w:type="dxa" w:w="80"/>
+              <w:right w:type="dxa" w:w="120"/>
+            </w:tcMar>
+          </w:tcPr>
+          <w:p>
+            <w:pPr>
+              <w:spacing w:after="0"/>
+              <w:jc w:val="left"/>
+            </w:pPr>
+            <w:r>
+              <w:rPr>
+                <w:rFonts w:ascii="Arial" w:cs="Arial" w:eastAsia="Arial" w:hAnsi="Arial"/>
+                <w:sz w:val="22"/>
+                <w:szCs w:val="22"/>
+              </w:rPr>
+              <w:t xml:space="preserve">Peça ao Claude: “rode notebooklm skill install” e depois feche e reabra o app. O pip/pipx instala só o comando de terminal — a skill precisa desse passo extra (seção 3.1).</w:t>
             </w:r>
           </w:p>
         </w:tc>

</xml_diff>

<commit_message>
Adiciona skill /analise-acidente (analise de acidente do trabalho)
- SKILL.md: skill completa com 4 fases (entrada, apuracao, relatorio, encadeamento)
  seguindo a IN GMTP/MTP n. 2/2022 e o roteiro de 6 secoes definido pelo AFT
- fatores-sfit.md: tabela oficial completa do SFIT (familias 251-260, codigos 6 digitos)
- scripts/gerar_relatorio_docx.py: gerador de relatorio em .docx (testado, python-docx)
- Apostila-AFT-Toolkit.docx: skill registrada na tabela 3.2 (Inspecao e lavratura)
</commit_message>
<xml_diff>
--- a/Apostila-AFT-Toolkit.docx
+++ b/Apostila-AFT-Toolkit.docx
@@ -2379,6 +2379,41 @@
                 <w:szCs w:val="22"/>
               </w:rPr>
               <w:t xml:space="preserve">Risco grave e iminente: gera o Relatório Técnico de Interdição/Embargo em Word (.docx) a partir do modelo oficial e, em seguida, redige os autos derivados das ementas do RT.</w:t>
+            </w:r>
+          </w:p>
+        </w:tc>
+      </w:tr>
+      <w:tr>
+        <w:tc>
+          <w:tcPr>
+            <w:tcW w:type="dxa" w:w="2600"/>
+          </w:tcPr>
+          <w:p>
+            <w:pPr>
+              <w:spacing w:after="40"/>
+            </w:pPr>
+            <w:r>
+              <w:rPr>
+                <w:b/>
+                <w:sz w:val="22"/>
+              </w:rPr>
+              <w:t>/analise-acidente</w:t>
+            </w:r>
+          </w:p>
+        </w:tc>
+        <w:tc>
+          <w:tcPr>
+            <w:tcW w:type="dxa" w:w="6760"/>
+          </w:tcPr>
+          <w:p>
+            <w:pPr>
+              <w:spacing w:after="40"/>
+            </w:pPr>
+            <w:r>
+              <w:rPr>
+                <w:sz w:val="22"/>
+              </w:rPr>
+              <w:t>Analise de acidente do trabalho: le os documentos do caso (CAT, Boletim de Ocorrencia, PGR, laudos, depoimentos, fotos), redige o Relatorio de Analise na estrutura da IN GMTP/MTP n. 2/2022, propoe os fatores causais com os codigos oficiais do SFIT (familias 251-260) para confirmacao do AFT e entrega o relatorio em Word. Ao final, pergunta se deve encadear a lavratura de autos (/inspecao-inicial + /gera-ai).</w:t>
             </w:r>
           </w:p>
         </w:tc>

</xml_diff>

<commit_message>
Apostila: documenta /revisa-auto e adiciona secao 1.2 sobre modelos do Claude
Inclui /revisa-auto na tabela de empacotamento (3.5) e explica em
linguagem simples a diferenca entre Haiku, Sonnet e Opus para os AFTs.

Co-Authored-By: Claude Sonnet 4.6 <noreply@anthropic.com>
</commit_message>
<xml_diff>
--- a/Apostila-AFT-Toolkit.docx
+++ b/Apostila-AFT-Toolkit.docx
@@ -273,6 +273,128 @@
           <w:szCs w:val="22"/>
         </w:rPr>
         <w:t xml:space="preserve">A IA redige e organiza; quem decide, revisa e transmite é sempre o Auditor. Nenhum documento sai do seu computador sem a sua ação.</w:t>
+      </w:r>
+    </w:p>
+    <w:p>
+      <w:pPr>
+        <w:pStyle w:val="Heading2"/>
+      </w:pPr>
+      <w:r>
+        <w:t xml:space="preserve">1.2 Os modelos do Claude: Haiku, Sonnet e Opus</w:t>
+      </w:r>
+    </w:p>
+    <w:p>
+      <w:pPr>
+        <w:spacing w:after="120"/>
+        <w:jc w:val="both"/>
+      </w:pPr>
+      <w:r>
+        <w:rPr>
+          <w:rFonts w:ascii="Arial" w:cs="Arial" w:eastAsia="Arial" w:hAnsi="Arial"/>
+          <w:sz w:val="22"/>
+          <w:szCs w:val="22"/>
+        </w:rPr>
+        <w:t xml:space="preserve">No aplicativo Claude existe um seletor de modelo. Não é outro programa nem outra IA: é o mesmo Claude, em três "tamanhos" diferentes — como escolher entre econômico, completo e turbo num carro. Você não precisa entender de tecnologia para usar o toolkit, mas é útil saber o que cada um faz:</w:t>
+      </w:r>
+    </w:p>
+    <w:p>
+      <w:pPr>
+        <w:pStyle w:val="ListParagraph"/>
+        <w:numPr>
+          <w:ilvl w:val="0"/>
+          <w:numId w:val="2"/>
+        </w:numPr>
+        <w:spacing w:after="80"/>
+      </w:pPr>
+      <w:r>
+        <w:rPr>
+          <w:rFonts w:ascii="Arial" w:cs="Arial" w:eastAsia="Arial" w:hAnsi="Arial"/>
+          <w:b/>
+          <w:bCs/>
+          <w:sz w:val="22"/>
+          <w:szCs w:val="22"/>
+        </w:rPr>
+        <w:t xml:space="preserve">Haiku — o mais rápido. </w:t>
+      </w:r>
+      <w:r>
+        <w:rPr>
+          <w:rFonts w:ascii="Arial" w:cs="Arial" w:eastAsia="Arial" w:hAnsi="Arial"/>
+          <w:sz w:val="22"/>
+          <w:szCs w:val="22"/>
+        </w:rPr>
+        <w:t xml:space="preserve">Responde quase na hora. Bom para perguntas curtas e diretas, mas pode entregar algo mais superficial em tarefas longas, como redigir um auto inteiro.</w:t>
+      </w:r>
+    </w:p>
+    <w:p>
+      <w:pPr>
+        <w:pStyle w:val="ListParagraph"/>
+        <w:numPr>
+          <w:ilvl w:val="0"/>
+          <w:numId w:val="2"/>
+        </w:numPr>
+        <w:spacing w:after="80"/>
+      </w:pPr>
+      <w:r>
+        <w:rPr>
+          <w:rFonts w:ascii="Arial" w:cs="Arial" w:eastAsia="Arial" w:hAnsi="Arial"/>
+          <w:b/>
+          <w:bCs/>
+          <w:sz w:val="22"/>
+          <w:szCs w:val="22"/>
+        </w:rPr>
+        <w:t xml:space="preserve">Sonnet — o equilíbrio do dia a dia. </w:t>
+      </w:r>
+      <w:r>
+        <w:rPr>
+          <w:rFonts w:ascii="Arial" w:cs="Arial" w:eastAsia="Arial" w:hAnsi="Arial"/>
+          <w:sz w:val="22"/>
+          <w:szCs w:val="22"/>
+        </w:rPr>
+        <w:t xml:space="preserve">É o modelo padrão do AFT Toolkit e dá conta bem da grande maioria das skills — redigir autos, analisar um PGR, montar a jornada — com boa velocidade. Na prática, você nem precisa trocar nada.</w:t>
+      </w:r>
+    </w:p>
+    <w:p>
+      <w:pPr>
+        <w:pStyle w:val="ListParagraph"/>
+        <w:numPr>
+          <w:ilvl w:val="0"/>
+          <w:numId w:val="2"/>
+        </w:numPr>
+        <w:spacing w:after="80"/>
+      </w:pPr>
+      <w:r>
+        <w:rPr>
+          <w:rFonts w:ascii="Arial" w:cs="Arial" w:eastAsia="Arial" w:hAnsi="Arial"/>
+          <w:b/>
+          <w:bCs/>
+          <w:sz w:val="22"/>
+          <w:szCs w:val="22"/>
+        </w:rPr>
+        <w:t xml:space="preserve">Opus — o mais cuidadoso. </w:t>
+      </w:r>
+      <w:r>
+        <w:rPr>
+          <w:rFonts w:ascii="Arial" w:cs="Arial" w:eastAsia="Arial" w:hAnsi="Arial"/>
+          <w:sz w:val="22"/>
+          <w:szCs w:val="22"/>
+        </w:rPr>
+        <w:t xml:space="preserve">Pensa mais antes de responder e por isso demora um pouco mais. Vale a pena reservar para os casos mais difíceis — um acidente de trabalho complexo, um PGR muito extenso, uma jornada de trabalho com várias inconsistências — quando compensa esperar um pouco mais por uma análise mais cuidadosa.</w:t>
+      </w:r>
+    </w:p>
+    <w:p>
+      <w:pPr>
+        <w:spacing w:after="240"/>
+        <w:jc w:val="both"/>
+      </w:pPr>
+      <w:r>
+        <w:rPr>
+          <w:rFonts w:ascii="Arial" w:cs="Arial" w:eastAsia="Arial" w:hAnsi="Arial"/>
+          <w:i/>
+          <w:iCs/>
+          <w:sz w:val="22"/>
+          <w:szCs w:val="22"/>
+        </w:rPr>
+        <w:t xml:space="preserve">Dica: o aplicativo já vem configurado com um modelo que atende bem ao dia a dia do toolkit. Só vale procurar o seletor de modelo e trocar para o Opus se sentir que uma tarefa muito complexa saiu rápida demais e superficial — para o uso comum, não é necessário tocar nisso.</w:t>
       </w:r>
     </w:p>
     <w:p>
@@ -3185,6 +3307,70 @@
                 <w:szCs w:val="22"/>
               </w:rPr>
               <w:t xml:space="preserve">O empacotador: pega os autos já redigidos (por qualquer skill ou colados por você), coleta os dados administrativos, converte fotos de evidência em PDF e gera o arquivo TXT no formato e encoding exatos do Sistema Auditor. É aqui que a anonimização é aplicada e revertida com segurança.</w:t>
+            </w:r>
+          </w:p>
+        </w:tc>
+      </w:tr>
+      <w:tr>
+        <w:tc>
+          <w:tcPr>
+            <w:tcW w:type="dxa" w:w="2600"/>
+            <w:tcBorders>
+              <w:top w:val="single" w:color="BFBFBF" w:sz="1"/>
+              <w:left w:val="single" w:color="BFBFBF" w:sz="1"/>
+              <w:bottom w:val="single" w:color="BFBFBF" w:sz="1"/>
+              <w:right w:val="single" w:color="BFBFBF" w:sz="1"/>
+            </w:tcBorders>
+            <w:tcMar>
+              <w:top w:type="dxa" w:w="80"/>
+              <w:left w:type="dxa" w:w="120"/>
+              <w:bottom w:type="dxa" w:w="80"/>
+              <w:right w:type="dxa" w:w="120"/>
+            </w:tcMar>
+          </w:tcPr>
+          <w:p>
+            <w:pPr>
+              <w:spacing w:after="0"/>
+              <w:jc w:val="both"/>
+            </w:pPr>
+            <w:r>
+              <w:rPr>
+                <w:rFonts w:ascii="Consolas" w:cs="Consolas" w:eastAsia="Consolas" w:hAnsi="Consolas"/>
+                <w:sz w:val="22"/>
+                <w:szCs w:val="22"/>
+              </w:rPr>
+              <w:t xml:space="preserve">/revisa-auto</w:t>
+            </w:r>
+          </w:p>
+        </w:tc>
+        <w:tc>
+          <w:tcPr>
+            <w:tcW w:type="dxa" w:w="6760"/>
+            <w:tcBorders>
+              <w:top w:val="single" w:color="BFBFBF" w:sz="1"/>
+              <w:left w:val="single" w:color="BFBFBF" w:sz="1"/>
+              <w:bottom w:val="single" w:color="BFBFBF" w:sz="1"/>
+              <w:right w:val="single" w:color="BFBFBF" w:sz="1"/>
+            </w:tcBorders>
+            <w:tcMar>
+              <w:top w:type="dxa" w:w="80"/>
+              <w:left w:type="dxa" w:w="120"/>
+              <w:bottom w:type="dxa" w:w="80"/>
+              <w:right w:type="dxa" w:w="120"/>
+            </w:tcMar>
+          </w:tcPr>
+          <w:p>
+            <w:pPr>
+              <w:spacing w:after="0"/>
+              <w:jc w:val="left"/>
+            </w:pPr>
+            <w:r>
+              <w:rPr>
+                <w:rFonts w:ascii="Arial" w:cs="Arial" w:eastAsia="Arial" w:hAnsi="Arial"/>
+                <w:sz w:val="22"/>
+                <w:szCs w:val="22"/>
+              </w:rPr>
+              <w:t xml:space="preserve">Revisor de qualidade que roda automaticamente dentro do /gera-ai, antes do empacotamento: confere o checklist 5W1H (O Quê, Quando, Onde, Como, Por Quê) em cada auto e, em autos de SST, garante o parágrafo de dano coletivo (Portaria MTP 667/2021). Também pode ser chamado isoladamente sobre um rascunho de auto.</w:t>
             </w:r>
           </w:p>
         </w:tc>

</xml_diff>

<commit_message>
Apostila: documenta /aft-atualizar na secao 3.1
Adiciona a linha do /aft-atualizar na tabela de Configuracao e visao
geral, logo apos o /aft-doctor.
</commit_message>
<xml_diff>
--- a/Apostila-AFT-Toolkit.docx
+++ b/Apostila-AFT-Toolkit.docx
@@ -1694,6 +1694,70 @@
                 <w:szCs w:val="22"/>
               </w:rPr>
               <w:t xml:space="preserve">Check-up da instalação: confere se Python, Git, as skills, a configuração, o seu perfil, a pasta de trabalho e as bibliotecas estão no lugar — e diz, em linguagem simples, o que falta e como resolver. Rode logo após o /aft-setup e sempre que algo não funcionar. Só diagnostica; não altera nada.</w:t>
+            </w:r>
+          </w:p>
+        </w:tc>
+      </w:tr>
+      <w:tr>
+        <w:tc>
+          <w:tcPr>
+            <w:tcW w:type="dxa" w:w="2600"/>
+            <w:tcBorders>
+              <w:top w:val="single" w:color="BFBFBF" w:sz="1"/>
+              <w:left w:val="single" w:color="BFBFBF" w:sz="1"/>
+              <w:bottom w:val="single" w:color="BFBFBF" w:sz="1"/>
+              <w:right w:val="single" w:color="BFBFBF" w:sz="1"/>
+            </w:tcBorders>
+            <w:tcMar>
+              <w:top w:type="dxa" w:w="80"/>
+              <w:left w:type="dxa" w:w="120"/>
+              <w:bottom w:type="dxa" w:w="80"/>
+              <w:right w:type="dxa" w:w="120"/>
+            </w:tcMar>
+          </w:tcPr>
+          <w:p>
+            <w:pPr>
+              <w:spacing w:after="0"/>
+              <w:jc w:val="both"/>
+            </w:pPr>
+            <w:r>
+              <w:rPr>
+                <w:rFonts w:ascii="Consolas" w:cs="Consolas" w:eastAsia="Consolas" w:hAnsi="Consolas"/>
+                <w:sz w:val="22"/>
+                <w:szCs w:val="22"/>
+              </w:rPr>
+              <w:t xml:space="preserve">/aft-atualizar</w:t>
+            </w:r>
+          </w:p>
+        </w:tc>
+        <w:tc>
+          <w:tcPr>
+            <w:tcW w:type="dxa" w:w="6760"/>
+            <w:tcBorders>
+              <w:top w:val="single" w:color="BFBFBF" w:sz="1"/>
+              <w:left w:val="single" w:color="BFBFBF" w:sz="1"/>
+              <w:bottom w:val="single" w:color="BFBFBF" w:sz="1"/>
+              <w:right w:val="single" w:color="BFBFBF" w:sz="1"/>
+            </w:tcBorders>
+            <w:tcMar>
+              <w:top w:type="dxa" w:w="80"/>
+              <w:left w:type="dxa" w:w="120"/>
+              <w:bottom w:type="dxa" w:w="80"/>
+              <w:right w:type="dxa" w:w="120"/>
+            </w:tcMar>
+          </w:tcPr>
+          <w:p>
+            <w:pPr>
+              <w:spacing w:after="0"/>
+              <w:jc w:val="left"/>
+            </w:pPr>
+            <w:r>
+              <w:rPr>
+                <w:rFonts w:ascii="Arial" w:cs="Arial" w:eastAsia="Arial" w:hAnsi="Arial"/>
+                <w:sz w:val="22"/>
+                <w:szCs w:val="22"/>
+              </w:rPr>
+              <w:t xml:space="preserve">Atualiza as skills (git pull no repositório do toolkit) e o comando notebooklm (notebooklm-py), se houver versão nova, e roda o /aft-doctor ao final para confirmar que nada quebrou. Diferente do /aft-doctor (só diagnostica), esta skill é a que baixa e instala as atualizações de fato.</w:t>
             </w:r>
           </w:p>
         </w:tc>

</xml_diff>

<commit_message>
docs: atualização manual da apostila
Ajustes feitos diretamente no Word pelo Ricardo.

Co-Authored-By: Claude Sonnet 5 <noreply@anthropic.com>
</commit_message>
<xml_diff>
--- a/Apostila-AFT-Toolkit.docx
+++ b/Apostila-AFT-Toolkit.docx
@@ -2545,7 +2545,23 @@
           <w:rFonts w:ascii="Calibri" w:hAnsi="Calibri" w:cs="Calibri"/>
           <w:color w:val="1A1A1A"/>
         </w:rPr>
-        <w:t> Conversando em português, como num chat. Quando o seu pedido casa com uma skill, ela entra em ação sozinha (ou você chama pelo nome, ex.: </w:t>
+        <w:t xml:space="preserve"> Conversando em português, como num chat. Quando o seu pedido </w:t>
+      </w:r>
+      <w:proofErr w:type="gramStart"/>
+      <w:r>
+        <w:rPr>
+          <w:rFonts w:ascii="Calibri" w:hAnsi="Calibri" w:cs="Calibri"/>
+          <w:color w:val="1A1A1A"/>
+        </w:rPr>
+        <w:t>casa</w:t>
+      </w:r>
+      <w:proofErr w:type="gramEnd"/>
+      <w:r>
+        <w:rPr>
+          <w:rFonts w:ascii="Calibri" w:hAnsi="Calibri" w:cs="Calibri"/>
+          <w:color w:val="1A1A1A"/>
+        </w:rPr>
+        <w:t xml:space="preserve"> com uma skill, ela entra em ação sozinha (ou você chama pelo nome, ex.: </w:t>
       </w:r>
       <w:r>
         <w:rPr>
@@ -3621,7 +3637,97 @@
           <w:bdr w:val="single" w:sz="8" w:space="4" w:color="0D9488" w:frame="1"/>
           <w:shd w:val="clear" w:color="auto" w:fill="FFFFFF"/>
         </w:rPr>
-        <w:t>/PGR-analise/aet-auditoria/jornada-analise/auditoria-AR-NR12/analise-acidente</w:t>
+        <w:t>/PGR-</w:t>
+      </w:r>
+      <w:proofErr w:type="gramStart"/>
+      <w:r>
+        <w:rPr>
+          <w:rStyle w:val="chip"/>
+          <w:rFonts w:ascii="Calibri" w:hAnsi="Calibri" w:cs="Calibri"/>
+          <w:b/>
+          <w:bCs/>
+          <w:color w:val="0D9488"/>
+          <w:sz w:val="24"/>
+          <w:szCs w:val="24"/>
+          <w:bdr w:val="single" w:sz="8" w:space="4" w:color="0D9488" w:frame="1"/>
+          <w:shd w:val="clear" w:color="auto" w:fill="FFFFFF"/>
+        </w:rPr>
+        <w:t>analise</w:t>
+      </w:r>
+      <w:proofErr w:type="gramEnd"/>
+      <w:r>
+        <w:rPr>
+          <w:rStyle w:val="chip"/>
+          <w:rFonts w:ascii="Calibri" w:hAnsi="Calibri" w:cs="Calibri"/>
+          <w:b/>
+          <w:bCs/>
+          <w:color w:val="0D9488"/>
+          <w:sz w:val="24"/>
+          <w:szCs w:val="24"/>
+          <w:bdr w:val="single" w:sz="8" w:space="4" w:color="0D9488" w:frame="1"/>
+          <w:shd w:val="clear" w:color="auto" w:fill="FFFFFF"/>
+        </w:rPr>
+        <w:t>/aet-auditoria/jornada-</w:t>
+      </w:r>
+      <w:proofErr w:type="gramStart"/>
+      <w:r>
+        <w:rPr>
+          <w:rStyle w:val="chip"/>
+          <w:rFonts w:ascii="Calibri" w:hAnsi="Calibri" w:cs="Calibri"/>
+          <w:b/>
+          <w:bCs/>
+          <w:color w:val="0D9488"/>
+          <w:sz w:val="24"/>
+          <w:szCs w:val="24"/>
+          <w:bdr w:val="single" w:sz="8" w:space="4" w:color="0D9488" w:frame="1"/>
+          <w:shd w:val="clear" w:color="auto" w:fill="FFFFFF"/>
+        </w:rPr>
+        <w:t>analise</w:t>
+      </w:r>
+      <w:proofErr w:type="gramEnd"/>
+      <w:r>
+        <w:rPr>
+          <w:rStyle w:val="chip"/>
+          <w:rFonts w:ascii="Calibri" w:hAnsi="Calibri" w:cs="Calibri"/>
+          <w:b/>
+          <w:bCs/>
+          <w:color w:val="0D9488"/>
+          <w:sz w:val="24"/>
+          <w:szCs w:val="24"/>
+          <w:bdr w:val="single" w:sz="8" w:space="4" w:color="0D9488" w:frame="1"/>
+          <w:shd w:val="clear" w:color="auto" w:fill="FFFFFF"/>
+        </w:rPr>
+        <w:t>/auditoria-AR-NR12/</w:t>
+      </w:r>
+      <w:proofErr w:type="gramStart"/>
+      <w:r>
+        <w:rPr>
+          <w:rStyle w:val="chip"/>
+          <w:rFonts w:ascii="Calibri" w:hAnsi="Calibri" w:cs="Calibri"/>
+          <w:b/>
+          <w:bCs/>
+          <w:color w:val="0D9488"/>
+          <w:sz w:val="24"/>
+          <w:szCs w:val="24"/>
+          <w:bdr w:val="single" w:sz="8" w:space="4" w:color="0D9488" w:frame="1"/>
+          <w:shd w:val="clear" w:color="auto" w:fill="FFFFFF"/>
+        </w:rPr>
+        <w:t>analise</w:t>
+      </w:r>
+      <w:proofErr w:type="gramEnd"/>
+      <w:r>
+        <w:rPr>
+          <w:rStyle w:val="chip"/>
+          <w:rFonts w:ascii="Calibri" w:hAnsi="Calibri" w:cs="Calibri"/>
+          <w:b/>
+          <w:bCs/>
+          <w:color w:val="0D9488"/>
+          <w:sz w:val="24"/>
+          <w:szCs w:val="24"/>
+          <w:bdr w:val="single" w:sz="8" w:space="4" w:color="0D9488" w:frame="1"/>
+          <w:shd w:val="clear" w:color="auto" w:fill="FFFFFF"/>
+        </w:rPr>
+        <w:t>-acidente</w:t>
       </w:r>
       <w:r>
         <w:rPr>
@@ -3850,9 +3956,25 @@
           <w:bdr w:val="single" w:sz="8" w:space="4" w:color="16A34A" w:frame="1"/>
           <w:shd w:val="clear" w:color="auto" w:fill="FFFFFF"/>
         </w:rPr>
-        <w:t>gera-ai</w:t>
+        <w:t>gera-</w:t>
+      </w:r>
+      <w:proofErr w:type="gramStart"/>
+      <w:r>
+        <w:rPr>
+          <w:rStyle w:val="chip"/>
+          <w:rFonts w:ascii="Calibri" w:hAnsi="Calibri" w:cs="Calibri"/>
+          <w:b/>
+          <w:bCs/>
+          <w:color w:val="16A34A"/>
+          <w:sz w:val="24"/>
+          <w:szCs w:val="24"/>
+          <w:bdr w:val="single" w:sz="8" w:space="4" w:color="16A34A" w:frame="1"/>
+          <w:shd w:val="clear" w:color="auto" w:fill="FFFFFF"/>
+        </w:rPr>
+        <w:t>ai</w:t>
       </w:r>
       <w:proofErr w:type="spellEnd"/>
+      <w:proofErr w:type="gramEnd"/>
     </w:p>
     <w:p>
       <w:pPr>
@@ -4624,6 +4746,7 @@
           <w:szCs w:val="24"/>
         </w:rPr>
       </w:pPr>
+      <w:proofErr w:type="gramStart"/>
       <w:r>
         <w:rPr>
           <w:rFonts w:ascii="Calibri" w:hAnsi="Calibri" w:cs="Calibri"/>
@@ -4654,7 +4777,16 @@
           <w:sz w:val="24"/>
           <w:szCs w:val="24"/>
         </w:rPr>
-        <w:t>a ação fiscal antes de ir a campo</w:t>
+        <w:t>a</w:t>
+      </w:r>
+      <w:proofErr w:type="gramEnd"/>
+      <w:r>
+        <w:rPr>
+          <w:rFonts w:ascii="Calibri" w:hAnsi="Calibri" w:cs="Calibri"/>
+          <w:sz w:val="24"/>
+          <w:szCs w:val="24"/>
+        </w:rPr>
+        <w:t xml:space="preserve"> ação fiscal antes de ir a campo</w:t>
       </w:r>
       <w:r>
         <w:rPr>
@@ -4680,6 +4812,7 @@
           <w:szCs w:val="24"/>
         </w:rPr>
       </w:pPr>
+      <w:proofErr w:type="gramStart"/>
       <w:r>
         <w:rPr>
           <w:rFonts w:ascii="Calibri" w:hAnsi="Calibri" w:cs="Calibri"/>
@@ -4710,7 +4843,16 @@
           <w:sz w:val="24"/>
           <w:szCs w:val="24"/>
         </w:rPr>
-        <w:t>o relato da sua inspeção física</w:t>
+        <w:t>o</w:t>
+      </w:r>
+      <w:proofErr w:type="gramEnd"/>
+      <w:r>
+        <w:rPr>
+          <w:rFonts w:ascii="Calibri" w:hAnsi="Calibri" w:cs="Calibri"/>
+          <w:sz w:val="24"/>
+          <w:szCs w:val="24"/>
+        </w:rPr>
+        <w:t xml:space="preserve"> relato da sua inspeção física</w:t>
       </w:r>
       <w:r>
         <w:rPr>
@@ -5709,7 +5851,25 @@
           <w:sz w:val="24"/>
           <w:szCs w:val="24"/>
         </w:rPr>
-        <w:t xml:space="preserve">”, que acessa pastas, documentos, cria arquivos, pastas, processa scripts localmente e etc. É nela que a </w:t>
+        <w:t xml:space="preserve">”, que acessa pastas, documentos, cria arquivos, pastas, processa scripts </w:t>
+      </w:r>
+      <w:proofErr w:type="gramStart"/>
+      <w:r>
+        <w:rPr>
+          <w:rFonts w:ascii="Calibri" w:hAnsi="Calibri" w:cs="Calibri"/>
+          <w:sz w:val="24"/>
+          <w:szCs w:val="24"/>
+        </w:rPr>
+        <w:t>localmente e etc.</w:t>
+      </w:r>
+      <w:proofErr w:type="gramEnd"/>
+      <w:r>
+        <w:rPr>
+          <w:rFonts w:ascii="Calibri" w:hAnsi="Calibri" w:cs="Calibri"/>
+          <w:sz w:val="24"/>
+          <w:szCs w:val="24"/>
+        </w:rPr>
+        <w:t xml:space="preserve"> É nela que a </w:t>
       </w:r>
       <w:proofErr w:type="spellStart"/>
       <w:r>
@@ -5925,7 +6085,7 @@
           <w:szCs w:val="24"/>
         </w:rPr>
         <w:drawing>
-          <wp:inline distT="0" distB="0" distL="0" distR="0" wp14:anchorId="521E0C67" wp14:editId="5B9212A1">
+          <wp:inline distT="0" distB="0" distL="0" distR="0" wp14:anchorId="521E0C67" wp14:editId="62491E27">
             <wp:extent cx="6078957" cy="3530279"/>
             <wp:effectExtent l="0" t="0" r="4445" b="635"/>
             <wp:docPr id="1877105587" name="Imagem 3" descr="Interface gráfica do usuário, Texto, Aplicativo, Email&#10;&#10;O conteúdo gerado por IA pode estar incorreto."/>
@@ -6075,14 +6235,10 @@
           <w:sz w:val="24"/>
           <w:szCs w:val="24"/>
         </w:rPr>
-        <w:t># Sou um  Auditor-Fiscal do Trabalho (AFT), servidor público  federal, cuja principal função é garantir o cumprimento da legislação trabalhista  em empresas e instituições, tanto públicas quanto privadas, em todo o território nacional.</w:t>
-      </w:r>
-    </w:p>
-    <w:p>
-      <w:pPr>
-        <w:pStyle w:val="PargrafodaLista"/>
-        <w:spacing w:after="80"/>
-        <w:ind w:left="720"/>
+        <w:t xml:space="preserve"># Sou </w:t>
+      </w:r>
+      <w:proofErr w:type="gramStart"/>
+      <w:r>
         <w:rPr>
           <w:rFonts w:ascii="Calibri" w:hAnsi="Calibri" w:cs="Calibri"/>
           <w:b/>
@@ -6093,13 +6249,10 @@
           <w:sz w:val="24"/>
           <w:szCs w:val="24"/>
         </w:rPr>
-      </w:pPr>
-    </w:p>
-    <w:p>
-      <w:pPr>
-        <w:pStyle w:val="PargrafodaLista"/>
-        <w:spacing w:after="80"/>
-        <w:ind w:left="720"/>
+        <w:t>um  Auditor</w:t>
+      </w:r>
+      <w:proofErr w:type="gramEnd"/>
+      <w:r>
         <w:rPr>
           <w:rFonts w:ascii="Calibri" w:hAnsi="Calibri" w:cs="Calibri"/>
           <w:b/>
@@ -6110,7 +6263,9 @@
           <w:sz w:val="24"/>
           <w:szCs w:val="24"/>
         </w:rPr>
-      </w:pPr>
+        <w:t xml:space="preserve">-Fiscal do Trabalho (AFT), servidor </w:t>
+      </w:r>
+      <w:proofErr w:type="gramStart"/>
       <w:r>
         <w:rPr>
           <w:rFonts w:ascii="Calibri" w:hAnsi="Calibri" w:cs="Calibri"/>
@@ -6122,14 +6277,10 @@
           <w:sz w:val="24"/>
           <w:szCs w:val="24"/>
         </w:rPr>
-        <w:t>Minhas  atividades são multifacetadas e incluem:</w:t>
-      </w:r>
-    </w:p>
-    <w:p>
-      <w:pPr>
-        <w:pStyle w:val="PargrafodaLista"/>
-        <w:spacing w:after="80"/>
-        <w:ind w:left="720"/>
+        <w:t>público  federal</w:t>
+      </w:r>
+      <w:proofErr w:type="gramEnd"/>
+      <w:r>
         <w:rPr>
           <w:rFonts w:ascii="Calibri" w:hAnsi="Calibri" w:cs="Calibri"/>
           <w:b/>
@@ -6140,13 +6291,10 @@
           <w:sz w:val="24"/>
           <w:szCs w:val="24"/>
         </w:rPr>
-      </w:pPr>
-    </w:p>
-    <w:p>
-      <w:pPr>
-        <w:pStyle w:val="PargrafodaLista"/>
-        <w:spacing w:after="80"/>
-        <w:ind w:left="720"/>
+        <w:t xml:space="preserve">, cuja principal função é garantir o cumprimento da legislação </w:t>
+      </w:r>
+      <w:proofErr w:type="gramStart"/>
+      <w:r>
         <w:rPr>
           <w:rFonts w:ascii="Calibri" w:hAnsi="Calibri" w:cs="Calibri"/>
           <w:b/>
@@ -6157,7 +6305,9 @@
           <w:sz w:val="24"/>
           <w:szCs w:val="24"/>
         </w:rPr>
-      </w:pPr>
+        <w:t>trabalhista  em</w:t>
+      </w:r>
+      <w:proofErr w:type="gramEnd"/>
       <w:r>
         <w:rPr>
           <w:rFonts w:ascii="Calibri" w:hAnsi="Calibri" w:cs="Calibri"/>
@@ -6169,8 +6319,7 @@
           <w:sz w:val="24"/>
           <w:szCs w:val="24"/>
         </w:rPr>
-        <w:lastRenderedPageBreak/>
-        <w:t>* Fiscalização: Realizar inspeções nos locais de trabalho para verificar se estão sendo respeitados os direitos dos trabalhadores, como jornada de trabalho, salário mínimo, registro em carteira, depósitos de FGTS e outros.</w:t>
+        <w:t xml:space="preserve"> empresas e instituições, tanto públicas quanto privadas, em todo o território nacional.</w:t>
       </w:r>
     </w:p>
     <w:p>
@@ -6206,6 +6355,7 @@
           <w:szCs w:val="24"/>
         </w:rPr>
       </w:pPr>
+      <w:proofErr w:type="gramStart"/>
       <w:r>
         <w:rPr>
           <w:rFonts w:ascii="Calibri" w:hAnsi="Calibri" w:cs="Calibri"/>
@@ -6217,14 +6367,10 @@
           <w:sz w:val="24"/>
           <w:szCs w:val="24"/>
         </w:rPr>
-        <w:t>* Segurança e Saúde no Trabalho: Fiscalizar o cumprimento das Normas Regulamentadoras (NRs), garantindo que o ambiente de trabalho seja seguro e saudável, e analisar as causas de acidentes de trabalho.</w:t>
-      </w:r>
-    </w:p>
-    <w:p>
-      <w:pPr>
-        <w:pStyle w:val="PargrafodaLista"/>
-        <w:spacing w:after="80"/>
-        <w:ind w:left="720"/>
+        <w:t>Minhas  atividades</w:t>
+      </w:r>
+      <w:proofErr w:type="gramEnd"/>
+      <w:r>
         <w:rPr>
           <w:rFonts w:ascii="Calibri" w:hAnsi="Calibri" w:cs="Calibri"/>
           <w:b/>
@@ -6235,7 +6381,8 @@
           <w:sz w:val="24"/>
           <w:szCs w:val="24"/>
         </w:rPr>
-      </w:pPr>
+        <w:t xml:space="preserve"> são multifacetadas e incluem:</w:t>
+      </w:r>
     </w:p>
     <w:p>
       <w:pPr>
@@ -6253,7 +6400,12 @@
           <w:szCs w:val="24"/>
         </w:rPr>
       </w:pPr>
-      <w:r>
+    </w:p>
+    <w:p>
+      <w:pPr>
+        <w:pStyle w:val="PargrafodaLista"/>
+        <w:spacing w:after="80"/>
+        <w:ind w:left="720"/>
         <w:rPr>
           <w:rFonts w:ascii="Calibri" w:hAnsi="Calibri" w:cs="Calibri"/>
           <w:b/>
@@ -6264,14 +6416,8 @@
           <w:sz w:val="24"/>
           <w:szCs w:val="24"/>
         </w:rPr>
-        <w:t>* Combate a Irregularidades: Atuar no combate a formas graves de violação de direitos, como:</w:t>
-      </w:r>
-    </w:p>
-    <w:p>
-      <w:pPr>
-        <w:pStyle w:val="PargrafodaLista"/>
-        <w:spacing w:after="80"/>
-        <w:ind w:left="720"/>
+      </w:pPr>
+      <w:r>
         <w:rPr>
           <w:rFonts w:ascii="Calibri" w:hAnsi="Calibri" w:cs="Calibri"/>
           <w:b/>
@@ -6282,7 +6428,10 @@
           <w:sz w:val="24"/>
           <w:szCs w:val="24"/>
         </w:rPr>
-      </w:pPr>
+        <w:lastRenderedPageBreak/>
+        <w:t xml:space="preserve">* Fiscalização: Realizar inspeções nos locais de trabalho para verificar se estão sendo respeitados os direitos dos trabalhadores, como jornada de trabalho, </w:t>
+      </w:r>
+      <w:proofErr w:type="gramStart"/>
       <w:r>
         <w:rPr>
           <w:rFonts w:ascii="Calibri" w:hAnsi="Calibri" w:cs="Calibri"/>
@@ -6294,14 +6443,10 @@
           <w:sz w:val="24"/>
           <w:szCs w:val="24"/>
         </w:rPr>
-        <w:t>Trabalho análogo à escravidão.</w:t>
-      </w:r>
-    </w:p>
-    <w:p>
-      <w:pPr>
-        <w:pStyle w:val="PargrafodaLista"/>
-        <w:spacing w:after="80"/>
-        <w:ind w:left="720"/>
+        <w:t>salário mínimo</w:t>
+      </w:r>
+      <w:proofErr w:type="gramEnd"/>
+      <w:r>
         <w:rPr>
           <w:rFonts w:ascii="Calibri" w:hAnsi="Calibri" w:cs="Calibri"/>
           <w:b/>
@@ -6312,8 +6457,14 @@
           <w:sz w:val="24"/>
           <w:szCs w:val="24"/>
         </w:rPr>
-      </w:pPr>
-      <w:r>
+        <w:t>, registro em carteira, depósitos de FGTS e outros.</w:t>
+      </w:r>
+    </w:p>
+    <w:p>
+      <w:pPr>
+        <w:pStyle w:val="PargrafodaLista"/>
+        <w:spacing w:after="80"/>
+        <w:ind w:left="720"/>
         <w:rPr>
           <w:rFonts w:ascii="Calibri" w:hAnsi="Calibri" w:cs="Calibri"/>
           <w:b/>
@@ -6324,21 +6475,13 @@
           <w:sz w:val="24"/>
           <w:szCs w:val="24"/>
         </w:rPr>
-        <w:t>Trabalho infantil.</w:t>
-      </w:r>
+      </w:pPr>
     </w:p>
     <w:p>
       <w:pPr>
         <w:pStyle w:val="PargrafodaLista"/>
         <w:spacing w:after="80"/>
         <w:ind w:left="720"/>
-        <w:rPr>
-          <w:rFonts w:ascii="Calibri" w:hAnsi="Calibri" w:cs="Calibri"/>
-          <w:sz w:val="24"/>
-          <w:szCs w:val="24"/>
-        </w:rPr>
-      </w:pPr>
-      <w:r>
         <w:rPr>
           <w:rFonts w:ascii="Calibri" w:hAnsi="Calibri" w:cs="Calibri"/>
           <w:b/>
@@ -6349,15 +6492,19 @@
           <w:sz w:val="24"/>
           <w:szCs w:val="24"/>
         </w:rPr>
-        <w:t>Informalidade.</w:t>
-      </w:r>
-      <w:r>
-        <w:rPr>
-          <w:rFonts w:ascii="Calibri" w:hAnsi="Calibri" w:cs="Calibri"/>
-          <w:sz w:val="24"/>
-          <w:szCs w:val="24"/>
-        </w:rPr>
-        <w:br/>
+      </w:pPr>
+      <w:r>
+        <w:rPr>
+          <w:rFonts w:ascii="Calibri" w:hAnsi="Calibri" w:cs="Calibri"/>
+          <w:b/>
+          <w:bCs/>
+          <w:i/>
+          <w:iCs/>
+          <w:color w:val="0E2841" w:themeColor="text2"/>
+          <w:sz w:val="24"/>
+          <w:szCs w:val="24"/>
+        </w:rPr>
+        <w:t>* Segurança e Saúde no Trabalho: Fiscalizar o cumprimento das Normas Regulamentadoras (NRs), garantindo que o ambiente de trabalho seja seguro e saudável, e analisar as causas de acidentes de trabalho.</w:t>
       </w:r>
     </w:p>
     <w:p>
@@ -6367,6 +6514,11 @@
         <w:ind w:left="720"/>
         <w:rPr>
           <w:rFonts w:ascii="Calibri" w:hAnsi="Calibri" w:cs="Calibri"/>
+          <w:b/>
+          <w:bCs/>
+          <w:i/>
+          <w:iCs/>
+          <w:color w:val="0E2841" w:themeColor="text2"/>
           <w:sz w:val="24"/>
           <w:szCs w:val="24"/>
         </w:rPr>
@@ -6379,6 +6531,141 @@
         <w:ind w:left="720"/>
         <w:rPr>
           <w:rFonts w:ascii="Calibri" w:hAnsi="Calibri" w:cs="Calibri"/>
+          <w:b/>
+          <w:bCs/>
+          <w:i/>
+          <w:iCs/>
+          <w:color w:val="0E2841" w:themeColor="text2"/>
+          <w:sz w:val="24"/>
+          <w:szCs w:val="24"/>
+        </w:rPr>
+      </w:pPr>
+      <w:r>
+        <w:rPr>
+          <w:rFonts w:ascii="Calibri" w:hAnsi="Calibri" w:cs="Calibri"/>
+          <w:b/>
+          <w:bCs/>
+          <w:i/>
+          <w:iCs/>
+          <w:color w:val="0E2841" w:themeColor="text2"/>
+          <w:sz w:val="24"/>
+          <w:szCs w:val="24"/>
+        </w:rPr>
+        <w:t>* Combate a Irregularidades: Atuar no combate a formas graves de violação de direitos, como:</w:t>
+      </w:r>
+    </w:p>
+    <w:p>
+      <w:pPr>
+        <w:pStyle w:val="PargrafodaLista"/>
+        <w:spacing w:after="80"/>
+        <w:ind w:left="720"/>
+        <w:rPr>
+          <w:rFonts w:ascii="Calibri" w:hAnsi="Calibri" w:cs="Calibri"/>
+          <w:b/>
+          <w:bCs/>
+          <w:i/>
+          <w:iCs/>
+          <w:color w:val="0E2841" w:themeColor="text2"/>
+          <w:sz w:val="24"/>
+          <w:szCs w:val="24"/>
+        </w:rPr>
+      </w:pPr>
+      <w:r>
+        <w:rPr>
+          <w:rFonts w:ascii="Calibri" w:hAnsi="Calibri" w:cs="Calibri"/>
+          <w:b/>
+          <w:bCs/>
+          <w:i/>
+          <w:iCs/>
+          <w:color w:val="0E2841" w:themeColor="text2"/>
+          <w:sz w:val="24"/>
+          <w:szCs w:val="24"/>
+        </w:rPr>
+        <w:t>Trabalho análogo à escravidão.</w:t>
+      </w:r>
+    </w:p>
+    <w:p>
+      <w:pPr>
+        <w:pStyle w:val="PargrafodaLista"/>
+        <w:spacing w:after="80"/>
+        <w:ind w:left="720"/>
+        <w:rPr>
+          <w:rFonts w:ascii="Calibri" w:hAnsi="Calibri" w:cs="Calibri"/>
+          <w:b/>
+          <w:bCs/>
+          <w:i/>
+          <w:iCs/>
+          <w:color w:val="0E2841" w:themeColor="text2"/>
+          <w:sz w:val="24"/>
+          <w:szCs w:val="24"/>
+        </w:rPr>
+      </w:pPr>
+      <w:r>
+        <w:rPr>
+          <w:rFonts w:ascii="Calibri" w:hAnsi="Calibri" w:cs="Calibri"/>
+          <w:b/>
+          <w:bCs/>
+          <w:i/>
+          <w:iCs/>
+          <w:color w:val="0E2841" w:themeColor="text2"/>
+          <w:sz w:val="24"/>
+          <w:szCs w:val="24"/>
+        </w:rPr>
+        <w:t>Trabalho infantil.</w:t>
+      </w:r>
+    </w:p>
+    <w:p>
+      <w:pPr>
+        <w:pStyle w:val="PargrafodaLista"/>
+        <w:spacing w:after="80"/>
+        <w:ind w:left="720"/>
+        <w:rPr>
+          <w:rFonts w:ascii="Calibri" w:hAnsi="Calibri" w:cs="Calibri"/>
+          <w:sz w:val="24"/>
+          <w:szCs w:val="24"/>
+        </w:rPr>
+      </w:pPr>
+      <w:r>
+        <w:rPr>
+          <w:rFonts w:ascii="Calibri" w:hAnsi="Calibri" w:cs="Calibri"/>
+          <w:b/>
+          <w:bCs/>
+          <w:i/>
+          <w:iCs/>
+          <w:color w:val="0E2841" w:themeColor="text2"/>
+          <w:sz w:val="24"/>
+          <w:szCs w:val="24"/>
+        </w:rPr>
+        <w:t>Informalidade.</w:t>
+      </w:r>
+      <w:r>
+        <w:rPr>
+          <w:rFonts w:ascii="Calibri" w:hAnsi="Calibri" w:cs="Calibri"/>
+          <w:sz w:val="24"/>
+          <w:szCs w:val="24"/>
+        </w:rPr>
+        <w:br/>
+      </w:r>
+    </w:p>
+    <w:p>
+      <w:pPr>
+        <w:pStyle w:val="PargrafodaLista"/>
+        <w:spacing w:after="80"/>
+        <w:ind w:left="720"/>
+        <w:rPr>
+          <w:rFonts w:ascii="Calibri" w:hAnsi="Calibri" w:cs="Calibri"/>
+          <w:sz w:val="24"/>
+          <w:szCs w:val="24"/>
+        </w:rPr>
+      </w:pPr>
+    </w:p>
+    <w:p>
+      <w:pPr>
+        <w:pStyle w:val="PargrafodaLista"/>
+        <w:spacing w:after="80"/>
+        <w:ind w:left="720"/>
+        <w:rPr>
+          <w:rFonts w:ascii="Calibri" w:hAnsi="Calibri" w:cs="Calibri"/>
           <w:sz w:val="24"/>
           <w:szCs w:val="24"/>
         </w:rPr>
@@ -6415,7 +6702,7 @@
           <w:szCs w:val="24"/>
         </w:rPr>
         <w:drawing>
-          <wp:inline distT="0" distB="0" distL="0" distR="0" wp14:anchorId="5F4F8C0C" wp14:editId="504AAB15">
+          <wp:inline distT="0" distB="0" distL="0" distR="0" wp14:anchorId="5F4F8C0C" wp14:editId="46E88BD4">
             <wp:extent cx="6193592" cy="3333509"/>
             <wp:effectExtent l="0" t="0" r="4445" b="0"/>
             <wp:docPr id="1821921538" name="Imagem 4" descr="Interface gráfica do usuário, Texto, Aplicativo, Email&#10;&#10;O conteúdo gerado por IA pode estar incorreto."/>
@@ -6539,7 +6826,7 @@
         </w:rPr>
         <w:lastRenderedPageBreak/>
         <w:drawing>
-          <wp:inline distT="0" distB="0" distL="0" distR="0" wp14:anchorId="25754CA9" wp14:editId="7518B7A8">
+          <wp:inline distT="0" distB="0" distL="0" distR="0" wp14:anchorId="25754CA9" wp14:editId="669395D9">
             <wp:extent cx="6070622" cy="3102015"/>
             <wp:effectExtent l="0" t="0" r="0" b="0"/>
             <wp:docPr id="1454922375" name="Imagem 5" descr="Interface gráfica do usuário, Texto, Aplicativo, Email&#10;&#10;O conteúdo gerado por IA pode estar incorreto."/>
@@ -6878,7 +7165,16 @@
           <w:sz w:val="24"/>
           <w:szCs w:val="24"/>
         </w:rPr>
-        <w:t xml:space="preserve">: ele continua rodando na bandeja do sistema (ícones perto do relógio). Clique com o botão direito no ícone do Claude na bandeja e escolha </w:t>
+        <w:t xml:space="preserve">: ele continua rodando na bandeja do sistema (ícones perto do relógio). Clique com o botão direito no ícone do Claude na bandeja e </w:t>
+      </w:r>
+      <w:proofErr w:type="gramStart"/>
+      <w:r>
+        <w:rPr>
+          <w:rFonts w:ascii="Calibri" w:hAnsi="Calibri" w:cs="Calibri"/>
+          <w:sz w:val="24"/>
+          <w:szCs w:val="24"/>
+        </w:rPr>
+        <w:t xml:space="preserve">escolha </w:t>
       </w:r>
       <w:r>
         <w:rPr>
@@ -6890,6 +7186,7 @@
         </w:rPr>
         <w:t>Sair</w:t>
       </w:r>
+      <w:proofErr w:type="gramEnd"/>
       <w:r>
         <w:rPr>
           <w:rFonts w:ascii="Calibri" w:hAnsi="Calibri" w:cs="Calibri"/>
@@ -7244,25 +7541,15 @@
           <w:sz w:val="24"/>
           <w:szCs w:val="24"/>
         </w:rPr>
-        <w:t xml:space="preserve"> (é a pasta do computador em que ele vai trabalhar). Escolha a pasta </w:t>
-      </w:r>
-      <w:r>
-        <w:rPr>
-          <w:rFonts w:ascii="Calibri" w:hAnsi="Calibri" w:cs="Calibri"/>
-          <w:b/>
-          <w:bCs/>
-          <w:sz w:val="24"/>
-          <w:szCs w:val="24"/>
-        </w:rPr>
-        <w:t>Documentos</w:t>
-      </w:r>
-      <w:r>
-        <w:rPr>
-          <w:rFonts w:ascii="Calibri" w:hAnsi="Calibri" w:cs="Calibri"/>
-          <w:sz w:val="24"/>
-          <w:szCs w:val="24"/>
-        </w:rPr>
-        <w:t xml:space="preserve"> (C:\</w:t>
+        <w:t xml:space="preserve"> (é a pasta do computador em que ele vai trabalhar). Escolha</w:t>
+      </w:r>
+      <w:r>
+        <w:rPr>
+          <w:rFonts w:ascii="Calibri" w:hAnsi="Calibri" w:cs="Calibri"/>
+          <w:sz w:val="24"/>
+          <w:szCs w:val="24"/>
+        </w:rPr>
+        <w:t xml:space="preserve"> qualquer pasta “meus </w:t>
       </w:r>
       <w:proofErr w:type="spellStart"/>
       <w:r>
@@ -7271,7 +7558,7 @@
           <w:sz w:val="24"/>
           <w:szCs w:val="24"/>
         </w:rPr>
-        <w:t>Users</w:t>
+        <w:t xml:space="preserve">documentos” </w:t>
       </w:r>
       <w:proofErr w:type="spellEnd"/>
       <w:r>
@@ -7280,41 +7567,15 @@
           <w:sz w:val="24"/>
           <w:szCs w:val="24"/>
         </w:rPr>
-        <w:t>\seu-nome\</w:t>
-      </w:r>
-      <w:proofErr w:type="spellStart"/>
-      <w:r>
-        <w:rPr>
-          <w:rFonts w:ascii="Calibri" w:hAnsi="Calibri" w:cs="Calibri"/>
-          <w:sz w:val="24"/>
-          <w:szCs w:val="24"/>
-        </w:rPr>
-        <w:t>Documents</w:t>
-      </w:r>
-      <w:proofErr w:type="spellEnd"/>
-      <w:r>
-        <w:rPr>
-          <w:rFonts w:ascii="Calibri" w:hAnsi="Calibri" w:cs="Calibri"/>
-          <w:sz w:val="24"/>
-          <w:szCs w:val="24"/>
-        </w:rPr>
-        <w:t xml:space="preserve">). Depois da instalação, quando a pasta Documentos\AFT existir, prefira escolhê-la nas conversas do dia a dia — é onde </w:t>
-      </w:r>
-      <w:r>
-        <w:rPr>
-          <w:rFonts w:ascii="Calibri" w:hAnsi="Calibri" w:cs="Calibri"/>
-          <w:sz w:val="24"/>
-          <w:szCs w:val="24"/>
-        </w:rPr>
-        <w:t>devem ficar</w:t>
-      </w:r>
-      <w:r>
-        <w:rPr>
-          <w:rFonts w:ascii="Calibri" w:hAnsi="Calibri" w:cs="Calibri"/>
-          <w:sz w:val="24"/>
-          <w:szCs w:val="24"/>
-        </w:rPr>
-        <w:t xml:space="preserve"> as suas fiscalizações.</w:t>
+        <w:t xml:space="preserve">para esse momento. </w:t>
+      </w:r>
+      <w:r>
+        <w:rPr>
+          <w:rFonts w:ascii="Calibri" w:hAnsi="Calibri" w:cs="Calibri"/>
+          <w:sz w:val="24"/>
+          <w:szCs w:val="24"/>
+        </w:rPr>
+        <w:t xml:space="preserve"> </w:t>
       </w:r>
     </w:p>
     <w:p>
@@ -7905,7 +8166,16 @@
           <w:sz w:val="24"/>
           <w:szCs w:val="24"/>
         </w:rPr>
-        <w:t xml:space="preserve"> clone https://github.com/ryckardo42/aft-toolkit.git ~/.</w:t>
+        <w:t xml:space="preserve"> clone https://github.com/ryckardo42/aft-toolkit.git ~</w:t>
+      </w:r>
+      <w:proofErr w:type="gramStart"/>
+      <w:r>
+        <w:rPr>
+          <w:rFonts w:ascii="Calibri" w:eastAsia="Consolas" w:hAnsi="Calibri" w:cs="Calibri"/>
+          <w:sz w:val="24"/>
+          <w:szCs w:val="24"/>
+        </w:rPr>
+        <w:t>/.</w:t>
       </w:r>
       <w:proofErr w:type="spellStart"/>
       <w:r>
@@ -7917,13 +8187,23 @@
         <w:t>claude</w:t>
       </w:r>
       <w:proofErr w:type="spellEnd"/>
+      <w:proofErr w:type="gramEnd"/>
       <w:r>
         <w:rPr>
           <w:rFonts w:ascii="Calibri" w:eastAsia="Consolas" w:hAnsi="Calibri" w:cs="Calibri"/>
           <w:sz w:val="24"/>
           <w:szCs w:val="24"/>
         </w:rPr>
-        <w:t>/skills. Se a pasta ~/.</w:t>
+        <w:t>/skills. Se a pasta ~</w:t>
+      </w:r>
+      <w:proofErr w:type="gramStart"/>
+      <w:r>
+        <w:rPr>
+          <w:rFonts w:ascii="Calibri" w:eastAsia="Consolas" w:hAnsi="Calibri" w:cs="Calibri"/>
+          <w:sz w:val="24"/>
+          <w:szCs w:val="24"/>
+        </w:rPr>
+        <w:t>/.</w:t>
       </w:r>
       <w:proofErr w:type="spellStart"/>
       <w:r>
@@ -7935,22 +8215,23 @@
         <w:t>claude</w:t>
       </w:r>
       <w:proofErr w:type="spellEnd"/>
+      <w:proofErr w:type="gramEnd"/>
       <w:r>
         <w:rPr>
           <w:rFonts w:ascii="Calibri" w:eastAsia="Consolas" w:hAnsi="Calibri" w:cs="Calibri"/>
           <w:sz w:val="24"/>
           <w:szCs w:val="24"/>
         </w:rPr>
-        <w:t xml:space="preserve">/skills </w:t>
-      </w:r>
+        <w:t xml:space="preserve">/skills já existir com conteúdo, clone numa pasta temporária e mova todo o conteúdo do repositório (incluindo a pasta </w:t>
+      </w:r>
+      <w:proofErr w:type="gramStart"/>
       <w:r>
         <w:rPr>
           <w:rFonts w:ascii="Calibri" w:eastAsia="Consolas" w:hAnsi="Calibri" w:cs="Calibri"/>
           <w:sz w:val="24"/>
           <w:szCs w:val="24"/>
         </w:rPr>
-        <w:lastRenderedPageBreak/>
-        <w:t>já existir com conteúdo, clone numa pasta temporária e mova todo o conteúdo do repositório (incluindo a pasta oculta .</w:t>
+        <w:t>oculta .</w:t>
       </w:r>
       <w:proofErr w:type="spellStart"/>
       <w:r>
@@ -7962,6 +8243,7 @@
         <w:t>git</w:t>
       </w:r>
       <w:proofErr w:type="spellEnd"/>
+      <w:proofErr w:type="gramEnd"/>
       <w:r>
         <w:rPr>
           <w:rFonts w:ascii="Calibri" w:eastAsia="Consolas" w:hAnsi="Calibri" w:cs="Calibri"/>
@@ -7988,7 +8270,17 @@
           <w:sz w:val="24"/>
           <w:szCs w:val="24"/>
         </w:rPr>
-        <w:t>5. Confirme que as skills ficaram diretamente em ~/.</w:t>
+        <w:lastRenderedPageBreak/>
+        <w:t>5. Confirme que as skills ficaram diretamente em ~</w:t>
+      </w:r>
+      <w:proofErr w:type="gramStart"/>
+      <w:r>
+        <w:rPr>
+          <w:rFonts w:ascii="Calibri" w:eastAsia="Consolas" w:hAnsi="Calibri" w:cs="Calibri"/>
+          <w:sz w:val="24"/>
+          <w:szCs w:val="24"/>
+        </w:rPr>
+        <w:t>/.</w:t>
       </w:r>
       <w:proofErr w:type="spellStart"/>
       <w:r>
@@ -8000,13 +8292,23 @@
         <w:t>claude</w:t>
       </w:r>
       <w:proofErr w:type="spellEnd"/>
+      <w:proofErr w:type="gramEnd"/>
       <w:r>
         <w:rPr>
           <w:rFonts w:ascii="Calibri" w:eastAsia="Consolas" w:hAnsi="Calibri" w:cs="Calibri"/>
           <w:sz w:val="24"/>
           <w:szCs w:val="24"/>
         </w:rPr>
-        <w:t>/skills (deve existir, por exemplo, ~/.</w:t>
+        <w:t>/skills (deve existir, por exemplo, ~</w:t>
+      </w:r>
+      <w:proofErr w:type="gramStart"/>
+      <w:r>
+        <w:rPr>
+          <w:rFonts w:ascii="Calibri" w:eastAsia="Consolas" w:hAnsi="Calibri" w:cs="Calibri"/>
+          <w:sz w:val="24"/>
+          <w:szCs w:val="24"/>
+        </w:rPr>
+        <w:t>/.</w:t>
       </w:r>
       <w:proofErr w:type="spellStart"/>
       <w:r>
@@ -8042,7 +8344,16 @@
           <w:sz w:val="24"/>
           <w:szCs w:val="24"/>
         </w:rPr>
-        <w:t>-setup/SKILL.md), liste-as e me diga se preciso reiniciar o aplicativo.</w:t>
+        <w:t>-setup/SKILL.md</w:t>
+      </w:r>
+      <w:proofErr w:type="gramEnd"/>
+      <w:r>
+        <w:rPr>
+          <w:rFonts w:ascii="Calibri" w:eastAsia="Consolas" w:hAnsi="Calibri" w:cs="Calibri"/>
+          <w:sz w:val="24"/>
+          <w:szCs w:val="24"/>
+        </w:rPr>
+        <w:t>), liste-as e me diga se preciso reiniciar o aplicativo.</w:t>
       </w:r>
     </w:p>
     <w:p>
@@ -8492,15 +8803,69 @@
           <w:sz w:val="24"/>
           <w:szCs w:val="24"/>
         </w:rPr>
-        <w:t xml:space="preserve">Dica para o dia a dia: </w:t>
-      </w:r>
-      <w:r>
-        <w:rPr>
-          <w:rFonts w:ascii="Calibri" w:hAnsi="Calibri" w:cs="Calibri"/>
-          <w:sz w:val="24"/>
-          <w:szCs w:val="24"/>
-        </w:rPr>
-        <w:t xml:space="preserve">a partir daqui, ao abrir conversas novas, escolha </w:t>
+        <w:br/>
+      </w:r>
+      <w:r>
+        <w:rPr>
+          <w:rFonts w:ascii="Calibri" w:hAnsi="Calibri" w:cs="Calibri"/>
+          <w:sz w:val="24"/>
+          <w:szCs w:val="24"/>
+        </w:rPr>
+        <w:t xml:space="preserve">O </w:t>
+      </w:r>
+      <w:proofErr w:type="spellStart"/>
+      <w:r>
+        <w:rPr>
+          <w:rFonts w:ascii="Calibri" w:hAnsi="Calibri" w:cs="Calibri"/>
+          <w:sz w:val="24"/>
+          <w:szCs w:val="24"/>
+        </w:rPr>
+        <w:t>claude</w:t>
+      </w:r>
+      <w:proofErr w:type="spellEnd"/>
+      <w:r>
+        <w:rPr>
+          <w:rFonts w:ascii="Calibri" w:hAnsi="Calibri" w:cs="Calibri"/>
+          <w:sz w:val="24"/>
+          <w:szCs w:val="24"/>
+        </w:rPr>
+        <w:t xml:space="preserve"> </w:t>
+      </w:r>
+      <w:proofErr w:type="spellStart"/>
+      <w:r>
+        <w:rPr>
+          <w:rFonts w:ascii="Calibri" w:hAnsi="Calibri" w:cs="Calibri"/>
+          <w:sz w:val="24"/>
+          <w:szCs w:val="24"/>
+        </w:rPr>
+        <w:t>Code</w:t>
+      </w:r>
+      <w:proofErr w:type="spellEnd"/>
+      <w:r>
+        <w:rPr>
+          <w:rFonts w:ascii="Calibri" w:hAnsi="Calibri" w:cs="Calibri"/>
+          <w:sz w:val="24"/>
+          <w:szCs w:val="24"/>
+        </w:rPr>
+        <w:t xml:space="preserve"> vai tomar por padrão, a partir </w:t>
+      </w:r>
+      <w:proofErr w:type="gramStart"/>
+      <w:r>
+        <w:rPr>
+          <w:rFonts w:ascii="Calibri" w:hAnsi="Calibri" w:cs="Calibri"/>
+          <w:sz w:val="24"/>
+          <w:szCs w:val="24"/>
+        </w:rPr>
+        <w:t>daqui, a</w:t>
+      </w:r>
+      <w:proofErr w:type="gramEnd"/>
+      <w:r>
+        <w:rPr>
+          <w:rFonts w:ascii="Calibri" w:hAnsi="Calibri" w:cs="Calibri"/>
+          <w:sz w:val="24"/>
+          <w:szCs w:val="24"/>
+        </w:rPr>
+        <w:t xml:space="preserve"> pasta </w:t>
       </w:r>
       <w:r>
         <w:rPr>
@@ -8510,15 +8875,204 @@
           <w:sz w:val="24"/>
           <w:szCs w:val="24"/>
         </w:rPr>
-        <w:t>Documentos\AFT</w:t>
-      </w:r>
-      <w:r>
-        <w:rPr>
-          <w:rFonts w:ascii="Calibri" w:hAnsi="Calibri" w:cs="Calibri"/>
-          <w:sz w:val="24"/>
-          <w:szCs w:val="24"/>
-        </w:rPr>
-        <w:t xml:space="preserve"> como pasta da sessão.</w:t>
+        <w:t>Documentos</w:t>
+      </w:r>
+      <w:r>
+        <w:rPr>
+          <w:rFonts w:ascii="Calibri" w:hAnsi="Calibri" w:cs="Calibri"/>
+          <w:sz w:val="24"/>
+          <w:szCs w:val="24"/>
+        </w:rPr>
+        <w:t xml:space="preserve"> (C:\</w:t>
+      </w:r>
+      <w:proofErr w:type="spellStart"/>
+      <w:r>
+        <w:rPr>
+          <w:rFonts w:ascii="Calibri" w:hAnsi="Calibri" w:cs="Calibri"/>
+          <w:sz w:val="24"/>
+          <w:szCs w:val="24"/>
+        </w:rPr>
+        <w:t>Users</w:t>
+      </w:r>
+      <w:proofErr w:type="spellEnd"/>
+      <w:r>
+        <w:rPr>
+          <w:rFonts w:ascii="Calibri" w:hAnsi="Calibri" w:cs="Calibri"/>
+          <w:sz w:val="24"/>
+          <w:szCs w:val="24"/>
+        </w:rPr>
+        <w:t>\seu-nome\</w:t>
+      </w:r>
+      <w:proofErr w:type="spellStart"/>
+      <w:r>
+        <w:rPr>
+          <w:rFonts w:ascii="Calibri" w:hAnsi="Calibri" w:cs="Calibri"/>
+          <w:sz w:val="24"/>
+          <w:szCs w:val="24"/>
+        </w:rPr>
+        <w:t>Documents</w:t>
+      </w:r>
+      <w:proofErr w:type="spellEnd"/>
+      <w:r>
+        <w:rPr>
+          <w:rFonts w:ascii="Calibri" w:hAnsi="Calibri" w:cs="Calibri"/>
+          <w:sz w:val="24"/>
+          <w:szCs w:val="24"/>
+        </w:rPr>
+        <w:t xml:space="preserve">). Depois da </w:t>
+      </w:r>
+      <w:proofErr w:type="gramStart"/>
+      <w:r>
+        <w:rPr>
+          <w:rFonts w:ascii="Calibri" w:hAnsi="Calibri" w:cs="Calibri"/>
+          <w:sz w:val="24"/>
+          <w:szCs w:val="24"/>
+        </w:rPr>
+        <w:t xml:space="preserve">instalação, </w:t>
+      </w:r>
+      <w:r>
+        <w:rPr>
+          <w:rFonts w:ascii="Calibri" w:hAnsi="Calibri" w:cs="Calibri"/>
+          <w:sz w:val="24"/>
+          <w:szCs w:val="24"/>
+        </w:rPr>
+        <w:t xml:space="preserve"> vai</w:t>
+      </w:r>
+      <w:proofErr w:type="gramEnd"/>
+      <w:r>
+        <w:rPr>
+          <w:rFonts w:ascii="Calibri" w:hAnsi="Calibri" w:cs="Calibri"/>
+          <w:sz w:val="24"/>
+          <w:szCs w:val="24"/>
+        </w:rPr>
+        <w:t xml:space="preserve"> ser criada a </w:t>
+      </w:r>
+      <w:proofErr w:type="gramStart"/>
+      <w:r>
+        <w:rPr>
+          <w:rFonts w:ascii="Calibri" w:hAnsi="Calibri" w:cs="Calibri"/>
+          <w:sz w:val="24"/>
+          <w:szCs w:val="24"/>
+        </w:rPr>
+        <w:t xml:space="preserve">pasta </w:t>
+      </w:r>
+      <w:r>
+        <w:rPr>
+          <w:rFonts w:ascii="Calibri" w:hAnsi="Calibri" w:cs="Calibri"/>
+          <w:sz w:val="24"/>
+          <w:szCs w:val="24"/>
+        </w:rPr>
+        <w:t xml:space="preserve"> Documentos</w:t>
+      </w:r>
+      <w:proofErr w:type="gramEnd"/>
+      <w:r>
+        <w:rPr>
+          <w:rFonts w:ascii="Calibri" w:hAnsi="Calibri" w:cs="Calibri"/>
+          <w:sz w:val="24"/>
+          <w:szCs w:val="24"/>
+        </w:rPr>
+        <w:t>\AFT</w:t>
+      </w:r>
+      <w:r>
+        <w:rPr>
+          <w:rFonts w:ascii="Calibri" w:hAnsi="Calibri" w:cs="Calibri"/>
+          <w:sz w:val="24"/>
+          <w:szCs w:val="24"/>
+        </w:rPr>
+        <w:t>\OS ATIVAS.</w:t>
+      </w:r>
+      <w:r>
+        <w:rPr>
+          <w:rFonts w:ascii="Calibri" w:hAnsi="Calibri" w:cs="Calibri"/>
+          <w:sz w:val="24"/>
+          <w:szCs w:val="24"/>
+        </w:rPr>
+        <w:t xml:space="preserve"> É dentro dela que </w:t>
+      </w:r>
+      <w:proofErr w:type="spellStart"/>
+      <w:r>
+        <w:rPr>
+          <w:rFonts w:ascii="Calibri" w:hAnsi="Calibri" w:cs="Calibri"/>
+          <w:sz w:val="24"/>
+          <w:szCs w:val="24"/>
+        </w:rPr>
+        <w:t>vc</w:t>
+      </w:r>
+      <w:proofErr w:type="spellEnd"/>
+      <w:r>
+        <w:rPr>
+          <w:rFonts w:ascii="Calibri" w:hAnsi="Calibri" w:cs="Calibri"/>
+          <w:sz w:val="24"/>
+          <w:szCs w:val="24"/>
+        </w:rPr>
+        <w:t xml:space="preserve"> vai colocar as pastas das suas empresas em auditoria. Lembre-se: Uma pasta por Empresa (RI). </w:t>
+      </w:r>
+      <w:r>
+        <w:rPr>
+          <w:rFonts w:ascii="Calibri" w:hAnsi="Calibri" w:cs="Calibri"/>
+          <w:sz w:val="24"/>
+          <w:szCs w:val="24"/>
+        </w:rPr>
+        <w:br/>
+      </w:r>
+      <w:r>
+        <w:rPr>
+          <w:rFonts w:ascii="Calibri" w:hAnsi="Calibri" w:cs="Calibri"/>
+          <w:sz w:val="24"/>
+          <w:szCs w:val="24"/>
+        </w:rPr>
+        <w:br/>
+      </w:r>
+      <w:r>
+        <w:rPr>
+          <w:rFonts w:ascii="Calibri" w:hAnsi="Calibri" w:cs="Calibri"/>
+          <w:sz w:val="24"/>
+          <w:szCs w:val="24"/>
+        </w:rPr>
+        <w:br/>
+      </w:r>
+    </w:p>
+    <w:p>
+      <w:pPr>
+        <w:spacing w:after="120"/>
+        <w:rPr>
+          <w:rFonts w:ascii="Calibri" w:hAnsi="Calibri" w:cs="Calibri"/>
+          <w:sz w:val="24"/>
+          <w:szCs w:val="24"/>
+        </w:rPr>
+      </w:pPr>
+      <w:r>
+        <w:rPr>
+          <w:rFonts w:ascii="Calibri" w:hAnsi="Calibri" w:cs="Calibri"/>
+          <w:sz w:val="24"/>
+          <w:szCs w:val="24"/>
+        </w:rPr>
+        <w:t>FOTO</w:t>
+      </w:r>
+      <w:r>
+        <w:rPr>
+          <w:rFonts w:ascii="Calibri" w:hAnsi="Calibri" w:cs="Calibri"/>
+          <w:sz w:val="24"/>
+          <w:szCs w:val="24"/>
+        </w:rPr>
+        <w:br/>
+      </w:r>
+      <w:r>
+        <w:rPr>
+          <w:rFonts w:ascii="Calibri" w:hAnsi="Calibri" w:cs="Calibri"/>
+          <w:sz w:val="24"/>
+          <w:szCs w:val="24"/>
+        </w:rPr>
+        <w:br/>
+        <w:t>É essa pasta que vai concentrar todas as suas auditorias!</w:t>
+      </w:r>
+      <w:r>
+        <w:rPr>
+          <w:rFonts w:ascii="Calibri" w:hAnsi="Calibri" w:cs="Calibri"/>
+          <w:sz w:val="24"/>
+          <w:szCs w:val="24"/>
+        </w:rPr>
+        <w:br/>
       </w:r>
     </w:p>
     <w:p>
@@ -8615,13 +9169,234 @@
     <w:p>
       <w:pPr>
         <w:spacing w:after="120"/>
-        <w:jc w:val="both"/>
-        <w:rPr>
-          <w:rFonts w:ascii="Calibri" w:hAnsi="Calibri" w:cs="Calibri"/>
-          <w:sz w:val="24"/>
-          <w:szCs w:val="24"/>
-        </w:rPr>
-      </w:pPr>
+        <w:rPr>
+          <w:rFonts w:ascii="Calibri" w:hAnsi="Calibri" w:cs="Calibri"/>
+          <w:sz w:val="24"/>
+          <w:szCs w:val="24"/>
+        </w:rPr>
+      </w:pPr>
+      <w:r>
+        <w:rPr>
+          <w:rFonts w:ascii="Calibri" w:hAnsi="Calibri" w:cs="Calibri"/>
+          <w:sz w:val="24"/>
+          <w:szCs w:val="24"/>
+        </w:rPr>
+        <w:t xml:space="preserve">Após isso, </w:t>
+      </w:r>
+      <w:proofErr w:type="gramStart"/>
+      <w:r>
+        <w:rPr>
+          <w:rFonts w:ascii="Calibri" w:hAnsi="Calibri" w:cs="Calibri"/>
+          <w:sz w:val="24"/>
+          <w:szCs w:val="24"/>
+        </w:rPr>
+        <w:t>tá</w:t>
+      </w:r>
+      <w:proofErr w:type="gramEnd"/>
+      <w:r>
+        <w:rPr>
+          <w:rFonts w:ascii="Calibri" w:hAnsi="Calibri" w:cs="Calibri"/>
+          <w:sz w:val="24"/>
+          <w:szCs w:val="24"/>
+        </w:rPr>
+        <w:t xml:space="preserve"> na hora de colocar o </w:t>
+      </w:r>
+      <w:proofErr w:type="spellStart"/>
+      <w:r>
+        <w:rPr>
+          <w:rFonts w:ascii="Calibri" w:hAnsi="Calibri" w:cs="Calibri"/>
+          <w:sz w:val="24"/>
+          <w:szCs w:val="24"/>
+        </w:rPr>
+        <w:t>claude</w:t>
+      </w:r>
+      <w:proofErr w:type="spellEnd"/>
+      <w:r>
+        <w:rPr>
+          <w:rFonts w:ascii="Calibri" w:hAnsi="Calibri" w:cs="Calibri"/>
+          <w:sz w:val="24"/>
+          <w:szCs w:val="24"/>
+        </w:rPr>
+        <w:t xml:space="preserve"> para organizar e entender suas auditorias. Diga “organize minhas OS ou /</w:t>
+      </w:r>
+      <w:proofErr w:type="spellStart"/>
+      <w:r>
+        <w:rPr>
+          <w:rFonts w:ascii="Calibri" w:hAnsi="Calibri" w:cs="Calibri"/>
+          <w:sz w:val="24"/>
+          <w:szCs w:val="24"/>
+        </w:rPr>
+        <w:t>organiza-OS</w:t>
+      </w:r>
+      <w:proofErr w:type="spellEnd"/>
+      <w:r>
+        <w:rPr>
+          <w:rFonts w:ascii="Calibri" w:hAnsi="Calibri" w:cs="Calibri"/>
+          <w:sz w:val="24"/>
+          <w:szCs w:val="24"/>
+        </w:rPr>
+        <w:t xml:space="preserve">.  O </w:t>
+      </w:r>
+      <w:proofErr w:type="spellStart"/>
+      <w:r>
+        <w:rPr>
+          <w:rFonts w:ascii="Calibri" w:hAnsi="Calibri" w:cs="Calibri"/>
+          <w:sz w:val="24"/>
+          <w:szCs w:val="24"/>
+        </w:rPr>
+        <w:t>claude</w:t>
+      </w:r>
+      <w:proofErr w:type="spellEnd"/>
+      <w:r>
+        <w:rPr>
+          <w:rFonts w:ascii="Calibri" w:hAnsi="Calibri" w:cs="Calibri"/>
+          <w:sz w:val="24"/>
+          <w:szCs w:val="24"/>
+        </w:rPr>
+        <w:t xml:space="preserve"> vai entender suas pastas, podendo renomear, organizar e criar dentro do aplicativo (</w:t>
+      </w:r>
+      <w:proofErr w:type="spellStart"/>
+      <w:r>
+        <w:rPr>
+          <w:rFonts w:ascii="Calibri" w:hAnsi="Calibri" w:cs="Calibri"/>
+          <w:sz w:val="24"/>
+          <w:szCs w:val="24"/>
+        </w:rPr>
+        <w:t>claude</w:t>
+      </w:r>
+      <w:proofErr w:type="spellEnd"/>
+      <w:r>
+        <w:rPr>
+          <w:rFonts w:ascii="Calibri" w:hAnsi="Calibri" w:cs="Calibri"/>
+          <w:sz w:val="24"/>
+          <w:szCs w:val="24"/>
+        </w:rPr>
+        <w:t xml:space="preserve"> </w:t>
+      </w:r>
+      <w:proofErr w:type="spellStart"/>
+      <w:r>
+        <w:rPr>
+          <w:rFonts w:ascii="Calibri" w:hAnsi="Calibri" w:cs="Calibri"/>
+          <w:sz w:val="24"/>
+          <w:szCs w:val="24"/>
+        </w:rPr>
+        <w:t>code</w:t>
+      </w:r>
+      <w:proofErr w:type="spellEnd"/>
+      <w:r>
+        <w:rPr>
+          <w:rFonts w:ascii="Calibri" w:hAnsi="Calibri" w:cs="Calibri"/>
+          <w:sz w:val="24"/>
+          <w:szCs w:val="24"/>
+        </w:rPr>
+        <w:t>) uma sessão (chat) para cada empresa:</w:t>
+      </w:r>
+    </w:p>
+    <w:p>
+      <w:pPr>
+        <w:spacing w:after="120"/>
+        <w:jc w:val="center"/>
+        <w:rPr>
+          <w:rFonts w:ascii="Calibri" w:hAnsi="Calibri" w:cs="Calibri"/>
+          <w:sz w:val="24"/>
+          <w:szCs w:val="24"/>
+        </w:rPr>
+      </w:pPr>
+      <w:r>
+        <w:rPr>
+          <w:rFonts w:ascii="Calibri" w:hAnsi="Calibri" w:cs="Calibri"/>
+          <w:sz w:val="24"/>
+          <w:szCs w:val="24"/>
+        </w:rPr>
+        <w:lastRenderedPageBreak/>
+        <w:br/>
+      </w:r>
+      <w:r>
+        <w:rPr>
+          <w:rFonts w:ascii="Calibri" w:hAnsi="Calibri" w:cs="Calibri"/>
+          <w:sz w:val="24"/>
+          <w:szCs w:val="24"/>
+        </w:rPr>
+        <w:br/>
+      </w:r>
+      <w:r>
+        <w:rPr>
+          <w:rFonts w:ascii="Calibri" w:hAnsi="Calibri" w:cs="Calibri"/>
+          <w:noProof/>
+          <w:sz w:val="24"/>
+          <w:szCs w:val="24"/>
+        </w:rPr>
+        <w:drawing>
+          <wp:inline distT="0" distB="0" distL="0" distR="0" wp14:anchorId="59DB629F" wp14:editId="7041AE20">
+            <wp:extent cx="3428577" cy="4284247"/>
+            <wp:effectExtent l="0" t="0" r="635" b="0"/>
+            <wp:docPr id="615115957" name="Imagem 2" descr="Interface gráfica do usuário, Aplicativo&#10;&#10;O conteúdo gerado por IA pode estar incorreto."/>
+            <wp:cNvGraphicFramePr>
+              <a:graphicFrameLocks xmlns:a="http://schemas.openxmlformats.org/drawingml/2006/main" noChangeAspect="1"/>
+            </wp:cNvGraphicFramePr>
+            <a:graphic xmlns:a="http://schemas.openxmlformats.org/drawingml/2006/main">
+              <a:graphicData uri="http://schemas.openxmlformats.org/drawingml/2006/picture">
+                <pic:pic xmlns:pic="http://schemas.openxmlformats.org/drawingml/2006/picture">
+                  <pic:nvPicPr>
+                    <pic:cNvPr id="615115957" name="Imagem 2" descr="Interface gráfica do usuário, Aplicativo&#10;&#10;O conteúdo gerado por IA pode estar incorreto."/>
+                    <pic:cNvPicPr/>
+                  </pic:nvPicPr>
+                  <pic:blipFill>
+                    <a:blip r:embed="rId17" cstate="print">
+                      <a:extLst>
+                        <a:ext uri="{28A0092B-C50C-407E-A947-70E740481C1C}">
+                          <a14:useLocalDpi xmlns:a14="http://schemas.microsoft.com/office/drawing/2010/main" val="0"/>
+                        </a:ext>
+                      </a:extLst>
+                    </a:blip>
+                    <a:stretch>
+                      <a:fillRect/>
+                    </a:stretch>
+                  </pic:blipFill>
+                  <pic:spPr>
+                    <a:xfrm>
+                      <a:off x="0" y="0"/>
+                      <a:ext cx="3439757" cy="4298218"/>
+                    </a:xfrm>
+                    <a:prstGeom prst="rect">
+                      <a:avLst/>
+                    </a:prstGeom>
+                  </pic:spPr>
+                </pic:pic>
+              </a:graphicData>
+            </a:graphic>
+          </wp:inline>
+        </w:drawing>
+      </w:r>
+    </w:p>
+    <w:p>
+      <w:pPr>
+        <w:spacing w:after="120"/>
+        <w:jc w:val="center"/>
+        <w:rPr>
+          <w:rFonts w:ascii="Calibri" w:hAnsi="Calibri" w:cs="Calibri"/>
+          <w:sz w:val="24"/>
+          <w:szCs w:val="24"/>
+        </w:rPr>
+      </w:pPr>
+    </w:p>
+    <w:p>
+      <w:pPr>
+        <w:spacing w:after="120"/>
+        <w:rPr>
+          <w:rFonts w:ascii="Calibri" w:hAnsi="Calibri" w:cs="Calibri"/>
+          <w:sz w:val="24"/>
+          <w:szCs w:val="24"/>
+        </w:rPr>
+      </w:pPr>
+      <w:r>
+        <w:rPr>
+          <w:rFonts w:ascii="Calibri" w:hAnsi="Calibri" w:cs="Calibri"/>
+          <w:sz w:val="24"/>
+          <w:szCs w:val="24"/>
+        </w:rPr>
+        <w:t xml:space="preserve">Em cada um desses chats (sessões) é que você deve trabalhar em cada empresa. </w:t>
+      </w:r>
     </w:p>
     <w:p>
       <w:pPr>
@@ -8742,7 +9517,7 @@
         </w:rPr>
         <w:t xml:space="preserve">Entre em </w:t>
       </w:r>
-      <w:hyperlink r:id="rId17" w:history="1">
+      <w:hyperlink r:id="rId18" w:history="1">
         <w:r>
           <w:rPr>
             <w:rStyle w:val="Hyperlink"/>
@@ -8912,8 +9687,18 @@
           <w:sz w:val="24"/>
           <w:szCs w:val="24"/>
         </w:rPr>
-        <w:t>-setup</w:t>
-      </w:r>
+        <w:t>-</w:t>
+      </w:r>
+      <w:proofErr w:type="gramStart"/>
+      <w:r>
+        <w:rPr>
+          <w:rFonts w:ascii="Calibri" w:eastAsia="Consolas" w:hAnsi="Calibri" w:cs="Calibri"/>
+          <w:sz w:val="24"/>
+          <w:szCs w:val="24"/>
+        </w:rPr>
+        <w:t>setup</w:t>
+      </w:r>
+      <w:proofErr w:type="gramEnd"/>
       <w:r>
         <w:rPr>
           <w:rFonts w:ascii="Calibri" w:hAnsi="Calibri" w:cs="Calibri"/>
@@ -8978,7 +9763,6 @@
           <w:sz w:val="24"/>
           <w:szCs w:val="24"/>
         </w:rPr>
-        <w:lastRenderedPageBreak/>
         <w:t>2.6 Como receber atualizações</w:t>
       </w:r>
       <w:bookmarkEnd w:id="10"/>
@@ -9126,6 +9910,7 @@
           <w:sz w:val="24"/>
           <w:szCs w:val="24"/>
         </w:rPr>
+        <w:lastRenderedPageBreak/>
         <w:t xml:space="preserve">Se algo der errado no Passo 3 (ex.: computador sem o </w:t>
       </w:r>
       <w:proofErr w:type="spellStart"/>
@@ -9179,7 +9964,7 @@
         </w:rPr>
         <w:t xml:space="preserve">baixe em </w:t>
       </w:r>
-      <w:hyperlink r:id="rId18" w:history="1">
+      <w:hyperlink r:id="rId19" w:history="1">
         <w:r>
           <w:rPr>
             <w:rStyle w:val="Hyperlink"/>
@@ -9345,7 +10130,16 @@
           <w:sz w:val="24"/>
           <w:szCs w:val="24"/>
         </w:rPr>
-        <w:t xml:space="preserve"> clone https://github.com/ryckardo42/aft-toolkit.git ~/.</w:t>
+        <w:t xml:space="preserve"> clone https://github.com/ryckardo42/aft-toolkit.git ~</w:t>
+      </w:r>
+      <w:proofErr w:type="gramStart"/>
+      <w:r>
+        <w:rPr>
+          <w:rFonts w:ascii="Calibri" w:eastAsia="Consolas" w:hAnsi="Calibri" w:cs="Calibri"/>
+          <w:sz w:val="24"/>
+          <w:szCs w:val="24"/>
+        </w:rPr>
+        <w:t>/.</w:t>
       </w:r>
       <w:proofErr w:type="spellStart"/>
       <w:r>
@@ -9357,6 +10151,7 @@
         <w:t>claude</w:t>
       </w:r>
       <w:proofErr w:type="spellEnd"/>
+      <w:proofErr w:type="gramEnd"/>
       <w:r>
         <w:rPr>
           <w:rFonts w:ascii="Calibri" w:eastAsia="Consolas" w:hAnsi="Calibri" w:cs="Calibri"/>
@@ -9371,7 +10166,16 @@
           <w:sz w:val="24"/>
           <w:szCs w:val="24"/>
         </w:rPr>
-        <w:t xml:space="preserve"> (as skills precisam ficar diretamente dentro de ~/.</w:t>
+        <w:t xml:space="preserve"> (as skills precisam ficar diretamente dentro de ~</w:t>
+      </w:r>
+      <w:proofErr w:type="gramStart"/>
+      <w:r>
+        <w:rPr>
+          <w:rFonts w:ascii="Calibri" w:hAnsi="Calibri" w:cs="Calibri"/>
+          <w:sz w:val="24"/>
+          <w:szCs w:val="24"/>
+        </w:rPr>
+        <w:t>/.</w:t>
       </w:r>
       <w:proofErr w:type="spellStart"/>
       <w:r>
@@ -9383,13 +10187,23 @@
         <w:t>claude</w:t>
       </w:r>
       <w:proofErr w:type="spellEnd"/>
-      <w:r>
-        <w:rPr>
-          <w:rFonts w:ascii="Calibri" w:hAnsi="Calibri" w:cs="Calibri"/>
-          <w:sz w:val="24"/>
-          <w:szCs w:val="24"/>
-        </w:rPr>
-        <w:t>/skills, ex.: ~/.</w:t>
+      <w:proofErr w:type="gramEnd"/>
+      <w:r>
+        <w:rPr>
+          <w:rFonts w:ascii="Calibri" w:hAnsi="Calibri" w:cs="Calibri"/>
+          <w:sz w:val="24"/>
+          <w:szCs w:val="24"/>
+        </w:rPr>
+        <w:t>/skills, ex.: ~</w:t>
+      </w:r>
+      <w:proofErr w:type="gramStart"/>
+      <w:r>
+        <w:rPr>
+          <w:rFonts w:ascii="Calibri" w:hAnsi="Calibri" w:cs="Calibri"/>
+          <w:sz w:val="24"/>
+          <w:szCs w:val="24"/>
+        </w:rPr>
+        <w:t>/.</w:t>
       </w:r>
       <w:proofErr w:type="spellStart"/>
       <w:r>
@@ -9401,6 +10215,7 @@
         <w:t>claude</w:t>
       </w:r>
       <w:proofErr w:type="spellEnd"/>
+      <w:proofErr w:type="gramEnd"/>
       <w:r>
         <w:rPr>
           <w:rFonts w:ascii="Calibri" w:hAnsi="Calibri" w:cs="Calibri"/>
@@ -9587,7 +10402,7 @@
         </w:rPr>
         <w:t xml:space="preserve">Abra a página da extensão na loja do Chrome — </w:t>
       </w:r>
-      <w:hyperlink r:id="rId19" w:history="1">
+      <w:hyperlink r:id="rId20" w:history="1">
         <w:r>
           <w:rPr>
             <w:rStyle w:val="Hyperlink"/>
@@ -9773,7 +10588,7 @@
                     <pic:cNvPicPr/>
                   </pic:nvPicPr>
                   <pic:blipFill>
-                    <a:blip r:embed="rId20">
+                    <a:blip r:embed="rId21">
                       <a:extLst>
                         <a:ext uri="{28A0092B-C50C-407E-A947-70E740481C1C}">
                           <a14:useLocalDpi xmlns:a14="http://schemas.microsoft.com/office/drawing/2010/main" val="0"/>
@@ -9944,7 +10759,7 @@
           <w:szCs w:val="24"/>
         </w:rPr>
         <w:drawing>
-          <wp:inline distT="0" distB="0" distL="0" distR="0" wp14:anchorId="38B8496B" wp14:editId="4EABFACC">
+          <wp:inline distT="0" distB="0" distL="0" distR="0" wp14:anchorId="38B8496B" wp14:editId="0BFF9213">
             <wp:extent cx="3707553" cy="2077307"/>
             <wp:effectExtent l="0" t="0" r="1270" b="5715"/>
             <wp:docPr id="248311817" name="Imagem 3" descr="Interface gráfica do usuário, Texto, Aplicativo&#10;&#10;O conteúdo gerado por IA pode estar incorreto."/>
@@ -9959,7 +10774,7 @@
                     <pic:cNvPicPr/>
                   </pic:nvPicPr>
                   <pic:blipFill>
-                    <a:blip r:embed="rId21" cstate="print">
+                    <a:blip r:embed="rId22" cstate="print">
                       <a:extLst>
                         <a:ext uri="{28A0092B-C50C-407E-A947-70E740481C1C}">
                           <a14:useLocalDpi xmlns:a14="http://schemas.microsoft.com/office/drawing/2010/main" val="0"/>
@@ -10032,7 +10847,25 @@
           <w:sz w:val="24"/>
           <w:szCs w:val="24"/>
         </w:rPr>
-        <w:t>para cada OS de OS ATIVAS/ que tenha CNPJ na ficha e atualiza o memory.md — notificação nova entra como “- [ ] CÓDIGO — prazo dd/mm/aaaa”; prazo que mudou no DET é corrigido na linha existente.</w:t>
+        <w:t xml:space="preserve">para cada OS de OS ATIVAS/ que tenha CNPJ na ficha e atualiza o memory.md — notificação nova entra como “- </w:t>
+      </w:r>
+      <w:proofErr w:type="gramStart"/>
+      <w:r>
+        <w:rPr>
+          <w:rFonts w:ascii="Calibri" w:hAnsi="Calibri" w:cs="Calibri"/>
+          <w:sz w:val="24"/>
+          <w:szCs w:val="24"/>
+        </w:rPr>
+        <w:t>[ ]</w:t>
+      </w:r>
+      <w:proofErr w:type="gramEnd"/>
+      <w:r>
+        <w:rPr>
+          <w:rFonts w:ascii="Calibri" w:hAnsi="Calibri" w:cs="Calibri"/>
+          <w:sz w:val="24"/>
+          <w:szCs w:val="24"/>
+        </w:rPr>
+        <w:t xml:space="preserve"> CÓDIGO — prazo dd/mm/aaaa”; prazo que mudou no DET é corrigido na linha existente.</w:t>
       </w:r>
     </w:p>
     <w:p>
@@ -10078,7 +10911,25 @@
           <w:sz w:val="24"/>
           <w:szCs w:val="24"/>
         </w:rPr>
-        <w:t xml:space="preserve">O resultado é ótimo no painel é ótimo. Pra quem trabalha em dupla e quer visualizar só suas </w:t>
+        <w:t xml:space="preserve">O resultado é ótimo no painel é ótimo. </w:t>
+      </w:r>
+      <w:proofErr w:type="gramStart"/>
+      <w:r>
+        <w:rPr>
+          <w:rFonts w:ascii="Calibri" w:hAnsi="Calibri" w:cs="Calibri"/>
+          <w:sz w:val="24"/>
+          <w:szCs w:val="24"/>
+        </w:rPr>
+        <w:t>Pra</w:t>
+      </w:r>
+      <w:proofErr w:type="gramEnd"/>
+      <w:r>
+        <w:rPr>
+          <w:rFonts w:ascii="Calibri" w:hAnsi="Calibri" w:cs="Calibri"/>
+          <w:sz w:val="24"/>
+          <w:szCs w:val="24"/>
+        </w:rPr>
+        <w:t xml:space="preserve"> quem trabalha em dupla e quer visualizar só suas </w:t>
       </w:r>
       <w:proofErr w:type="spellStart"/>
       <w:r>
@@ -10131,7 +10982,7 @@
           <w:szCs w:val="24"/>
         </w:rPr>
         <w:drawing>
-          <wp:inline distT="0" distB="0" distL="0" distR="0" wp14:anchorId="4BC4078E" wp14:editId="43668292">
+          <wp:inline distT="0" distB="0" distL="0" distR="0" wp14:anchorId="4BC4078E" wp14:editId="059A5019">
             <wp:extent cx="4732443" cy="3287750"/>
             <wp:effectExtent l="0" t="0" r="5080" b="1905"/>
             <wp:docPr id="1676791193" name="Imagem 4" descr="Interface gráfica do usuário, Texto, Aplicativo, Email&#10;&#10;O conteúdo gerado por IA pode estar incorreto."/>
@@ -10146,7 +10997,7 @@
                     <pic:cNvPicPr/>
                   </pic:nvPicPr>
                   <pic:blipFill>
-                    <a:blip r:embed="rId22" cstate="print">
+                    <a:blip r:embed="rId23" cstate="print">
                       <a:extLst>
                         <a:ext uri="{28A0092B-C50C-407E-A947-70E740481C1C}">
                           <a14:useLocalDpi xmlns:a14="http://schemas.microsoft.com/office/drawing/2010/main" val="0"/>
@@ -10333,6 +11184,7 @@
           <w:szCs w:val="24"/>
         </w:rPr>
       </w:pPr>
+      <w:proofErr w:type="gramStart"/>
       <w:r>
         <w:rPr>
           <w:rFonts w:ascii="Calibri" w:hAnsi="Calibri" w:cs="Calibri"/>
@@ -10341,7 +11193,18 @@
           <w:sz w:val="24"/>
           <w:szCs w:val="24"/>
         </w:rPr>
-        <w:t>Sincronizou mas a notificação não apareceu</w:t>
+        <w:t>Sincronizou</w:t>
+      </w:r>
+      <w:proofErr w:type="gramEnd"/>
+      <w:r>
+        <w:rPr>
+          <w:rFonts w:ascii="Calibri" w:hAnsi="Calibri" w:cs="Calibri"/>
+          <w:b/>
+          <w:bCs/>
+          <w:sz w:val="24"/>
+          <w:szCs w:val="24"/>
+        </w:rPr>
+        <w:t xml:space="preserve"> mas a notificação não apareceu</w:t>
       </w:r>
       <w:r>
         <w:rPr>
@@ -10465,7 +11328,43 @@
           <w:sz w:val="24"/>
           <w:szCs w:val="24"/>
         </w:rPr>
-        <w:t>o fluxo completo do capítulo 4 é o caminho recomendado para quem quer rastrear prazos de DET e manter o painel atualizado, mas nenhuma skill de redação exige esse fluxo. Você pode chamar /inspecao-inicial, /registro, /aft-rt-rgi, /PGR-analise ou /det-630 direto, colar a narrativa da inspeção e receber o texto do auto pronto — sem nunca ter cadastrado uma OS e sem precisar do CNPJ real (um nome fantasia basta; o texto do auto nunca embute o CNPJ no corpo, ele é só metadado administrativo). O CNPJ só passa a ser obrigatório no /gera-ai, porque é um campo exigido pelo próprio Sistema Auditor — não pelo toolkit — para a importação do TXT. Ou seja: dá para usar o toolkit só para gerar o texto dos autos, sem nunca empacotar nada.</w:t>
+        <w:t>o fluxo completo do capítulo 4 é o caminho recomendado para quem quer rastrear prazos de DET e manter o painel atualizado, mas nenhuma skill de redação exige esse fluxo. Você pode chamar /inspecao-inicial, /registro, /aft-rt-rgi, /PGR-</w:t>
+      </w:r>
+      <w:proofErr w:type="gramStart"/>
+      <w:r>
+        <w:rPr>
+          <w:rFonts w:ascii="Calibri" w:hAnsi="Calibri" w:cs="Calibri"/>
+          <w:sz w:val="24"/>
+          <w:szCs w:val="24"/>
+        </w:rPr>
+        <w:t>analise</w:t>
+      </w:r>
+      <w:proofErr w:type="gramEnd"/>
+      <w:r>
+        <w:rPr>
+          <w:rFonts w:ascii="Calibri" w:hAnsi="Calibri" w:cs="Calibri"/>
+          <w:sz w:val="24"/>
+          <w:szCs w:val="24"/>
+        </w:rPr>
+        <w:t xml:space="preserve"> ou /det-630 direto, colar a narrativa da inspeção e receber o texto do auto pronto — sem nunca ter cadastrado uma OS e sem precisar do CNPJ real (um nome fantasia basta; o texto do auto nunca embute o CNPJ no corpo, ele é só metadado administrativo). O CNPJ só passa a ser obrigatório no /gera-</w:t>
+      </w:r>
+      <w:proofErr w:type="gramStart"/>
+      <w:r>
+        <w:rPr>
+          <w:rFonts w:ascii="Calibri" w:hAnsi="Calibri" w:cs="Calibri"/>
+          <w:sz w:val="24"/>
+          <w:szCs w:val="24"/>
+        </w:rPr>
+        <w:t>ai</w:t>
+      </w:r>
+      <w:proofErr w:type="gramEnd"/>
+      <w:r>
+        <w:rPr>
+          <w:rFonts w:ascii="Calibri" w:hAnsi="Calibri" w:cs="Calibri"/>
+          <w:sz w:val="24"/>
+          <w:szCs w:val="24"/>
+        </w:rPr>
+        <w:t>, porque é um campo exigido pelo próprio Sistema Auditor — não pelo toolkit — para a importação do TXT. Ou seja: dá para usar o toolkit só para gerar o texto dos autos, sem nunca empacotar nada.</w:t>
       </w:r>
     </w:p>
     <w:p>
@@ -11740,7 +12639,25 @@
                 <w:sz w:val="24"/>
                 <w:szCs w:val="24"/>
               </w:rPr>
-              <w:t xml:space="preserve">/notebooks para tirar uma duvida </w:t>
+              <w:t xml:space="preserve">/notebooks para tirar uma </w:t>
+            </w:r>
+            <w:proofErr w:type="gramStart"/>
+            <w:r>
+              <w:rPr>
+                <w:rFonts w:ascii="Calibri" w:hAnsi="Calibri" w:cs="Calibri"/>
+                <w:sz w:val="24"/>
+                <w:szCs w:val="24"/>
+              </w:rPr>
+              <w:t>duvida</w:t>
+            </w:r>
+            <w:proofErr w:type="gramEnd"/>
+            <w:r>
+              <w:rPr>
+                <w:rFonts w:ascii="Calibri" w:hAnsi="Calibri" w:cs="Calibri"/>
+                <w:sz w:val="24"/>
+                <w:szCs w:val="24"/>
+              </w:rPr>
+              <w:t xml:space="preserve"> </w:t>
             </w:r>
             <w:proofErr w:type="spellStart"/>
             <w:r>
@@ -12199,8 +13116,18 @@
                 <w:szCs w:val="24"/>
               </w:rPr>
               <w:lastRenderedPageBreak/>
-              <w:t>/PGR-analise</w:t>
-            </w:r>
+              <w:t>/PGR-</w:t>
+            </w:r>
+            <w:proofErr w:type="gramStart"/>
+            <w:r>
+              <w:rPr>
+                <w:rFonts w:ascii="Calibri" w:eastAsia="Consolas" w:hAnsi="Calibri" w:cs="Calibri"/>
+                <w:sz w:val="24"/>
+                <w:szCs w:val="24"/>
+              </w:rPr>
+              <w:t>analise</w:t>
+            </w:r>
+            <w:proofErr w:type="gramEnd"/>
           </w:p>
         </w:tc>
         <w:tc>
@@ -12672,7 +13599,27 @@
                 <w:szCs w:val="24"/>
               </w:rPr>
               <w:lastRenderedPageBreak/>
-              <w:t>/analise-acidente</w:t>
+              <w:t>/</w:t>
+            </w:r>
+            <w:proofErr w:type="gramStart"/>
+            <w:r>
+              <w:rPr>
+                <w:rFonts w:ascii="Calibri" w:hAnsi="Calibri" w:cs="Calibri"/>
+                <w:b/>
+                <w:sz w:val="24"/>
+                <w:szCs w:val="24"/>
+              </w:rPr>
+              <w:t>analise</w:t>
+            </w:r>
+            <w:proofErr w:type="gramEnd"/>
+            <w:r>
+              <w:rPr>
+                <w:rFonts w:ascii="Calibri" w:hAnsi="Calibri" w:cs="Calibri"/>
+                <w:b/>
+                <w:sz w:val="24"/>
+                <w:szCs w:val="24"/>
+              </w:rPr>
+              <w:t>-acidente</w:t>
             </w:r>
           </w:p>
         </w:tc>
@@ -12689,13 +13636,23 @@
                 <w:szCs w:val="24"/>
               </w:rPr>
             </w:pPr>
-            <w:r>
-              <w:rPr>
-                <w:rFonts w:ascii="Calibri" w:hAnsi="Calibri" w:cs="Calibri"/>
-                <w:sz w:val="24"/>
-                <w:szCs w:val="24"/>
-              </w:rPr>
-              <w:t xml:space="preserve">Analise de acidente do trabalho: </w:t>
+            <w:proofErr w:type="gramStart"/>
+            <w:r>
+              <w:rPr>
+                <w:rFonts w:ascii="Calibri" w:hAnsi="Calibri" w:cs="Calibri"/>
+                <w:sz w:val="24"/>
+                <w:szCs w:val="24"/>
+              </w:rPr>
+              <w:t>Analise</w:t>
+            </w:r>
+            <w:proofErr w:type="gramEnd"/>
+            <w:r>
+              <w:rPr>
+                <w:rFonts w:ascii="Calibri" w:hAnsi="Calibri" w:cs="Calibri"/>
+                <w:sz w:val="24"/>
+                <w:szCs w:val="24"/>
+              </w:rPr>
+              <w:t xml:space="preserve"> de acidente do trabalho: </w:t>
             </w:r>
             <w:proofErr w:type="spellStart"/>
             <w:r>
@@ -12749,7 +13706,25 @@
                 <w:sz w:val="24"/>
                 <w:szCs w:val="24"/>
               </w:rPr>
-              <w:t xml:space="preserve"> de Analise na estrutura da IN GMTP/MTP n. 2/2022, </w:t>
+              <w:t xml:space="preserve"> de </w:t>
+            </w:r>
+            <w:proofErr w:type="gramStart"/>
+            <w:r>
+              <w:rPr>
+                <w:rFonts w:ascii="Calibri" w:hAnsi="Calibri" w:cs="Calibri"/>
+                <w:sz w:val="24"/>
+                <w:szCs w:val="24"/>
+              </w:rPr>
+              <w:t>Analise</w:t>
+            </w:r>
+            <w:proofErr w:type="gramEnd"/>
+            <w:r>
+              <w:rPr>
+                <w:rFonts w:ascii="Calibri" w:hAnsi="Calibri" w:cs="Calibri"/>
+                <w:sz w:val="24"/>
+                <w:szCs w:val="24"/>
+              </w:rPr>
+              <w:t xml:space="preserve"> na estrutura da IN GMTP/MTP n. 2/2022, </w:t>
             </w:r>
             <w:proofErr w:type="spellStart"/>
             <w:r>
@@ -12983,7 +13958,25 @@
           <w:sz w:val="24"/>
           <w:szCs w:val="24"/>
         </w:rPr>
-        <w:t>-inicial as aciona sozinha quando identifica a NR; você também pode chamá-las direto.</w:t>
+        <w:t>-</w:t>
+      </w:r>
+      <w:proofErr w:type="gramStart"/>
+      <w:r>
+        <w:rPr>
+          <w:rFonts w:ascii="Calibri" w:hAnsi="Calibri" w:cs="Calibri"/>
+          <w:sz w:val="24"/>
+          <w:szCs w:val="24"/>
+        </w:rPr>
+        <w:t>inicial</w:t>
+      </w:r>
+      <w:proofErr w:type="gramEnd"/>
+      <w:r>
+        <w:rPr>
+          <w:rFonts w:ascii="Calibri" w:hAnsi="Calibri" w:cs="Calibri"/>
+          <w:sz w:val="24"/>
+          <w:szCs w:val="24"/>
+        </w:rPr>
+        <w:t xml:space="preserve"> as aciona sozinha quando identifica a NR; você também pode chamá-las direto.</w:t>
       </w:r>
     </w:p>
     <w:tbl>
@@ -13433,8 +14426,18 @@
                 <w:sz w:val="24"/>
                 <w:szCs w:val="24"/>
               </w:rPr>
-              <w:t>/jornada-analise</w:t>
-            </w:r>
+              <w:t>/jornada-</w:t>
+            </w:r>
+            <w:proofErr w:type="gramStart"/>
+            <w:r>
+              <w:rPr>
+                <w:rFonts w:ascii="Calibri" w:eastAsia="Consolas" w:hAnsi="Calibri" w:cs="Calibri"/>
+                <w:sz w:val="24"/>
+                <w:szCs w:val="24"/>
+              </w:rPr>
+              <w:t>analise</w:t>
+            </w:r>
+            <w:proofErr w:type="gramEnd"/>
           </w:p>
         </w:tc>
         <w:tc>
@@ -13692,6 +14695,7 @@
                 <w:sz w:val="24"/>
                 <w:szCs w:val="24"/>
               </w:rPr>
+              <w:lastRenderedPageBreak/>
               <w:t>/jornada-auto-</w:t>
             </w:r>
             <w:proofErr w:type="spellStart"/>
@@ -13935,9 +14939,19 @@
                 <w:sz w:val="24"/>
                 <w:szCs w:val="24"/>
               </w:rPr>
-              <w:t>gera-ai</w:t>
+              <w:t>gera-</w:t>
+            </w:r>
+            <w:proofErr w:type="gramStart"/>
+            <w:r>
+              <w:rPr>
+                <w:rFonts w:ascii="Calibri" w:eastAsia="Consolas" w:hAnsi="Calibri" w:cs="Calibri"/>
+                <w:sz w:val="24"/>
+                <w:szCs w:val="24"/>
+              </w:rPr>
+              <w:t>ai</w:t>
             </w:r>
             <w:proofErr w:type="spellEnd"/>
+            <w:proofErr w:type="gramEnd"/>
           </w:p>
         </w:tc>
         <w:tc>
@@ -14078,16 +15092,44 @@
                 <w:sz w:val="24"/>
                 <w:szCs w:val="24"/>
               </w:rPr>
-              <w:t>gera-ai</w:t>
+              <w:t>gera-</w:t>
+            </w:r>
+            <w:proofErr w:type="gramStart"/>
+            <w:r>
+              <w:rPr>
+                <w:rFonts w:ascii="Calibri" w:hAnsi="Calibri" w:cs="Calibri"/>
+                <w:sz w:val="24"/>
+                <w:szCs w:val="24"/>
+              </w:rPr>
+              <w:t>ai</w:t>
             </w:r>
             <w:proofErr w:type="spellEnd"/>
-            <w:r>
-              <w:rPr>
-                <w:rFonts w:ascii="Calibri" w:hAnsi="Calibri" w:cs="Calibri"/>
-                <w:sz w:val="24"/>
-                <w:szCs w:val="24"/>
-              </w:rPr>
-              <w:t>, antes do empacotamento: confere o checklist 5W1H (O Quê, Quando, Onde, Como, Por Quê) em cada auto e, em autos de SST, garante o parágrafo de dano coletivo (Portaria MTP 667/2021). Também pode ser chamado isoladamente sobre um rascunho de auto.</w:t>
+            <w:proofErr w:type="gramEnd"/>
+            <w:r>
+              <w:rPr>
+                <w:rFonts w:ascii="Calibri" w:hAnsi="Calibri" w:cs="Calibri"/>
+                <w:sz w:val="24"/>
+                <w:szCs w:val="24"/>
+              </w:rPr>
+              <w:t xml:space="preserve">, antes do empacotamento: confere o checklist 5W1H (O Quê, Quando, Onde, Como, </w:t>
+            </w:r>
+            <w:proofErr w:type="gramStart"/>
+            <w:r>
+              <w:rPr>
+                <w:rFonts w:ascii="Calibri" w:hAnsi="Calibri" w:cs="Calibri"/>
+                <w:sz w:val="24"/>
+                <w:szCs w:val="24"/>
+              </w:rPr>
+              <w:t>Por Quê</w:t>
+            </w:r>
+            <w:proofErr w:type="gramEnd"/>
+            <w:r>
+              <w:rPr>
+                <w:rFonts w:ascii="Calibri" w:hAnsi="Calibri" w:cs="Calibri"/>
+                <w:sz w:val="24"/>
+                <w:szCs w:val="24"/>
+              </w:rPr>
+              <w:t>) em cada auto e, em autos de SST, garante o parágrafo de dano coletivo (Portaria MTP 667/2021). Também pode ser chamado isoladamente sobre um rascunho de auto.</w:t>
             </w:r>
           </w:p>
         </w:tc>
@@ -14381,7 +15423,29 @@
           <w:szCs w:val="24"/>
           <w:shd w:val="clear" w:color="auto" w:fill="FDFDFC"/>
         </w:rPr>
-        <w:t>Você vai ver, em várias skills, referência a arquivos com nome  tipo </w:t>
+        <w:t xml:space="preserve">Você vai ver, em várias skills, referência a arquivos com </w:t>
+      </w:r>
+      <w:proofErr w:type="gramStart"/>
+      <w:r>
+        <w:rPr>
+          <w:rFonts w:ascii="Calibri" w:hAnsi="Calibri" w:cs="Calibri"/>
+          <w:color w:val="000000" w:themeColor="text1"/>
+          <w:sz w:val="24"/>
+          <w:szCs w:val="24"/>
+          <w:shd w:val="clear" w:color="auto" w:fill="FDFDFC"/>
+        </w:rPr>
+        <w:t>nome  tipo</w:t>
+      </w:r>
+      <w:proofErr w:type="gramEnd"/>
+      <w:r>
+        <w:rPr>
+          <w:rFonts w:ascii="Calibri" w:hAnsi="Calibri" w:cs="Calibri"/>
+          <w:color w:val="000000" w:themeColor="text1"/>
+          <w:sz w:val="24"/>
+          <w:szCs w:val="24"/>
+          <w:shd w:val="clear" w:color="auto" w:fill="FDFDFC"/>
+        </w:rPr>
+        <w:t> </w:t>
       </w:r>
       <w:r>
         <w:rPr>
@@ -14444,8 +15508,9 @@
           <w:szCs w:val="24"/>
           <w:shd w:val="clear" w:color="auto" w:fill="FDFDFC"/>
         </w:rPr>
-        <w:t xml:space="preserve">: pequenos programinhas de computador, parecidos com uma calculadora ou um carimbo automático, que fazem sempre a mesma tarefa mecânica, exatamente igual, toda vez que rodam [...] A </w:t>
-      </w:r>
+        <w:t xml:space="preserve">: pequenos programinhas de computador, parecidos com uma calculadora ou um carimbo automático, que fazem sempre </w:t>
+      </w:r>
+      <w:proofErr w:type="gramStart"/>
       <w:r>
         <w:rPr>
           <w:rFonts w:ascii="Calibri" w:hAnsi="Calibri" w:cs="Calibri"/>
@@ -14454,8 +15519,18 @@
           <w:szCs w:val="24"/>
           <w:shd w:val="clear" w:color="auto" w:fill="FDFDFC"/>
         </w:rPr>
-        <w:lastRenderedPageBreak/>
-        <w:t xml:space="preserve">diferença para a IA é essa: a IA "pensa" [...], enquanto o script só executa uma receita fixa, sem interpretar nada. [...] E é aqui que mora a "mágica" do Claude </w:t>
+        <w:t>a mesma</w:t>
+      </w:r>
+      <w:proofErr w:type="gramEnd"/>
+      <w:r>
+        <w:rPr>
+          <w:rFonts w:ascii="Calibri" w:hAnsi="Calibri" w:cs="Calibri"/>
+          <w:color w:val="000000" w:themeColor="text1"/>
+          <w:sz w:val="24"/>
+          <w:szCs w:val="24"/>
+          <w:shd w:val="clear" w:color="auto" w:fill="FDFDFC"/>
+        </w:rPr>
+        <w:t xml:space="preserve"> tarefa mecânica, exatamente igual, toda vez que rodam [...] A diferença para a IA é essa: a IA "pensa" [...], enquanto o script só executa uma receita fixa, sem interpretar nada. [...] E é aqui que mora a "mágica" do Claude </w:t>
       </w:r>
       <w:proofErr w:type="spellStart"/>
       <w:r>
@@ -14836,6 +15911,7 @@
                 <w:sz w:val="24"/>
                 <w:szCs w:val="24"/>
               </w:rPr>
+              <w:lastRenderedPageBreak/>
               <w:t xml:space="preserve">Python </w:t>
             </w:r>
             <w:proofErr w:type="spellStart"/>
@@ -14879,7 +15955,17 @@
                 <w:sz w:val="24"/>
                 <w:szCs w:val="24"/>
               </w:rPr>
-              <w:t>Injeta o Subtítulo 3 (OBSERVAÇÕES) canônico — lido de config/blocos_auto.md — em todo auto, byte a byte idêntico. As skills de redação não escrevem mais esse bloco; só o /</w:t>
+              <w:lastRenderedPageBreak/>
+              <w:t xml:space="preserve">Injeta o Subtítulo 3 (OBSERVAÇÕES) canônico — lido de config/blocos_auto.md — em todo auto, byte a byte idêntico. As </w:t>
+            </w:r>
+            <w:r>
+              <w:rPr>
+                <w:rFonts w:ascii="Calibri" w:hAnsi="Calibri" w:cs="Calibri"/>
+                <w:sz w:val="24"/>
+                <w:szCs w:val="24"/>
+              </w:rPr>
+              <w:lastRenderedPageBreak/>
+              <w:t>skills de redação não escrevem mais esse bloco; só o /</w:t>
             </w:r>
             <w:proofErr w:type="spellStart"/>
             <w:r>
@@ -14888,9 +15974,19 @@
                 <w:sz w:val="24"/>
                 <w:szCs w:val="24"/>
               </w:rPr>
-              <w:t>gera-ai</w:t>
+              <w:t>gera-</w:t>
+            </w:r>
+            <w:proofErr w:type="gramStart"/>
+            <w:r>
+              <w:rPr>
+                <w:rFonts w:ascii="Calibri" w:hAnsi="Calibri" w:cs="Calibri"/>
+                <w:sz w:val="24"/>
+                <w:szCs w:val="24"/>
+              </w:rPr>
+              <w:t>ai</w:t>
             </w:r>
             <w:proofErr w:type="spellEnd"/>
+            <w:proofErr w:type="gramEnd"/>
             <w:r>
               <w:rPr>
                 <w:rFonts w:ascii="Calibri" w:hAnsi="Calibri" w:cs="Calibri"/>
@@ -14935,6 +16031,7 @@
                 <w:bdr w:val="single" w:sz="6" w:space="1" w:color="2A323C" w:frame="1"/>
                 <w:shd w:val="clear" w:color="auto" w:fill="0D1117"/>
               </w:rPr>
+              <w:lastRenderedPageBreak/>
               <w:t>validar_txt.py</w:t>
             </w:r>
           </w:p>
@@ -15845,6 +16942,7 @@
               <w:t xml:space="preserve">Varre OS ATIVAS/*/memory.md (parser tolerante), calcula dias-para-o-prazo com </w:t>
             </w:r>
             <w:proofErr w:type="spellStart"/>
+            <w:proofErr w:type="gramStart"/>
             <w:r>
               <w:rPr>
                 <w:rFonts w:ascii="Calibri" w:hAnsi="Calibri" w:cs="Calibri"/>
@@ -15854,6 +16952,7 @@
               <w:t>date.today</w:t>
             </w:r>
             <w:proofErr w:type="spellEnd"/>
+            <w:proofErr w:type="gramEnd"/>
             <w:r>
               <w:rPr>
                 <w:rFonts w:ascii="Calibri" w:hAnsi="Calibri" w:cs="Calibri"/>
@@ -16006,7 +17105,6 @@
                 <w:bdr w:val="single" w:sz="6" w:space="1" w:color="2A323C" w:frame="1"/>
                 <w:shd w:val="clear" w:color="auto" w:fill="0D1117"/>
               </w:rPr>
-              <w:lastRenderedPageBreak/>
               <w:t>aft_doctor.py</w:t>
             </w:r>
           </w:p>
@@ -16387,6 +17485,7 @@
                 <w:bdr w:val="single" w:sz="6" w:space="1" w:color="2A323C" w:frame="1"/>
                 <w:shd w:val="clear" w:color="auto" w:fill="0D1117"/>
               </w:rPr>
+              <w:lastRenderedPageBreak/>
               <w:t>comprimir_pdf.py</w:t>
             </w:r>
           </w:p>
@@ -17360,7 +18459,27 @@
           <w:sz w:val="24"/>
           <w:szCs w:val="24"/>
         </w:rPr>
-        <w:t xml:space="preserve"> do  cabeçalho.</w:t>
+        <w:t xml:space="preserve"> </w:t>
+      </w:r>
+      <w:proofErr w:type="gramStart"/>
+      <w:r>
+        <w:rPr>
+          <w:rFonts w:ascii="Calibri" w:hAnsi="Calibri" w:cs="Calibri"/>
+          <w:color w:val="000000" w:themeColor="text1"/>
+          <w:sz w:val="24"/>
+          <w:szCs w:val="24"/>
+        </w:rPr>
+        <w:t>do  cabeçalho</w:t>
+      </w:r>
+      <w:proofErr w:type="gramEnd"/>
+      <w:r>
+        <w:rPr>
+          <w:rFonts w:ascii="Calibri" w:hAnsi="Calibri" w:cs="Calibri"/>
+          <w:color w:val="000000" w:themeColor="text1"/>
+          <w:sz w:val="24"/>
+          <w:szCs w:val="24"/>
+        </w:rPr>
+        <w:t>.</w:t>
       </w:r>
     </w:p>
     <w:p>
@@ -17550,7 +18669,6 @@
           <w:sz w:val="24"/>
           <w:szCs w:val="24"/>
         </w:rPr>
-        <w:lastRenderedPageBreak/>
         <w:t>A detecção de notificações DET do /painel é heurística (pode dar falso positivo) — o AFT confere antes de cadastrar.</w:t>
       </w:r>
     </w:p>
@@ -17772,7 +18890,25 @@
           <w:sz w:val="24"/>
           <w:szCs w:val="24"/>
         </w:rPr>
-        <w:t xml:space="preserve"> (arquivo .depara na pasta da OS) que associa um código a cada dado real: [[TRAB_01]] para o nome, [[CPF_01]] para o CPF, [[AUTUADA]] para a razão social.</w:t>
+        <w:t xml:space="preserve"> (</w:t>
+      </w:r>
+      <w:proofErr w:type="gramStart"/>
+      <w:r>
+        <w:rPr>
+          <w:rFonts w:ascii="Calibri" w:hAnsi="Calibri" w:cs="Calibri"/>
+          <w:sz w:val="24"/>
+          <w:szCs w:val="24"/>
+        </w:rPr>
+        <w:t>arquivo .depara</w:t>
+      </w:r>
+      <w:proofErr w:type="gramEnd"/>
+      <w:r>
+        <w:rPr>
+          <w:rFonts w:ascii="Calibri" w:hAnsi="Calibri" w:cs="Calibri"/>
+          <w:sz w:val="24"/>
+          <w:szCs w:val="24"/>
+        </w:rPr>
+        <w:t xml:space="preserve"> na pasta da OS) que associa um código a cada dado real: [[TRAB_01]] para o nome, [[CPF_01]] para o CPF, [[AUTUADA]] para a razão social.</w:t>
       </w:r>
     </w:p>
     <w:p>
@@ -18257,7 +19393,25 @@
           <w:sz w:val="24"/>
           <w:szCs w:val="24"/>
         </w:rPr>
-        <w:t>; o PGR entregue vai para /PGR-analise.</w:t>
+        <w:t>; o PGR entregue vai para /PGR-</w:t>
+      </w:r>
+      <w:proofErr w:type="gramStart"/>
+      <w:r>
+        <w:rPr>
+          <w:rFonts w:ascii="Calibri" w:hAnsi="Calibri" w:cs="Calibri"/>
+          <w:sz w:val="24"/>
+          <w:szCs w:val="24"/>
+        </w:rPr>
+        <w:t>analise</w:t>
+      </w:r>
+      <w:proofErr w:type="gramEnd"/>
+      <w:r>
+        <w:rPr>
+          <w:rFonts w:ascii="Calibri" w:hAnsi="Calibri" w:cs="Calibri"/>
+          <w:sz w:val="24"/>
+          <w:szCs w:val="24"/>
+        </w:rPr>
+        <w:t>.</w:t>
       </w:r>
     </w:p>
     <w:p>
@@ -18289,9 +19443,19 @@
           <w:sz w:val="24"/>
           <w:szCs w:val="24"/>
         </w:rPr>
-        <w:t>gera-ai</w:t>
+        <w:t>gera-</w:t>
+      </w:r>
+      <w:proofErr w:type="gramStart"/>
+      <w:r>
+        <w:rPr>
+          <w:rFonts w:ascii="Calibri" w:eastAsia="Consolas" w:hAnsi="Calibri" w:cs="Calibri"/>
+          <w:sz w:val="24"/>
+          <w:szCs w:val="24"/>
+        </w:rPr>
+        <w:t>ai</w:t>
       </w:r>
       <w:proofErr w:type="spellEnd"/>
+      <w:proofErr w:type="gramEnd"/>
       <w:r>
         <w:rPr>
           <w:rFonts w:ascii="Calibri" w:hAnsi="Calibri" w:cs="Calibri"/>
@@ -18506,7 +19670,25 @@
           <w:sz w:val="24"/>
           <w:szCs w:val="24"/>
         </w:rPr>
-        <w:t>── aft-config.md                      (seus dados — criado pelo /</w:t>
+        <w:t xml:space="preserve">── aft-config.md                   </w:t>
+      </w:r>
+      <w:proofErr w:type="gramStart"/>
+      <w:r>
+        <w:rPr>
+          <w:rFonts w:ascii="Calibri" w:eastAsia="Consolas" w:hAnsi="Calibri" w:cs="Calibri"/>
+          <w:sz w:val="24"/>
+          <w:szCs w:val="24"/>
+        </w:rPr>
+        <w:t xml:space="preserve">   (</w:t>
+      </w:r>
+      <w:proofErr w:type="gramEnd"/>
+      <w:r>
+        <w:rPr>
+          <w:rFonts w:ascii="Calibri" w:eastAsia="Consolas" w:hAnsi="Calibri" w:cs="Calibri"/>
+          <w:sz w:val="24"/>
+          <w:szCs w:val="24"/>
+        </w:rPr>
+        <w:t>seus dados — criado pelo /</w:t>
       </w:r>
       <w:proofErr w:type="spellStart"/>
       <w:r>
@@ -18552,7 +19734,25 @@
           <w:sz w:val="24"/>
           <w:szCs w:val="24"/>
         </w:rPr>
-        <w:t>── painel.html                        (visão geral das OS — gerado pelo /painel)</w:t>
+        <w:t xml:space="preserve">── painel.html                     </w:t>
+      </w:r>
+      <w:proofErr w:type="gramStart"/>
+      <w:r>
+        <w:rPr>
+          <w:rFonts w:ascii="Calibri" w:eastAsia="Consolas" w:hAnsi="Calibri" w:cs="Calibri"/>
+          <w:sz w:val="24"/>
+          <w:szCs w:val="24"/>
+        </w:rPr>
+        <w:t xml:space="preserve">   (</w:t>
+      </w:r>
+      <w:proofErr w:type="gramEnd"/>
+      <w:r>
+        <w:rPr>
+          <w:rFonts w:ascii="Calibri" w:eastAsia="Consolas" w:hAnsi="Calibri" w:cs="Calibri"/>
+          <w:sz w:val="24"/>
+          <w:szCs w:val="24"/>
+        </w:rPr>
+        <w:t>visão geral das OS — gerado pelo /painel)</w:t>
       </w:r>
     </w:p>
     <w:p>
@@ -18637,7 +19837,25 @@
           <w:sz w:val="24"/>
           <w:szCs w:val="24"/>
         </w:rPr>
-        <w:t>── memory.md                  (ficha da fiscalização — criada pelo /</w:t>
+        <w:t xml:space="preserve">── memory.md               </w:t>
+      </w:r>
+      <w:proofErr w:type="gramStart"/>
+      <w:r>
+        <w:rPr>
+          <w:rFonts w:ascii="Calibri" w:eastAsia="Consolas" w:hAnsi="Calibri" w:cs="Calibri"/>
+          <w:sz w:val="24"/>
+          <w:szCs w:val="24"/>
+        </w:rPr>
+        <w:t xml:space="preserve">   (</w:t>
+      </w:r>
+      <w:proofErr w:type="gramEnd"/>
+      <w:r>
+        <w:rPr>
+          <w:rFonts w:ascii="Calibri" w:eastAsia="Consolas" w:hAnsi="Calibri" w:cs="Calibri"/>
+          <w:sz w:val="24"/>
+          <w:szCs w:val="24"/>
+        </w:rPr>
+        <w:t>ficha da fiscalização — criada pelo /</w:t>
       </w:r>
       <w:proofErr w:type="spellStart"/>
       <w:r>
@@ -18691,7 +19909,25 @@
           <w:sz w:val="24"/>
           <w:szCs w:val="24"/>
         </w:rPr>
-        <w:t>── inspecao-fisica.md         (relato de campo)</w:t>
+        <w:t xml:space="preserve">── inspecao-fisica.md      </w:t>
+      </w:r>
+      <w:proofErr w:type="gramStart"/>
+      <w:r>
+        <w:rPr>
+          <w:rFonts w:ascii="Calibri" w:eastAsia="Consolas" w:hAnsi="Calibri" w:cs="Calibri"/>
+          <w:sz w:val="24"/>
+          <w:szCs w:val="24"/>
+        </w:rPr>
+        <w:t xml:space="preserve">   (</w:t>
+      </w:r>
+      <w:proofErr w:type="gramEnd"/>
+      <w:r>
+        <w:rPr>
+          <w:rFonts w:ascii="Calibri" w:eastAsia="Consolas" w:hAnsi="Calibri" w:cs="Calibri"/>
+          <w:sz w:val="24"/>
+          <w:szCs w:val="24"/>
+        </w:rPr>
+        <w:t>relato de campo)</w:t>
       </w:r>
     </w:p>
     <w:p>
@@ -18727,7 +19963,25 @@
           <w:sz w:val="24"/>
           <w:szCs w:val="24"/>
         </w:rPr>
-        <w:t>── autos.md                   (autos redigidos)</w:t>
+        <w:t xml:space="preserve">── autos.md                </w:t>
+      </w:r>
+      <w:proofErr w:type="gramStart"/>
+      <w:r>
+        <w:rPr>
+          <w:rFonts w:ascii="Calibri" w:eastAsia="Consolas" w:hAnsi="Calibri" w:cs="Calibri"/>
+          <w:sz w:val="24"/>
+          <w:szCs w:val="24"/>
+        </w:rPr>
+        <w:t xml:space="preserve">   (</w:t>
+      </w:r>
+      <w:proofErr w:type="gramEnd"/>
+      <w:r>
+        <w:rPr>
+          <w:rFonts w:ascii="Calibri" w:eastAsia="Consolas" w:hAnsi="Calibri" w:cs="Calibri"/>
+          <w:sz w:val="24"/>
+          <w:szCs w:val="24"/>
+        </w:rPr>
+        <w:t>autos redigidos)</w:t>
       </w:r>
     </w:p>
     <w:p>
@@ -18747,7 +20001,25 @@
           <w:sz w:val="24"/>
           <w:szCs w:val="24"/>
         </w:rPr>
-        <w:t>│       └── Autos 19-05\               (TXT importável + anexos PDF)</w:t>
+        <w:t xml:space="preserve">│       └── Autos 19-05\            </w:t>
+      </w:r>
+      <w:proofErr w:type="gramStart"/>
+      <w:r>
+        <w:rPr>
+          <w:rFonts w:ascii="Calibri" w:eastAsia="Consolas" w:hAnsi="Calibri" w:cs="Calibri"/>
+          <w:sz w:val="24"/>
+          <w:szCs w:val="24"/>
+        </w:rPr>
+        <w:t xml:space="preserve">   (</w:t>
+      </w:r>
+      <w:proofErr w:type="gramEnd"/>
+      <w:r>
+        <w:rPr>
+          <w:rFonts w:ascii="Calibri" w:eastAsia="Consolas" w:hAnsi="Calibri" w:cs="Calibri"/>
+          <w:sz w:val="24"/>
+          <w:szCs w:val="24"/>
+        </w:rPr>
+        <w:t>TXT importável + anexos PDF)</w:t>
       </w:r>
     </w:p>
     <w:p>
@@ -18767,7 +20039,25 @@
           <w:sz w:val="24"/>
           <w:szCs w:val="24"/>
         </w:rPr>
-        <w:t>└── OS ARQUIVADAS\</w:t>
+        <w:t xml:space="preserve">└── </w:t>
+      </w:r>
+      <w:proofErr w:type="gramStart"/>
+      <w:r>
+        <w:rPr>
+          <w:rFonts w:ascii="Calibri" w:eastAsia="Consolas" w:hAnsi="Calibri" w:cs="Calibri"/>
+          <w:sz w:val="24"/>
+          <w:szCs w:val="24"/>
+        </w:rPr>
+        <w:t>OS ARQUIVADAS</w:t>
+      </w:r>
+      <w:proofErr w:type="gramEnd"/>
+      <w:r>
+        <w:rPr>
+          <w:rFonts w:ascii="Calibri" w:eastAsia="Consolas" w:hAnsi="Calibri" w:cs="Calibri"/>
+          <w:sz w:val="24"/>
+          <w:szCs w:val="24"/>
+        </w:rPr>
+        <w:t>\</w:t>
       </w:r>
     </w:p>
     <w:p>
@@ -18906,7 +20196,29 @@
           <w:sz w:val="24"/>
           <w:szCs w:val="24"/>
         </w:rPr>
-        <w:t xml:space="preserve">O arquivo .depara é sensível. </w:t>
+        <w:t xml:space="preserve">O </w:t>
+      </w:r>
+      <w:proofErr w:type="gramStart"/>
+      <w:r>
+        <w:rPr>
+          <w:rFonts w:ascii="Calibri" w:hAnsi="Calibri" w:cs="Calibri"/>
+          <w:b/>
+          <w:bCs/>
+          <w:sz w:val="24"/>
+          <w:szCs w:val="24"/>
+        </w:rPr>
+        <w:t>arquivo .depara</w:t>
+      </w:r>
+      <w:proofErr w:type="gramEnd"/>
+      <w:r>
+        <w:rPr>
+          <w:rFonts w:ascii="Calibri" w:hAnsi="Calibri" w:cs="Calibri"/>
+          <w:b/>
+          <w:bCs/>
+          <w:sz w:val="24"/>
+          <w:szCs w:val="24"/>
+        </w:rPr>
+        <w:t xml:space="preserve"> é sensível. </w:t>
       </w:r>
       <w:r>
         <w:rPr>
@@ -18939,7 +20251,29 @@
           <w:sz w:val="24"/>
           <w:szCs w:val="24"/>
         </w:rPr>
-        <w:t>A cópia .tokenized.txt é a versão segura para compartilhar</w:t>
+        <w:t xml:space="preserve">A </w:t>
+      </w:r>
+      <w:proofErr w:type="gramStart"/>
+      <w:r>
+        <w:rPr>
+          <w:rFonts w:ascii="Calibri" w:hAnsi="Calibri" w:cs="Calibri"/>
+          <w:b/>
+          <w:bCs/>
+          <w:sz w:val="24"/>
+          <w:szCs w:val="24"/>
+        </w:rPr>
+        <w:t>cópia .</w:t>
+      </w:r>
+      <w:proofErr w:type="gramEnd"/>
+      <w:r>
+        <w:rPr>
+          <w:rFonts w:ascii="Calibri" w:hAnsi="Calibri" w:cs="Calibri"/>
+          <w:b/>
+          <w:bCs/>
+          <w:sz w:val="24"/>
+          <w:szCs w:val="24"/>
+        </w:rPr>
+        <w:t>tokenized.txt é a versão segura para compartilhar</w:t>
       </w:r>
       <w:r>
         <w:rPr>
@@ -19626,7 +20960,16 @@
                 <w:sz w:val="24"/>
                 <w:szCs w:val="24"/>
               </w:rPr>
-              <w:t>. Se persistir, peça a ele: “as skills estão diretamente em ~/.</w:t>
+              <w:t>. Se persistir, peça a ele: “as skills estão diretamente em ~</w:t>
+            </w:r>
+            <w:proofErr w:type="gramStart"/>
+            <w:r>
+              <w:rPr>
+                <w:rFonts w:ascii="Calibri" w:hAnsi="Calibri" w:cs="Calibri"/>
+                <w:sz w:val="24"/>
+                <w:szCs w:val="24"/>
+              </w:rPr>
+              <w:t>/.</w:t>
             </w:r>
             <w:proofErr w:type="spellStart"/>
             <w:r>
@@ -19638,13 +20981,23 @@
               <w:t>claude</w:t>
             </w:r>
             <w:proofErr w:type="spellEnd"/>
-            <w:r>
-              <w:rPr>
-                <w:rFonts w:ascii="Calibri" w:hAnsi="Calibri" w:cs="Calibri"/>
-                <w:sz w:val="24"/>
-                <w:szCs w:val="24"/>
-              </w:rPr>
-              <w:t>/skills (ex.: ~/.</w:t>
+            <w:proofErr w:type="gramEnd"/>
+            <w:r>
+              <w:rPr>
+                <w:rFonts w:ascii="Calibri" w:hAnsi="Calibri" w:cs="Calibri"/>
+                <w:sz w:val="24"/>
+                <w:szCs w:val="24"/>
+              </w:rPr>
+              <w:t>/skills (ex.: ~</w:t>
+            </w:r>
+            <w:proofErr w:type="gramStart"/>
+            <w:r>
+              <w:rPr>
+                <w:rFonts w:ascii="Calibri" w:hAnsi="Calibri" w:cs="Calibri"/>
+                <w:sz w:val="24"/>
+                <w:szCs w:val="24"/>
+              </w:rPr>
+              <w:t>/.</w:t>
             </w:r>
             <w:proofErr w:type="spellStart"/>
             <w:r>
@@ -19656,6 +21009,7 @@
               <w:t>claude</w:t>
             </w:r>
             <w:proofErr w:type="spellEnd"/>
+            <w:proofErr w:type="gramEnd"/>
             <w:r>
               <w:rPr>
                 <w:rFonts w:ascii="Calibri" w:hAnsi="Calibri" w:cs="Calibri"/>
@@ -20441,7 +21795,7 @@
         </w:rPr>
         <w:t xml:space="preserve"> em </w:t>
       </w:r>
-      <w:hyperlink r:id="rId23" w:history="1">
+      <w:hyperlink r:id="rId24" w:history="1">
         <w:r>
           <w:rPr>
             <w:rStyle w:val="Hyperlink"/>
@@ -20509,12 +21863,12 @@
       </w:r>
     </w:p>
     <w:sectPr>
-      <w:headerReference w:type="even" r:id="rId24"/>
-      <w:headerReference w:type="default" r:id="rId25"/>
-      <w:footerReference w:type="even" r:id="rId26"/>
-      <w:footerReference w:type="default" r:id="rId27"/>
-      <w:headerReference w:type="first" r:id="rId28"/>
-      <w:footerReference w:type="first" r:id="rId29"/>
+      <w:headerReference w:type="even" r:id="rId25"/>
+      <w:headerReference w:type="default" r:id="rId26"/>
+      <w:footerReference w:type="even" r:id="rId27"/>
+      <w:footerReference w:type="default" r:id="rId28"/>
+      <w:headerReference w:type="first" r:id="rId29"/>
+      <w:footerReference w:type="first" r:id="rId30"/>
       <w:pgSz w:w="11906" w:h="16838"/>
       <w:pgMar w:top="720" w:right="720" w:bottom="720" w:left="720" w:header="708" w:footer="708" w:gutter="0"/>
       <w:cols w:space="720"/>

</xml_diff>

<commit_message>
docs: apostila — atualização manual do Ricardo
Ajustes feitos diretamente no Word (inclui o caminho de chegada e as novidades
recentes do toolkit).

Co-Authored-By: Claude Fable 5 <noreply@anthropic.com>
</commit_message>
<xml_diff>
--- a/Apostila-AFT-Toolkit.docx
+++ b/Apostila-AFT-Toolkit.docx
@@ -198,7 +198,16 @@
           <w:sz w:val="24"/>
           <w:szCs w:val="24"/>
         </w:rPr>
-        <w:t>Julho de 2026 · versão 1.5</w:t>
+        <w:t xml:space="preserve">Julho de 2026 · versão </w:t>
+      </w:r>
+      <w:r>
+        <w:rPr>
+          <w:rFonts w:ascii="Calibri" w:hAnsi="Calibri" w:cs="Calibri"/>
+          <w:color w:val="666666"/>
+          <w:sz w:val="24"/>
+          <w:szCs w:val="24"/>
+        </w:rPr>
+        <w:t>2.1 (20/07/26)</w:t>
       </w:r>
     </w:p>
     <w:p>
@@ -373,7 +382,7 @@
                 <w:sz w:val="24"/>
                 <w:szCs w:val="24"/>
               </w:rPr>
-              <w:t>1</w:t>
+              <w:t>2</w:t>
             </w:r>
             <w:r>
               <w:rPr>
@@ -461,7 +470,7 @@
                 <w:sz w:val="24"/>
                 <w:szCs w:val="24"/>
               </w:rPr>
-              <w:t>1</w:t>
+              <w:t>5</w:t>
             </w:r>
             <w:r>
               <w:rPr>
@@ -549,7 +558,7 @@
                 <w:sz w:val="24"/>
                 <w:szCs w:val="24"/>
               </w:rPr>
-              <w:t>1</w:t>
+              <w:t>5</w:t>
             </w:r>
             <w:r>
               <w:rPr>
@@ -637,7 +646,7 @@
                 <w:sz w:val="24"/>
                 <w:szCs w:val="24"/>
               </w:rPr>
-              <w:t>1</w:t>
+              <w:t>5</w:t>
             </w:r>
             <w:r>
               <w:rPr>
@@ -725,7 +734,7 @@
                 <w:sz w:val="24"/>
                 <w:szCs w:val="24"/>
               </w:rPr>
-              <w:t>1</w:t>
+              <w:t>6</w:t>
             </w:r>
             <w:r>
               <w:rPr>
@@ -813,7 +822,7 @@
                 <w:sz w:val="24"/>
                 <w:szCs w:val="24"/>
               </w:rPr>
-              <w:t>1</w:t>
+              <w:t>6</w:t>
             </w:r>
             <w:r>
               <w:rPr>
@@ -901,7 +910,7 @@
                 <w:sz w:val="24"/>
                 <w:szCs w:val="24"/>
               </w:rPr>
-              <w:t>1</w:t>
+              <w:t>9</w:t>
             </w:r>
             <w:r>
               <w:rPr>
@@ -989,7 +998,7 @@
                 <w:sz w:val="24"/>
                 <w:szCs w:val="24"/>
               </w:rPr>
-              <w:t>1</w:t>
+              <w:t>9</w:t>
             </w:r>
             <w:r>
               <w:rPr>
@@ -1077,7 +1086,7 @@
                 <w:sz w:val="24"/>
                 <w:szCs w:val="24"/>
               </w:rPr>
-              <w:t>1</w:t>
+              <w:t>11</w:t>
             </w:r>
             <w:r>
               <w:rPr>
@@ -1165,7 +1174,7 @@
                 <w:sz w:val="24"/>
                 <w:szCs w:val="24"/>
               </w:rPr>
-              <w:t>1</w:t>
+              <w:t>12</w:t>
             </w:r>
             <w:r>
               <w:rPr>
@@ -1253,7 +1262,7 @@
                 <w:sz w:val="24"/>
                 <w:szCs w:val="24"/>
               </w:rPr>
-              <w:t>1</w:t>
+              <w:t>12</w:t>
             </w:r>
             <w:r>
               <w:rPr>
@@ -1341,7 +1350,7 @@
                 <w:sz w:val="24"/>
                 <w:szCs w:val="24"/>
               </w:rPr>
-              <w:t>1</w:t>
+              <w:t>12</w:t>
             </w:r>
             <w:r>
               <w:rPr>
@@ -1429,7 +1438,7 @@
                 <w:sz w:val="24"/>
                 <w:szCs w:val="24"/>
               </w:rPr>
-              <w:t>1</w:t>
+              <w:t>16</w:t>
             </w:r>
             <w:r>
               <w:rPr>
@@ -1517,7 +1526,7 @@
                 <w:sz w:val="24"/>
                 <w:szCs w:val="24"/>
               </w:rPr>
-              <w:t>1</w:t>
+              <w:t>16</w:t>
             </w:r>
             <w:r>
               <w:rPr>
@@ -1605,7 +1614,7 @@
                 <w:sz w:val="24"/>
                 <w:szCs w:val="24"/>
               </w:rPr>
-              <w:t>1</w:t>
+              <w:t>17</w:t>
             </w:r>
             <w:r>
               <w:rPr>
@@ -1693,7 +1702,7 @@
                 <w:sz w:val="24"/>
                 <w:szCs w:val="24"/>
               </w:rPr>
-              <w:t>1</w:t>
+              <w:t>19</w:t>
             </w:r>
             <w:r>
               <w:rPr>
@@ -1781,7 +1790,7 @@
                 <w:sz w:val="24"/>
                 <w:szCs w:val="24"/>
               </w:rPr>
-              <w:t>1</w:t>
+              <w:t>19</w:t>
             </w:r>
             <w:r>
               <w:rPr>
@@ -1869,7 +1878,7 @@
                 <w:sz w:val="24"/>
                 <w:szCs w:val="24"/>
               </w:rPr>
-              <w:t>1</w:t>
+              <w:t>20</w:t>
             </w:r>
             <w:r>
               <w:rPr>
@@ -1957,7 +1966,7 @@
                 <w:sz w:val="24"/>
                 <w:szCs w:val="24"/>
               </w:rPr>
-              <w:t>1</w:t>
+              <w:t>23</w:t>
             </w:r>
             <w:r>
               <w:rPr>
@@ -2045,7 +2054,7 @@
                 <w:sz w:val="24"/>
                 <w:szCs w:val="24"/>
               </w:rPr>
-              <w:t>1</w:t>
+              <w:t>23</w:t>
             </w:r>
             <w:r>
               <w:rPr>
@@ -2133,7 +2142,7 @@
                 <w:sz w:val="24"/>
                 <w:szCs w:val="24"/>
               </w:rPr>
-              <w:t>1</w:t>
+              <w:t>25</w:t>
             </w:r>
             <w:r>
               <w:rPr>
@@ -2221,7 +2230,7 @@
                 <w:sz w:val="24"/>
                 <w:szCs w:val="24"/>
               </w:rPr>
-              <w:t>1</w:t>
+              <w:t>25</w:t>
             </w:r>
             <w:r>
               <w:rPr>
@@ -2309,7 +2318,7 @@
                 <w:sz w:val="24"/>
                 <w:szCs w:val="24"/>
               </w:rPr>
-              <w:t>1</w:t>
+              <w:t>26</w:t>
             </w:r>
             <w:r>
               <w:rPr>
@@ -2670,16 +2679,16 @@
         <w:rPr>
           <w:rFonts w:ascii="Calibri" w:hAnsi="Calibri" w:cs="Calibri"/>
           <w:color w:val="1A1A1A"/>
-          <w:sz w:val="24"/>
-          <w:szCs w:val="24"/>
+          <w:sz w:val="21"/>
+          <w:szCs w:val="21"/>
         </w:rPr>
       </w:pPr>
       <w:r>
         <w:rPr>
           <w:rFonts w:ascii="Calibri" w:hAnsi="Calibri" w:cs="Calibri"/>
           <w:color w:val="1A1A1A"/>
-          <w:sz w:val="24"/>
-          <w:szCs w:val="24"/>
+          <w:sz w:val="21"/>
+          <w:szCs w:val="21"/>
         </w:rPr>
         <w:t>Instale uma vez</w:t>
       </w:r>
@@ -2691,16 +2700,16 @@
         <w:rPr>
           <w:rFonts w:ascii="Calibri" w:hAnsi="Calibri" w:cs="Calibri"/>
           <w:color w:val="555555"/>
-          <w:sz w:val="24"/>
-          <w:szCs w:val="24"/>
+          <w:sz w:val="21"/>
+          <w:szCs w:val="21"/>
         </w:rPr>
       </w:pPr>
       <w:r>
         <w:rPr>
           <w:rFonts w:ascii="Calibri" w:hAnsi="Calibri" w:cs="Calibri"/>
           <w:color w:val="555555"/>
-          <w:sz w:val="24"/>
-          <w:szCs w:val="24"/>
+          <w:sz w:val="21"/>
+          <w:szCs w:val="21"/>
         </w:rPr>
         <w:t>Cria sua pasta de trabalho (</w:t>
       </w:r>
@@ -2710,8 +2719,8 @@
           <w:b/>
           <w:bCs/>
           <w:color w:val="555555"/>
-          <w:sz w:val="24"/>
-          <w:szCs w:val="24"/>
+          <w:sz w:val="21"/>
+          <w:szCs w:val="21"/>
         </w:rPr>
         <w:t>~/</w:t>
       </w:r>
@@ -2722,8 +2731,8 @@
           <w:b/>
           <w:bCs/>
           <w:color w:val="555555"/>
-          <w:sz w:val="24"/>
-          <w:szCs w:val="24"/>
+          <w:sz w:val="21"/>
+          <w:szCs w:val="21"/>
         </w:rPr>
         <w:t>Documents</w:t>
       </w:r>
@@ -2734,8 +2743,8 @@
           <w:b/>
           <w:bCs/>
           <w:color w:val="555555"/>
-          <w:sz w:val="24"/>
-          <w:szCs w:val="24"/>
+          <w:sz w:val="21"/>
+          <w:szCs w:val="21"/>
         </w:rPr>
         <w:t>/AFT</w:t>
       </w:r>
@@ -2743,8 +2752,8 @@
         <w:rPr>
           <w:rFonts w:ascii="Calibri" w:hAnsi="Calibri" w:cs="Calibri"/>
           <w:color w:val="555555"/>
-          <w:sz w:val="24"/>
-          <w:szCs w:val="24"/>
+          <w:sz w:val="21"/>
+          <w:szCs w:val="21"/>
         </w:rPr>
         <w:t>), grava seus dados de auditor (CIF, UORG), instala o seu perfil no Claude, as proteções de privacidade e deixa o </w:t>
       </w:r>
@@ -2754,8 +2763,8 @@
           <w:b/>
           <w:bCs/>
           <w:color w:val="555555"/>
-          <w:sz w:val="24"/>
-          <w:szCs w:val="24"/>
+          <w:sz w:val="21"/>
+          <w:szCs w:val="21"/>
         </w:rPr>
         <w:t>painel</w:t>
       </w:r>
@@ -2763,8 +2772,8 @@
         <w:rPr>
           <w:rFonts w:ascii="Calibri" w:hAnsi="Calibri" w:cs="Calibri"/>
           <w:color w:val="555555"/>
-          <w:sz w:val="24"/>
-          <w:szCs w:val="24"/>
+          <w:sz w:val="21"/>
+          <w:szCs w:val="21"/>
         </w:rPr>
         <w:t> sempre ligado na sua máquina. Guiado, do início ao fim.</w:t>
       </w:r>
@@ -2776,8 +2785,8 @@
         <w:rPr>
           <w:rFonts w:ascii="Calibri" w:hAnsi="Calibri" w:cs="Calibri"/>
           <w:color w:val="1A1A1A"/>
-          <w:sz w:val="24"/>
-          <w:szCs w:val="24"/>
+          <w:sz w:val="21"/>
+          <w:szCs w:val="21"/>
         </w:rPr>
       </w:pPr>
       <w:r>
@@ -2787,8 +2796,8 @@
           <w:b/>
           <w:bCs/>
           <w:color w:val="F4661B"/>
-          <w:sz w:val="24"/>
-          <w:szCs w:val="24"/>
+          <w:sz w:val="21"/>
+          <w:szCs w:val="21"/>
           <w:bdr w:val="single" w:sz="8" w:space="4" w:color="F4661B" w:frame="1"/>
           <w:shd w:val="clear" w:color="auto" w:fill="FFFFFF"/>
         </w:rPr>
@@ -2802,8 +2811,8 @@
           <w:b/>
           <w:bCs/>
           <w:color w:val="F4661B"/>
-          <w:sz w:val="24"/>
-          <w:szCs w:val="24"/>
+          <w:sz w:val="21"/>
+          <w:szCs w:val="21"/>
           <w:bdr w:val="single" w:sz="8" w:space="4" w:color="F4661B" w:frame="1"/>
           <w:shd w:val="clear" w:color="auto" w:fill="FFFFFF"/>
         </w:rPr>
@@ -2817,8 +2826,8 @@
           <w:b/>
           <w:bCs/>
           <w:color w:val="F4661B"/>
-          <w:sz w:val="24"/>
-          <w:szCs w:val="24"/>
+          <w:sz w:val="21"/>
+          <w:szCs w:val="21"/>
           <w:bdr w:val="single" w:sz="8" w:space="4" w:color="F4661B" w:frame="1"/>
           <w:shd w:val="clear" w:color="auto" w:fill="FFFFFF"/>
         </w:rPr>
@@ -2834,8 +2843,8 @@
           <w:b/>
           <w:bCs/>
           <w:color w:val="FFFFFF"/>
-          <w:sz w:val="24"/>
-          <w:szCs w:val="24"/>
+          <w:sz w:val="21"/>
+          <w:szCs w:val="21"/>
         </w:rPr>
       </w:pPr>
       <w:r>
@@ -2844,8 +2853,8 @@
           <w:b/>
           <w:bCs/>
           <w:color w:val="FFFFFF"/>
-          <w:sz w:val="24"/>
-          <w:szCs w:val="24"/>
+          <w:sz w:val="21"/>
+          <w:szCs w:val="21"/>
         </w:rPr>
         <w:t>2</w:t>
       </w:r>
@@ -2859,16 +2868,16 @@
         <w:rPr>
           <w:rFonts w:ascii="Calibri" w:hAnsi="Calibri" w:cs="Calibri"/>
           <w:color w:val="1A1A1A"/>
-          <w:sz w:val="24"/>
-          <w:szCs w:val="24"/>
+          <w:sz w:val="21"/>
+          <w:szCs w:val="21"/>
         </w:rPr>
       </w:pPr>
       <w:r>
         <w:rPr>
           <w:rFonts w:ascii="Calibri" w:hAnsi="Calibri" w:cs="Calibri"/>
           <w:color w:val="1A1A1A"/>
-          <w:sz w:val="24"/>
-          <w:szCs w:val="24"/>
+          <w:sz w:val="21"/>
+          <w:szCs w:val="21"/>
         </w:rPr>
         <w:t>Confira se está tudo certo</w:t>
       </w:r>
@@ -2880,16 +2889,16 @@
         <w:rPr>
           <w:rFonts w:ascii="Calibri" w:hAnsi="Calibri" w:cs="Calibri"/>
           <w:color w:val="555555"/>
-          <w:sz w:val="24"/>
-          <w:szCs w:val="24"/>
+          <w:sz w:val="21"/>
+          <w:szCs w:val="21"/>
         </w:rPr>
       </w:pPr>
       <w:r>
         <w:rPr>
           <w:rFonts w:ascii="Calibri" w:hAnsi="Calibri" w:cs="Calibri"/>
           <w:color w:val="555555"/>
-          <w:sz w:val="24"/>
-          <w:szCs w:val="24"/>
+          <w:sz w:val="21"/>
+          <w:szCs w:val="21"/>
         </w:rPr>
         <w:t>Diagnóstico completo em linguagem simples (</w:t>
       </w:r>
@@ -2897,8 +2906,8 @@
         <w:rPr>
           <w:rFonts w:ascii="Apple Color Emoji" w:hAnsi="Apple Color Emoji" w:cs="Apple Color Emoji"/>
           <w:color w:val="555555"/>
-          <w:sz w:val="24"/>
-          <w:szCs w:val="24"/>
+          <w:sz w:val="21"/>
+          <w:szCs w:val="21"/>
         </w:rPr>
         <w:t>🟢</w:t>
       </w:r>
@@ -2906,8 +2915,8 @@
         <w:rPr>
           <w:rFonts w:ascii="Calibri" w:hAnsi="Calibri" w:cs="Calibri"/>
           <w:color w:val="555555"/>
-          <w:sz w:val="24"/>
-          <w:szCs w:val="24"/>
+          <w:sz w:val="21"/>
+          <w:szCs w:val="21"/>
         </w:rPr>
         <w:t xml:space="preserve"> </w:t>
       </w:r>
@@ -2915,8 +2924,8 @@
         <w:rPr>
           <w:rFonts w:ascii="Apple Color Emoji" w:hAnsi="Apple Color Emoji" w:cs="Apple Color Emoji"/>
           <w:color w:val="555555"/>
-          <w:sz w:val="24"/>
-          <w:szCs w:val="24"/>
+          <w:sz w:val="21"/>
+          <w:szCs w:val="21"/>
         </w:rPr>
         <w:t>🟡</w:t>
       </w:r>
@@ -2924,8 +2933,8 @@
         <w:rPr>
           <w:rFonts w:ascii="Calibri" w:hAnsi="Calibri" w:cs="Calibri"/>
           <w:color w:val="555555"/>
-          <w:sz w:val="24"/>
-          <w:szCs w:val="24"/>
+          <w:sz w:val="21"/>
+          <w:szCs w:val="21"/>
         </w:rPr>
         <w:t xml:space="preserve"> </w:t>
       </w:r>
@@ -2933,8 +2942,8 @@
         <w:rPr>
           <w:rFonts w:ascii="Apple Color Emoji" w:hAnsi="Apple Color Emoji" w:cs="Apple Color Emoji"/>
           <w:color w:val="555555"/>
-          <w:sz w:val="24"/>
-          <w:szCs w:val="24"/>
+          <w:sz w:val="21"/>
+          <w:szCs w:val="21"/>
         </w:rPr>
         <w:t>🔴</w:t>
       </w:r>
@@ -2942,8 +2951,8 @@
         <w:rPr>
           <w:rFonts w:ascii="Calibri" w:hAnsi="Calibri" w:cs="Calibri"/>
           <w:color w:val="555555"/>
-          <w:sz w:val="24"/>
-          <w:szCs w:val="24"/>
+          <w:sz w:val="21"/>
+          <w:szCs w:val="21"/>
         </w:rPr>
         <w:t>). Não altera nada — só verifica e explica como resolver. Rode sempre que algo parecer estranho.</w:t>
       </w:r>
@@ -2955,8 +2964,8 @@
         <w:rPr>
           <w:rFonts w:ascii="Calibri" w:hAnsi="Calibri" w:cs="Calibri"/>
           <w:color w:val="1A1A1A"/>
-          <w:sz w:val="24"/>
-          <w:szCs w:val="24"/>
+          <w:sz w:val="21"/>
+          <w:szCs w:val="21"/>
         </w:rPr>
       </w:pPr>
       <w:r>
@@ -2966,8 +2975,8 @@
           <w:b/>
           <w:bCs/>
           <w:color w:val="F4661B"/>
-          <w:sz w:val="24"/>
-          <w:szCs w:val="24"/>
+          <w:sz w:val="21"/>
+          <w:szCs w:val="21"/>
           <w:bdr w:val="single" w:sz="8" w:space="4" w:color="F4661B" w:frame="1"/>
           <w:shd w:val="clear" w:color="auto" w:fill="FFFFFF"/>
         </w:rPr>
@@ -2981,8 +2990,8 @@
           <w:b/>
           <w:bCs/>
           <w:color w:val="F4661B"/>
-          <w:sz w:val="24"/>
-          <w:szCs w:val="24"/>
+          <w:sz w:val="21"/>
+          <w:szCs w:val="21"/>
           <w:bdr w:val="single" w:sz="8" w:space="4" w:color="F4661B" w:frame="1"/>
           <w:shd w:val="clear" w:color="auto" w:fill="FFFFFF"/>
         </w:rPr>
@@ -2999,8 +3008,8 @@
           <w:b/>
           <w:bCs/>
           <w:color w:val="FFFFFF"/>
-          <w:sz w:val="24"/>
-          <w:szCs w:val="24"/>
+          <w:sz w:val="21"/>
+          <w:szCs w:val="21"/>
         </w:rPr>
       </w:pPr>
       <w:r>
@@ -3009,8 +3018,8 @@
           <w:b/>
           <w:bCs/>
           <w:color w:val="FFFFFF"/>
-          <w:sz w:val="24"/>
-          <w:szCs w:val="24"/>
+          <w:sz w:val="21"/>
+          <w:szCs w:val="21"/>
         </w:rPr>
         <w:t>3</w:t>
       </w:r>
@@ -3024,16 +3033,16 @@
         <w:rPr>
           <w:rFonts w:ascii="Calibri" w:hAnsi="Calibri" w:cs="Calibri"/>
           <w:color w:val="1A1A1A"/>
-          <w:sz w:val="24"/>
-          <w:szCs w:val="24"/>
+          <w:sz w:val="21"/>
+          <w:szCs w:val="21"/>
         </w:rPr>
       </w:pPr>
       <w:r>
         <w:rPr>
           <w:rFonts w:ascii="Calibri" w:hAnsi="Calibri" w:cs="Calibri"/>
           <w:color w:val="1A1A1A"/>
-          <w:sz w:val="24"/>
-          <w:szCs w:val="24"/>
+          <w:sz w:val="21"/>
+          <w:szCs w:val="21"/>
         </w:rPr>
         <w:t>Já fiscalizava antes do toolkit?</w:t>
       </w:r>
@@ -3045,16 +3054,16 @@
         <w:rPr>
           <w:rFonts w:ascii="Calibri" w:hAnsi="Calibri" w:cs="Calibri"/>
           <w:color w:val="555555"/>
-          <w:sz w:val="24"/>
-          <w:szCs w:val="24"/>
+          <w:sz w:val="21"/>
+          <w:szCs w:val="21"/>
         </w:rPr>
       </w:pPr>
       <w:r>
         <w:rPr>
           <w:rFonts w:ascii="Calibri" w:hAnsi="Calibri" w:cs="Calibri"/>
           <w:color w:val="555555"/>
-          <w:sz w:val="24"/>
-          <w:szCs w:val="24"/>
+          <w:sz w:val="21"/>
+          <w:szCs w:val="21"/>
         </w:rPr>
         <w:t>Jogue a pasta antiga da fiscalização dentro de </w:t>
       </w:r>
@@ -3064,8 +3073,8 @@
           <w:b/>
           <w:bCs/>
           <w:color w:val="555555"/>
-          <w:sz w:val="24"/>
-          <w:szCs w:val="24"/>
+          <w:sz w:val="21"/>
+          <w:szCs w:val="21"/>
         </w:rPr>
         <w:t>OS ATIVAS/</w:t>
       </w:r>
@@ -3073,8 +3082,8 @@
         <w:rPr>
           <w:rFonts w:ascii="Calibri" w:hAnsi="Calibri" w:cs="Calibri"/>
           <w:color w:val="555555"/>
-          <w:sz w:val="24"/>
-          <w:szCs w:val="24"/>
+          <w:sz w:val="21"/>
+          <w:szCs w:val="21"/>
         </w:rPr>
         <w:t> e peça para organizar: ela monta tudo no padrão do toolkit, com um plano que </w:t>
       </w:r>
@@ -3084,8 +3093,8 @@
           <w:b/>
           <w:bCs/>
           <w:color w:val="555555"/>
-          <w:sz w:val="24"/>
-          <w:szCs w:val="24"/>
+          <w:sz w:val="21"/>
+          <w:szCs w:val="21"/>
         </w:rPr>
         <w:t>você aprova antes</w:t>
       </w:r>
@@ -3093,8 +3102,8 @@
         <w:rPr>
           <w:rFonts w:ascii="Calibri" w:hAnsi="Calibri" w:cs="Calibri"/>
           <w:color w:val="555555"/>
-          <w:sz w:val="24"/>
-          <w:szCs w:val="24"/>
+          <w:sz w:val="21"/>
+          <w:szCs w:val="21"/>
         </w:rPr>
         <w:t> de qualquer arquivo ser mexido.</w:t>
       </w:r>
@@ -3106,8 +3115,8 @@
         <w:rPr>
           <w:rFonts w:ascii="Calibri" w:hAnsi="Calibri" w:cs="Calibri"/>
           <w:color w:val="1A1A1A"/>
-          <w:sz w:val="24"/>
-          <w:szCs w:val="24"/>
+          <w:sz w:val="21"/>
+          <w:szCs w:val="21"/>
         </w:rPr>
       </w:pPr>
       <w:r>
@@ -3117,8 +3126,8 @@
           <w:b/>
           <w:bCs/>
           <w:color w:val="D97706"/>
-          <w:sz w:val="24"/>
-          <w:szCs w:val="24"/>
+          <w:sz w:val="21"/>
+          <w:szCs w:val="21"/>
           <w:bdr w:val="single" w:sz="8" w:space="4" w:color="D97706" w:frame="1"/>
           <w:shd w:val="clear" w:color="auto" w:fill="FFFFFF"/>
         </w:rPr>
@@ -3134,8 +3143,8 @@
           <w:b/>
           <w:bCs/>
           <w:color w:val="FFFFFF"/>
-          <w:sz w:val="24"/>
-          <w:szCs w:val="24"/>
+          <w:sz w:val="21"/>
+          <w:szCs w:val="21"/>
         </w:rPr>
       </w:pPr>
       <w:r>
@@ -3144,8 +3153,8 @@
           <w:b/>
           <w:bCs/>
           <w:color w:val="FFFFFF"/>
-          <w:sz w:val="24"/>
-          <w:szCs w:val="24"/>
+          <w:sz w:val="21"/>
+          <w:szCs w:val="21"/>
         </w:rPr>
         <w:t>4</w:t>
       </w:r>
@@ -3159,16 +3168,16 @@
         <w:rPr>
           <w:rFonts w:ascii="Calibri" w:hAnsi="Calibri" w:cs="Calibri"/>
           <w:color w:val="1A1A1A"/>
-          <w:sz w:val="24"/>
-          <w:szCs w:val="24"/>
+          <w:sz w:val="21"/>
+          <w:szCs w:val="21"/>
         </w:rPr>
       </w:pPr>
       <w:r>
         <w:rPr>
           <w:rFonts w:ascii="Calibri" w:hAnsi="Calibri" w:cs="Calibri"/>
           <w:color w:val="1A1A1A"/>
-          <w:sz w:val="24"/>
-          <w:szCs w:val="24"/>
+          <w:sz w:val="21"/>
+          <w:szCs w:val="21"/>
         </w:rPr>
         <w:t>Abra a auditoria</w:t>
       </w:r>
@@ -3180,16 +3189,16 @@
         <w:rPr>
           <w:rFonts w:ascii="Calibri" w:hAnsi="Calibri" w:cs="Calibri"/>
           <w:color w:val="555555"/>
-          <w:sz w:val="24"/>
-          <w:szCs w:val="24"/>
+          <w:sz w:val="21"/>
+          <w:szCs w:val="21"/>
         </w:rPr>
       </w:pPr>
       <w:r>
         <w:rPr>
           <w:rFonts w:ascii="Calibri" w:hAnsi="Calibri" w:cs="Calibri"/>
           <w:color w:val="555555"/>
-          <w:sz w:val="24"/>
-          <w:szCs w:val="24"/>
+          <w:sz w:val="21"/>
+          <w:szCs w:val="21"/>
         </w:rPr>
         <w:t>Uma pasta por empresa fiscalizada, com a ficha </w:t>
       </w:r>
@@ -3199,8 +3208,8 @@
           <w:b/>
           <w:bCs/>
           <w:color w:val="555555"/>
-          <w:sz w:val="24"/>
-          <w:szCs w:val="24"/>
+          <w:sz w:val="21"/>
+          <w:szCs w:val="21"/>
         </w:rPr>
         <w:t>memory.md</w:t>
       </w:r>
@@ -3208,8 +3217,8 @@
         <w:rPr>
           <w:rFonts w:ascii="Calibri" w:hAnsi="Calibri" w:cs="Calibri"/>
           <w:color w:val="555555"/>
-          <w:sz w:val="24"/>
-          <w:szCs w:val="24"/>
+          <w:sz w:val="21"/>
+          <w:szCs w:val="21"/>
         </w:rPr>
         <w:t> — a "capa da OS" onde ficam status, notificações DET, pendências e autos. O CNPJ é opcional aqui (só vira obrigatório na hora de gerar os autos).</w:t>
       </w:r>
@@ -3221,8 +3230,8 @@
         <w:rPr>
           <w:rFonts w:ascii="Calibri" w:hAnsi="Calibri" w:cs="Calibri"/>
           <w:color w:val="1A1A1A"/>
-          <w:sz w:val="24"/>
-          <w:szCs w:val="24"/>
+          <w:sz w:val="21"/>
+          <w:szCs w:val="21"/>
         </w:rPr>
       </w:pPr>
       <w:r>
@@ -3232,8 +3241,8 @@
           <w:b/>
           <w:bCs/>
           <w:color w:val="16A34A"/>
-          <w:sz w:val="24"/>
-          <w:szCs w:val="24"/>
+          <w:sz w:val="21"/>
+          <w:szCs w:val="21"/>
           <w:bdr w:val="single" w:sz="8" w:space="4" w:color="16A34A" w:frame="1"/>
           <w:shd w:val="clear" w:color="auto" w:fill="FFFFFF"/>
         </w:rPr>
@@ -3247,8 +3256,8 @@
           <w:b/>
           <w:bCs/>
           <w:color w:val="16A34A"/>
-          <w:sz w:val="24"/>
-          <w:szCs w:val="24"/>
+          <w:sz w:val="21"/>
+          <w:szCs w:val="21"/>
           <w:bdr w:val="single" w:sz="8" w:space="4" w:color="16A34A" w:frame="1"/>
           <w:shd w:val="clear" w:color="auto" w:fill="FFFFFF"/>
         </w:rPr>
@@ -3265,8 +3274,8 @@
           <w:b/>
           <w:bCs/>
           <w:color w:val="FFFFFF"/>
-          <w:sz w:val="24"/>
-          <w:szCs w:val="24"/>
+          <w:sz w:val="21"/>
+          <w:szCs w:val="21"/>
         </w:rPr>
       </w:pPr>
       <w:r>
@@ -3275,8 +3284,8 @@
           <w:b/>
           <w:bCs/>
           <w:color w:val="FFFFFF"/>
-          <w:sz w:val="24"/>
-          <w:szCs w:val="24"/>
+          <w:sz w:val="21"/>
+          <w:szCs w:val="21"/>
         </w:rPr>
         <w:t>5</w:t>
       </w:r>
@@ -3290,16 +3299,16 @@
         <w:rPr>
           <w:rFonts w:ascii="Calibri" w:hAnsi="Calibri" w:cs="Calibri"/>
           <w:color w:val="1A1A1A"/>
-          <w:sz w:val="24"/>
-          <w:szCs w:val="24"/>
+          <w:sz w:val="21"/>
+          <w:szCs w:val="21"/>
         </w:rPr>
       </w:pPr>
       <w:r>
         <w:rPr>
           <w:rFonts w:ascii="Calibri" w:hAnsi="Calibri" w:cs="Calibri"/>
           <w:color w:val="1A1A1A"/>
-          <w:sz w:val="24"/>
-          <w:szCs w:val="24"/>
+          <w:sz w:val="21"/>
+          <w:szCs w:val="21"/>
         </w:rPr>
         <w:t>Prepare a ação fiscal</w:t>
       </w:r>
@@ -3311,16 +3320,16 @@
         <w:rPr>
           <w:rFonts w:ascii="Calibri" w:hAnsi="Calibri" w:cs="Calibri"/>
           <w:color w:val="555555"/>
-          <w:sz w:val="24"/>
-          <w:szCs w:val="24"/>
+          <w:sz w:val="21"/>
+          <w:szCs w:val="21"/>
         </w:rPr>
       </w:pPr>
       <w:r>
         <w:rPr>
           <w:rFonts w:ascii="Calibri" w:hAnsi="Calibri" w:cs="Calibri"/>
           <w:color w:val="555555"/>
-          <w:sz w:val="24"/>
-          <w:szCs w:val="24"/>
+          <w:sz w:val="21"/>
+          <w:szCs w:val="21"/>
         </w:rPr>
         <w:t>Antes de ir a campo: planeje a visita (denúncia, dados prévios, checklist) e, se for o caso, notifique a empresa pelo DET para apresentar documentos.</w:t>
       </w:r>
@@ -3332,8 +3341,8 @@
         <w:rPr>
           <w:rFonts w:ascii="Calibri" w:hAnsi="Calibri" w:cs="Calibri"/>
           <w:color w:val="1A1A1A"/>
-          <w:sz w:val="24"/>
-          <w:szCs w:val="24"/>
+          <w:sz w:val="21"/>
+          <w:szCs w:val="21"/>
         </w:rPr>
       </w:pPr>
       <w:r>
@@ -3343,8 +3352,8 @@
           <w:b/>
           <w:bCs/>
           <w:color w:val="2563EB"/>
-          <w:sz w:val="24"/>
-          <w:szCs w:val="24"/>
+          <w:sz w:val="21"/>
+          <w:szCs w:val="21"/>
           <w:bdr w:val="single" w:sz="8" w:space="4" w:color="2563EB" w:frame="1"/>
           <w:shd w:val="clear" w:color="auto" w:fill="FFFFFF"/>
         </w:rPr>
@@ -3358,8 +3367,8 @@
           <w:b/>
           <w:bCs/>
           <w:color w:val="2563EB"/>
-          <w:sz w:val="24"/>
-          <w:szCs w:val="24"/>
+          <w:sz w:val="21"/>
+          <w:szCs w:val="21"/>
           <w:bdr w:val="single" w:sz="8" w:space="4" w:color="2563EB" w:frame="1"/>
           <w:shd w:val="clear" w:color="auto" w:fill="FFFFFF"/>
         </w:rPr>
@@ -3373,8 +3382,8 @@
           <w:b/>
           <w:bCs/>
           <w:color w:val="2563EB"/>
-          <w:sz w:val="24"/>
-          <w:szCs w:val="24"/>
+          <w:sz w:val="21"/>
+          <w:szCs w:val="21"/>
           <w:bdr w:val="single" w:sz="8" w:space="4" w:color="2563EB" w:frame="1"/>
           <w:shd w:val="clear" w:color="auto" w:fill="FFFFFF"/>
         </w:rPr>
@@ -3388,8 +3397,8 @@
           <w:b/>
           <w:bCs/>
           <w:color w:val="2563EB"/>
-          <w:sz w:val="24"/>
-          <w:szCs w:val="24"/>
+          <w:sz w:val="21"/>
+          <w:szCs w:val="21"/>
           <w:bdr w:val="single" w:sz="8" w:space="4" w:color="2563EB" w:frame="1"/>
           <w:shd w:val="clear" w:color="auto" w:fill="FFFFFF"/>
         </w:rPr>
@@ -3403,8 +3412,8 @@
           <w:b/>
           <w:bCs/>
           <w:color w:val="2563EB"/>
-          <w:sz w:val="24"/>
-          <w:szCs w:val="24"/>
+          <w:sz w:val="21"/>
+          <w:szCs w:val="21"/>
           <w:bdr w:val="single" w:sz="8" w:space="4" w:color="2563EB" w:frame="1"/>
           <w:shd w:val="clear" w:color="auto" w:fill="FFFFFF"/>
         </w:rPr>
@@ -3420,8 +3429,8 @@
           <w:b/>
           <w:bCs/>
           <w:color w:val="FFFFFF"/>
-          <w:sz w:val="24"/>
-          <w:szCs w:val="24"/>
+          <w:sz w:val="21"/>
+          <w:szCs w:val="21"/>
         </w:rPr>
       </w:pPr>
       <w:r>
@@ -3430,8 +3439,8 @@
           <w:b/>
           <w:bCs/>
           <w:color w:val="FFFFFF"/>
-          <w:sz w:val="24"/>
-          <w:szCs w:val="24"/>
+          <w:sz w:val="21"/>
+          <w:szCs w:val="21"/>
         </w:rPr>
         <w:t>6</w:t>
       </w:r>
@@ -3445,16 +3454,16 @@
         <w:rPr>
           <w:rFonts w:ascii="Calibri" w:hAnsi="Calibri" w:cs="Calibri"/>
           <w:color w:val="1A1A1A"/>
-          <w:sz w:val="24"/>
-          <w:szCs w:val="24"/>
+          <w:sz w:val="21"/>
+          <w:szCs w:val="21"/>
         </w:rPr>
       </w:pPr>
       <w:r>
         <w:rPr>
           <w:rFonts w:ascii="Calibri" w:hAnsi="Calibri" w:cs="Calibri"/>
           <w:color w:val="1A1A1A"/>
-          <w:sz w:val="24"/>
-          <w:szCs w:val="24"/>
+          <w:sz w:val="21"/>
+          <w:szCs w:val="21"/>
         </w:rPr>
         <w:t>Voltou da inspeção? Narre</w:t>
       </w:r>
@@ -3466,16 +3475,16 @@
         <w:rPr>
           <w:rFonts w:ascii="Calibri" w:hAnsi="Calibri" w:cs="Calibri"/>
           <w:color w:val="555555"/>
-          <w:sz w:val="24"/>
-          <w:szCs w:val="24"/>
+          <w:sz w:val="21"/>
+          <w:szCs w:val="21"/>
         </w:rPr>
       </w:pPr>
       <w:r>
         <w:rPr>
           <w:rFonts w:ascii="Calibri" w:hAnsi="Calibri" w:cs="Calibri"/>
           <w:color w:val="555555"/>
-          <w:sz w:val="24"/>
-          <w:szCs w:val="24"/>
+          <w:sz w:val="21"/>
+          <w:szCs w:val="21"/>
         </w:rPr>
         <w:t>Conte o que viu — por voz ou texto corrido. O relato vira uma lista organizada de achados, fiel ao que você disse, pronta para embasar autos e análises.</w:t>
       </w:r>
@@ -3487,8 +3496,8 @@
         <w:rPr>
           <w:rFonts w:ascii="Calibri" w:hAnsi="Calibri" w:cs="Calibri"/>
           <w:color w:val="1A1A1A"/>
-          <w:sz w:val="24"/>
-          <w:szCs w:val="24"/>
+          <w:sz w:val="21"/>
+          <w:szCs w:val="21"/>
         </w:rPr>
       </w:pPr>
       <w:r>
@@ -3498,8 +3507,8 @@
           <w:b/>
           <w:bCs/>
           <w:color w:val="0EA5E9"/>
-          <w:sz w:val="24"/>
-          <w:szCs w:val="24"/>
+          <w:sz w:val="21"/>
+          <w:szCs w:val="21"/>
           <w:bdr w:val="single" w:sz="8" w:space="4" w:color="0EA5E9" w:frame="1"/>
           <w:shd w:val="clear" w:color="auto" w:fill="FFFFFF"/>
         </w:rPr>
@@ -3513,8 +3522,8 @@
           <w:b/>
           <w:bCs/>
           <w:color w:val="0EA5E9"/>
-          <w:sz w:val="24"/>
-          <w:szCs w:val="24"/>
+          <w:sz w:val="21"/>
+          <w:szCs w:val="21"/>
           <w:bdr w:val="single" w:sz="8" w:space="4" w:color="0EA5E9" w:frame="1"/>
           <w:shd w:val="clear" w:color="auto" w:fill="FFFFFF"/>
         </w:rPr>
@@ -3531,8 +3540,8 @@
           <w:b/>
           <w:bCs/>
           <w:color w:val="FFFFFF"/>
-          <w:sz w:val="24"/>
-          <w:szCs w:val="24"/>
+          <w:sz w:val="21"/>
+          <w:szCs w:val="21"/>
         </w:rPr>
       </w:pPr>
       <w:r>
@@ -3541,10 +3550,9 @@
           <w:b/>
           <w:bCs/>
           <w:color w:val="FFFFFF"/>
-          <w:sz w:val="24"/>
-          <w:szCs w:val="24"/>
-        </w:rPr>
-        <w:lastRenderedPageBreak/>
+          <w:sz w:val="21"/>
+          <w:szCs w:val="21"/>
+        </w:rPr>
         <w:t>7</w:t>
       </w:r>
     </w:p>
@@ -3557,16 +3565,16 @@
         <w:rPr>
           <w:rFonts w:ascii="Calibri" w:hAnsi="Calibri" w:cs="Calibri"/>
           <w:color w:val="1A1A1A"/>
-          <w:sz w:val="24"/>
-          <w:szCs w:val="24"/>
+          <w:sz w:val="21"/>
+          <w:szCs w:val="21"/>
         </w:rPr>
       </w:pPr>
       <w:r>
         <w:rPr>
           <w:rFonts w:ascii="Calibri" w:hAnsi="Calibri" w:cs="Calibri"/>
           <w:color w:val="1A1A1A"/>
-          <w:sz w:val="24"/>
-          <w:szCs w:val="24"/>
+          <w:sz w:val="21"/>
+          <w:szCs w:val="21"/>
         </w:rPr>
         <w:t>Analise os documentos da empresa</w:t>
       </w:r>
@@ -3578,16 +3586,16 @@
         <w:rPr>
           <w:rFonts w:ascii="Calibri" w:hAnsi="Calibri" w:cs="Calibri"/>
           <w:color w:val="555555"/>
-          <w:sz w:val="24"/>
-          <w:szCs w:val="24"/>
+          <w:sz w:val="21"/>
+          <w:szCs w:val="21"/>
         </w:rPr>
       </w:pPr>
       <w:r>
         <w:rPr>
           <w:rFonts w:ascii="Calibri" w:hAnsi="Calibri" w:cs="Calibri"/>
           <w:color w:val="555555"/>
-          <w:sz w:val="24"/>
-          <w:szCs w:val="24"/>
+          <w:sz w:val="21"/>
+          <w:szCs w:val="21"/>
         </w:rPr>
         <w:t>Cada tipo de documento tem uma especialista: PGR, ergonomia (AET), pacote de ponto eletrônico (AFD/AEJ/atestados), laudos de máquinas (NR-12) e acidentes de trabalho. Dúvida de enquadramento? A consulta busca ementa e fundamentação na base </w:t>
       </w:r>
@@ -3598,8 +3606,8 @@
           <w:b/>
           <w:bCs/>
           <w:color w:val="555555"/>
-          <w:sz w:val="24"/>
-          <w:szCs w:val="24"/>
+          <w:sz w:val="21"/>
+          <w:szCs w:val="21"/>
         </w:rPr>
         <w:t>NotebookLM</w:t>
       </w:r>
@@ -3608,8 +3616,8 @@
         <w:rPr>
           <w:rFonts w:ascii="Calibri" w:hAnsi="Calibri" w:cs="Calibri"/>
           <w:color w:val="555555"/>
-          <w:sz w:val="24"/>
-          <w:szCs w:val="24"/>
+          <w:sz w:val="21"/>
+          <w:szCs w:val="21"/>
         </w:rPr>
         <w:t>.</w:t>
       </w:r>
@@ -3621,8 +3629,8 @@
         <w:rPr>
           <w:rFonts w:ascii="Calibri" w:hAnsi="Calibri" w:cs="Calibri"/>
           <w:color w:val="1A1A1A"/>
-          <w:sz w:val="24"/>
-          <w:szCs w:val="24"/>
+          <w:sz w:val="21"/>
+          <w:szCs w:val="21"/>
         </w:rPr>
       </w:pPr>
       <w:r>
@@ -3632,11 +3640,12 @@
           <w:b/>
           <w:bCs/>
           <w:color w:val="0D9488"/>
-          <w:sz w:val="24"/>
-          <w:szCs w:val="24"/>
+          <w:sz w:val="21"/>
+          <w:szCs w:val="21"/>
           <w:bdr w:val="single" w:sz="8" w:space="4" w:color="0D9488" w:frame="1"/>
           <w:shd w:val="clear" w:color="auto" w:fill="FFFFFF"/>
         </w:rPr>
+        <w:lastRenderedPageBreak/>
         <w:t>/PGR-</w:t>
       </w:r>
       <w:proofErr w:type="gramStart"/>
@@ -3647,8 +3656,8 @@
           <w:b/>
           <w:bCs/>
           <w:color w:val="0D9488"/>
-          <w:sz w:val="24"/>
-          <w:szCs w:val="24"/>
+          <w:sz w:val="21"/>
+          <w:szCs w:val="21"/>
           <w:bdr w:val="single" w:sz="8" w:space="4" w:color="0D9488" w:frame="1"/>
           <w:shd w:val="clear" w:color="auto" w:fill="FFFFFF"/>
         </w:rPr>
@@ -3662,8 +3671,8 @@
           <w:b/>
           <w:bCs/>
           <w:color w:val="0D9488"/>
-          <w:sz w:val="24"/>
-          <w:szCs w:val="24"/>
+          <w:sz w:val="21"/>
+          <w:szCs w:val="21"/>
           <w:bdr w:val="single" w:sz="8" w:space="4" w:color="0D9488" w:frame="1"/>
           <w:shd w:val="clear" w:color="auto" w:fill="FFFFFF"/>
         </w:rPr>
@@ -3677,8 +3686,8 @@
           <w:b/>
           <w:bCs/>
           <w:color w:val="0D9488"/>
-          <w:sz w:val="24"/>
-          <w:szCs w:val="24"/>
+          <w:sz w:val="21"/>
+          <w:szCs w:val="21"/>
           <w:bdr w:val="single" w:sz="8" w:space="4" w:color="0D9488" w:frame="1"/>
           <w:shd w:val="clear" w:color="auto" w:fill="FFFFFF"/>
         </w:rPr>
@@ -3692,8 +3701,8 @@
           <w:b/>
           <w:bCs/>
           <w:color w:val="0D9488"/>
-          <w:sz w:val="24"/>
-          <w:szCs w:val="24"/>
+          <w:sz w:val="21"/>
+          <w:szCs w:val="21"/>
           <w:bdr w:val="single" w:sz="8" w:space="4" w:color="0D9488" w:frame="1"/>
           <w:shd w:val="clear" w:color="auto" w:fill="FFFFFF"/>
         </w:rPr>
@@ -3707,8 +3716,8 @@
           <w:b/>
           <w:bCs/>
           <w:color w:val="0D9488"/>
-          <w:sz w:val="24"/>
-          <w:szCs w:val="24"/>
+          <w:sz w:val="21"/>
+          <w:szCs w:val="21"/>
           <w:bdr w:val="single" w:sz="8" w:space="4" w:color="0D9488" w:frame="1"/>
           <w:shd w:val="clear" w:color="auto" w:fill="FFFFFF"/>
         </w:rPr>
@@ -3722,8 +3731,8 @@
           <w:b/>
           <w:bCs/>
           <w:color w:val="0D9488"/>
-          <w:sz w:val="24"/>
-          <w:szCs w:val="24"/>
+          <w:sz w:val="21"/>
+          <w:szCs w:val="21"/>
           <w:bdr w:val="single" w:sz="8" w:space="4" w:color="0D9488" w:frame="1"/>
           <w:shd w:val="clear" w:color="auto" w:fill="FFFFFF"/>
         </w:rPr>
@@ -3736,8 +3745,8 @@
           <w:b/>
           <w:bCs/>
           <w:color w:val="0EA5E9"/>
-          <w:sz w:val="24"/>
-          <w:szCs w:val="24"/>
+          <w:sz w:val="21"/>
+          <w:szCs w:val="21"/>
           <w:bdr w:val="single" w:sz="8" w:space="4" w:color="0EA5E9" w:frame="1"/>
           <w:shd w:val="clear" w:color="auto" w:fill="FFFFFF"/>
         </w:rPr>
@@ -3753,8 +3762,8 @@
           <w:b/>
           <w:bCs/>
           <w:color w:val="FFFFFF"/>
-          <w:sz w:val="24"/>
-          <w:szCs w:val="24"/>
+          <w:sz w:val="21"/>
+          <w:szCs w:val="21"/>
         </w:rPr>
       </w:pPr>
       <w:r>
@@ -3763,8 +3772,8 @@
           <w:b/>
           <w:bCs/>
           <w:color w:val="FFFFFF"/>
-          <w:sz w:val="24"/>
-          <w:szCs w:val="24"/>
+          <w:sz w:val="21"/>
+          <w:szCs w:val="21"/>
         </w:rPr>
         <w:t>8</w:t>
       </w:r>
@@ -3778,16 +3787,16 @@
         <w:rPr>
           <w:rFonts w:ascii="Calibri" w:hAnsi="Calibri" w:cs="Calibri"/>
           <w:color w:val="1A1A1A"/>
-          <w:sz w:val="24"/>
-          <w:szCs w:val="24"/>
+          <w:sz w:val="21"/>
+          <w:szCs w:val="21"/>
         </w:rPr>
       </w:pPr>
       <w:r>
         <w:rPr>
           <w:rFonts w:ascii="Calibri" w:hAnsi="Calibri" w:cs="Calibri"/>
           <w:color w:val="1A1A1A"/>
-          <w:sz w:val="24"/>
-          <w:szCs w:val="24"/>
+          <w:sz w:val="21"/>
+          <w:szCs w:val="21"/>
         </w:rPr>
         <w:t>Lavre os autos</w:t>
       </w:r>
@@ -3799,16 +3808,16 @@
         <w:rPr>
           <w:rFonts w:ascii="Calibri" w:hAnsi="Calibri" w:cs="Calibri"/>
           <w:color w:val="555555"/>
-          <w:sz w:val="24"/>
-          <w:szCs w:val="24"/>
+          <w:sz w:val="21"/>
+          <w:szCs w:val="21"/>
         </w:rPr>
       </w:pPr>
       <w:r>
         <w:rPr>
           <w:rFonts w:ascii="Calibri" w:hAnsi="Calibri" w:cs="Calibri"/>
           <w:color w:val="555555"/>
-          <w:sz w:val="24"/>
-          <w:szCs w:val="24"/>
+          <w:sz w:val="21"/>
+          <w:szCs w:val="21"/>
         </w:rPr>
         <w:t>A redação parte do seu relato e das análises; casos comuns têm skill própria (falta de registro, omissão de documentos do DET). Tudo passa pela revisão 5W1H e termina no </w:t>
       </w:r>
@@ -3818,8 +3827,8 @@
           <w:b/>
           <w:bCs/>
           <w:color w:val="555555"/>
-          <w:sz w:val="24"/>
-          <w:szCs w:val="24"/>
+          <w:sz w:val="21"/>
+          <w:szCs w:val="21"/>
         </w:rPr>
         <w:t>TXT importável pelo Sistema Auditor</w:t>
       </w:r>
@@ -3827,8 +3836,8 @@
         <w:rPr>
           <w:rFonts w:ascii="Calibri" w:hAnsi="Calibri" w:cs="Calibri"/>
           <w:color w:val="555555"/>
-          <w:sz w:val="24"/>
-          <w:szCs w:val="24"/>
+          <w:sz w:val="21"/>
+          <w:szCs w:val="21"/>
         </w:rPr>
         <w:t> — com anexos e com os dados pessoais protegidos. </w:t>
       </w:r>
@@ -3838,8 +3847,8 @@
           <w:b/>
           <w:bCs/>
           <w:color w:val="555555"/>
-          <w:sz w:val="24"/>
-          <w:szCs w:val="24"/>
+          <w:sz w:val="21"/>
+          <w:szCs w:val="21"/>
         </w:rPr>
         <w:t>Você revisa e você transmite</w:t>
       </w:r>
@@ -3847,8 +3856,8 @@
         <w:rPr>
           <w:rFonts w:ascii="Calibri" w:hAnsi="Calibri" w:cs="Calibri"/>
           <w:color w:val="555555"/>
-          <w:sz w:val="24"/>
-          <w:szCs w:val="24"/>
+          <w:sz w:val="21"/>
+          <w:szCs w:val="21"/>
         </w:rPr>
         <w:t>: o toolkit prepara, quem decide é o AFT.</w:t>
       </w:r>
@@ -3863,8 +3872,8 @@
           <w:b/>
           <w:bCs/>
           <w:color w:val="16A34A"/>
-          <w:sz w:val="24"/>
-          <w:szCs w:val="24"/>
+          <w:sz w:val="21"/>
+          <w:szCs w:val="21"/>
           <w:bdr w:val="single" w:sz="8" w:space="4" w:color="16A34A" w:frame="1"/>
           <w:shd w:val="clear" w:color="auto" w:fill="FFFFFF"/>
         </w:rPr>
@@ -3876,8 +3885,8 @@
           <w:b/>
           <w:bCs/>
           <w:color w:val="16A34A"/>
-          <w:sz w:val="24"/>
-          <w:szCs w:val="24"/>
+          <w:sz w:val="21"/>
+          <w:szCs w:val="21"/>
           <w:bdr w:val="single" w:sz="8" w:space="4" w:color="16A34A" w:frame="1"/>
           <w:shd w:val="clear" w:color="auto" w:fill="FFFFFF"/>
         </w:rPr>
@@ -3891,8 +3900,8 @@
           <w:b/>
           <w:bCs/>
           <w:color w:val="16A34A"/>
-          <w:sz w:val="24"/>
-          <w:szCs w:val="24"/>
+          <w:sz w:val="21"/>
+          <w:szCs w:val="21"/>
           <w:bdr w:val="single" w:sz="8" w:space="4" w:color="16A34A" w:frame="1"/>
           <w:shd w:val="clear" w:color="auto" w:fill="FFFFFF"/>
         </w:rPr>
@@ -3906,8 +3915,8 @@
           <w:b/>
           <w:bCs/>
           <w:color w:val="16A34A"/>
-          <w:sz w:val="24"/>
-          <w:szCs w:val="24"/>
+          <w:sz w:val="21"/>
+          <w:szCs w:val="21"/>
           <w:bdr w:val="single" w:sz="8" w:space="4" w:color="16A34A" w:frame="1"/>
           <w:shd w:val="clear" w:color="auto" w:fill="FFFFFF"/>
         </w:rPr>
@@ -3921,8 +3930,8 @@
           <w:b/>
           <w:bCs/>
           <w:color w:val="16A34A"/>
-          <w:sz w:val="24"/>
-          <w:szCs w:val="24"/>
+          <w:sz w:val="21"/>
+          <w:szCs w:val="21"/>
           <w:bdr w:val="single" w:sz="8" w:space="4" w:color="16A34A" w:frame="1"/>
           <w:shd w:val="clear" w:color="auto" w:fill="FFFFFF"/>
         </w:rPr>
@@ -3936,8 +3945,8 @@
           <w:b/>
           <w:bCs/>
           <w:color w:val="16A34A"/>
-          <w:sz w:val="24"/>
-          <w:szCs w:val="24"/>
+          <w:sz w:val="21"/>
+          <w:szCs w:val="21"/>
           <w:bdr w:val="single" w:sz="8" w:space="4" w:color="16A34A" w:frame="1"/>
           <w:shd w:val="clear" w:color="auto" w:fill="FFFFFF"/>
         </w:rPr>
@@ -3951,8 +3960,8 @@
           <w:b/>
           <w:bCs/>
           <w:color w:val="16A34A"/>
-          <w:sz w:val="24"/>
-          <w:szCs w:val="24"/>
+          <w:sz w:val="21"/>
+          <w:szCs w:val="21"/>
           <w:bdr w:val="single" w:sz="8" w:space="4" w:color="16A34A" w:frame="1"/>
           <w:shd w:val="clear" w:color="auto" w:fill="FFFFFF"/>
         </w:rPr>
@@ -3966,8 +3975,8 @@
           <w:b/>
           <w:bCs/>
           <w:color w:val="16A34A"/>
-          <w:sz w:val="24"/>
-          <w:szCs w:val="24"/>
+          <w:sz w:val="21"/>
+          <w:szCs w:val="21"/>
           <w:bdr w:val="single" w:sz="8" w:space="4" w:color="16A34A" w:frame="1"/>
           <w:shd w:val="clear" w:color="auto" w:fill="FFFFFF"/>
         </w:rPr>
@@ -3983,8 +3992,8 @@
         <w:rPr>
           <w:rFonts w:ascii="Calibri" w:hAnsi="Calibri" w:cs="Calibri"/>
           <w:color w:val="1A1A1A"/>
-          <w:sz w:val="24"/>
-          <w:szCs w:val="24"/>
+          <w:sz w:val="21"/>
+          <w:szCs w:val="21"/>
         </w:rPr>
       </w:pPr>
     </w:p>
@@ -3997,8 +4006,8 @@
           <w:b/>
           <w:bCs/>
           <w:color w:val="555555"/>
-          <w:sz w:val="24"/>
-          <w:szCs w:val="24"/>
+          <w:sz w:val="21"/>
+          <w:szCs w:val="21"/>
         </w:rPr>
       </w:pPr>
       <w:r>
@@ -4007,8 +4016,8 @@
           <w:b/>
           <w:bCs/>
           <w:color w:val="555555"/>
-          <w:sz w:val="24"/>
-          <w:szCs w:val="24"/>
+          <w:sz w:val="21"/>
+          <w:szCs w:val="21"/>
         </w:rPr>
         <w:t>Consultoras de NR:</w:t>
       </w:r>
@@ -4020,16 +4029,16 @@
         <w:rPr>
           <w:rFonts w:ascii="Calibri" w:hAnsi="Calibri" w:cs="Calibri"/>
           <w:color w:val="777777"/>
-          <w:sz w:val="24"/>
-          <w:szCs w:val="24"/>
+          <w:sz w:val="21"/>
+          <w:szCs w:val="21"/>
         </w:rPr>
       </w:pPr>
       <w:r>
         <w:rPr>
           <w:rFonts w:ascii="Calibri" w:hAnsi="Calibri" w:cs="Calibri"/>
           <w:color w:val="777777"/>
-          <w:sz w:val="24"/>
-          <w:szCs w:val="24"/>
+          <w:sz w:val="21"/>
+          <w:szCs w:val="21"/>
         </w:rPr>
         <w:t> /NR12 (máquinas) e /NR18 (obras) ajudam no enquadramento durante a redação.</w:t>
       </w:r>
@@ -4043,8 +4052,8 @@
           <w:b/>
           <w:bCs/>
           <w:color w:val="FFFFFF"/>
-          <w:sz w:val="24"/>
-          <w:szCs w:val="24"/>
+          <w:sz w:val="21"/>
+          <w:szCs w:val="21"/>
         </w:rPr>
       </w:pPr>
       <w:r>
@@ -4053,8 +4062,8 @@
           <w:b/>
           <w:bCs/>
           <w:color w:val="FFFFFF"/>
-          <w:sz w:val="24"/>
-          <w:szCs w:val="24"/>
+          <w:sz w:val="21"/>
+          <w:szCs w:val="21"/>
         </w:rPr>
         <w:t>9</w:t>
       </w:r>
@@ -4068,16 +4077,16 @@
         <w:rPr>
           <w:rFonts w:ascii="Calibri" w:hAnsi="Calibri" w:cs="Calibri"/>
           <w:color w:val="1A1A1A"/>
-          <w:sz w:val="24"/>
-          <w:szCs w:val="24"/>
+          <w:sz w:val="21"/>
+          <w:szCs w:val="21"/>
         </w:rPr>
       </w:pPr>
       <w:r>
         <w:rPr>
           <w:rFonts w:ascii="Calibri" w:hAnsi="Calibri" w:cs="Calibri"/>
           <w:color w:val="1A1A1A"/>
-          <w:sz w:val="24"/>
-          <w:szCs w:val="24"/>
+          <w:sz w:val="21"/>
+          <w:szCs w:val="21"/>
         </w:rPr>
         <w:t>Risco grave e iminente</w:t>
       </w:r>
@@ -4089,16 +4098,16 @@
         <w:rPr>
           <w:rFonts w:ascii="Calibri" w:hAnsi="Calibri" w:cs="Calibri"/>
           <w:color w:val="555555"/>
-          <w:sz w:val="24"/>
-          <w:szCs w:val="24"/>
+          <w:sz w:val="21"/>
+          <w:szCs w:val="21"/>
         </w:rPr>
       </w:pPr>
       <w:r>
         <w:rPr>
           <w:rFonts w:ascii="Calibri" w:hAnsi="Calibri" w:cs="Calibri"/>
           <w:color w:val="555555"/>
-          <w:sz w:val="24"/>
-          <w:szCs w:val="24"/>
+          <w:sz w:val="21"/>
+          <w:szCs w:val="21"/>
         </w:rPr>
         <w:t>Interdição ou embargo: o relatório técnico sai em .</w:t>
       </w:r>
@@ -4107,8 +4116,8 @@
         <w:rPr>
           <w:rFonts w:ascii="Calibri" w:hAnsi="Calibri" w:cs="Calibri"/>
           <w:color w:val="555555"/>
-          <w:sz w:val="24"/>
-          <w:szCs w:val="24"/>
+          <w:sz w:val="21"/>
+          <w:szCs w:val="21"/>
         </w:rPr>
         <w:t>docx</w:t>
       </w:r>
@@ -4117,8 +4126,8 @@
         <w:rPr>
           <w:rFonts w:ascii="Calibri" w:hAnsi="Calibri" w:cs="Calibri"/>
           <w:color w:val="555555"/>
-          <w:sz w:val="24"/>
-          <w:szCs w:val="24"/>
+          <w:sz w:val="21"/>
+          <w:szCs w:val="21"/>
         </w:rPr>
         <w:t xml:space="preserve"> no modelo oficial, já com os autos derivados. Se a empresa pedir a suspensão com um laudo, a auditoria do laudo alimenta o RT de manutenção.</w:t>
       </w:r>
@@ -4130,8 +4139,8 @@
         <w:rPr>
           <w:rFonts w:ascii="Calibri" w:hAnsi="Calibri" w:cs="Calibri"/>
           <w:color w:val="1A1A1A"/>
-          <w:sz w:val="24"/>
-          <w:szCs w:val="24"/>
+          <w:sz w:val="21"/>
+          <w:szCs w:val="21"/>
         </w:rPr>
       </w:pPr>
       <w:r>
@@ -4141,8 +4150,8 @@
           <w:b/>
           <w:bCs/>
           <w:color w:val="DC2626"/>
-          <w:sz w:val="24"/>
-          <w:szCs w:val="24"/>
+          <w:sz w:val="21"/>
+          <w:szCs w:val="21"/>
           <w:bdr w:val="single" w:sz="8" w:space="4" w:color="DC2626" w:frame="1"/>
           <w:shd w:val="clear" w:color="auto" w:fill="FFFFFF"/>
         </w:rPr>
@@ -4156,8 +4165,8 @@
           <w:b/>
           <w:bCs/>
           <w:color w:val="DC2626"/>
-          <w:sz w:val="24"/>
-          <w:szCs w:val="24"/>
+          <w:sz w:val="21"/>
+          <w:szCs w:val="21"/>
           <w:bdr w:val="single" w:sz="8" w:space="4" w:color="DC2626" w:frame="1"/>
           <w:shd w:val="clear" w:color="auto" w:fill="FFFFFF"/>
         </w:rPr>
@@ -4171,8 +4180,8 @@
           <w:b/>
           <w:bCs/>
           <w:color w:val="DC2626"/>
-          <w:sz w:val="24"/>
-          <w:szCs w:val="24"/>
+          <w:sz w:val="21"/>
+          <w:szCs w:val="21"/>
           <w:bdr w:val="single" w:sz="8" w:space="4" w:color="DC2626" w:frame="1"/>
           <w:shd w:val="clear" w:color="auto" w:fill="FFFFFF"/>
         </w:rPr>
@@ -4186,8 +4195,8 @@
           <w:b/>
           <w:bCs/>
           <w:color w:val="DC2626"/>
-          <w:sz w:val="24"/>
-          <w:szCs w:val="24"/>
+          <w:sz w:val="21"/>
+          <w:szCs w:val="21"/>
           <w:bdr w:val="single" w:sz="8" w:space="4" w:color="DC2626" w:frame="1"/>
           <w:shd w:val="clear" w:color="auto" w:fill="FFFFFF"/>
         </w:rPr>
@@ -4201,8 +4210,8 @@
           <w:b/>
           <w:bCs/>
           <w:color w:val="0D9488"/>
-          <w:sz w:val="24"/>
-          <w:szCs w:val="24"/>
+          <w:sz w:val="21"/>
+          <w:szCs w:val="21"/>
           <w:bdr w:val="single" w:sz="8" w:space="4" w:color="0D9488" w:frame="1"/>
           <w:shd w:val="clear" w:color="auto" w:fill="FFFFFF"/>
         </w:rPr>
@@ -4218,8 +4227,8 @@
           <w:b/>
           <w:bCs/>
           <w:color w:val="FFFFFF"/>
-          <w:sz w:val="24"/>
-          <w:szCs w:val="24"/>
+          <w:sz w:val="21"/>
+          <w:szCs w:val="21"/>
         </w:rPr>
       </w:pPr>
       <w:r>
@@ -4228,8 +4237,8 @@
           <w:b/>
           <w:bCs/>
           <w:color w:val="FFFFFF"/>
-          <w:sz w:val="24"/>
-          <w:szCs w:val="24"/>
+          <w:sz w:val="21"/>
+          <w:szCs w:val="21"/>
         </w:rPr>
         <w:t>10</w:t>
       </w:r>
@@ -4243,16 +4252,16 @@
         <w:rPr>
           <w:rFonts w:ascii="Calibri" w:hAnsi="Calibri" w:cs="Calibri"/>
           <w:color w:val="1A1A1A"/>
-          <w:sz w:val="24"/>
-          <w:szCs w:val="24"/>
+          <w:sz w:val="21"/>
+          <w:szCs w:val="21"/>
         </w:rPr>
       </w:pPr>
       <w:r>
         <w:rPr>
           <w:rFonts w:ascii="Calibri" w:hAnsi="Calibri" w:cs="Calibri"/>
           <w:color w:val="1A1A1A"/>
-          <w:sz w:val="24"/>
-          <w:szCs w:val="24"/>
+          <w:sz w:val="21"/>
+          <w:szCs w:val="21"/>
         </w:rPr>
         <w:t>Acompanhe prazos sem esforço</w:t>
       </w:r>
@@ -4264,16 +4273,16 @@
         <w:rPr>
           <w:rFonts w:ascii="Calibri" w:hAnsi="Calibri" w:cs="Calibri"/>
           <w:color w:val="555555"/>
-          <w:sz w:val="24"/>
-          <w:szCs w:val="24"/>
+          <w:sz w:val="21"/>
+          <w:szCs w:val="21"/>
         </w:rPr>
       </w:pPr>
       <w:r>
         <w:rPr>
           <w:rFonts w:ascii="Calibri" w:hAnsi="Calibri" w:cs="Calibri"/>
           <w:color w:val="555555"/>
-          <w:sz w:val="24"/>
-          <w:szCs w:val="24"/>
+          <w:sz w:val="21"/>
+          <w:szCs w:val="21"/>
         </w:rPr>
         <w:t>O painel mostra todas as auditorias em cards, com notificações DET, pendências e vencimentos — direto no navegador, só na sua máquina. Os prazos podem ir para o seu </w:t>
       </w:r>
@@ -4283,8 +4292,8 @@
           <w:b/>
           <w:bCs/>
           <w:color w:val="555555"/>
-          <w:sz w:val="24"/>
-          <w:szCs w:val="24"/>
+          <w:sz w:val="21"/>
+          <w:szCs w:val="21"/>
         </w:rPr>
         <w:t xml:space="preserve">Google </w:t>
       </w:r>
@@ -4295,8 +4304,8 @@
           <w:b/>
           <w:bCs/>
           <w:color w:val="555555"/>
-          <w:sz w:val="24"/>
-          <w:szCs w:val="24"/>
+          <w:sz w:val="21"/>
+          <w:szCs w:val="21"/>
         </w:rPr>
         <w:t>Calendar</w:t>
       </w:r>
@@ -4305,8 +4314,8 @@
         <w:rPr>
           <w:rFonts w:ascii="Calibri" w:hAnsi="Calibri" w:cs="Calibri"/>
           <w:color w:val="555555"/>
-          <w:sz w:val="24"/>
-          <w:szCs w:val="24"/>
+          <w:sz w:val="21"/>
+          <w:szCs w:val="21"/>
         </w:rPr>
         <w:t xml:space="preserve"> (evento por notificação, </w:t>
       </w:r>
@@ -4314,8 +4323,8 @@
         <w:rPr>
           <w:rFonts w:ascii="Segoe UI Symbol" w:hAnsi="Segoe UI Symbol" w:cs="Segoe UI Symbol"/>
           <w:color w:val="555555"/>
-          <w:sz w:val="24"/>
-          <w:szCs w:val="24"/>
+          <w:sz w:val="21"/>
+          <w:szCs w:val="21"/>
         </w:rPr>
         <w:t>✓</w:t>
       </w:r>
@@ -4323,8 +4332,8 @@
         <w:rPr>
           <w:rFonts w:ascii="Calibri" w:hAnsi="Calibri" w:cs="Calibri"/>
           <w:color w:val="555555"/>
-          <w:sz w:val="24"/>
-          <w:szCs w:val="24"/>
+          <w:sz w:val="21"/>
+          <w:szCs w:val="21"/>
         </w:rPr>
         <w:t xml:space="preserve"> quando você responde).</w:t>
       </w:r>
@@ -4336,8 +4345,8 @@
         <w:rPr>
           <w:rFonts w:ascii="Calibri" w:hAnsi="Calibri" w:cs="Calibri"/>
           <w:color w:val="1A1A1A"/>
-          <w:sz w:val="24"/>
-          <w:szCs w:val="24"/>
+          <w:sz w:val="21"/>
+          <w:szCs w:val="21"/>
         </w:rPr>
       </w:pPr>
       <w:r>
@@ -4347,8 +4356,8 @@
           <w:b/>
           <w:bCs/>
           <w:color w:val="9333EA"/>
-          <w:sz w:val="24"/>
-          <w:szCs w:val="24"/>
+          <w:sz w:val="21"/>
+          <w:szCs w:val="21"/>
           <w:bdr w:val="single" w:sz="8" w:space="4" w:color="9333EA" w:frame="1"/>
           <w:shd w:val="clear" w:color="auto" w:fill="FFFFFF"/>
         </w:rPr>
@@ -4362,8 +4371,8 @@
           <w:b/>
           <w:bCs/>
           <w:color w:val="9333EA"/>
-          <w:sz w:val="24"/>
-          <w:szCs w:val="24"/>
+          <w:sz w:val="21"/>
+          <w:szCs w:val="21"/>
           <w:bdr w:val="single" w:sz="8" w:space="4" w:color="9333EA" w:frame="1"/>
           <w:shd w:val="clear" w:color="auto" w:fill="FFFFFF"/>
         </w:rPr>
@@ -4380,8 +4389,8 @@
           <w:b/>
           <w:bCs/>
           <w:color w:val="FFFFFF"/>
-          <w:sz w:val="24"/>
-          <w:szCs w:val="24"/>
+          <w:sz w:val="21"/>
+          <w:szCs w:val="21"/>
         </w:rPr>
       </w:pPr>
       <w:r>
@@ -4390,8 +4399,8 @@
           <w:b/>
           <w:bCs/>
           <w:color w:val="FFFFFF"/>
-          <w:sz w:val="24"/>
-          <w:szCs w:val="24"/>
+          <w:sz w:val="21"/>
+          <w:szCs w:val="21"/>
         </w:rPr>
         <w:t>11</w:t>
       </w:r>
@@ -4405,16 +4414,16 @@
         <w:rPr>
           <w:rFonts w:ascii="Calibri" w:hAnsi="Calibri" w:cs="Calibri"/>
           <w:color w:val="1A1A1A"/>
-          <w:sz w:val="24"/>
-          <w:szCs w:val="24"/>
+          <w:sz w:val="21"/>
+          <w:szCs w:val="21"/>
         </w:rPr>
       </w:pPr>
       <w:r>
         <w:rPr>
           <w:rFonts w:ascii="Calibri" w:hAnsi="Calibri" w:cs="Calibri"/>
           <w:color w:val="1A1A1A"/>
-          <w:sz w:val="24"/>
-          <w:szCs w:val="24"/>
+          <w:sz w:val="21"/>
+          <w:szCs w:val="21"/>
         </w:rPr>
         <w:t>Feche a ação fiscal</w:t>
       </w:r>
@@ -4426,16 +4435,16 @@
         <w:rPr>
           <w:rFonts w:ascii="Calibri" w:hAnsi="Calibri" w:cs="Calibri"/>
           <w:color w:val="555555"/>
-          <w:sz w:val="24"/>
-          <w:szCs w:val="24"/>
+          <w:sz w:val="21"/>
+          <w:szCs w:val="21"/>
         </w:rPr>
       </w:pPr>
       <w:r>
         <w:rPr>
           <w:rFonts w:ascii="Calibri" w:hAnsi="Calibri" w:cs="Calibri"/>
           <w:color w:val="555555"/>
-          <w:sz w:val="24"/>
-          <w:szCs w:val="24"/>
+          <w:sz w:val="21"/>
+          <w:szCs w:val="21"/>
         </w:rPr>
         <w:t>Confira o que já foi efetivamente transmitido no Sistema Auditor e gere o relatório final da ação.</w:t>
       </w:r>
@@ -4447,8 +4456,8 @@
         <w:rPr>
           <w:rFonts w:ascii="Calibri" w:hAnsi="Calibri" w:cs="Calibri"/>
           <w:color w:val="1A1A1A"/>
-          <w:sz w:val="24"/>
-          <w:szCs w:val="24"/>
+          <w:sz w:val="21"/>
+          <w:szCs w:val="21"/>
         </w:rPr>
       </w:pPr>
       <w:r>
@@ -4458,8 +4467,8 @@
           <w:b/>
           <w:bCs/>
           <w:color w:val="2563EB"/>
-          <w:sz w:val="24"/>
-          <w:szCs w:val="24"/>
+          <w:sz w:val="21"/>
+          <w:szCs w:val="21"/>
           <w:bdr w:val="single" w:sz="8" w:space="4" w:color="2563EB" w:frame="1"/>
           <w:shd w:val="clear" w:color="auto" w:fill="FFFFFF"/>
         </w:rPr>
@@ -4473,8 +4482,8 @@
           <w:b/>
           <w:bCs/>
           <w:color w:val="2563EB"/>
-          <w:sz w:val="24"/>
-          <w:szCs w:val="24"/>
+          <w:sz w:val="21"/>
+          <w:szCs w:val="21"/>
           <w:bdr w:val="single" w:sz="8" w:space="4" w:color="2563EB" w:frame="1"/>
           <w:shd w:val="clear" w:color="auto" w:fill="FFFFFF"/>
         </w:rPr>
@@ -4491,8 +4500,8 @@
           <w:b/>
           <w:bCs/>
           <w:color w:val="FFFFFF"/>
-          <w:sz w:val="24"/>
-          <w:szCs w:val="24"/>
+          <w:sz w:val="21"/>
+          <w:szCs w:val="21"/>
         </w:rPr>
       </w:pPr>
       <w:r>
@@ -4501,8 +4510,8 @@
           <w:b/>
           <w:bCs/>
           <w:color w:val="FFFFFF"/>
-          <w:sz w:val="24"/>
-          <w:szCs w:val="24"/>
+          <w:sz w:val="21"/>
+          <w:szCs w:val="21"/>
         </w:rPr>
         <w:t>12</w:t>
       </w:r>
@@ -4516,16 +4525,16 @@
         <w:rPr>
           <w:rFonts w:ascii="Calibri" w:hAnsi="Calibri" w:cs="Calibri"/>
           <w:color w:val="1A1A1A"/>
-          <w:sz w:val="24"/>
-          <w:szCs w:val="24"/>
+          <w:sz w:val="21"/>
+          <w:szCs w:val="21"/>
         </w:rPr>
       </w:pPr>
       <w:r>
         <w:rPr>
           <w:rFonts w:ascii="Calibri" w:hAnsi="Calibri" w:cs="Calibri"/>
           <w:color w:val="1A1A1A"/>
-          <w:sz w:val="24"/>
-          <w:szCs w:val="24"/>
+          <w:sz w:val="21"/>
+          <w:szCs w:val="21"/>
         </w:rPr>
         <w:t>Mantenha o toolkit em dia</w:t>
       </w:r>
@@ -4537,16 +4546,16 @@
         <w:rPr>
           <w:rFonts w:ascii="Calibri" w:hAnsi="Calibri" w:cs="Calibri"/>
           <w:color w:val="555555"/>
-          <w:sz w:val="24"/>
-          <w:szCs w:val="24"/>
+          <w:sz w:val="21"/>
+          <w:szCs w:val="21"/>
         </w:rPr>
       </w:pPr>
       <w:r>
         <w:rPr>
           <w:rFonts w:ascii="Calibri" w:hAnsi="Calibri" w:cs="Calibri"/>
           <w:color w:val="555555"/>
-          <w:sz w:val="24"/>
-          <w:szCs w:val="24"/>
+          <w:sz w:val="21"/>
+          <w:szCs w:val="21"/>
         </w:rPr>
         <w:t>Uma frase e pronto: baixa a versão nova, confere a segurança do que chegou, atualiza seu perfil e te conta </w:t>
       </w:r>
@@ -4556,8 +4565,8 @@
           <w:b/>
           <w:bCs/>
           <w:color w:val="555555"/>
-          <w:sz w:val="24"/>
-          <w:szCs w:val="24"/>
+          <w:sz w:val="21"/>
+          <w:szCs w:val="21"/>
         </w:rPr>
         <w:t>as novidades em português</w:t>
       </w:r>
@@ -4565,8 +4574,8 @@
         <w:rPr>
           <w:rFonts w:ascii="Calibri" w:hAnsi="Calibri" w:cs="Calibri"/>
           <w:color w:val="555555"/>
-          <w:sz w:val="24"/>
-          <w:szCs w:val="24"/>
+          <w:sz w:val="21"/>
+          <w:szCs w:val="21"/>
         </w:rPr>
         <w:t>, sem jargão. Suas skills pessoais (</w:t>
       </w:r>
@@ -4575,8 +4584,8 @@
           <w:rStyle w:val="CdigoHTML"/>
           <w:rFonts w:ascii="Calibri" w:eastAsia="Arial" w:hAnsi="Calibri" w:cs="Calibri"/>
           <w:color w:val="555555"/>
-          <w:sz w:val="24"/>
-          <w:szCs w:val="24"/>
+          <w:sz w:val="21"/>
+          <w:szCs w:val="21"/>
         </w:rPr>
         <w:t>minha-*</w:t>
       </w:r>
@@ -4584,8 +4593,8 @@
         <w:rPr>
           <w:rFonts w:ascii="Calibri" w:hAnsi="Calibri" w:cs="Calibri"/>
           <w:color w:val="555555"/>
-          <w:sz w:val="24"/>
-          <w:szCs w:val="24"/>
+          <w:sz w:val="21"/>
+          <w:szCs w:val="21"/>
         </w:rPr>
         <w:t>) nunca são tocadas.</w:t>
       </w:r>
@@ -4597,8 +4606,8 @@
         <w:rPr>
           <w:rFonts w:ascii="Calibri" w:hAnsi="Calibri" w:cs="Calibri"/>
           <w:color w:val="1A1A1A"/>
-          <w:sz w:val="24"/>
-          <w:szCs w:val="24"/>
+          <w:sz w:val="21"/>
+          <w:szCs w:val="21"/>
         </w:rPr>
       </w:pPr>
       <w:r>
@@ -4608,8 +4617,8 @@
           <w:b/>
           <w:bCs/>
           <w:color w:val="F4661B"/>
-          <w:sz w:val="24"/>
-          <w:szCs w:val="24"/>
+          <w:sz w:val="21"/>
+          <w:szCs w:val="21"/>
           <w:bdr w:val="single" w:sz="8" w:space="4" w:color="F4661B" w:frame="1"/>
           <w:shd w:val="clear" w:color="auto" w:fill="FFFFFF"/>
         </w:rPr>
@@ -4623,8 +4632,8 @@
           <w:b/>
           <w:bCs/>
           <w:color w:val="F4661B"/>
-          <w:sz w:val="24"/>
-          <w:szCs w:val="24"/>
+          <w:sz w:val="21"/>
+          <w:szCs w:val="21"/>
           <w:bdr w:val="single" w:sz="8" w:space="4" w:color="F4661B" w:frame="1"/>
           <w:shd w:val="clear" w:color="auto" w:fill="FFFFFF"/>
         </w:rPr>
@@ -4638,8 +4647,8 @@
           <w:b/>
           <w:bCs/>
           <w:color w:val="F4661B"/>
-          <w:sz w:val="24"/>
-          <w:szCs w:val="24"/>
+          <w:sz w:val="21"/>
+          <w:szCs w:val="21"/>
           <w:bdr w:val="single" w:sz="8" w:space="4" w:color="F4661B" w:frame="1"/>
           <w:shd w:val="clear" w:color="auto" w:fill="FFFFFF"/>
         </w:rPr>
@@ -6085,7 +6094,7 @@
           <w:szCs w:val="24"/>
         </w:rPr>
         <w:drawing>
-          <wp:inline distT="0" distB="0" distL="0" distR="0" wp14:anchorId="521E0C67" wp14:editId="62491E27">
+          <wp:inline distT="0" distB="0" distL="0" distR="0" wp14:anchorId="521E0C67" wp14:editId="70A531D2">
             <wp:extent cx="6078957" cy="3530279"/>
             <wp:effectExtent l="0" t="0" r="4445" b="635"/>
             <wp:docPr id="1877105587" name="Imagem 3" descr="Interface gráfica do usuário, Texto, Aplicativo, Email&#10;&#10;O conteúdo gerado por IA pode estar incorreto."/>
@@ -6702,7 +6711,7 @@
           <w:szCs w:val="24"/>
         </w:rPr>
         <w:drawing>
-          <wp:inline distT="0" distB="0" distL="0" distR="0" wp14:anchorId="5F4F8C0C" wp14:editId="46E88BD4">
+          <wp:inline distT="0" distB="0" distL="0" distR="0" wp14:anchorId="5F4F8C0C" wp14:editId="33CD93A0">
             <wp:extent cx="6193592" cy="3333509"/>
             <wp:effectExtent l="0" t="0" r="4445" b="0"/>
             <wp:docPr id="1821921538" name="Imagem 4" descr="Interface gráfica do usuário, Texto, Aplicativo, Email&#10;&#10;O conteúdo gerado por IA pode estar incorreto."/>
@@ -6826,7 +6835,7 @@
         </w:rPr>
         <w:lastRenderedPageBreak/>
         <w:drawing>
-          <wp:inline distT="0" distB="0" distL="0" distR="0" wp14:anchorId="25754CA9" wp14:editId="669395D9">
+          <wp:inline distT="0" distB="0" distL="0" distR="0" wp14:anchorId="25754CA9" wp14:editId="3C5C163A">
             <wp:extent cx="6070622" cy="3102015"/>
             <wp:effectExtent l="0" t="0" r="0" b="0"/>
             <wp:docPr id="1454922375" name="Imagem 5" descr="Interface gráfica do usuário, Texto, Aplicativo, Email&#10;&#10;O conteúdo gerado por IA pode estar incorreto."/>
@@ -7549,25 +7558,7 @@
           <w:sz w:val="24"/>
           <w:szCs w:val="24"/>
         </w:rPr>
-        <w:t xml:space="preserve"> qualquer pasta “meus </w:t>
-      </w:r>
-      <w:proofErr w:type="spellStart"/>
-      <w:r>
-        <w:rPr>
-          <w:rFonts w:ascii="Calibri" w:hAnsi="Calibri" w:cs="Calibri"/>
-          <w:sz w:val="24"/>
-          <w:szCs w:val="24"/>
-        </w:rPr>
-        <w:t xml:space="preserve">documentos” </w:t>
-      </w:r>
-      <w:proofErr w:type="spellEnd"/>
-      <w:r>
-        <w:rPr>
-          <w:rFonts w:ascii="Calibri" w:hAnsi="Calibri" w:cs="Calibri"/>
-          <w:sz w:val="24"/>
-          <w:szCs w:val="24"/>
-        </w:rPr>
-        <w:t xml:space="preserve">para esse momento. </w:t>
+        <w:t xml:space="preserve"> qualquer pasta “meus documentos” para esse momento. </w:t>
       </w:r>
       <w:r>
         <w:rPr>
@@ -8979,15 +8970,7 @@
           <w:sz w:val="24"/>
           <w:szCs w:val="24"/>
         </w:rPr>
-        <w:t>\OS ATIVAS.</w:t>
-      </w:r>
-      <w:r>
-        <w:rPr>
-          <w:rFonts w:ascii="Calibri" w:hAnsi="Calibri" w:cs="Calibri"/>
-          <w:sz w:val="24"/>
-          <w:szCs w:val="24"/>
-        </w:rPr>
-        <w:t xml:space="preserve"> É dentro dela que </w:t>
+        <w:t xml:space="preserve">\OS ATIVAS. É dentro dela que </w:t>
       </w:r>
       <w:proofErr w:type="spellStart"/>
       <w:r>
@@ -9327,7 +9310,7 @@
           <w:szCs w:val="24"/>
         </w:rPr>
         <w:drawing>
-          <wp:inline distT="0" distB="0" distL="0" distR="0" wp14:anchorId="59DB629F" wp14:editId="7041AE20">
+          <wp:inline distT="0" distB="0" distL="0" distR="0" wp14:anchorId="59DB629F" wp14:editId="11426CFE">
             <wp:extent cx="3428577" cy="4284247"/>
             <wp:effectExtent l="0" t="0" r="635" b="0"/>
             <wp:docPr id="615115957" name="Imagem 2" descr="Interface gráfica do usuário, Aplicativo&#10;&#10;O conteúdo gerado por IA pode estar incorreto."/>
@@ -10759,7 +10742,7 @@
           <w:szCs w:val="24"/>
         </w:rPr>
         <w:drawing>
-          <wp:inline distT="0" distB="0" distL="0" distR="0" wp14:anchorId="38B8496B" wp14:editId="0BFF9213">
+          <wp:inline distT="0" distB="0" distL="0" distR="0" wp14:anchorId="38B8496B" wp14:editId="35B58F2C">
             <wp:extent cx="3707553" cy="2077307"/>
             <wp:effectExtent l="0" t="0" r="1270" b="5715"/>
             <wp:docPr id="248311817" name="Imagem 3" descr="Interface gráfica do usuário, Texto, Aplicativo&#10;&#10;O conteúdo gerado por IA pode estar incorreto."/>
@@ -10982,7 +10965,7 @@
           <w:szCs w:val="24"/>
         </w:rPr>
         <w:drawing>
-          <wp:inline distT="0" distB="0" distL="0" distR="0" wp14:anchorId="4BC4078E" wp14:editId="059A5019">
+          <wp:inline distT="0" distB="0" distL="0" distR="0" wp14:anchorId="4BC4078E" wp14:editId="086C16DB">
             <wp:extent cx="4732443" cy="3287750"/>
             <wp:effectExtent l="0" t="0" r="5080" b="1905"/>
             <wp:docPr id="1676791193" name="Imagem 4" descr="Interface gráfica do usuário, Texto, Aplicativo, Email&#10;&#10;O conteúdo gerado por IA pode estar incorreto."/>

</xml_diff>

<commit_message>
Apostila: atualiza o .docx da apostila do toolkit
Co-Authored-By: Claude Opus 5 <noreply@anthropic.com>
</commit_message>
<xml_diff>
--- a/Apostila-AFT-Toolkit.docx
+++ b/Apostila-AFT-Toolkit.docx
@@ -6094,7 +6094,7 @@
           <w:szCs w:val="24"/>
         </w:rPr>
         <w:drawing>
-          <wp:inline distT="0" distB="0" distL="0" distR="0" wp14:anchorId="521E0C67" wp14:editId="2FFF88C8">
+          <wp:inline distT="0" distB="0" distL="0" distR="0" wp14:anchorId="521E0C67" wp14:editId="7E4C0D7A">
             <wp:extent cx="6078957" cy="3530279"/>
             <wp:effectExtent l="0" t="0" r="4445" b="635"/>
             <wp:docPr id="1877105587" name="Imagem 3" descr="Interface gráfica do usuário, Texto, Aplicativo, Email&#10;&#10;O conteúdo gerado por IA pode estar incorreto."/>
@@ -6711,7 +6711,7 @@
           <w:szCs w:val="24"/>
         </w:rPr>
         <w:drawing>
-          <wp:inline distT="0" distB="0" distL="0" distR="0" wp14:anchorId="5F4F8C0C" wp14:editId="62E96CCB">
+          <wp:inline distT="0" distB="0" distL="0" distR="0" wp14:anchorId="5F4F8C0C" wp14:editId="34DF8708">
             <wp:extent cx="6193592" cy="3333509"/>
             <wp:effectExtent l="0" t="0" r="4445" b="0"/>
             <wp:docPr id="1821921538" name="Imagem 4" descr="Interface gráfica do usuário, Texto, Aplicativo, Email&#10;&#10;O conteúdo gerado por IA pode estar incorreto."/>
@@ -6835,7 +6835,7 @@
         </w:rPr>
         <w:lastRenderedPageBreak/>
         <w:drawing>
-          <wp:inline distT="0" distB="0" distL="0" distR="0" wp14:anchorId="25754CA9" wp14:editId="1DFF36E3">
+          <wp:inline distT="0" distB="0" distL="0" distR="0" wp14:anchorId="25754CA9" wp14:editId="2D51C42C">
             <wp:extent cx="6070622" cy="3102015"/>
             <wp:effectExtent l="0" t="0" r="0" b="0"/>
             <wp:docPr id="1454922375" name="Imagem 5" descr="Interface gráfica do usuário, Texto, Aplicativo, Email&#10;&#10;O conteúdo gerado por IA pode estar incorreto."/>
@@ -8453,7 +8453,7 @@
           <w:szCs w:val="24"/>
         </w:rPr>
         <w:drawing>
-          <wp:inline distT="0" distB="0" distL="0" distR="0" wp14:anchorId="587060DB" wp14:editId="41C42D00">
+          <wp:inline distT="0" distB="0" distL="0" distR="0" wp14:anchorId="587060DB" wp14:editId="027A6A6F">
             <wp:extent cx="6645910" cy="3171190"/>
             <wp:effectExtent l="0" t="0" r="0" b="3810"/>
             <wp:docPr id="1953640500" name="Imagem 2"/>
@@ -9509,7 +9509,7 @@
           <w:szCs w:val="24"/>
         </w:rPr>
         <w:drawing>
-          <wp:inline distT="0" distB="0" distL="0" distR="0" wp14:anchorId="59DB629F" wp14:editId="72D07277">
+          <wp:inline distT="0" distB="0" distL="0" distR="0" wp14:anchorId="59DB629F" wp14:editId="7429CBC0">
             <wp:extent cx="3428577" cy="4284247"/>
             <wp:effectExtent l="0" t="0" r="635" b="0"/>
             <wp:docPr id="615115957" name="Imagem 2" descr="Interface gráfica do usuário, Aplicativo&#10;&#10;O conteúdo gerado por IA pode estar incorreto."/>
@@ -10444,88 +10444,134 @@
     </w:p>
     <w:p>
       <w:pPr>
-        <w:pStyle w:val="Ttulo2"/>
-        <w:rPr>
-          <w:rFonts w:ascii="Calibri" w:hAnsi="Calibri" w:cs="Calibri"/>
-          <w:color w:val="C55A11"/>
-          <w:sz w:val="24"/>
-          <w:szCs w:val="24"/>
-        </w:rPr>
-      </w:pPr>
-      <w:bookmarkStart w:id="12" w:name="_Toc990000028"/>
-      <w:r>
-        <w:rPr>
-          <w:rFonts w:ascii="Calibri" w:hAnsi="Calibri" w:cs="Calibri"/>
-          <w:color w:val="C55A11"/>
+        <w:pStyle w:val="Ttulo1"/>
+        <w:numPr>
+          <w:ilvl w:val="0"/>
+          <w:numId w:val="5"/>
+        </w:numPr>
+        <w:rPr>
+          <w:rFonts w:ascii="Calibri" w:hAnsi="Calibri" w:cs="Calibri"/>
+          <w:color w:val="E97132"/>
+          <w:sz w:val="24"/>
+          <w:szCs w:val="24"/>
+        </w:rPr>
+      </w:pPr>
+      <w:bookmarkStart w:id="12" w:name="_Toc233441472"/>
+      <w:r>
+        <w:rPr>
+          <w:rFonts w:ascii="Calibri" w:hAnsi="Calibri" w:cs="Calibri"/>
+          <w:color w:val="E97132"/>
           <w:sz w:val="24"/>
           <w:szCs w:val="24"/>
         </w:rPr>
         <w:lastRenderedPageBreak/>
-        <w:t>2.8 Painel e extensão Chrome</w:t>
-      </w:r>
-      <w:r>
-        <w:rPr>
-          <w:rFonts w:ascii="Calibri" w:hAnsi="Calibri" w:cs="Calibri"/>
-          <w:color w:val="C55A11"/>
-          <w:sz w:val="24"/>
-          <w:szCs w:val="24"/>
-        </w:rPr>
-        <w:t>/Edge</w:t>
-      </w:r>
-      <w:r>
-        <w:rPr>
-          <w:rFonts w:ascii="Calibri" w:hAnsi="Calibri" w:cs="Calibri"/>
-          <w:color w:val="C55A11"/>
-          <w:sz w:val="24"/>
-          <w:szCs w:val="24"/>
-        </w:rPr>
-        <w:t xml:space="preserve"> — as notificações do DET direto na sua ficha</w:t>
-      </w:r>
-      <w:bookmarkEnd w:id="12"/>
-    </w:p>
-    <w:p>
-      <w:pPr>
-        <w:pStyle w:val="Ttulo2"/>
-        <w:rPr>
-          <w:rFonts w:ascii="Calibri" w:hAnsi="Calibri" w:cs="Calibri"/>
-          <w:color w:val="C55A11"/>
-          <w:sz w:val="24"/>
-          <w:szCs w:val="24"/>
-        </w:rPr>
-      </w:pPr>
-    </w:p>
-    <w:p>
-      <w:pPr>
-        <w:spacing w:after="120"/>
-        <w:jc w:val="both"/>
-        <w:rPr>
-          <w:rFonts w:ascii="Calibri" w:hAnsi="Calibri" w:cs="Calibri"/>
-          <w:sz w:val="24"/>
-          <w:szCs w:val="24"/>
-        </w:rPr>
-      </w:pPr>
-      <w:r>
-        <w:rPr>
-          <w:rFonts w:ascii="Calibri" w:hAnsi="Calibri" w:cs="Calibri"/>
-          <w:b/>
-          <w:bCs/>
-          <w:sz w:val="24"/>
-          <w:szCs w:val="24"/>
-        </w:rPr>
-        <w:t xml:space="preserve">Painel: </w:t>
-      </w:r>
-      <w:r>
-        <w:rPr>
-          <w:rFonts w:ascii="Calibri" w:hAnsi="Calibri" w:cs="Calibri"/>
-          <w:sz w:val="24"/>
-          <w:szCs w:val="24"/>
-        </w:rPr>
-        <w:t xml:space="preserve">O </w:t>
+        <w:t xml:space="preserve">Usando o Claude </w:t>
       </w:r>
       <w:proofErr w:type="spellStart"/>
       <w:r>
         <w:rPr>
           <w:rFonts w:ascii="Calibri" w:hAnsi="Calibri" w:cs="Calibri"/>
+          <w:color w:val="E97132"/>
+          <w:sz w:val="24"/>
+          <w:szCs w:val="24"/>
+        </w:rPr>
+        <w:t>Code</w:t>
+      </w:r>
+      <w:proofErr w:type="spellEnd"/>
+      <w:r>
+        <w:rPr>
+          <w:rFonts w:ascii="Calibri" w:hAnsi="Calibri" w:cs="Calibri"/>
+          <w:color w:val="E97132"/>
+          <w:sz w:val="24"/>
+          <w:szCs w:val="24"/>
+        </w:rPr>
+        <w:t xml:space="preserve"> como um Sistema operacional de fiscalização</w:t>
+      </w:r>
+    </w:p>
+    <w:p>
+      <w:pPr>
+        <w:autoSpaceDE w:val="0"/>
+        <w:autoSpaceDN w:val="0"/>
+        <w:adjustRightInd w:val="0"/>
+        <w:rPr>
+          <w:rFonts w:ascii="Calibri" w:hAnsi="Calibri" w:cs="Calibri"/>
+          <w:color w:val="000000" w:themeColor="text1"/>
+          <w:sz w:val="24"/>
+          <w:szCs w:val="24"/>
+        </w:rPr>
+      </w:pPr>
+      <w:r>
+        <w:rPr>
+          <w:rFonts w:ascii="Calibri" w:hAnsi="Calibri" w:cs="Calibri"/>
+          <w:color w:val="000000" w:themeColor="text1"/>
+          <w:sz w:val="24"/>
+          <w:szCs w:val="24"/>
+        </w:rPr>
+        <w:t xml:space="preserve">3.1 Skills = Habilidades </w:t>
+      </w:r>
+      <w:r>
+        <w:rPr>
+          <w:rFonts w:ascii="Calibri" w:hAnsi="Calibri" w:cs="Calibri"/>
+          <w:color w:val="000000" w:themeColor="text1"/>
+          <w:sz w:val="24"/>
+          <w:szCs w:val="24"/>
+        </w:rPr>
+        <w:br/>
+      </w:r>
+      <w:r>
+        <w:rPr>
+          <w:rFonts w:ascii="Calibri" w:hAnsi="Calibri" w:cs="Calibri"/>
+          <w:color w:val="000000" w:themeColor="text1"/>
+          <w:sz w:val="24"/>
+          <w:szCs w:val="24"/>
+        </w:rPr>
+        <w:br/>
+      </w:r>
+      <w:proofErr w:type="gramStart"/>
+      <w:r>
+        <w:rPr>
+          <w:rFonts w:ascii="Calibri" w:hAnsi="Calibri" w:cs="Calibri"/>
+          <w:color w:val="000000" w:themeColor="text1"/>
+          <w:sz w:val="24"/>
+          <w:szCs w:val="24"/>
+        </w:rPr>
+        <w:t>Durante  meu</w:t>
+      </w:r>
+      <w:proofErr w:type="gramEnd"/>
+      <w:r>
+        <w:rPr>
+          <w:rFonts w:ascii="Calibri" w:hAnsi="Calibri" w:cs="Calibri"/>
+          <w:color w:val="000000" w:themeColor="text1"/>
+          <w:sz w:val="24"/>
+          <w:szCs w:val="24"/>
+        </w:rPr>
+        <w:t xml:space="preserve"> uso no </w:t>
+      </w:r>
+      <w:proofErr w:type="gramStart"/>
+      <w:r>
+        <w:rPr>
+          <w:rFonts w:ascii="Calibri" w:hAnsi="Calibri" w:cs="Calibri"/>
+          <w:color w:val="000000" w:themeColor="text1"/>
+          <w:sz w:val="24"/>
+          <w:szCs w:val="24"/>
+        </w:rPr>
+        <w:t>dia-a-dia</w:t>
+      </w:r>
+      <w:proofErr w:type="gramEnd"/>
+      <w:r>
+        <w:rPr>
+          <w:rFonts w:ascii="Calibri" w:hAnsi="Calibri" w:cs="Calibri"/>
+          <w:color w:val="000000" w:themeColor="text1"/>
+          <w:sz w:val="24"/>
+          <w:szCs w:val="24"/>
+        </w:rPr>
+        <w:t xml:space="preserve"> fui criando várias skills (habilidades) para o </w:t>
+      </w:r>
+      <w:proofErr w:type="spellStart"/>
+      <w:r>
+        <w:rPr>
+          <w:rFonts w:ascii="Calibri" w:hAnsi="Calibri" w:cs="Calibri"/>
+          <w:color w:val="000000" w:themeColor="text1"/>
           <w:sz w:val="24"/>
           <w:szCs w:val="24"/>
         </w:rPr>
@@ -10535,6 +10581,7 @@
       <w:r>
         <w:rPr>
           <w:rFonts w:ascii="Calibri" w:hAnsi="Calibri" w:cs="Calibri"/>
+          <w:color w:val="000000" w:themeColor="text1"/>
           <w:sz w:val="24"/>
           <w:szCs w:val="24"/>
         </w:rPr>
@@ -10544,6 +10591,7 @@
       <w:r>
         <w:rPr>
           <w:rFonts w:ascii="Calibri" w:hAnsi="Calibri" w:cs="Calibri"/>
+          <w:color w:val="000000" w:themeColor="text1"/>
           <w:sz w:val="24"/>
           <w:szCs w:val="24"/>
         </w:rPr>
@@ -10553,84 +10601,183 @@
       <w:r>
         <w:rPr>
           <w:rFonts w:ascii="Calibri" w:hAnsi="Calibri" w:cs="Calibri"/>
-          <w:sz w:val="24"/>
-          <w:szCs w:val="24"/>
-        </w:rPr>
-        <w:t xml:space="preserve"> gera um pequeno painel ativo rodando localmente na sua </w:t>
-      </w:r>
+          <w:color w:val="000000" w:themeColor="text1"/>
+          <w:sz w:val="24"/>
+          <w:szCs w:val="24"/>
+        </w:rPr>
+        <w:t xml:space="preserve">. </w:t>
+      </w:r>
+      <w:r>
+        <w:rPr>
+          <w:rFonts w:ascii="Calibri" w:hAnsi="Calibri" w:cs="Calibri"/>
+          <w:color w:val="000000" w:themeColor="text1"/>
+          <w:sz w:val="24"/>
+          <w:szCs w:val="24"/>
+        </w:rPr>
+        <w:t xml:space="preserve">Todas as skills do pacote </w:t>
+      </w:r>
+      <w:proofErr w:type="spellStart"/>
+      <w:r>
+        <w:rPr>
+          <w:rFonts w:ascii="Calibri" w:hAnsi="Calibri" w:cs="Calibri"/>
+          <w:color w:val="000000" w:themeColor="text1"/>
+          <w:sz w:val="24"/>
+          <w:szCs w:val="24"/>
+        </w:rPr>
+        <w:t>aft</w:t>
+      </w:r>
+      <w:proofErr w:type="spellEnd"/>
+      <w:r>
+        <w:rPr>
+          <w:rFonts w:ascii="Calibri" w:hAnsi="Calibri" w:cs="Calibri"/>
+          <w:color w:val="000000" w:themeColor="text1"/>
+          <w:sz w:val="24"/>
+          <w:szCs w:val="24"/>
+        </w:rPr>
+        <w:t>-toolkit começa com ‘</w:t>
+      </w:r>
+      <w:proofErr w:type="spellStart"/>
+      <w:r>
+        <w:rPr>
+          <w:rFonts w:ascii="Calibri" w:hAnsi="Calibri" w:cs="Calibri"/>
+          <w:color w:val="000000" w:themeColor="text1"/>
+          <w:sz w:val="24"/>
+          <w:szCs w:val="24"/>
+        </w:rPr>
+        <w:t>aft</w:t>
+      </w:r>
+      <w:proofErr w:type="spellEnd"/>
       <w:proofErr w:type="gramStart"/>
       <w:r>
         <w:rPr>
           <w:rFonts w:ascii="Calibri" w:hAnsi="Calibri" w:cs="Calibri"/>
-          <w:sz w:val="24"/>
-          <w:szCs w:val="24"/>
-        </w:rPr>
-        <w:t>maquina</w:t>
+          <w:color w:val="000000" w:themeColor="text1"/>
+          <w:sz w:val="24"/>
+          <w:szCs w:val="24"/>
+        </w:rPr>
+        <w:t>-‘</w:t>
       </w:r>
       <w:proofErr w:type="gramEnd"/>
       <w:r>
         <w:rPr>
           <w:rFonts w:ascii="Calibri" w:hAnsi="Calibri" w:cs="Calibri"/>
-          <w:sz w:val="24"/>
-          <w:szCs w:val="24"/>
-        </w:rPr>
-        <w:t xml:space="preserve"> num “</w:t>
+          <w:color w:val="000000" w:themeColor="text1"/>
+          <w:sz w:val="24"/>
+          <w:szCs w:val="24"/>
+        </w:rPr>
+        <w:t xml:space="preserve">, como exemplo a ‘aft-nr01’, que é “perita” em NR nas ementas de NR01. Você não precisa saber o nome de cada habilidade, elas são chamadas naturalmente numa conversa com a IA. No </w:t>
       </w:r>
       <w:proofErr w:type="spellStart"/>
-      <w:proofErr w:type="gramStart"/>
-      <w:r>
-        <w:rPr>
-          <w:rFonts w:ascii="Calibri" w:hAnsi="Calibri" w:cs="Calibri"/>
-          <w:sz w:val="24"/>
-          <w:szCs w:val="24"/>
-        </w:rPr>
-        <w:t>servidorzinho”que</w:t>
+      <w:r>
+        <w:rPr>
+          <w:rFonts w:ascii="Calibri" w:hAnsi="Calibri" w:cs="Calibri"/>
+          <w:color w:val="000000" w:themeColor="text1"/>
+          <w:sz w:val="24"/>
+          <w:szCs w:val="24"/>
+        </w:rPr>
+        <w:t>claude</w:t>
       </w:r>
       <w:proofErr w:type="spellEnd"/>
-      <w:proofErr w:type="gramEnd"/>
-      <w:r>
-        <w:rPr>
-          <w:rFonts w:ascii="Calibri" w:hAnsi="Calibri" w:cs="Calibri"/>
-          <w:sz w:val="24"/>
-          <w:szCs w:val="24"/>
-        </w:rPr>
-        <w:t xml:space="preserve"> consume menos de 10MB. Com ele você pode ter uma visão mais ampliada de todas suas fiscalizações em andamento, desde que elas estejam na pasta “Documentos &gt;&gt; AFT &gt;&gt; OS ATIVAS”. Pode ser uma mão na roda para quem trabalha em dupla e não gosta da poluição e bagunça do SFITWEB e DET e quer ter uma visão em cards de suas auditorias. </w:t>
-      </w:r>
-    </w:p>
-    <w:p>
-      <w:pPr>
-        <w:pStyle w:val="Ttulo2"/>
-        <w:rPr>
-          <w:rFonts w:ascii="Calibri" w:hAnsi="Calibri" w:cs="Calibri"/>
-          <w:color w:val="C55A11"/>
-          <w:sz w:val="24"/>
-          <w:szCs w:val="24"/>
-        </w:rPr>
-      </w:pPr>
-    </w:p>
-    <w:p>
-      <w:pPr>
-        <w:pStyle w:val="Ttulo2"/>
-        <w:rPr>
-          <w:rFonts w:ascii="Calibri" w:hAnsi="Calibri" w:cs="Calibri"/>
-          <w:color w:val="C55A11"/>
-          <w:sz w:val="24"/>
-          <w:szCs w:val="24"/>
-        </w:rPr>
-      </w:pPr>
+      <w:r>
+        <w:rPr>
+          <w:rFonts w:ascii="Calibri" w:hAnsi="Calibri" w:cs="Calibri"/>
+          <w:color w:val="000000" w:themeColor="text1"/>
+          <w:sz w:val="24"/>
+          <w:szCs w:val="24"/>
+        </w:rPr>
+        <w:t xml:space="preserve"> </w:t>
+      </w:r>
+      <w:proofErr w:type="spellStart"/>
+      <w:r>
+        <w:rPr>
+          <w:rFonts w:ascii="Calibri" w:hAnsi="Calibri" w:cs="Calibri"/>
+          <w:color w:val="000000" w:themeColor="text1"/>
+          <w:sz w:val="24"/>
+          <w:szCs w:val="24"/>
+        </w:rPr>
+        <w:t>code</w:t>
+      </w:r>
+      <w:proofErr w:type="spellEnd"/>
+      <w:r>
+        <w:rPr>
+          <w:rFonts w:ascii="Calibri" w:hAnsi="Calibri" w:cs="Calibri"/>
+          <w:color w:val="000000" w:themeColor="text1"/>
+          <w:sz w:val="24"/>
+          <w:szCs w:val="24"/>
+        </w:rPr>
+        <w:t xml:space="preserve">, uma habilidade é </w:t>
+      </w:r>
+      <w:proofErr w:type="spellStart"/>
+      <w:r>
+        <w:rPr>
+          <w:rFonts w:ascii="Calibri" w:hAnsi="Calibri" w:cs="Calibri"/>
+          <w:color w:val="000000" w:themeColor="text1"/>
+          <w:sz w:val="24"/>
+          <w:szCs w:val="24"/>
+        </w:rPr>
+        <w:t>prececida</w:t>
+      </w:r>
+      <w:proofErr w:type="spellEnd"/>
+      <w:r>
+        <w:rPr>
+          <w:rFonts w:ascii="Calibri" w:hAnsi="Calibri" w:cs="Calibri"/>
+          <w:color w:val="000000" w:themeColor="text1"/>
+          <w:sz w:val="24"/>
+          <w:szCs w:val="24"/>
+        </w:rPr>
+        <w:t xml:space="preserve"> do ‘/’, exemplo /</w:t>
+      </w:r>
+      <w:proofErr w:type="spellStart"/>
+      <w:r>
+        <w:rPr>
+          <w:rFonts w:ascii="Calibri" w:hAnsi="Calibri" w:cs="Calibri"/>
+          <w:color w:val="000000" w:themeColor="text1"/>
+          <w:sz w:val="24"/>
+          <w:szCs w:val="24"/>
+        </w:rPr>
+        <w:t>aft-inspecao-fisica</w:t>
+      </w:r>
+      <w:proofErr w:type="spellEnd"/>
+      <w:r>
+        <w:rPr>
+          <w:rFonts w:ascii="Calibri" w:hAnsi="Calibri" w:cs="Calibri"/>
+          <w:color w:val="000000" w:themeColor="text1"/>
+          <w:sz w:val="24"/>
+          <w:szCs w:val="24"/>
+        </w:rPr>
+        <w:t xml:space="preserve"> (para registrar achados da inspeção física).</w:t>
+      </w:r>
+      <w:r>
+        <w:rPr>
+          <w:rFonts w:ascii="Calibri" w:hAnsi="Calibri" w:cs="Calibri"/>
+          <w:color w:val="000000" w:themeColor="text1"/>
+          <w:sz w:val="24"/>
+          <w:szCs w:val="24"/>
+        </w:rPr>
+        <w:br/>
+      </w:r>
+      <w:r>
+        <w:rPr>
+          <w:rFonts w:ascii="Calibri" w:hAnsi="Calibri" w:cs="Calibri"/>
+          <w:color w:val="000000" w:themeColor="text1"/>
+          <w:sz w:val="24"/>
+          <w:szCs w:val="24"/>
+        </w:rPr>
+        <w:br/>
+      </w:r>
       <w:r>
         <w:rPr>
           <w:rFonts w:ascii="Calibri" w:hAnsi="Calibri" w:cs="Calibri"/>
           <w:noProof/>
-          <w:color w:val="C55A11"/>
+          <w:color w:val="000000" w:themeColor="text1"/>
           <w:sz w:val="24"/>
           <w:szCs w:val="24"/>
         </w:rPr>
         <w:drawing>
-          <wp:inline distT="0" distB="0" distL="0" distR="0" wp14:anchorId="36B5D1B9" wp14:editId="60031F31">
-            <wp:extent cx="6645910" cy="3750310"/>
-            <wp:effectExtent l="0" t="0" r="0" b="0"/>
-            <wp:docPr id="1887839236" name="Imagem 1" descr="Interface gráfica do usuário, Aplicativo&#10;&#10;O conteúdo gerado por IA pode estar incorreto."/>
+          <wp:inline distT="0" distB="0" distL="0" distR="0" wp14:anchorId="63FF6567" wp14:editId="2F4E42AD">
+            <wp:extent cx="6645910" cy="4189095"/>
+            <wp:effectExtent l="0" t="0" r="0" b="1905"/>
+            <wp:docPr id="2137990499" name="Imagem 4" descr="Texto&#10;&#10;O conteúdo gerado por IA pode estar incorreto."/>
             <wp:cNvGraphicFramePr>
               <a:graphicFrameLocks xmlns:a="http://schemas.openxmlformats.org/drawingml/2006/main" noChangeAspect="1"/>
             </wp:cNvGraphicFramePr>
@@ -10638,11 +10785,11 @@
               <a:graphicData uri="http://schemas.openxmlformats.org/drawingml/2006/picture">
                 <pic:pic xmlns:pic="http://schemas.openxmlformats.org/drawingml/2006/picture">
                   <pic:nvPicPr>
-                    <pic:cNvPr id="1887839236" name="Imagem 1" descr="Interface gráfica do usuário, Aplicativo&#10;&#10;O conteúdo gerado por IA pode estar incorreto."/>
+                    <pic:cNvPr id="2137990499" name="Imagem 4" descr="Texto&#10;&#10;O conteúdo gerado por IA pode estar incorreto."/>
                     <pic:cNvPicPr/>
                   </pic:nvPicPr>
                   <pic:blipFill>
-                    <a:blip r:embed="rId21" cstate="print">
+                    <a:blip r:embed="rId21">
                       <a:extLst>
                         <a:ext uri="{28A0092B-C50C-407E-A947-70E740481C1C}">
                           <a14:useLocalDpi xmlns:a14="http://schemas.microsoft.com/office/drawing/2010/main" val="0"/>
@@ -10656,7 +10803,7 @@
                   <pic:spPr>
                     <a:xfrm>
                       <a:off x="0" y="0"/>
-                      <a:ext cx="6645910" cy="3750310"/>
+                      <a:ext cx="6645910" cy="4189095"/>
                     </a:xfrm>
                     <a:prstGeom prst="rect">
                       <a:avLst/>
@@ -10668,22 +10815,10 @@
           </wp:inline>
         </w:drawing>
       </w:r>
-    </w:p>
-    <w:p>
-      <w:pPr>
-        <w:spacing w:after="120"/>
-        <w:jc w:val="both"/>
-        <w:rPr>
-          <w:rFonts w:ascii="Calibri" w:hAnsi="Calibri" w:cs="Calibri"/>
-          <w:sz w:val="24"/>
-          <w:szCs w:val="24"/>
-        </w:rPr>
-      </w:pPr>
-      <w:r>
-        <w:rPr>
-          <w:rFonts w:ascii="Calibri" w:hAnsi="Calibri" w:cs="Calibri"/>
-          <w:b/>
-          <w:bCs/>
+      <w:r>
+        <w:rPr>
+          <w:rFonts w:ascii="Calibri" w:hAnsi="Calibri" w:cs="Calibri"/>
+          <w:color w:val="000000" w:themeColor="text1"/>
           <w:sz w:val="24"/>
           <w:szCs w:val="24"/>
         </w:rPr>
@@ -10692,8 +10827,7 @@
       <w:r>
         <w:rPr>
           <w:rFonts w:ascii="Calibri" w:hAnsi="Calibri" w:cs="Calibri"/>
-          <w:b/>
-          <w:bCs/>
+          <w:color w:val="000000" w:themeColor="text1"/>
           <w:sz w:val="24"/>
           <w:szCs w:val="24"/>
         </w:rPr>
@@ -10702,27 +10836,7 @@
       <w:r>
         <w:rPr>
           <w:rFonts w:ascii="Calibri" w:hAnsi="Calibri" w:cs="Calibri"/>
-          <w:sz w:val="24"/>
-          <w:szCs w:val="24"/>
-        </w:rPr>
-        <w:t>Esse painel pode ser melhor ainda: desenvolvi uma extensão que funciona no Chrome e Edge que faz captura das informações do nosso DET, logado, e joga essas informações para a memória de cada fiscalização, refletindo nesse painel. Coisas como número da notificação, data de lavratura, ciência, entregas. É instalável em 15 segundos. Juro, 15 segundos.</w:t>
-      </w:r>
-    </w:p>
-    <w:p>
-      <w:pPr>
-        <w:spacing w:after="120"/>
-        <w:jc w:val="both"/>
-        <w:rPr>
-          <w:rFonts w:ascii="Calibri" w:hAnsi="Calibri" w:cs="Calibri"/>
-          <w:sz w:val="24"/>
-          <w:szCs w:val="24"/>
-        </w:rPr>
-      </w:pPr>
-      <w:r>
-        <w:rPr>
-          <w:rFonts w:ascii="Calibri" w:hAnsi="Calibri" w:cs="Calibri"/>
-          <w:b/>
-          <w:bCs/>
+          <w:color w:val="000000" w:themeColor="text1"/>
           <w:sz w:val="24"/>
           <w:szCs w:val="24"/>
         </w:rPr>
@@ -10731,288 +10845,348 @@
       <w:r>
         <w:rPr>
           <w:rFonts w:ascii="Calibri" w:hAnsi="Calibri" w:cs="Calibri"/>
-          <w:b/>
-          <w:bCs/>
-          <w:sz w:val="24"/>
-          <w:szCs w:val="24"/>
-        </w:rPr>
-        <w:t xml:space="preserve">O que é. </w:t>
-      </w:r>
-      <w:r>
-        <w:rPr>
-          <w:rFonts w:ascii="Calibri" w:hAnsi="Calibri" w:cs="Calibri"/>
-          <w:sz w:val="24"/>
-          <w:szCs w:val="24"/>
-        </w:rPr>
-        <w:t xml:space="preserve">A </w:t>
-      </w:r>
-      <w:r>
-        <w:rPr>
-          <w:rFonts w:ascii="Calibri" w:hAnsi="Calibri" w:cs="Calibri"/>
-          <w:b/>
-          <w:bCs/>
-          <w:sz w:val="24"/>
-          <w:szCs w:val="24"/>
-        </w:rPr>
-        <w:t>Sync DET</w:t>
-      </w:r>
-      <w:r>
-        <w:rPr>
-          <w:rFonts w:ascii="Calibri" w:hAnsi="Calibri" w:cs="Calibri"/>
-          <w:sz w:val="24"/>
-          <w:szCs w:val="24"/>
-        </w:rPr>
-        <w:t xml:space="preserve"> é uma extensão gratuita para o navegador (Chrome e Edge) que conversa com o painel do toolkit. Ela resolve uma das tarefas mais repetitivas da fiscalização: copiar, notificação por notificação, o código e o prazo de entrega do DET para a ficha de cada auditoria. Com ela, isso vira um clique: as notificações confirmadas caem direto na ficha (memory.md) da OS certa, e o painel passa a acompanhar os vencimentos sozinho.</w:t>
-      </w:r>
-    </w:p>
-    <w:p>
-      <w:pPr>
-        <w:spacing w:after="120"/>
-        <w:jc w:val="both"/>
-        <w:rPr>
-          <w:rFonts w:ascii="Calibri" w:hAnsi="Calibri" w:cs="Calibri"/>
-          <w:sz w:val="24"/>
-          <w:szCs w:val="24"/>
-        </w:rPr>
-      </w:pPr>
-      <w:r>
-        <w:rPr>
-          <w:rFonts w:ascii="Calibri" w:hAnsi="Calibri" w:cs="Calibri"/>
-          <w:b/>
-          <w:bCs/>
-          <w:sz w:val="24"/>
-          <w:szCs w:val="24"/>
-        </w:rPr>
-        <w:t xml:space="preserve">Antes de começar, um pré-requisito: </w:t>
-      </w:r>
-      <w:r>
-        <w:rPr>
-          <w:rFonts w:ascii="Calibri" w:hAnsi="Calibri" w:cs="Calibri"/>
-          <w:sz w:val="24"/>
-          <w:szCs w:val="24"/>
-        </w:rPr>
-        <w:t>o servidor do painel precisa estar ligado na sua máquina. Se você fez a instalação pelo /aft-setup, ele já fica sempre ligado (sobe sozinho quando você entra no Windows). Na dúvida, rode /aft-doctor — ele confere e explica como resolver.</w:t>
-      </w:r>
-    </w:p>
-    <w:p>
-      <w:pPr>
-        <w:spacing w:after="120"/>
-        <w:jc w:val="both"/>
-        <w:rPr>
-          <w:rFonts w:ascii="Calibri" w:hAnsi="Calibri" w:cs="Calibri"/>
-          <w:sz w:val="24"/>
-          <w:szCs w:val="24"/>
-        </w:rPr>
-      </w:pPr>
-      <w:r>
-        <w:rPr>
-          <w:rFonts w:ascii="Calibri" w:hAnsi="Calibri" w:cs="Calibri"/>
-          <w:b/>
-          <w:bCs/>
-          <w:sz w:val="24"/>
-          <w:szCs w:val="24"/>
-        </w:rPr>
-        <w:t>Instalando a extensão (uma vez só):</w:t>
-      </w:r>
-    </w:p>
-    <w:p>
-      <w:pPr>
-        <w:pStyle w:val="PargrafodaLista"/>
-        <w:numPr>
-          <w:ilvl w:val="0"/>
-          <w:numId w:val="2"/>
-        </w:numPr>
-        <w:spacing w:after="80"/>
-        <w:rPr>
-          <w:rFonts w:ascii="Calibri" w:hAnsi="Calibri" w:cs="Calibri"/>
-          <w:sz w:val="24"/>
-          <w:szCs w:val="24"/>
-        </w:rPr>
-      </w:pPr>
-      <w:r>
-        <w:rPr>
-          <w:rFonts w:ascii="Calibri" w:hAnsi="Calibri" w:cs="Calibri"/>
-          <w:sz w:val="24"/>
-          <w:szCs w:val="24"/>
+          <w:color w:val="000000" w:themeColor="text1"/>
+          <w:sz w:val="24"/>
+          <w:szCs w:val="24"/>
+        </w:rPr>
+        <w:br/>
+      </w:r>
+      <w:r>
+        <w:rPr>
+          <w:rFonts w:ascii="Calibri" w:hAnsi="Calibri" w:cs="Calibri"/>
+          <w:color w:val="000000" w:themeColor="text1"/>
+          <w:sz w:val="24"/>
+          <w:szCs w:val="24"/>
+        </w:rPr>
+        <w:br/>
+      </w:r>
+    </w:p>
+    <w:p>
+      <w:pPr>
+        <w:autoSpaceDE w:val="0"/>
+        <w:autoSpaceDN w:val="0"/>
+        <w:adjustRightInd w:val="0"/>
+        <w:rPr>
+          <w:rFonts w:ascii="AppleSystemUIFont" w:hAnsi="AppleSystemUIFont" w:cs="AppleSystemUIFont"/>
+          <w:sz w:val="26"/>
+          <w:szCs w:val="26"/>
+        </w:rPr>
+      </w:pPr>
+      <w:r>
+        <w:rPr>
+          <w:rFonts w:ascii="Calibri" w:hAnsi="Calibri" w:cs="Calibri"/>
+          <w:color w:val="000000" w:themeColor="text1"/>
+          <w:sz w:val="24"/>
+          <w:szCs w:val="24"/>
+        </w:rPr>
+        <w:t xml:space="preserve">Durante a instalação do </w:t>
+      </w:r>
+      <w:proofErr w:type="gramStart"/>
+      <w:r>
+        <w:rPr>
+          <w:rFonts w:ascii="Calibri" w:hAnsi="Calibri" w:cs="Calibri"/>
+          <w:color w:val="000000" w:themeColor="text1"/>
+          <w:sz w:val="24"/>
+          <w:szCs w:val="24"/>
+        </w:rPr>
+        <w:t xml:space="preserve">toolkit, </w:t>
+      </w:r>
+      <w:r>
+        <w:rPr>
+          <w:rFonts w:ascii="Calibri" w:hAnsi="Calibri" w:cs="Calibri"/>
+          <w:color w:val="000000" w:themeColor="text1"/>
+          <w:sz w:val="24"/>
+          <w:szCs w:val="24"/>
+        </w:rPr>
+        <w:t xml:space="preserve"> </w:t>
+      </w:r>
+      <w:r>
+        <w:rPr>
+          <w:rFonts w:ascii="Calibri" w:hAnsi="Calibri" w:cs="Calibri"/>
+          <w:color w:val="000000" w:themeColor="text1"/>
+          <w:sz w:val="24"/>
+          <w:szCs w:val="24"/>
+        </w:rPr>
+        <w:t>O</w:t>
+      </w:r>
+      <w:proofErr w:type="gramEnd"/>
+      <w:r>
+        <w:rPr>
+          <w:rFonts w:ascii="Calibri" w:hAnsi="Calibri" w:cs="Calibri"/>
+          <w:color w:val="000000" w:themeColor="text1"/>
+          <w:sz w:val="24"/>
+          <w:szCs w:val="24"/>
+        </w:rPr>
+        <w:t xml:space="preserve"> </w:t>
+      </w:r>
+      <w:proofErr w:type="spellStart"/>
+      <w:r>
+        <w:rPr>
+          <w:rFonts w:ascii="Calibri" w:hAnsi="Calibri" w:cs="Calibri"/>
+          <w:color w:val="000000" w:themeColor="text1"/>
+          <w:sz w:val="24"/>
+          <w:szCs w:val="24"/>
+        </w:rPr>
+        <w:t>claude</w:t>
+      </w:r>
+      <w:proofErr w:type="spellEnd"/>
+      <w:r>
+        <w:rPr>
+          <w:rFonts w:ascii="Calibri" w:hAnsi="Calibri" w:cs="Calibri"/>
+          <w:color w:val="000000" w:themeColor="text1"/>
+          <w:sz w:val="24"/>
+          <w:szCs w:val="24"/>
+        </w:rPr>
+        <w:t xml:space="preserve"> </w:t>
+      </w:r>
+      <w:proofErr w:type="spellStart"/>
+      <w:r>
+        <w:rPr>
+          <w:rFonts w:ascii="Calibri" w:hAnsi="Calibri" w:cs="Calibri"/>
+          <w:color w:val="000000" w:themeColor="text1"/>
+          <w:sz w:val="24"/>
+          <w:szCs w:val="24"/>
+        </w:rPr>
+        <w:t>code</w:t>
+      </w:r>
+      <w:proofErr w:type="spellEnd"/>
+      <w:r>
+        <w:rPr>
+          <w:rFonts w:ascii="Calibri" w:hAnsi="Calibri" w:cs="Calibri"/>
+          <w:color w:val="000000" w:themeColor="text1"/>
+          <w:sz w:val="24"/>
+          <w:szCs w:val="24"/>
+        </w:rPr>
+        <w:t xml:space="preserve"> vai criar uma pasta ‘AFT’ dentro da </w:t>
+      </w:r>
+      <w:proofErr w:type="gramStart"/>
+      <w:r>
+        <w:rPr>
+          <w:rFonts w:ascii="Calibri" w:hAnsi="Calibri" w:cs="Calibri"/>
+          <w:color w:val="000000" w:themeColor="text1"/>
+          <w:sz w:val="24"/>
+          <w:szCs w:val="24"/>
+        </w:rPr>
+        <w:t>pasta  ‘</w:t>
+      </w:r>
+      <w:proofErr w:type="gramEnd"/>
+      <w:r>
+        <w:rPr>
+          <w:rFonts w:ascii="Calibri" w:hAnsi="Calibri" w:cs="Calibri"/>
+          <w:color w:val="000000" w:themeColor="text1"/>
+          <w:sz w:val="24"/>
+          <w:szCs w:val="24"/>
+        </w:rPr>
+        <w:t xml:space="preserve">documentos’ da sua máquina. É lá onde a mágica vai acontecer. </w:t>
+      </w:r>
+      <w:r>
+        <w:rPr>
+          <w:rFonts w:ascii="AppleSystemUIFont" w:hAnsi="AppleSystemUIFont" w:cs="AppleSystemUIFont"/>
+          <w:sz w:val="26"/>
+          <w:szCs w:val="26"/>
+        </w:rPr>
+        <w:t xml:space="preserve">É importante que você saiba que toda a mágica que o </w:t>
+      </w:r>
+      <w:r>
+        <w:rPr>
+          <w:rFonts w:ascii="AppleSystemUIFont" w:hAnsi="AppleSystemUIFont" w:cs="AppleSystemUIFont"/>
+          <w:sz w:val="26"/>
+          <w:szCs w:val="26"/>
+        </w:rPr>
+        <w:t>Claude</w:t>
+      </w:r>
+      <w:r>
+        <w:rPr>
+          <w:rFonts w:ascii="AppleSystemUIFont" w:hAnsi="AppleSystemUIFont" w:cs="AppleSystemUIFont"/>
+          <w:sz w:val="26"/>
+          <w:szCs w:val="26"/>
+        </w:rPr>
+        <w:t xml:space="preserve"> vai fazer é dentro dessa pasta </w:t>
+      </w:r>
+      <w:r>
+        <w:rPr>
+          <w:rFonts w:ascii="AppleSystemUIFont" w:hAnsi="AppleSystemUIFont" w:cs="AppleSystemUIFont"/>
+          <w:sz w:val="26"/>
+          <w:szCs w:val="26"/>
+        </w:rPr>
+        <w:t xml:space="preserve">‘OS ATIVAS’. </w:t>
+      </w:r>
+      <w:r>
+        <w:rPr>
+          <w:rFonts w:ascii="AppleSystemUIFont" w:hAnsi="AppleSystemUIFont" w:cs="AppleSystemUIFont"/>
+          <w:sz w:val="26"/>
+          <w:szCs w:val="26"/>
+        </w:rPr>
+        <w:t xml:space="preserve"> </w:t>
+      </w:r>
+      <w:r>
+        <w:rPr>
+          <w:rFonts w:ascii="AppleSystemUIFont" w:hAnsi="AppleSystemUIFont" w:cs="AppleSystemUIFont"/>
+          <w:sz w:val="26"/>
+          <w:szCs w:val="26"/>
+        </w:rPr>
+        <w:t>Tudo</w:t>
+      </w:r>
+      <w:r>
+        <w:rPr>
+          <w:rFonts w:ascii="AppleSystemUIFont" w:hAnsi="AppleSystemUIFont" w:cs="AppleSystemUIFont"/>
+          <w:sz w:val="26"/>
+          <w:szCs w:val="26"/>
+        </w:rPr>
+        <w:t xml:space="preserve"> que o </w:t>
+      </w:r>
+      <w:r>
+        <w:rPr>
+          <w:rFonts w:ascii="AppleSystemUIFont" w:hAnsi="AppleSystemUIFont" w:cs="AppleSystemUIFont"/>
+          <w:sz w:val="26"/>
+          <w:szCs w:val="26"/>
+        </w:rPr>
+        <w:t xml:space="preserve">Claude </w:t>
+      </w:r>
+      <w:proofErr w:type="spellStart"/>
+      <w:r>
+        <w:rPr>
+          <w:rFonts w:ascii="AppleSystemUIFont" w:hAnsi="AppleSystemUIFont" w:cs="AppleSystemUIFont"/>
+          <w:sz w:val="26"/>
+          <w:szCs w:val="26"/>
+        </w:rPr>
+        <w:t>Code</w:t>
+      </w:r>
+      <w:proofErr w:type="spellEnd"/>
+      <w:r>
+        <w:rPr>
+          <w:rFonts w:ascii="AppleSystemUIFont" w:hAnsi="AppleSystemUIFont" w:cs="AppleSystemUIFont"/>
+          <w:sz w:val="26"/>
+          <w:szCs w:val="26"/>
+        </w:rPr>
+        <w:t xml:space="preserve"> </w:t>
+      </w:r>
+      <w:proofErr w:type="gramStart"/>
+      <w:r>
+        <w:rPr>
+          <w:rFonts w:ascii="AppleSystemUIFont" w:hAnsi="AppleSystemUIFont" w:cs="AppleSystemUIFont"/>
+          <w:sz w:val="26"/>
+          <w:szCs w:val="26"/>
+        </w:rPr>
+        <w:t xml:space="preserve">vai </w:t>
+      </w:r>
+      <w:r>
+        <w:rPr>
+          <w:rFonts w:ascii="AppleSystemUIFont" w:hAnsi="AppleSystemUIFont" w:cs="AppleSystemUIFont"/>
+          <w:sz w:val="26"/>
+          <w:szCs w:val="26"/>
+        </w:rPr>
+        <w:t xml:space="preserve"> produzir</w:t>
+      </w:r>
+      <w:proofErr w:type="gramEnd"/>
+      <w:r>
+        <w:rPr>
+          <w:rFonts w:ascii="AppleSystemUIFont" w:hAnsi="AppleSystemUIFont" w:cs="AppleSystemUIFont"/>
+          <w:sz w:val="26"/>
+          <w:szCs w:val="26"/>
+        </w:rPr>
+        <w:t xml:space="preserve"> vai ser colocado </w:t>
+      </w:r>
+      <w:r>
+        <w:rPr>
+          <w:rFonts w:ascii="AppleSystemUIFont" w:hAnsi="AppleSystemUIFont" w:cs="AppleSystemUIFont"/>
+          <w:sz w:val="26"/>
+          <w:szCs w:val="26"/>
+        </w:rPr>
+        <w:t xml:space="preserve">ali, </w:t>
+      </w:r>
+      <w:proofErr w:type="gramStart"/>
+      <w:r>
+        <w:rPr>
+          <w:rFonts w:ascii="AppleSystemUIFont" w:hAnsi="AppleSystemUIFont" w:cs="AppleSystemUIFont"/>
+          <w:sz w:val="26"/>
+          <w:szCs w:val="26"/>
+        </w:rPr>
+        <w:t xml:space="preserve">portanto </w:t>
+      </w:r>
+      <w:r>
+        <w:rPr>
+          <w:rFonts w:ascii="AppleSystemUIFont" w:hAnsi="AppleSystemUIFont" w:cs="AppleSystemUIFont"/>
+          <w:sz w:val="26"/>
+          <w:szCs w:val="26"/>
+        </w:rPr>
+        <w:t xml:space="preserve"> é</w:t>
+      </w:r>
+      <w:proofErr w:type="gramEnd"/>
+      <w:r>
+        <w:rPr>
+          <w:rFonts w:ascii="AppleSystemUIFont" w:hAnsi="AppleSystemUIFont" w:cs="AppleSystemUIFont"/>
+          <w:sz w:val="26"/>
+          <w:szCs w:val="26"/>
+        </w:rPr>
+        <w:t xml:space="preserve"> muito importante que você transfira todas as pastas das suas </w:t>
+      </w:r>
+      <w:r>
+        <w:rPr>
+          <w:rFonts w:ascii="AppleSystemUIFont" w:hAnsi="AppleSystemUIFont" w:cs="AppleSystemUIFont"/>
+          <w:sz w:val="26"/>
+          <w:szCs w:val="26"/>
+        </w:rPr>
+        <w:t>fiscalizações</w:t>
+      </w:r>
+      <w:r>
+        <w:rPr>
+          <w:rFonts w:ascii="AppleSystemUIFont" w:hAnsi="AppleSystemUIFont" w:cs="AppleSystemUIFont"/>
+          <w:sz w:val="26"/>
+          <w:szCs w:val="26"/>
+        </w:rPr>
+        <w:t>, uma pasta para cada empresa, para dentro dessa pasta OS Ativas</w:t>
+      </w:r>
+      <w:r>
+        <w:rPr>
+          <w:rFonts w:ascii="AppleSystemUIFont" w:hAnsi="AppleSystemUIFont" w:cs="AppleSystemUIFont"/>
+          <w:sz w:val="26"/>
+          <w:szCs w:val="26"/>
+        </w:rPr>
+        <w:t>.</w:t>
+      </w:r>
+    </w:p>
+    <w:p>
+      <w:pPr>
+        <w:autoSpaceDE w:val="0"/>
+        <w:autoSpaceDN w:val="0"/>
+        <w:adjustRightInd w:val="0"/>
+        <w:jc w:val="center"/>
+        <w:rPr>
+          <w:rFonts w:ascii="AppleSystemUIFont" w:hAnsi="AppleSystemUIFont" w:cs="AppleSystemUIFont"/>
+          <w:sz w:val="26"/>
+          <w:szCs w:val="26"/>
+        </w:rPr>
+      </w:pPr>
+      <w:r>
+        <w:rPr>
+          <w:rFonts w:ascii="AppleSystemUIFont" w:hAnsi="AppleSystemUIFont" w:cs="AppleSystemUIFont"/>
+          <w:sz w:val="26"/>
+          <w:szCs w:val="26"/>
         </w:rPr>
         <w:lastRenderedPageBreak/>
-        <w:t xml:space="preserve">Abra a página da extensão na loja do Chrome — </w:t>
-      </w:r>
-      <w:hyperlink r:id="rId22" w:history="1">
-        <w:r>
-          <w:rPr>
-            <w:rStyle w:val="Hyperlink"/>
-            <w:rFonts w:ascii="Calibri" w:hAnsi="Calibri" w:cs="Calibri"/>
-            <w:sz w:val="24"/>
-            <w:szCs w:val="24"/>
-          </w:rPr>
-          <w:t>Sync DET — SisOS / AFT Toolkit</w:t>
-        </w:r>
-      </w:hyperlink>
-      <w:r>
-        <w:rPr>
-          <w:rFonts w:ascii="Calibri" w:hAnsi="Calibri" w:cs="Calibri"/>
-          <w:sz w:val="24"/>
-          <w:szCs w:val="24"/>
-        </w:rPr>
-        <w:t xml:space="preserve"> — e clique em </w:t>
-      </w:r>
-      <w:r>
-        <w:rPr>
-          <w:rFonts w:ascii="Calibri" w:hAnsi="Calibri" w:cs="Calibri"/>
-          <w:b/>
-          <w:bCs/>
-          <w:sz w:val="24"/>
-          <w:szCs w:val="24"/>
-        </w:rPr>
-        <w:t>Usar no Chrome</w:t>
-      </w:r>
-      <w:r>
-        <w:rPr>
-          <w:rFonts w:ascii="Calibri" w:hAnsi="Calibri" w:cs="Calibri"/>
-          <w:sz w:val="24"/>
-          <w:szCs w:val="24"/>
-        </w:rPr>
-        <w:t>. No Microsoft Edge o caminho é o mesmo: a loja pede só uma confirmação a mais (“Permitir extensões de outras lojas”) e o botão vira “Instalar”.</w:t>
-      </w:r>
-    </w:p>
-    <w:p>
-      <w:pPr>
-        <w:pStyle w:val="PargrafodaLista"/>
-        <w:numPr>
-          <w:ilvl w:val="0"/>
-          <w:numId w:val="2"/>
-        </w:numPr>
-        <w:spacing w:after="80"/>
-        <w:rPr>
-          <w:rFonts w:ascii="Calibri" w:hAnsi="Calibri" w:cs="Calibri"/>
-          <w:sz w:val="24"/>
-          <w:szCs w:val="24"/>
-        </w:rPr>
-      </w:pPr>
-      <w:r>
-        <w:rPr>
-          <w:rFonts w:ascii="Calibri" w:hAnsi="Calibri" w:cs="Calibri"/>
-          <w:sz w:val="24"/>
-          <w:szCs w:val="24"/>
-        </w:rPr>
-        <w:t>Fixe a extensão na barra do navegador: clique no ícone de quebra-cabeça (🧩) e depois no alfinete ao lado de “Sync DET”. Assim ela fica sempre à vista.</w:t>
-      </w:r>
-    </w:p>
-    <w:p>
-      <w:pPr>
-        <w:pStyle w:val="PargrafodaLista"/>
-        <w:numPr>
-          <w:ilvl w:val="0"/>
-          <w:numId w:val="2"/>
-        </w:numPr>
-        <w:spacing w:after="80"/>
-        <w:rPr>
-          <w:rFonts w:ascii="Calibri" w:hAnsi="Calibri" w:cs="Calibri"/>
-          <w:sz w:val="24"/>
-          <w:szCs w:val="24"/>
-        </w:rPr>
-      </w:pPr>
-      <w:r>
-        <w:rPr>
-          <w:rFonts w:ascii="Calibri" w:hAnsi="Calibri" w:cs="Calibri"/>
-          <w:sz w:val="24"/>
-          <w:szCs w:val="24"/>
-        </w:rPr>
-        <w:t xml:space="preserve">Clique no ícone da extensão. Na primeira abertura aparece a tela de configuração: marque a caixa </w:t>
-      </w:r>
-      <w:r>
-        <w:rPr>
-          <w:rFonts w:ascii="Calibri" w:hAnsi="Calibri" w:cs="Calibri"/>
-          <w:b/>
-          <w:bCs/>
-          <w:sz w:val="24"/>
-          <w:szCs w:val="24"/>
-        </w:rPr>
-        <w:t>PAINEL LOCAL (AFT TOOLKIT)</w:t>
-      </w:r>
-      <w:r>
-        <w:rPr>
-          <w:rFonts w:ascii="Calibri" w:hAnsi="Calibri" w:cs="Calibri"/>
-          <w:sz w:val="24"/>
-          <w:szCs w:val="24"/>
-        </w:rPr>
-        <w:t xml:space="preserve"> e clique em </w:t>
-      </w:r>
-      <w:r>
-        <w:rPr>
-          <w:rFonts w:ascii="Calibri" w:hAnsi="Calibri" w:cs="Calibri"/>
-          <w:b/>
-          <w:bCs/>
-          <w:sz w:val="24"/>
-          <w:szCs w:val="24"/>
-        </w:rPr>
-        <w:t>Salvar</w:t>
-      </w:r>
-      <w:r>
-        <w:rPr>
-          <w:rFonts w:ascii="Calibri" w:hAnsi="Calibri" w:cs="Calibri"/>
-          <w:sz w:val="24"/>
-          <w:szCs w:val="24"/>
-        </w:rPr>
-        <w:t>. Pronto — é a única configuração necessária.</w:t>
-      </w:r>
-    </w:p>
-    <w:p>
-      <w:pPr>
-        <w:pStyle w:val="PargrafodaLista"/>
-        <w:numPr>
-          <w:ilvl w:val="0"/>
-          <w:numId w:val="2"/>
-        </w:numPr>
-        <w:spacing w:after="80"/>
-        <w:rPr>
-          <w:rFonts w:ascii="Calibri" w:hAnsi="Calibri" w:cs="Calibri"/>
-          <w:sz w:val="24"/>
-          <w:szCs w:val="24"/>
-        </w:rPr>
-      </w:pPr>
-      <w:r>
-        <w:rPr>
-          <w:rFonts w:ascii="Calibri" w:hAnsi="Calibri" w:cs="Calibri"/>
-          <w:sz w:val="24"/>
-          <w:szCs w:val="24"/>
-        </w:rPr>
-        <w:t>Os campos “URL do SisOS” e “Token de acesso” podem ficar em branco: eles pertencem a outro modo de uso (o SisOS, um sistema na nuvem) e não são necessários com o painel local. O endereço http://127.0.0.1:8347 que aparece no campo do painel já é o padrão — não precisa mexer.</w:t>
-      </w:r>
-    </w:p>
-    <w:p>
-      <w:pPr>
-        <w:spacing w:after="80"/>
-        <w:rPr>
-          <w:rFonts w:ascii="Calibri" w:hAnsi="Calibri" w:cs="Calibri"/>
-          <w:sz w:val="24"/>
-          <w:szCs w:val="24"/>
-        </w:rPr>
-      </w:pPr>
-    </w:p>
-    <w:p>
-      <w:pPr>
-        <w:spacing w:after="80"/>
-        <w:jc w:val="center"/>
-        <w:rPr>
-          <w:rFonts w:ascii="Calibri" w:hAnsi="Calibri" w:cs="Calibri"/>
-          <w:sz w:val="24"/>
-          <w:szCs w:val="24"/>
-        </w:rPr>
-      </w:pPr>
-      <w:r>
-        <w:rPr>
-          <w:rFonts w:ascii="Calibri" w:hAnsi="Calibri" w:cs="Calibri"/>
+        <w:br/>
+      </w:r>
+      <w:r>
+        <w:rPr>
+          <w:rFonts w:ascii="AppleSystemUIFont" w:hAnsi="AppleSystemUIFont" w:cs="AppleSystemUIFont"/>
+          <w:sz w:val="26"/>
+          <w:szCs w:val="26"/>
+        </w:rPr>
+        <w:br/>
+      </w:r>
+      <w:r>
+        <w:rPr>
+          <w:rFonts w:ascii="AppleSystemUIFont" w:hAnsi="AppleSystemUIFont" w:cs="AppleSystemUIFont"/>
           <w:noProof/>
-          <w:sz w:val="24"/>
-          <w:szCs w:val="24"/>
+          <w:sz w:val="26"/>
+          <w:szCs w:val="26"/>
         </w:rPr>
         <w:drawing>
-          <wp:inline distT="0" distB="0" distL="0" distR="0" wp14:anchorId="40301E1A" wp14:editId="5D5F9609">
-            <wp:extent cx="3217333" cy="4739975"/>
+          <wp:inline distT="0" distB="0" distL="0" distR="0" wp14:anchorId="33B8529A" wp14:editId="0F0D2086">
+            <wp:extent cx="4318000" cy="3517900"/>
             <wp:effectExtent l="0" t="0" r="0" b="0"/>
-            <wp:docPr id="1593862050" name="Imagem 1" descr="Interface gráfica do usuário, Texto, Aplicativo, Email&#10;&#10;O conteúdo gerado por IA pode estar incorreto."/>
+            <wp:docPr id="1336341326" name="Imagem 1" descr="Texto, Tabela&#10;&#10;O conteúdo gerado por IA pode estar incorreto."/>
             <wp:cNvGraphicFramePr>
               <a:graphicFrameLocks xmlns:a="http://schemas.openxmlformats.org/drawingml/2006/main" noChangeAspect="1"/>
             </wp:cNvGraphicFramePr>
@@ -11020,11 +11194,11 @@
               <a:graphicData uri="http://schemas.openxmlformats.org/drawingml/2006/picture">
                 <pic:pic xmlns:pic="http://schemas.openxmlformats.org/drawingml/2006/picture">
                   <pic:nvPicPr>
-                    <pic:cNvPr id="1593862050" name="Imagem 1" descr="Interface gráfica do usuário, Texto, Aplicativo, Email&#10;&#10;O conteúdo gerado por IA pode estar incorreto."/>
+                    <pic:cNvPr id="1336341326" name="Imagem 1" descr="Texto, Tabela&#10;&#10;O conteúdo gerado por IA pode estar incorreto."/>
                     <pic:cNvPicPr/>
                   </pic:nvPicPr>
                   <pic:blipFill>
-                    <a:blip r:embed="rId23">
+                    <a:blip r:embed="rId22">
                       <a:extLst>
                         <a:ext uri="{28A0092B-C50C-407E-A947-70E740481C1C}">
                           <a14:useLocalDpi xmlns:a14="http://schemas.microsoft.com/office/drawing/2010/main" val="0"/>
@@ -11038,7 +11212,7 @@
                   <pic:spPr>
                     <a:xfrm>
                       <a:off x="0" y="0"/>
-                      <a:ext cx="3231965" cy="4761532"/>
+                      <a:ext cx="4318000" cy="3517900"/>
                     </a:xfrm>
                     <a:prstGeom prst="rect">
                       <a:avLst/>
@@ -11053,152 +11227,128 @@
     </w:p>
     <w:p>
       <w:pPr>
-        <w:spacing w:after="120"/>
-        <w:rPr>
-          <w:rFonts w:ascii="Calibri" w:hAnsi="Calibri" w:cs="Calibri"/>
-          <w:sz w:val="24"/>
-          <w:szCs w:val="24"/>
-        </w:rPr>
-      </w:pPr>
-    </w:p>
-    <w:p>
-      <w:pPr>
-        <w:spacing w:after="120"/>
+        <w:autoSpaceDE w:val="0"/>
+        <w:autoSpaceDN w:val="0"/>
+        <w:adjustRightInd w:val="0"/>
         <w:jc w:val="both"/>
         <w:rPr>
-          <w:rFonts w:ascii="Calibri" w:hAnsi="Calibri" w:cs="Calibri"/>
-          <w:sz w:val="24"/>
-          <w:szCs w:val="24"/>
-        </w:rPr>
-      </w:pPr>
-      <w:r>
-        <w:rPr>
-          <w:rFonts w:ascii="Calibri" w:hAnsi="Calibri" w:cs="Calibri"/>
-          <w:b/>
-          <w:bCs/>
-          <w:sz w:val="24"/>
-          <w:szCs w:val="24"/>
-        </w:rPr>
-        <w:t>Usando no dia a dia:</w:t>
-      </w:r>
-    </w:p>
-    <w:p>
-      <w:pPr>
-        <w:pStyle w:val="PargrafodaLista"/>
-        <w:numPr>
-          <w:ilvl w:val="0"/>
-          <w:numId w:val="2"/>
-        </w:numPr>
-        <w:spacing w:after="80"/>
-        <w:rPr>
-          <w:rFonts w:ascii="Calibri" w:hAnsi="Calibri" w:cs="Calibri"/>
-          <w:sz w:val="24"/>
-          <w:szCs w:val="24"/>
-        </w:rPr>
-      </w:pPr>
-      <w:r>
-        <w:rPr>
-          <w:rFonts w:ascii="Calibri" w:hAnsi="Calibri" w:cs="Calibri"/>
-          <w:b/>
-          <w:bCs/>
-          <w:sz w:val="24"/>
-          <w:szCs w:val="24"/>
-        </w:rPr>
-        <w:t>Entre no DET normalmente</w:t>
-      </w:r>
-      <w:r>
-        <w:rPr>
-          <w:rFonts w:ascii="Calibri" w:hAnsi="Calibri" w:cs="Calibri"/>
-          <w:sz w:val="24"/>
-          <w:szCs w:val="24"/>
-        </w:rPr>
-        <w:t xml:space="preserve"> (auditor-det.sit.trabalho.gov.br), com o seu login gov.br. Só de você navegar logado, a extensão captura sozinha a chave de sessão que o próprio site já usa — pense nela como o crachá que o DET te entrega na entrada. Você não copia, não cola e não digita senha nenhuma na extensão.</w:t>
-      </w:r>
-    </w:p>
-    <w:p>
-      <w:pPr>
-        <w:pStyle w:val="PargrafodaLista"/>
-        <w:numPr>
-          <w:ilvl w:val="0"/>
-          <w:numId w:val="2"/>
-        </w:numPr>
-        <w:spacing w:after="80"/>
-        <w:rPr>
-          <w:rFonts w:ascii="Calibri" w:hAnsi="Calibri" w:cs="Calibri"/>
-          <w:sz w:val="24"/>
-          <w:szCs w:val="24"/>
-        </w:rPr>
-      </w:pPr>
-      <w:r>
-        <w:rPr>
-          <w:rFonts w:ascii="Calibri" w:hAnsi="Calibri" w:cs="Calibri"/>
-          <w:b/>
-          <w:bCs/>
-          <w:sz w:val="24"/>
-          <w:szCs w:val="24"/>
-        </w:rPr>
-        <w:t>Clique no botão flutuante Sincronizar</w:t>
-      </w:r>
-      <w:r>
-        <w:rPr>
-          <w:rFonts w:ascii="Calibri" w:hAnsi="Calibri" w:cs="Calibri"/>
-          <w:b/>
-          <w:bCs/>
-          <w:sz w:val="24"/>
-          <w:szCs w:val="24"/>
-        </w:rPr>
-        <w:t xml:space="preserve">, </w:t>
-      </w:r>
-      <w:r>
-        <w:rPr>
-          <w:rFonts w:ascii="Calibri" w:hAnsi="Calibri" w:cs="Calibri"/>
-          <w:sz w:val="24"/>
-          <w:szCs w:val="24"/>
-        </w:rPr>
-        <w:t>no final da página, no canto direito da sua tela,</w:t>
-      </w:r>
-      <w:r>
-        <w:rPr>
-          <w:rFonts w:ascii="Calibri" w:hAnsi="Calibri" w:cs="Calibri"/>
-          <w:sz w:val="24"/>
-          <w:szCs w:val="24"/>
-        </w:rPr>
-        <w:t xml:space="preserve"> que a extensão acrescenta no canto da página do DET. É ele que dispara a mágica.</w:t>
-      </w:r>
-    </w:p>
-    <w:p>
-      <w:pPr>
-        <w:spacing w:after="80"/>
-        <w:rPr>
-          <w:rFonts w:ascii="Calibri" w:hAnsi="Calibri" w:cs="Calibri"/>
-          <w:sz w:val="24"/>
-          <w:szCs w:val="24"/>
-        </w:rPr>
-      </w:pPr>
-    </w:p>
-    <w:p>
-      <w:pPr>
-        <w:spacing w:after="80"/>
+          <w:rFonts w:ascii="AppleSystemUIFont" w:hAnsi="AppleSystemUIFont" w:cs="AppleSystemUIFont"/>
+          <w:sz w:val="26"/>
+          <w:szCs w:val="26"/>
+        </w:rPr>
+      </w:pPr>
+      <w:r>
+        <w:rPr>
+          <w:rFonts w:ascii="AppleSystemUIFont" w:hAnsi="AppleSystemUIFont" w:cs="AppleSystemUIFont"/>
+          <w:sz w:val="26"/>
+          <w:szCs w:val="26"/>
+        </w:rPr>
+        <w:br/>
+      </w:r>
+      <w:r>
+        <w:rPr>
+          <w:rFonts w:ascii="AppleSystemUIFont" w:hAnsi="AppleSystemUIFont" w:cs="AppleSystemUIFont"/>
+          <w:sz w:val="26"/>
+          <w:szCs w:val="26"/>
+        </w:rPr>
+        <w:br/>
+      </w:r>
+      <w:r>
+        <w:rPr>
+          <w:rFonts w:ascii="AppleSystemUIFont" w:hAnsi="AppleSystemUIFont" w:cs="AppleSystemUIFont"/>
+          <w:sz w:val="26"/>
+          <w:szCs w:val="26"/>
+        </w:rPr>
+        <w:t xml:space="preserve"> Após mover as pastas, peça para o </w:t>
+      </w:r>
+      <w:proofErr w:type="gramStart"/>
+      <w:r>
+        <w:rPr>
+          <w:rFonts w:ascii="AppleSystemUIFont" w:hAnsi="AppleSystemUIFont" w:cs="AppleSystemUIFont"/>
+          <w:sz w:val="26"/>
+          <w:szCs w:val="26"/>
+        </w:rPr>
+        <w:t xml:space="preserve">Claude </w:t>
+      </w:r>
+      <w:r>
+        <w:rPr>
+          <w:rFonts w:ascii="AppleSystemUIFont" w:hAnsi="AppleSystemUIFont" w:cs="AppleSystemUIFont"/>
+          <w:sz w:val="26"/>
+          <w:szCs w:val="26"/>
+        </w:rPr>
+        <w:t xml:space="preserve"> organizar</w:t>
+      </w:r>
+      <w:proofErr w:type="gramEnd"/>
+      <w:r>
+        <w:rPr>
+          <w:rFonts w:ascii="AppleSystemUIFont" w:hAnsi="AppleSystemUIFont" w:cs="AppleSystemUIFont"/>
+          <w:sz w:val="26"/>
+          <w:szCs w:val="26"/>
+        </w:rPr>
+        <w:t xml:space="preserve"> essa pasta OS ativas, com linguagem natural ou com o comando ‘/</w:t>
+      </w:r>
+      <w:proofErr w:type="spellStart"/>
+      <w:r>
+        <w:rPr>
+          <w:rFonts w:ascii="AppleSystemUIFont" w:hAnsi="AppleSystemUIFont" w:cs="AppleSystemUIFont"/>
+          <w:sz w:val="26"/>
+          <w:szCs w:val="26"/>
+        </w:rPr>
+        <w:t>aft-organiza-os</w:t>
+      </w:r>
+      <w:proofErr w:type="spellEnd"/>
+      <w:proofErr w:type="gramStart"/>
+      <w:r>
+        <w:rPr>
+          <w:rFonts w:ascii="AppleSystemUIFont" w:hAnsi="AppleSystemUIFont" w:cs="AppleSystemUIFont"/>
+          <w:sz w:val="26"/>
+          <w:szCs w:val="26"/>
+        </w:rPr>
+        <w:t>’ .</w:t>
+      </w:r>
+      <w:proofErr w:type="gramEnd"/>
+      <w:r>
+        <w:rPr>
+          <w:rFonts w:ascii="AppleSystemUIFont" w:hAnsi="AppleSystemUIFont" w:cs="AppleSystemUIFont"/>
+          <w:sz w:val="26"/>
+          <w:szCs w:val="26"/>
+        </w:rPr>
+        <w:t xml:space="preserve"> </w:t>
+      </w:r>
+    </w:p>
+    <w:p>
+      <w:pPr>
+        <w:autoSpaceDE w:val="0"/>
+        <w:autoSpaceDN w:val="0"/>
+        <w:adjustRightInd w:val="0"/>
         <w:jc w:val="center"/>
         <w:rPr>
-          <w:rFonts w:ascii="Calibri" w:hAnsi="Calibri" w:cs="Calibri"/>
-          <w:sz w:val="24"/>
-          <w:szCs w:val="24"/>
-        </w:rPr>
-      </w:pPr>
+          <w:rFonts w:ascii="AppleSystemUIFont" w:hAnsi="AppleSystemUIFont" w:cs="AppleSystemUIFont"/>
+          <w:sz w:val="26"/>
+          <w:szCs w:val="26"/>
+        </w:rPr>
+      </w:pPr>
+      <w:r>
+        <w:rPr>
+          <w:rFonts w:ascii="AppleSystemUIFont" w:hAnsi="AppleSystemUIFont" w:cs="AppleSystemUIFont"/>
+          <w:sz w:val="26"/>
+          <w:szCs w:val="26"/>
+        </w:rPr>
+        <w:br/>
+      </w:r>
       <w:r>
         <w:rPr>
           <w:rFonts w:ascii="Calibri" w:hAnsi="Calibri" w:cs="Calibri"/>
           <w:noProof/>
-          <w:sz w:val="24"/>
-          <w:szCs w:val="24"/>
-        </w:rPr>
-        <w:lastRenderedPageBreak/>
+          <w:color w:val="000000" w:themeColor="text1"/>
+          <w:sz w:val="24"/>
+          <w:szCs w:val="24"/>
+        </w:rPr>
         <w:drawing>
-          <wp:inline distT="0" distB="0" distL="0" distR="0" wp14:anchorId="38B8496B" wp14:editId="38C45BD0">
-            <wp:extent cx="3707553" cy="2077307"/>
-            <wp:effectExtent l="0" t="0" r="1270" b="5715"/>
-            <wp:docPr id="248311817" name="Imagem 3" descr="Interface gráfica do usuário, Texto, Aplicativo&#10;&#10;O conteúdo gerado por IA pode estar incorreto."/>
+          <wp:inline distT="0" distB="0" distL="0" distR="0" wp14:anchorId="78E36F66" wp14:editId="0FA56D43">
+            <wp:extent cx="6645910" cy="3727450"/>
+            <wp:effectExtent l="0" t="0" r="0" b="6350"/>
+            <wp:docPr id="97681221" name="Imagem 3" descr="Interface gráfica do usuário, Texto, Aplicativo&#10;&#10;O conteúdo gerado por IA pode estar incorreto."/>
             <wp:cNvGraphicFramePr>
               <a:graphicFrameLocks xmlns:a="http://schemas.openxmlformats.org/drawingml/2006/main" noChangeAspect="1"/>
             </wp:cNvGraphicFramePr>
@@ -11206,11 +11356,11 @@
               <a:graphicData uri="http://schemas.openxmlformats.org/drawingml/2006/picture">
                 <pic:pic xmlns:pic="http://schemas.openxmlformats.org/drawingml/2006/picture">
                   <pic:nvPicPr>
-                    <pic:cNvPr id="248311817" name="Imagem 3" descr="Interface gráfica do usuário, Texto, Aplicativo&#10;&#10;O conteúdo gerado por IA pode estar incorreto."/>
+                    <pic:cNvPr id="97681221" name="Imagem 3" descr="Interface gráfica do usuário, Texto, Aplicativo&#10;&#10;O conteúdo gerado por IA pode estar incorreto."/>
                     <pic:cNvPicPr/>
                   </pic:nvPicPr>
                   <pic:blipFill>
-                    <a:blip r:embed="rId24" cstate="print">
+                    <a:blip r:embed="rId23" cstate="print">
                       <a:extLst>
                         <a:ext uri="{28A0092B-C50C-407E-A947-70E740481C1C}">
                           <a14:useLocalDpi xmlns:a14="http://schemas.microsoft.com/office/drawing/2010/main" val="0"/>
@@ -11224,7 +11374,7 @@
                   <pic:spPr>
                     <a:xfrm>
                       <a:off x="0" y="0"/>
-                      <a:ext cx="3738419" cy="2094601"/>
+                      <a:ext cx="6645910" cy="3727450"/>
                     </a:xfrm>
                     <a:prstGeom prst="rect">
                       <a:avLst/>
@@ -11236,259 +11386,195 @@
           </wp:inline>
         </w:drawing>
       </w:r>
-    </w:p>
-    <w:p>
-      <w:pPr>
-        <w:spacing w:after="80"/>
-        <w:rPr>
-          <w:rFonts w:ascii="Calibri" w:hAnsi="Calibri" w:cs="Calibri"/>
-          <w:sz w:val="24"/>
-          <w:szCs w:val="24"/>
-        </w:rPr>
-      </w:pPr>
-    </w:p>
-    <w:p>
-      <w:pPr>
-        <w:pStyle w:val="PargrafodaLista"/>
-        <w:numPr>
-          <w:ilvl w:val="0"/>
-          <w:numId w:val="2"/>
-        </w:numPr>
-        <w:spacing w:after="80"/>
-        <w:rPr>
-          <w:rFonts w:ascii="Calibri" w:hAnsi="Calibri" w:cs="Calibri"/>
-          <w:sz w:val="24"/>
-          <w:szCs w:val="24"/>
-        </w:rPr>
-      </w:pPr>
-      <w:r>
-        <w:rPr>
-          <w:rFonts w:ascii="Calibri" w:hAnsi="Calibri" w:cs="Calibri"/>
-          <w:sz w:val="24"/>
-          <w:szCs w:val="24"/>
-        </w:rPr>
-        <w:t xml:space="preserve">A extensão entrega </w:t>
-      </w:r>
-      <w:r>
-        <w:rPr>
-          <w:rFonts w:ascii="Calibri" w:hAnsi="Calibri" w:cs="Calibri"/>
-          <w:sz w:val="24"/>
-          <w:szCs w:val="24"/>
-        </w:rPr>
-        <w:t xml:space="preserve">informações para o painel local na sua máquina </w:t>
-      </w:r>
-      <w:r>
-        <w:rPr>
-          <w:rFonts w:ascii="Calibri" w:hAnsi="Calibri" w:cs="Calibri"/>
-          <w:sz w:val="24"/>
-          <w:szCs w:val="24"/>
-        </w:rPr>
-        <w:t xml:space="preserve">para cada OS de OS ATIVAS/ que tenha CNPJ na ficha e atualiza o memory.md — notificação nova entra como “- </w:t>
+      <w:r>
+        <w:rPr>
+          <w:rFonts w:ascii="AppleSystemUIFont" w:hAnsi="AppleSystemUIFont" w:cs="AppleSystemUIFont"/>
+          <w:sz w:val="26"/>
+          <w:szCs w:val="26"/>
+        </w:rPr>
+        <w:br/>
+      </w:r>
+    </w:p>
+    <w:p>
+      <w:pPr>
+        <w:autoSpaceDE w:val="0"/>
+        <w:autoSpaceDN w:val="0"/>
+        <w:adjustRightInd w:val="0"/>
+        <w:jc w:val="both"/>
+        <w:rPr>
+          <w:rFonts w:ascii="AppleSystemUIFont" w:hAnsi="AppleSystemUIFont" w:cs="AppleSystemUIFont"/>
+          <w:sz w:val="26"/>
+          <w:szCs w:val="26"/>
+        </w:rPr>
+      </w:pPr>
+      <w:r>
+        <w:rPr>
+          <w:rFonts w:ascii="AppleSystemUIFont" w:hAnsi="AppleSystemUIFont" w:cs="AppleSystemUIFont"/>
+          <w:sz w:val="26"/>
+          <w:szCs w:val="26"/>
+        </w:rPr>
+        <w:t xml:space="preserve">Ele vai entender o conteúdo das pastas e vai organizar conforme o tipo de documento. Se for </w:t>
+      </w:r>
+      <w:r>
+        <w:rPr>
+          <w:rFonts w:ascii="AppleSystemUIFont" w:hAnsi="AppleSystemUIFont" w:cs="AppleSystemUIFont"/>
+          <w:sz w:val="26"/>
+          <w:szCs w:val="26"/>
+        </w:rPr>
+        <w:t>auto</w:t>
+      </w:r>
+      <w:r>
+        <w:rPr>
+          <w:rFonts w:ascii="AppleSystemUIFont" w:hAnsi="AppleSystemUIFont" w:cs="AppleSystemUIFont"/>
+          <w:sz w:val="26"/>
+          <w:szCs w:val="26"/>
+        </w:rPr>
+        <w:t xml:space="preserve"> de infração</w:t>
+      </w:r>
+      <w:r>
+        <w:rPr>
+          <w:rFonts w:ascii="AppleSystemUIFont" w:hAnsi="AppleSystemUIFont" w:cs="AppleSystemUIFont"/>
+          <w:sz w:val="26"/>
+          <w:szCs w:val="26"/>
+        </w:rPr>
+        <w:t xml:space="preserve">, vai </w:t>
+      </w:r>
+      <w:r>
+        <w:rPr>
+          <w:rFonts w:ascii="AppleSystemUIFont" w:hAnsi="AppleSystemUIFont" w:cs="AppleSystemUIFont"/>
+          <w:sz w:val="26"/>
+          <w:szCs w:val="26"/>
+        </w:rPr>
+        <w:t xml:space="preserve">para dentro de uma pasta de </w:t>
       </w:r>
       <w:proofErr w:type="gramStart"/>
       <w:r>
         <w:rPr>
-          <w:rFonts w:ascii="Calibri" w:hAnsi="Calibri" w:cs="Calibri"/>
-          <w:sz w:val="24"/>
-          <w:szCs w:val="24"/>
-        </w:rPr>
-        <w:t>[ ]</w:t>
+          <w:rFonts w:ascii="AppleSystemUIFont" w:hAnsi="AppleSystemUIFont" w:cs="AppleSystemUIFont"/>
+          <w:sz w:val="26"/>
+          <w:szCs w:val="26"/>
+        </w:rPr>
+        <w:t xml:space="preserve">auto </w:t>
+      </w:r>
+      <w:r>
+        <w:rPr>
+          <w:rFonts w:ascii="AppleSystemUIFont" w:hAnsi="AppleSystemUIFont" w:cs="AppleSystemUIFont"/>
+          <w:sz w:val="26"/>
+          <w:szCs w:val="26"/>
+        </w:rPr>
+        <w:t xml:space="preserve"> de</w:t>
       </w:r>
       <w:proofErr w:type="gramEnd"/>
       <w:r>
         <w:rPr>
-          <w:rFonts w:ascii="Calibri" w:hAnsi="Calibri" w:cs="Calibri"/>
-          <w:sz w:val="24"/>
-          <w:szCs w:val="24"/>
-        </w:rPr>
-        <w:t xml:space="preserve"> CÓDIGO — prazo dd/mm/aaaa”; prazo que mudou no DET é corrigido na linha existente.</w:t>
-      </w:r>
-    </w:p>
-    <w:p>
-      <w:pPr>
-        <w:pStyle w:val="PargrafodaLista"/>
-        <w:numPr>
-          <w:ilvl w:val="0"/>
-          <w:numId w:val="2"/>
-        </w:numPr>
-        <w:spacing w:after="80"/>
-        <w:rPr>
-          <w:rFonts w:ascii="Calibri" w:hAnsi="Calibri" w:cs="Calibri"/>
-          <w:sz w:val="24"/>
-          <w:szCs w:val="24"/>
-        </w:rPr>
-      </w:pPr>
-      <w:r>
-        <w:rPr>
-          <w:rFonts w:ascii="Calibri" w:hAnsi="Calibri" w:cs="Calibri"/>
-          <w:sz w:val="24"/>
-          <w:szCs w:val="24"/>
-        </w:rPr>
-        <w:t>O resultado aparece num aviso na própria página: “✅ Local: 2 importada(s) · 1 prazo(s) atualizado(s)”. Se o DET devolver notificações de outra fiscalização do mesmo empregador (de um colega, ou uma ação antiga), elas não entram — e o aviso conta quantas foram ignoradas, para você saber que existem.</w:t>
-      </w:r>
-    </w:p>
-    <w:p>
-      <w:pPr>
-        <w:pStyle w:val="PargrafodaLista"/>
-        <w:numPr>
-          <w:ilvl w:val="0"/>
-          <w:numId w:val="2"/>
-        </w:numPr>
-        <w:spacing w:after="80"/>
-        <w:rPr>
-          <w:rFonts w:ascii="Calibri" w:hAnsi="Calibri" w:cs="Calibri"/>
-          <w:sz w:val="24"/>
-          <w:szCs w:val="24"/>
-        </w:rPr>
-      </w:pPr>
-      <w:r>
-        <w:rPr>
-          <w:rFonts w:ascii="Calibri" w:hAnsi="Calibri" w:cs="Calibri"/>
-          <w:sz w:val="24"/>
-          <w:szCs w:val="24"/>
-        </w:rPr>
-        <w:t xml:space="preserve">O resultado é ótimo no painel é ótimo. </w:t>
-      </w:r>
-      <w:proofErr w:type="gramStart"/>
-      <w:r>
-        <w:rPr>
-          <w:rFonts w:ascii="Calibri" w:hAnsi="Calibri" w:cs="Calibri"/>
-          <w:sz w:val="24"/>
-          <w:szCs w:val="24"/>
-        </w:rPr>
-        <w:t>Pra</w:t>
-      </w:r>
-      <w:proofErr w:type="gramEnd"/>
-      <w:r>
-        <w:rPr>
-          <w:rFonts w:ascii="Calibri" w:hAnsi="Calibri" w:cs="Calibri"/>
-          <w:sz w:val="24"/>
-          <w:szCs w:val="24"/>
-        </w:rPr>
-        <w:t xml:space="preserve"> quem trabalha em dupla e quer visualizar só suas </w:t>
+          <w:rFonts w:ascii="AppleSystemUIFont" w:hAnsi="AppleSystemUIFont" w:cs="AppleSystemUIFont"/>
+          <w:sz w:val="26"/>
+          <w:szCs w:val="26"/>
+        </w:rPr>
+        <w:t xml:space="preserve"> infração. Se for notificação, para dentro da </w:t>
+      </w:r>
+      <w:r>
+        <w:rPr>
+          <w:rFonts w:ascii="AppleSystemUIFont" w:hAnsi="AppleSystemUIFont" w:cs="AppleSystemUIFont"/>
+          <w:sz w:val="26"/>
+          <w:szCs w:val="26"/>
+        </w:rPr>
+        <w:lastRenderedPageBreak/>
+        <w:t xml:space="preserve">sua pasta respectiva. Se for documento recebido, idem. E assim por diante. Logo </w:t>
       </w:r>
       <w:proofErr w:type="spellStart"/>
       <w:r>
         <w:rPr>
-          <w:rFonts w:ascii="Calibri" w:hAnsi="Calibri" w:cs="Calibri"/>
-          <w:sz w:val="24"/>
-          <w:szCs w:val="24"/>
-        </w:rPr>
-        <w:t>infos</w:t>
+          <w:rFonts w:ascii="AppleSystemUIFont" w:hAnsi="AppleSystemUIFont" w:cs="AppleSystemUIFont"/>
+          <w:sz w:val="26"/>
+          <w:szCs w:val="26"/>
+        </w:rPr>
+        <w:t>logo</w:t>
       </w:r>
       <w:proofErr w:type="spellEnd"/>
       <w:r>
         <w:rPr>
-          <w:rFonts w:ascii="Calibri" w:hAnsi="Calibri" w:cs="Calibri"/>
-          <w:sz w:val="24"/>
-          <w:szCs w:val="24"/>
-        </w:rPr>
-        <w:t xml:space="preserve">, é interessante essa funcionalidade. </w:t>
-      </w:r>
-    </w:p>
-    <w:p>
-      <w:pPr>
-        <w:pStyle w:val="PargrafodaLista"/>
-        <w:spacing w:after="80"/>
-        <w:ind w:left="720"/>
-        <w:rPr>
-          <w:rFonts w:ascii="Calibri" w:hAnsi="Calibri" w:cs="Calibri"/>
-          <w:sz w:val="24"/>
-          <w:szCs w:val="24"/>
-        </w:rPr>
-      </w:pPr>
-    </w:p>
-    <w:p>
-      <w:pPr>
-        <w:pStyle w:val="PargrafodaLista"/>
-        <w:spacing w:after="80"/>
-        <w:ind w:left="720"/>
-        <w:jc w:val="center"/>
-        <w:rPr>
-          <w:rFonts w:ascii="Calibri" w:hAnsi="Calibri" w:cs="Calibri"/>
-          <w:sz w:val="24"/>
-          <w:szCs w:val="24"/>
-        </w:rPr>
-      </w:pPr>
-      <w:r>
-        <w:rPr>
-          <w:rFonts w:ascii="Calibri" w:hAnsi="Calibri" w:cs="Calibri"/>
-          <w:noProof/>
-          <w:sz w:val="24"/>
-          <w:szCs w:val="24"/>
-        </w:rPr>
-        <w:drawing>
-          <wp:inline distT="0" distB="0" distL="0" distR="0" wp14:anchorId="4BC4078E" wp14:editId="131F747B">
-            <wp:extent cx="4732443" cy="3287750"/>
-            <wp:effectExtent l="0" t="0" r="5080" b="1905"/>
-            <wp:docPr id="1676791193" name="Imagem 4" descr="Interface gráfica do usuário, Texto, Aplicativo, Email&#10;&#10;O conteúdo gerado por IA pode estar incorreto."/>
-            <wp:cNvGraphicFramePr>
-              <a:graphicFrameLocks xmlns:a="http://schemas.openxmlformats.org/drawingml/2006/main" noChangeAspect="1"/>
-            </wp:cNvGraphicFramePr>
-            <a:graphic xmlns:a="http://schemas.openxmlformats.org/drawingml/2006/main">
-              <a:graphicData uri="http://schemas.openxmlformats.org/drawingml/2006/picture">
-                <pic:pic xmlns:pic="http://schemas.openxmlformats.org/drawingml/2006/picture">
-                  <pic:nvPicPr>
-                    <pic:cNvPr id="1676791193" name="Imagem 4" descr="Interface gráfica do usuário, Texto, Aplicativo, Email&#10;&#10;O conteúdo gerado por IA pode estar incorreto."/>
-                    <pic:cNvPicPr/>
-                  </pic:nvPicPr>
-                  <pic:blipFill>
-                    <a:blip r:embed="rId25" cstate="print">
-                      <a:extLst>
-                        <a:ext uri="{28A0092B-C50C-407E-A947-70E740481C1C}">
-                          <a14:useLocalDpi xmlns:a14="http://schemas.microsoft.com/office/drawing/2010/main" val="0"/>
-                        </a:ext>
-                      </a:extLst>
-                    </a:blip>
-                    <a:stretch>
-                      <a:fillRect/>
-                    </a:stretch>
-                  </pic:blipFill>
-                  <pic:spPr>
-                    <a:xfrm>
-                      <a:off x="0" y="0"/>
-                      <a:ext cx="4756154" cy="3304223"/>
-                    </a:xfrm>
-                    <a:prstGeom prst="rect">
-                      <a:avLst/>
-                    </a:prstGeom>
-                  </pic:spPr>
-                </pic:pic>
-              </a:graphicData>
-            </a:graphic>
-          </wp:inline>
-        </w:drawing>
-      </w:r>
-    </w:p>
-    <w:p>
-      <w:pPr>
-        <w:spacing w:after="80"/>
-        <w:rPr>
-          <w:rFonts w:ascii="Calibri" w:hAnsi="Calibri" w:cs="Calibri"/>
-          <w:sz w:val="24"/>
-          <w:szCs w:val="24"/>
-        </w:rPr>
-      </w:pPr>
-    </w:p>
-    <w:p>
-      <w:pPr>
-        <w:spacing w:after="80"/>
-        <w:rPr>
-          <w:rFonts w:ascii="Calibri" w:hAnsi="Calibri" w:cs="Calibri"/>
-          <w:sz w:val="24"/>
-          <w:szCs w:val="24"/>
-        </w:rPr>
-      </w:pPr>
-    </w:p>
-    <w:p>
-      <w:pPr>
-        <w:spacing w:after="120"/>
-        <w:rPr>
-          <w:rFonts w:ascii="Calibri" w:hAnsi="Calibri" w:cs="Calibri"/>
-          <w:sz w:val="24"/>
-          <w:szCs w:val="24"/>
-        </w:rPr>
-      </w:pPr>
+          <w:rFonts w:ascii="AppleSystemUIFont" w:hAnsi="AppleSystemUIFont" w:cs="AppleSystemUIFont"/>
+          <w:sz w:val="26"/>
+          <w:szCs w:val="26"/>
+        </w:rPr>
+        <w:t xml:space="preserve"> você vai entender.</w:t>
+      </w:r>
+    </w:p>
+    <w:p>
+      <w:pPr>
+        <w:pStyle w:val="Ttulo1"/>
+        <w:rPr>
+          <w:rFonts w:ascii="Calibri" w:hAnsi="Calibri" w:cs="Calibri"/>
+          <w:color w:val="000000" w:themeColor="text1"/>
+          <w:sz w:val="24"/>
+          <w:szCs w:val="24"/>
+        </w:rPr>
+      </w:pPr>
+      <w:r>
+        <w:rPr>
+          <w:rFonts w:ascii="Calibri" w:hAnsi="Calibri" w:cs="Calibri"/>
+          <w:b w:val="0"/>
+          <w:bCs w:val="0"/>
+          <w:color w:val="000000" w:themeColor="text1"/>
+          <w:sz w:val="24"/>
+          <w:szCs w:val="24"/>
+        </w:rPr>
+        <w:br/>
+      </w:r>
+      <w:r>
+        <w:rPr>
+          <w:rFonts w:ascii="Calibri" w:hAnsi="Calibri" w:cs="Calibri"/>
+          <w:color w:val="000000" w:themeColor="text1"/>
+          <w:sz w:val="24"/>
+          <w:szCs w:val="24"/>
+        </w:rPr>
+        <w:br/>
+      </w:r>
+    </w:p>
+    <w:p>
+      <w:pPr>
+        <w:pStyle w:val="Ttulo1"/>
+        <w:ind w:left="360"/>
+        <w:rPr>
+          <w:rFonts w:ascii="Calibri" w:hAnsi="Calibri" w:cs="Calibri"/>
+          <w:color w:val="000000" w:themeColor="text1"/>
+          <w:sz w:val="24"/>
+          <w:szCs w:val="24"/>
+        </w:rPr>
+      </w:pPr>
+    </w:p>
+    <w:p>
+      <w:pPr>
+        <w:pStyle w:val="Ttulo1"/>
+        <w:rPr>
+          <w:rFonts w:ascii="Calibri" w:hAnsi="Calibri" w:cs="Calibri"/>
+          <w:color w:val="E97132"/>
+          <w:sz w:val="24"/>
+          <w:szCs w:val="24"/>
+        </w:rPr>
+      </w:pPr>
+    </w:p>
+    <w:p>
+      <w:pPr>
+        <w:pStyle w:val="Ttulo1"/>
+        <w:rPr>
+          <w:rFonts w:ascii="Calibri" w:hAnsi="Calibri" w:cs="Calibri"/>
+          <w:color w:val="E97132"/>
+          <w:sz w:val="24"/>
+          <w:szCs w:val="24"/>
+        </w:rPr>
+      </w:pPr>
+      <w:r>
+        <w:rPr>
+          <w:rFonts w:ascii="Calibri" w:hAnsi="Calibri" w:cs="Calibri"/>
+          <w:color w:val="E97132"/>
+          <w:sz w:val="24"/>
+          <w:szCs w:val="24"/>
+        </w:rPr>
+        <w:t>3. Catálogo das skills</w:t>
+      </w:r>
+      <w:bookmarkEnd w:id="12"/>
     </w:p>
     <w:p>
       <w:pPr>
@@ -11503,20 +11589,111 @@
       <w:r>
         <w:rPr>
           <w:rFonts w:ascii="Calibri" w:hAnsi="Calibri" w:cs="Calibri"/>
+          <w:sz w:val="24"/>
+          <w:szCs w:val="24"/>
+        </w:rPr>
+        <w:t>Para usar uma skill, basta digitar o comando (por exemplo /</w:t>
+      </w:r>
+      <w:proofErr w:type="spellStart"/>
+      <w:r>
+        <w:rPr>
+          <w:rFonts w:ascii="Calibri" w:hAnsi="Calibri" w:cs="Calibri"/>
+          <w:sz w:val="24"/>
+          <w:szCs w:val="24"/>
+        </w:rPr>
+        <w:t>inspecao-fisica</w:t>
+      </w:r>
+      <w:proofErr w:type="spellEnd"/>
+      <w:r>
+        <w:rPr>
+          <w:rFonts w:ascii="Calibri" w:hAnsi="Calibri" w:cs="Calibri"/>
+          <w:sz w:val="24"/>
+          <w:szCs w:val="24"/>
+        </w:rPr>
+        <w:t xml:space="preserve">) numa conversa do Claude </w:t>
+      </w:r>
+      <w:proofErr w:type="spellStart"/>
+      <w:r>
+        <w:rPr>
+          <w:rFonts w:ascii="Calibri" w:hAnsi="Calibri" w:cs="Calibri"/>
+          <w:sz w:val="24"/>
+          <w:szCs w:val="24"/>
+        </w:rPr>
+        <w:t>Code</w:t>
+      </w:r>
+      <w:proofErr w:type="spellEnd"/>
+      <w:r>
+        <w:rPr>
+          <w:rFonts w:ascii="Calibri" w:hAnsi="Calibri" w:cs="Calibri"/>
+          <w:sz w:val="24"/>
+          <w:szCs w:val="24"/>
+        </w:rPr>
+        <w:t>, ou simplesmente pedir em português (“cheguei da inspeção e vou narrar o que vi”). A skill conduz a conversa: pergunta o que falta, mostra o resultado para você revisar e salva tudo na pasta da OS.</w:t>
+      </w:r>
+    </w:p>
+    <w:p>
+      <w:pPr>
+        <w:spacing w:after="120"/>
+        <w:jc w:val="both"/>
+        <w:rPr>
+          <w:rFonts w:ascii="Calibri" w:hAnsi="Calibri" w:cs="Calibri"/>
+          <w:sz w:val="24"/>
+          <w:szCs w:val="24"/>
+        </w:rPr>
+      </w:pPr>
+      <w:r>
+        <w:rPr>
+          <w:rFonts w:ascii="Calibri" w:hAnsi="Calibri" w:cs="Calibri"/>
           <w:b/>
           <w:bCs/>
           <w:sz w:val="24"/>
           <w:szCs w:val="24"/>
         </w:rPr>
-        <w:t xml:space="preserve">O que a extensão nunca faz. </w:t>
-      </w:r>
-      <w:r>
-        <w:rPr>
-          <w:rFonts w:ascii="Calibri" w:hAnsi="Calibri" w:cs="Calibri"/>
-          <w:sz w:val="24"/>
-          <w:szCs w:val="24"/>
-        </w:rPr>
-        <w:t>Ela não marca notificação como respondida (o checkbox da ficha é decisão sua, no painel), não altera o que você já escreveu no memory.md (cada arquivo alterado recebe backup antes) e não manda nada para a internet: a conversa entre extensão e painel acontece inteira dentro do seu computador (127.0.0.1 é o endereço da própria máquina). A chave de sessão vive só na memória, expira sozinha em cerca de 30 minutos e não é gravada em arquivo.</w:t>
+        <w:t xml:space="preserve">Modo rápido: </w:t>
+      </w:r>
+      <w:r>
+        <w:rPr>
+          <w:rFonts w:ascii="Calibri" w:hAnsi="Calibri" w:cs="Calibri"/>
+          <w:sz w:val="24"/>
+          <w:szCs w:val="24"/>
+        </w:rPr>
+        <w:t>o fluxo completo do capítulo 4 é o caminho recomendado para quem quer rastrear prazos de DET e manter o painel atualizado, mas nenhuma skill de redação exige esse fluxo. Você pode chamar /inspecao-inicial, /registro, /aft-rt-rgi, /PGR-</w:t>
+      </w:r>
+      <w:proofErr w:type="gramStart"/>
+      <w:r>
+        <w:rPr>
+          <w:rFonts w:ascii="Calibri" w:hAnsi="Calibri" w:cs="Calibri"/>
+          <w:sz w:val="24"/>
+          <w:szCs w:val="24"/>
+        </w:rPr>
+        <w:t>analise</w:t>
+      </w:r>
+      <w:proofErr w:type="gramEnd"/>
+      <w:r>
+        <w:rPr>
+          <w:rFonts w:ascii="Calibri" w:hAnsi="Calibri" w:cs="Calibri"/>
+          <w:sz w:val="24"/>
+          <w:szCs w:val="24"/>
+        </w:rPr>
+        <w:t xml:space="preserve"> ou /det-630 direto, colar a narrativa da inspeção e receber o texto do auto pronto — sem nunca ter cadastrado uma OS e sem precisar do CNPJ real (um nome fantasia basta; o texto do auto nunca embute o CNPJ no corpo, ele é só metadado administrativo). O CNPJ só passa a ser obrigatório no /gera-</w:t>
+      </w:r>
+      <w:proofErr w:type="gramStart"/>
+      <w:r>
+        <w:rPr>
+          <w:rFonts w:ascii="Calibri" w:hAnsi="Calibri" w:cs="Calibri"/>
+          <w:sz w:val="24"/>
+          <w:szCs w:val="24"/>
+        </w:rPr>
+        <w:t>ai</w:t>
+      </w:r>
+      <w:proofErr w:type="gramEnd"/>
+      <w:r>
+        <w:rPr>
+          <w:rFonts w:ascii="Calibri" w:hAnsi="Calibri" w:cs="Calibri"/>
+          <w:sz w:val="24"/>
+          <w:szCs w:val="24"/>
+        </w:rPr>
+        <w:t>, porque é um campo exigido pelo próprio Sistema Auditor — não pelo toolkit — para a importação do TXT. Ou seja: dá para usar o toolkit só para gerar o texto dos autos, sem nunca empacotar nada.</w:t>
       </w:r>
     </w:p>
     <w:p>
@@ -11529,410 +11706,28 @@
           <w:szCs w:val="24"/>
         </w:rPr>
       </w:pPr>
-      <w:r>
-        <w:rPr>
-          <w:rFonts w:ascii="Calibri" w:hAnsi="Calibri" w:cs="Calibri"/>
-          <w:b/>
-          <w:bCs/>
-          <w:sz w:val="24"/>
-          <w:szCs w:val="24"/>
-        </w:rPr>
-        <w:lastRenderedPageBreak/>
-        <w:t>Se algo não funcionar:</w:t>
-      </w:r>
-    </w:p>
-    <w:p>
-      <w:pPr>
-        <w:pStyle w:val="PargrafodaLista"/>
-        <w:numPr>
-          <w:ilvl w:val="0"/>
-          <w:numId w:val="2"/>
-        </w:numPr>
-        <w:spacing w:after="80"/>
-        <w:rPr>
-          <w:rFonts w:ascii="Calibri" w:hAnsi="Calibri" w:cs="Calibri"/>
-          <w:sz w:val="24"/>
-          <w:szCs w:val="24"/>
-        </w:rPr>
-      </w:pPr>
-      <w:r>
-        <w:rPr>
-          <w:rFonts w:ascii="Calibri" w:hAnsi="Calibri" w:cs="Calibri"/>
-          <w:b/>
-          <w:bCs/>
-          <w:sz w:val="24"/>
-          <w:szCs w:val="24"/>
-        </w:rPr>
-        <w:t>“Painel não está no ar”</w:t>
-      </w:r>
-      <w:r>
-        <w:rPr>
-          <w:rFonts w:ascii="Calibri" w:hAnsi="Calibri" w:cs="Calibri"/>
-          <w:sz w:val="24"/>
-          <w:szCs w:val="24"/>
-        </w:rPr>
-        <w:t xml:space="preserve"> — o servidor local não está rodando. Peça ao Claude: /painel (ou rode /aft-doctor para diagnosticar).</w:t>
-      </w:r>
-    </w:p>
-    <w:p>
-      <w:pPr>
-        <w:pStyle w:val="PargrafodaLista"/>
-        <w:numPr>
-          <w:ilvl w:val="0"/>
-          <w:numId w:val="2"/>
-        </w:numPr>
-        <w:spacing w:after="80"/>
-        <w:rPr>
-          <w:rFonts w:ascii="Calibri" w:hAnsi="Calibri" w:cs="Calibri"/>
-          <w:sz w:val="24"/>
-          <w:szCs w:val="24"/>
-        </w:rPr>
-      </w:pPr>
-      <w:r>
-        <w:rPr>
-          <w:rFonts w:ascii="Calibri" w:hAnsi="Calibri" w:cs="Calibri"/>
-          <w:b/>
-          <w:bCs/>
-          <w:sz w:val="24"/>
-          <w:szCs w:val="24"/>
-        </w:rPr>
-        <w:t>“Token DET não capturado”</w:t>
-      </w:r>
-      <w:r>
-        <w:rPr>
-          <w:rFonts w:ascii="Calibri" w:hAnsi="Calibri" w:cs="Calibri"/>
-          <w:sz w:val="24"/>
-          <w:szCs w:val="24"/>
-        </w:rPr>
-        <w:t xml:space="preserve"> — a extensão ainda não viu você navegar logado. Abra qualquer página interna do DET (a lista de notificações, por exemplo) e clique em Sincronizar de novo.</w:t>
-      </w:r>
-    </w:p>
-    <w:p>
-      <w:pPr>
-        <w:pStyle w:val="PargrafodaLista"/>
-        <w:numPr>
-          <w:ilvl w:val="0"/>
-          <w:numId w:val="2"/>
-        </w:numPr>
-        <w:spacing w:after="80"/>
-        <w:rPr>
-          <w:rFonts w:ascii="Calibri" w:hAnsi="Calibri" w:cs="Calibri"/>
-          <w:sz w:val="24"/>
-          <w:szCs w:val="24"/>
-        </w:rPr>
-      </w:pPr>
-      <w:proofErr w:type="gramStart"/>
-      <w:r>
-        <w:rPr>
-          <w:rFonts w:ascii="Calibri" w:hAnsi="Calibri" w:cs="Calibri"/>
-          <w:b/>
-          <w:bCs/>
-          <w:sz w:val="24"/>
-          <w:szCs w:val="24"/>
-        </w:rPr>
-        <w:t>Sincronizou</w:t>
-      </w:r>
-      <w:proofErr w:type="gramEnd"/>
-      <w:r>
-        <w:rPr>
-          <w:rFonts w:ascii="Calibri" w:hAnsi="Calibri" w:cs="Calibri"/>
-          <w:b/>
-          <w:bCs/>
-          <w:sz w:val="24"/>
-          <w:szCs w:val="24"/>
-        </w:rPr>
-        <w:t xml:space="preserve"> mas a notificação não apareceu</w:t>
-      </w:r>
-      <w:r>
-        <w:rPr>
-          <w:rFonts w:ascii="Calibri" w:hAnsi="Calibri" w:cs="Calibri"/>
-          <w:sz w:val="24"/>
-          <w:szCs w:val="24"/>
-        </w:rPr>
-        <w:t xml:space="preserve"> — confira se a OS tem o CNPJ (ou CPF) no memory.md: sem ele o painel não sabe qual empregador consultar no DET.</w:t>
-      </w:r>
-    </w:p>
-    <w:p>
-      <w:pPr>
-        <w:spacing w:after="120"/>
-        <w:rPr>
-          <w:rFonts w:ascii="Calibri" w:hAnsi="Calibri" w:cs="Calibri"/>
-          <w:sz w:val="24"/>
-          <w:szCs w:val="24"/>
-        </w:rPr>
-      </w:pPr>
-      <w:r>
-        <w:rPr>
-          <w:rFonts w:ascii="Calibri" w:hAnsi="Calibri" w:cs="Calibri"/>
-          <w:sz w:val="24"/>
-          <w:szCs w:val="24"/>
-        </w:rPr>
-        <w:t xml:space="preserve">O mesmo link </w:t>
-      </w:r>
-      <w:hyperlink r:id="rId26" w:history="1">
-        <w:r>
-          <w:rPr>
-            <w:rStyle w:val="Hyperlink"/>
-            <w:rFonts w:ascii="Calibri" w:hAnsi="Calibri" w:cs="Calibri"/>
-            <w:sz w:val="24"/>
-            <w:szCs w:val="24"/>
-          </w:rPr>
-          <w:t>https://chromewebstore.google.com/detail/sync-det-%E2%80%94-sisos-aft-tool/khmecjbidgcndmgmkbpfncjgmmfehiem</w:t>
-        </w:r>
-      </w:hyperlink>
-      <w:r>
-        <w:rPr>
-          <w:rFonts w:ascii="Calibri" w:hAnsi="Calibri" w:cs="Calibri"/>
-          <w:sz w:val="24"/>
-          <w:szCs w:val="24"/>
-        </w:rPr>
-        <w:t xml:space="preserve">  também instala no navegador Edge</w:t>
-      </w:r>
-    </w:p>
-    <w:p>
-      <w:pPr>
-        <w:spacing w:after="120"/>
-        <w:rPr>
-          <w:rFonts w:ascii="Calibri" w:hAnsi="Calibri" w:cs="Calibri"/>
-          <w:sz w:val="24"/>
-          <w:szCs w:val="24"/>
-        </w:rPr>
-      </w:pPr>
-    </w:p>
-    <w:p>
-      <w:pPr>
-        <w:spacing w:after="120"/>
-        <w:jc w:val="center"/>
-        <w:rPr>
-          <w:rFonts w:ascii="Calibri" w:hAnsi="Calibri" w:cs="Calibri"/>
-          <w:sz w:val="24"/>
-          <w:szCs w:val="24"/>
-        </w:rPr>
-      </w:pPr>
-      <w:r>
-        <w:rPr>
-          <w:rFonts w:ascii="Calibri" w:hAnsi="Calibri" w:cs="Calibri"/>
-          <w:noProof/>
-          <w:sz w:val="24"/>
-          <w:szCs w:val="24"/>
-        </w:rPr>
-        <w:drawing>
-          <wp:inline distT="0" distB="0" distL="0" distR="0" wp14:anchorId="75E10BBD" wp14:editId="66C44888">
-            <wp:extent cx="5409777" cy="3931987"/>
-            <wp:effectExtent l="0" t="0" r="635" b="5080"/>
-            <wp:docPr id="1581436987" name="Imagem 1" descr="Interface gráfica do usuário, Texto, Aplicativo, chat ou mensagem de texto, Email&#10;&#10;O conteúdo gerado por IA pode estar incorreto."/>
-            <wp:cNvGraphicFramePr>
-              <a:graphicFrameLocks xmlns:a="http://schemas.openxmlformats.org/drawingml/2006/main" noChangeAspect="1"/>
-            </wp:cNvGraphicFramePr>
-            <a:graphic xmlns:a="http://schemas.openxmlformats.org/drawingml/2006/main">
-              <a:graphicData uri="http://schemas.openxmlformats.org/drawingml/2006/picture">
-                <pic:pic xmlns:pic="http://schemas.openxmlformats.org/drawingml/2006/picture">
-                  <pic:nvPicPr>
-                    <pic:cNvPr id="1581436987" name="Imagem 1" descr="Interface gráfica do usuário, Texto, Aplicativo, chat ou mensagem de texto, Email&#10;&#10;O conteúdo gerado por IA pode estar incorreto."/>
-                    <pic:cNvPicPr/>
-                  </pic:nvPicPr>
-                  <pic:blipFill>
-                    <a:blip r:embed="rId27" cstate="print">
-                      <a:extLst>
-                        <a:ext uri="{28A0092B-C50C-407E-A947-70E740481C1C}">
-                          <a14:useLocalDpi xmlns:a14="http://schemas.microsoft.com/office/drawing/2010/main" val="0"/>
-                        </a:ext>
-                      </a:extLst>
-                    </a:blip>
-                    <a:stretch>
-                      <a:fillRect/>
-                    </a:stretch>
-                  </pic:blipFill>
-                  <pic:spPr>
-                    <a:xfrm>
-                      <a:off x="0" y="0"/>
-                      <a:ext cx="5429008" cy="3945964"/>
-                    </a:xfrm>
-                    <a:prstGeom prst="rect">
-                      <a:avLst/>
-                    </a:prstGeom>
-                  </pic:spPr>
-                </pic:pic>
-              </a:graphicData>
-            </a:graphic>
-          </wp:inline>
-        </w:drawing>
-      </w:r>
-    </w:p>
-    <w:p>
-      <w:pPr>
-        <w:pStyle w:val="Ttulo1"/>
-        <w:rPr>
-          <w:rFonts w:ascii="Calibri" w:hAnsi="Calibri" w:cs="Calibri"/>
-          <w:color w:val="E97132"/>
-          <w:sz w:val="24"/>
-          <w:szCs w:val="24"/>
-        </w:rPr>
-      </w:pPr>
-      <w:bookmarkStart w:id="13" w:name="_Toc233441472"/>
-      <w:r>
-        <w:rPr>
-          <w:rFonts w:ascii="Calibri" w:hAnsi="Calibri" w:cs="Calibri"/>
-          <w:color w:val="E97132"/>
-          <w:sz w:val="24"/>
-          <w:szCs w:val="24"/>
-        </w:rPr>
-        <w:t>3. Catálogo das skills</w:t>
+    </w:p>
+    <w:p>
+      <w:pPr>
+        <w:pStyle w:val="Ttulo2"/>
+        <w:rPr>
+          <w:rFonts w:ascii="Calibri" w:hAnsi="Calibri" w:cs="Calibri"/>
+          <w:color w:val="C55A11"/>
+          <w:sz w:val="24"/>
+          <w:szCs w:val="24"/>
+        </w:rPr>
+      </w:pPr>
+      <w:bookmarkStart w:id="13" w:name="_Toc233441473"/>
+      <w:r>
+        <w:rPr>
+          <w:rFonts w:ascii="Calibri" w:hAnsi="Calibri" w:cs="Calibri"/>
+          <w:color w:val="C55A11"/>
+          <w:sz w:val="24"/>
+          <w:szCs w:val="24"/>
+        </w:rPr>
+        <w:t>3.1 Configuração e visão geral</w:t>
       </w:r>
       <w:bookmarkEnd w:id="13"/>
-    </w:p>
-    <w:p>
-      <w:pPr>
-        <w:spacing w:after="120"/>
-        <w:jc w:val="both"/>
-        <w:rPr>
-          <w:rFonts w:ascii="Calibri" w:hAnsi="Calibri" w:cs="Calibri"/>
-          <w:sz w:val="24"/>
-          <w:szCs w:val="24"/>
-        </w:rPr>
-      </w:pPr>
-      <w:r>
-        <w:rPr>
-          <w:rFonts w:ascii="Calibri" w:hAnsi="Calibri" w:cs="Calibri"/>
-          <w:sz w:val="24"/>
-          <w:szCs w:val="24"/>
-        </w:rPr>
-        <w:t>Para usar uma skill, basta digitar o comando (por exemplo /</w:t>
-      </w:r>
-      <w:proofErr w:type="spellStart"/>
-      <w:r>
-        <w:rPr>
-          <w:rFonts w:ascii="Calibri" w:hAnsi="Calibri" w:cs="Calibri"/>
-          <w:sz w:val="24"/>
-          <w:szCs w:val="24"/>
-        </w:rPr>
-        <w:t>inspecao-fisica</w:t>
-      </w:r>
-      <w:proofErr w:type="spellEnd"/>
-      <w:r>
-        <w:rPr>
-          <w:rFonts w:ascii="Calibri" w:hAnsi="Calibri" w:cs="Calibri"/>
-          <w:sz w:val="24"/>
-          <w:szCs w:val="24"/>
-        </w:rPr>
-        <w:t xml:space="preserve">) numa conversa do Claude </w:t>
-      </w:r>
-      <w:proofErr w:type="spellStart"/>
-      <w:r>
-        <w:rPr>
-          <w:rFonts w:ascii="Calibri" w:hAnsi="Calibri" w:cs="Calibri"/>
-          <w:sz w:val="24"/>
-          <w:szCs w:val="24"/>
-        </w:rPr>
-        <w:t>Code</w:t>
-      </w:r>
-      <w:proofErr w:type="spellEnd"/>
-      <w:r>
-        <w:rPr>
-          <w:rFonts w:ascii="Calibri" w:hAnsi="Calibri" w:cs="Calibri"/>
-          <w:sz w:val="24"/>
-          <w:szCs w:val="24"/>
-        </w:rPr>
-        <w:t>, ou simplesmente pedir em português (“cheguei da inspeção e vou narrar o que vi”). A skill conduz a conversa: pergunta o que falta, mostra o resultado para você revisar e salva tudo na pasta da OS.</w:t>
-      </w:r>
-    </w:p>
-    <w:p>
-      <w:pPr>
-        <w:spacing w:after="120"/>
-        <w:jc w:val="both"/>
-        <w:rPr>
-          <w:rFonts w:ascii="Calibri" w:hAnsi="Calibri" w:cs="Calibri"/>
-          <w:sz w:val="24"/>
-          <w:szCs w:val="24"/>
-        </w:rPr>
-      </w:pPr>
-      <w:r>
-        <w:rPr>
-          <w:rFonts w:ascii="Calibri" w:hAnsi="Calibri" w:cs="Calibri"/>
-          <w:b/>
-          <w:bCs/>
-          <w:sz w:val="24"/>
-          <w:szCs w:val="24"/>
-        </w:rPr>
-        <w:t xml:space="preserve">Modo rápido: </w:t>
-      </w:r>
-      <w:r>
-        <w:rPr>
-          <w:rFonts w:ascii="Calibri" w:hAnsi="Calibri" w:cs="Calibri"/>
-          <w:sz w:val="24"/>
-          <w:szCs w:val="24"/>
-        </w:rPr>
-        <w:t>o fluxo completo do capítulo 4 é o caminho recomendado para quem quer rastrear prazos de DET e manter o painel atualizado, mas nenhuma skill de redação exige esse fluxo. Você pode chamar /inspecao-inicial, /registro, /aft-rt-rgi, /PGR-</w:t>
-      </w:r>
-      <w:proofErr w:type="gramStart"/>
-      <w:r>
-        <w:rPr>
-          <w:rFonts w:ascii="Calibri" w:hAnsi="Calibri" w:cs="Calibri"/>
-          <w:sz w:val="24"/>
-          <w:szCs w:val="24"/>
-        </w:rPr>
-        <w:t>analise</w:t>
-      </w:r>
-      <w:proofErr w:type="gramEnd"/>
-      <w:r>
-        <w:rPr>
-          <w:rFonts w:ascii="Calibri" w:hAnsi="Calibri" w:cs="Calibri"/>
-          <w:sz w:val="24"/>
-          <w:szCs w:val="24"/>
-        </w:rPr>
-        <w:t xml:space="preserve"> ou /det-630 direto, colar a narrativa da inspeção e receber o texto do auto pronto — sem nunca ter cadastrado uma OS e sem precisar do CNPJ real (um nome fantasia basta; o texto do auto nunca embute o CNPJ no corpo, ele é só metadado administrativo). O CNPJ só passa a ser obrigatório no /gera-</w:t>
-      </w:r>
-      <w:proofErr w:type="gramStart"/>
-      <w:r>
-        <w:rPr>
-          <w:rFonts w:ascii="Calibri" w:hAnsi="Calibri" w:cs="Calibri"/>
-          <w:sz w:val="24"/>
-          <w:szCs w:val="24"/>
-        </w:rPr>
-        <w:t>ai</w:t>
-      </w:r>
-      <w:proofErr w:type="gramEnd"/>
-      <w:r>
-        <w:rPr>
-          <w:rFonts w:ascii="Calibri" w:hAnsi="Calibri" w:cs="Calibri"/>
-          <w:sz w:val="24"/>
-          <w:szCs w:val="24"/>
-        </w:rPr>
-        <w:t>, porque é um campo exigido pelo próprio Sistema Auditor — não pelo toolkit — para a importação do TXT. Ou seja: dá para usar o toolkit só para gerar o texto dos autos, sem nunca empacotar nada.</w:t>
-      </w:r>
-    </w:p>
-    <w:p>
-      <w:pPr>
-        <w:spacing w:after="120"/>
-        <w:jc w:val="both"/>
-        <w:rPr>
-          <w:rFonts w:ascii="Calibri" w:hAnsi="Calibri" w:cs="Calibri"/>
-          <w:sz w:val="24"/>
-          <w:szCs w:val="24"/>
-        </w:rPr>
-      </w:pPr>
-    </w:p>
-    <w:p>
-      <w:pPr>
-        <w:pStyle w:val="Ttulo2"/>
-        <w:rPr>
-          <w:rFonts w:ascii="Calibri" w:hAnsi="Calibri" w:cs="Calibri"/>
-          <w:color w:val="C55A11"/>
-          <w:sz w:val="24"/>
-          <w:szCs w:val="24"/>
-        </w:rPr>
-      </w:pPr>
-      <w:bookmarkStart w:id="14" w:name="_Toc233441473"/>
-      <w:r>
-        <w:rPr>
-          <w:rFonts w:ascii="Calibri" w:hAnsi="Calibri" w:cs="Calibri"/>
-          <w:color w:val="C55A11"/>
-          <w:sz w:val="24"/>
-          <w:szCs w:val="24"/>
-        </w:rPr>
-        <w:t>3.1 Configuração e visão geral</w:t>
-      </w:r>
-      <w:bookmarkEnd w:id="14"/>
       <w:r>
         <w:rPr>
           <w:rFonts w:ascii="Calibri" w:hAnsi="Calibri" w:cs="Calibri"/>
@@ -12002,7 +11797,6 @@
                 <w:sz w:val="24"/>
                 <w:szCs w:val="24"/>
               </w:rPr>
-              <w:lastRenderedPageBreak/>
               <w:t>Skill</w:t>
             </w:r>
           </w:p>
@@ -12562,6 +12356,7 @@
                 <w:sz w:val="24"/>
                 <w:szCs w:val="24"/>
               </w:rPr>
+              <w:lastRenderedPageBreak/>
               <w:t>/painel</w:t>
             </w:r>
           </w:p>
@@ -12883,7 +12678,7 @@
           <w:szCs w:val="24"/>
         </w:rPr>
       </w:pPr>
-      <w:bookmarkStart w:id="15" w:name="_Toc233441474"/>
+      <w:bookmarkStart w:id="14" w:name="_Toc233441474"/>
       <w:r>
         <w:rPr>
           <w:rFonts w:ascii="Calibri" w:hAnsi="Calibri" w:cs="Calibri"/>
@@ -12893,7 +12688,7 @@
         </w:rPr>
         <w:t>3.2 Inspeção e lavratura</w:t>
       </w:r>
-      <w:bookmarkEnd w:id="15"/>
+      <w:bookmarkEnd w:id="14"/>
     </w:p>
     <w:p>
       <w:pPr>
@@ -13236,7 +13031,6 @@
                 <w:sz w:val="24"/>
                 <w:szCs w:val="24"/>
               </w:rPr>
-              <w:lastRenderedPageBreak/>
               <w:t>descricao</w:t>
             </w:r>
             <w:proofErr w:type="spellEnd"/>
@@ -13427,7 +13221,6 @@
                 <w:sz w:val="24"/>
                 <w:szCs w:val="24"/>
               </w:rPr>
-              <w:lastRenderedPageBreak/>
               <w:t>/</w:t>
             </w:r>
             <w:proofErr w:type="spellStart"/>
@@ -13723,6 +13516,7 @@
                 <w:sz w:val="24"/>
                 <w:szCs w:val="24"/>
               </w:rPr>
+              <w:lastRenderedPageBreak/>
               <w:t>/det-630</w:t>
             </w:r>
           </w:p>
@@ -14008,16 +13802,7 @@
                 <w:sz w:val="24"/>
                 <w:szCs w:val="24"/>
               </w:rPr>
-              <w:t xml:space="preserve">Julga o laudo de adequação à NR-12 ou a apreciação de riscos que a empresa apresentou — seja num pedido de suspensão de interdição, seja em resposta a uma notificação. Confere o método de estimativa de risco, a categoria de segurança (S/F/P → B, 1, 2, 3, 4 da NBR 14153), a interface de segurança (relé ou CLP), os requisitos da NR-12 que dependem da apreciação e a habilitação de quem assinou, e entrega um parecer: apto, apto com ressalvas ou insuficiente. Salva um arquivo numerado (auditoria-1-AR-NR12.md, auditoria-2-AR-NR12.md…) na pasta da OS. Exemplos do que dizer: “analisa esse laudo de conformidade NR-12 que a empresa juntou no pedido de suspensão”; “a metalúrgica respondeu minha notificação com uma apreciação de riscos feita com HRN, dá teu julgamento técnico”; “esse laudo sustenta o levantamento da interdição?”; “o laudo fala em categoria 2 mas não vi relé de segurança em lugar nenhum, dá uma auditada”; “auditar a apreciação de riscos que veio na resposta do DET”; “a </w:t>
-            </w:r>
-            <w:r>
-              <w:rPr>
-                <w:rFonts w:ascii="Calibri" w:hAnsi="Calibri" w:cs="Calibri"/>
-                <w:sz w:val="24"/>
-                <w:szCs w:val="24"/>
-              </w:rPr>
-              <w:lastRenderedPageBreak/>
-              <w:t>empresa mandou fotos e um documento de 3 páginas feito por TST, confere se sustenta o levantamento”.</w:t>
+              <w:t>Julga o laudo de adequação à NR-12 ou a apreciação de riscos que a empresa apresentou — seja num pedido de suspensão de interdição, seja em resposta a uma notificação. Confere o método de estimativa de risco, a categoria de segurança (S/F/P → B, 1, 2, 3, 4 da NBR 14153), a interface de segurança (relé ou CLP), os requisitos da NR-12 que dependem da apreciação e a habilitação de quem assinou, e entrega um parecer: apto, apto com ressalvas ou insuficiente. Salva um arquivo numerado (auditoria-1-AR-NR12.md, auditoria-2-AR-NR12.md…) na pasta da OS. Exemplos do que dizer: “analisa esse laudo de conformidade NR-12 que a empresa juntou no pedido de suspensão”; “a metalúrgica respondeu minha notificação com uma apreciação de riscos feita com HRN, dá teu julgamento técnico”; “esse laudo sustenta o levantamento da interdição?”; “o laudo fala em categoria 2 mas não vi relé de segurança em lugar nenhum, dá uma auditada”; “auditar a apreciação de riscos que veio na resposta do DET”; “a empresa mandou fotos e um documento de 3 páginas feito por TST, confere se sustenta o levantamento”.</w:t>
             </w:r>
           </w:p>
         </w:tc>
@@ -14054,7 +13839,6 @@
                 <w:sz w:val="24"/>
                 <w:szCs w:val="24"/>
               </w:rPr>
-              <w:lastRenderedPageBreak/>
               <w:t>/</w:t>
             </w:r>
             <w:proofErr w:type="spellStart"/>
@@ -14223,6 +14007,7 @@
                 <w:sz w:val="24"/>
                 <w:szCs w:val="24"/>
               </w:rPr>
+              <w:lastRenderedPageBreak/>
               <w:t>Relatorio</w:t>
             </w:r>
             <w:proofErr w:type="spellEnd"/>
@@ -14402,7 +14187,7 @@
           <w:szCs w:val="24"/>
         </w:rPr>
       </w:pPr>
-      <w:bookmarkStart w:id="16" w:name="_Toc233441475"/>
+      <w:bookmarkStart w:id="15" w:name="_Toc233441475"/>
       <w:r>
         <w:rPr>
           <w:rFonts w:ascii="Calibri" w:hAnsi="Calibri" w:cs="Calibri"/>
@@ -14412,7 +14197,7 @@
         </w:rPr>
         <w:t>3.3 Consultoras especializadas por NR</w:t>
       </w:r>
-      <w:bookmarkEnd w:id="16"/>
+      <w:bookmarkEnd w:id="15"/>
     </w:p>
     <w:p>
       <w:pPr>
@@ -14806,7 +14591,7 @@
           <w:szCs w:val="24"/>
         </w:rPr>
       </w:pPr>
-      <w:bookmarkStart w:id="17" w:name="_Toc233441476"/>
+      <w:bookmarkStart w:id="16" w:name="_Toc233441476"/>
       <w:r>
         <w:rPr>
           <w:rFonts w:ascii="Calibri" w:hAnsi="Calibri" w:cs="Calibri"/>
@@ -14816,7 +14601,7 @@
         </w:rPr>
         <w:t>3.4 Jornada e ponto eletrônico (Portaria MTP 671/2021)</w:t>
       </w:r>
-      <w:bookmarkEnd w:id="17"/>
+      <w:bookmarkEnd w:id="16"/>
     </w:p>
     <w:tbl>
       <w:tblPr>
@@ -14877,7 +14662,6 @@
                 <w:sz w:val="24"/>
                 <w:szCs w:val="24"/>
               </w:rPr>
-              <w:lastRenderedPageBreak/>
               <w:t>Skill</w:t>
             </w:r>
           </w:p>
@@ -15310,7 +15094,7 @@
           <w:szCs w:val="24"/>
         </w:rPr>
       </w:pPr>
-      <w:bookmarkStart w:id="18" w:name="_Toc233441477"/>
+      <w:bookmarkStart w:id="17" w:name="_Toc233441477"/>
       <w:r>
         <w:rPr>
           <w:rFonts w:ascii="Calibri" w:hAnsi="Calibri" w:cs="Calibri"/>
@@ -15320,7 +15104,7 @@
         </w:rPr>
         <w:t>3.5 Empacotamento, rastreamento e relatórios</w:t>
       </w:r>
-      <w:bookmarkEnd w:id="18"/>
+      <w:bookmarkEnd w:id="17"/>
     </w:p>
     <w:tbl>
       <w:tblPr>
@@ -15381,6 +15165,7 @@
                 <w:sz w:val="24"/>
                 <w:szCs w:val="24"/>
               </w:rPr>
+              <w:lastRenderedPageBreak/>
               <w:t>Skill</w:t>
             </w:r>
           </w:p>
@@ -16096,18 +15881,7 @@
           <w:szCs w:val="24"/>
           <w:shd w:val="clear" w:color="auto" w:fill="FDFDFC"/>
         </w:rPr>
-        <w:t xml:space="preserve">Somente a título de informação pode estar </w:t>
-      </w:r>
-      <w:r>
-        <w:rPr>
-          <w:rFonts w:ascii="Calibri" w:hAnsi="Calibri" w:cs="Calibri"/>
-          <w:color w:val="000000" w:themeColor="text1"/>
-          <w:sz w:val="24"/>
-          <w:szCs w:val="24"/>
-          <w:shd w:val="clear" w:color="auto" w:fill="FDFDFC"/>
-        </w:rPr>
-        <w:lastRenderedPageBreak/>
-        <w:t>desatualizad</w:t>
+        <w:t>Somente a título de informação pode estar desatualizad</w:t>
       </w:r>
       <w:r>
         <w:rPr>
@@ -16660,6 +16434,7 @@
                 <w:bdr w:val="single" w:sz="6" w:space="1" w:color="2A323C" w:frame="1"/>
                 <w:shd w:val="clear" w:color="auto" w:fill="0D1117"/>
               </w:rPr>
+              <w:lastRenderedPageBreak/>
               <w:t>checar_pii.py</w:t>
             </w:r>
           </w:p>
@@ -17839,16 +17614,7 @@
                 <w:sz w:val="24"/>
                 <w:szCs w:val="24"/>
               </w:rPr>
-              <w:t xml:space="preserve"> -p, 1 chamada por ID; </w:t>
-            </w:r>
-            <w:r>
-              <w:rPr>
-                <w:rFonts w:ascii="Calibri" w:hAnsi="Calibri" w:cs="Calibri"/>
-                <w:sz w:val="24"/>
-                <w:szCs w:val="24"/>
-              </w:rPr>
-              <w:lastRenderedPageBreak/>
-              <w:t>falha de login/rede é inconclusiva, nunca veredito). Emite relatório legível + JSON. Só leitura.</w:t>
+              <w:t xml:space="preserve"> -p, 1 chamada por ID; falha de login/rede é inconclusiva, nunca veredito). Emite relatório legível + JSON. Só leitura.</w:t>
             </w:r>
           </w:p>
         </w:tc>
@@ -17886,7 +17652,6 @@
                 <w:bdr w:val="single" w:sz="6" w:space="1" w:color="2A323C" w:frame="1"/>
                 <w:shd w:val="clear" w:color="auto" w:fill="0D1117"/>
               </w:rPr>
-              <w:lastRenderedPageBreak/>
               <w:t>fotos_para_pdf.py</w:t>
             </w:r>
           </w:p>
@@ -18281,6 +18046,7 @@
                 <w:bdr w:val="single" w:sz="6" w:space="1" w:color="2A323C" w:frame="1"/>
                 <w:shd w:val="clear" w:color="auto" w:fill="0D1117"/>
               </w:rPr>
+              <w:lastRenderedPageBreak/>
               <w:t>scan_autos.py</w:t>
             </w:r>
           </w:p>
@@ -19285,7 +19051,7 @@
           <w:szCs w:val="24"/>
         </w:rPr>
       </w:pPr>
-      <w:bookmarkStart w:id="19" w:name="_Toc233441478"/>
+      <w:bookmarkStart w:id="18" w:name="_Toc233441478"/>
       <w:r>
         <w:rPr>
           <w:rFonts w:ascii="Calibri" w:hAnsi="Calibri" w:cs="Calibri"/>
@@ -19296,7 +19062,7 @@
         <w:lastRenderedPageBreak/>
         <w:t>4. Como funciona a anonimização</w:t>
       </w:r>
-      <w:bookmarkEnd w:id="19"/>
+      <w:bookmarkEnd w:id="18"/>
     </w:p>
     <w:p>
       <w:pPr>
@@ -19616,7 +19382,7 @@
           <w:szCs w:val="24"/>
         </w:rPr>
       </w:pPr>
-      <w:bookmarkStart w:id="20" w:name="_Toc233441479"/>
+      <w:bookmarkStart w:id="19" w:name="_Toc233441479"/>
       <w:r>
         <w:rPr>
           <w:rFonts w:ascii="Calibri" w:hAnsi="Calibri" w:cs="Calibri"/>
@@ -19626,7 +19392,7 @@
         </w:rPr>
         <w:t>Fluxo típico de uma fiscalização</w:t>
       </w:r>
-      <w:bookmarkEnd w:id="20"/>
+      <w:bookmarkEnd w:id="19"/>
     </w:p>
     <w:p>
       <w:pPr>
@@ -20563,8 +20329,14 @@
     </w:p>
     <w:p>
       <w:pPr>
-        <w:rPr>
-          <w:rFonts w:ascii="Calibri" w:hAnsi="Calibri" w:cs="Calibri"/>
+        <w:pStyle w:val="Ttulo2"/>
+        <w:numPr>
+          <w:ilvl w:val="0"/>
+          <w:numId w:val="7"/>
+        </w:numPr>
+        <w:rPr>
+          <w:rFonts w:ascii="Calibri" w:hAnsi="Calibri" w:cs="Calibri"/>
+          <w:color w:val="C55A11"/>
           <w:sz w:val="24"/>
           <w:szCs w:val="24"/>
         </w:rPr>
@@ -20577,37 +20349,377 @@
         </w:rPr>
         <w:br w:type="page"/>
       </w:r>
-    </w:p>
-    <w:p>
-      <w:pPr>
-        <w:rPr>
-          <w:rFonts w:ascii="Calibri" w:hAnsi="Calibri" w:cs="Calibri"/>
-          <w:sz w:val="24"/>
-          <w:szCs w:val="24"/>
-        </w:rPr>
-      </w:pPr>
-    </w:p>
-    <w:p>
-      <w:pPr>
-        <w:pStyle w:val="Ttulo1"/>
-        <w:rPr>
-          <w:rFonts w:ascii="Calibri" w:hAnsi="Calibri" w:cs="Calibri"/>
-          <w:color w:val="E97132"/>
-          <w:sz w:val="24"/>
-          <w:szCs w:val="24"/>
-        </w:rPr>
-      </w:pPr>
-      <w:bookmarkStart w:id="21" w:name="_Toc233441480"/>
-      <w:r>
-        <w:rPr>
-          <w:rFonts w:ascii="Calibri" w:hAnsi="Calibri" w:cs="Calibri"/>
-          <w:color w:val="E97132"/>
-          <w:sz w:val="24"/>
-          <w:szCs w:val="24"/>
-        </w:rPr>
-        <w:t>6. Boas práticas e segurança</w:t>
-      </w:r>
-      <w:bookmarkEnd w:id="21"/>
+      <w:bookmarkStart w:id="20" w:name="_Toc990000028"/>
+      <w:r>
+        <w:rPr>
+          <w:rFonts w:ascii="Calibri" w:hAnsi="Calibri" w:cs="Calibri"/>
+          <w:color w:val="C55A11"/>
+          <w:sz w:val="24"/>
+          <w:szCs w:val="24"/>
+        </w:rPr>
+        <w:lastRenderedPageBreak/>
+        <w:t xml:space="preserve"> Painel e extensão Chrome/Edge — as notificações do DET direto na sua ficha</w:t>
+      </w:r>
+      <w:bookmarkEnd w:id="20"/>
+    </w:p>
+    <w:p>
+      <w:pPr>
+        <w:pStyle w:val="Ttulo2"/>
+        <w:rPr>
+          <w:rFonts w:ascii="Calibri" w:hAnsi="Calibri" w:cs="Calibri"/>
+          <w:color w:val="C55A11"/>
+          <w:sz w:val="24"/>
+          <w:szCs w:val="24"/>
+        </w:rPr>
+      </w:pPr>
+    </w:p>
+    <w:p>
+      <w:pPr>
+        <w:spacing w:after="120"/>
+        <w:jc w:val="both"/>
+        <w:rPr>
+          <w:rFonts w:ascii="Calibri" w:hAnsi="Calibri" w:cs="Calibri"/>
+          <w:sz w:val="24"/>
+          <w:szCs w:val="24"/>
+        </w:rPr>
+      </w:pPr>
+      <w:r>
+        <w:rPr>
+          <w:rFonts w:ascii="Calibri" w:hAnsi="Calibri" w:cs="Calibri"/>
+          <w:b/>
+          <w:bCs/>
+          <w:sz w:val="24"/>
+          <w:szCs w:val="24"/>
+        </w:rPr>
+        <w:t xml:space="preserve">Painel: </w:t>
+      </w:r>
+      <w:r>
+        <w:rPr>
+          <w:rFonts w:ascii="Calibri" w:hAnsi="Calibri" w:cs="Calibri"/>
+          <w:sz w:val="24"/>
+          <w:szCs w:val="24"/>
+        </w:rPr>
+        <w:t xml:space="preserve">O </w:t>
+      </w:r>
+      <w:proofErr w:type="spellStart"/>
+      <w:r>
+        <w:rPr>
+          <w:rFonts w:ascii="Calibri" w:hAnsi="Calibri" w:cs="Calibri"/>
+          <w:sz w:val="24"/>
+          <w:szCs w:val="24"/>
+        </w:rPr>
+        <w:t>claude</w:t>
+      </w:r>
+      <w:proofErr w:type="spellEnd"/>
+      <w:r>
+        <w:rPr>
+          <w:rFonts w:ascii="Calibri" w:hAnsi="Calibri" w:cs="Calibri"/>
+          <w:sz w:val="24"/>
+          <w:szCs w:val="24"/>
+        </w:rPr>
+        <w:t xml:space="preserve"> </w:t>
+      </w:r>
+      <w:proofErr w:type="spellStart"/>
+      <w:r>
+        <w:rPr>
+          <w:rFonts w:ascii="Calibri" w:hAnsi="Calibri" w:cs="Calibri"/>
+          <w:sz w:val="24"/>
+          <w:szCs w:val="24"/>
+        </w:rPr>
+        <w:t>code</w:t>
+      </w:r>
+      <w:proofErr w:type="spellEnd"/>
+      <w:r>
+        <w:rPr>
+          <w:rFonts w:ascii="Calibri" w:hAnsi="Calibri" w:cs="Calibri"/>
+          <w:sz w:val="24"/>
+          <w:szCs w:val="24"/>
+        </w:rPr>
+        <w:t xml:space="preserve"> gera um pequeno painel ativo rodando localmente na sua </w:t>
+      </w:r>
+      <w:proofErr w:type="gramStart"/>
+      <w:r>
+        <w:rPr>
+          <w:rFonts w:ascii="Calibri" w:hAnsi="Calibri" w:cs="Calibri"/>
+          <w:sz w:val="24"/>
+          <w:szCs w:val="24"/>
+        </w:rPr>
+        <w:t>maquina</w:t>
+      </w:r>
+      <w:proofErr w:type="gramEnd"/>
+      <w:r>
+        <w:rPr>
+          <w:rFonts w:ascii="Calibri" w:hAnsi="Calibri" w:cs="Calibri"/>
+          <w:sz w:val="24"/>
+          <w:szCs w:val="24"/>
+        </w:rPr>
+        <w:t xml:space="preserve"> num “</w:t>
+      </w:r>
+      <w:proofErr w:type="spellStart"/>
+      <w:proofErr w:type="gramStart"/>
+      <w:r>
+        <w:rPr>
+          <w:rFonts w:ascii="Calibri" w:hAnsi="Calibri" w:cs="Calibri"/>
+          <w:sz w:val="24"/>
+          <w:szCs w:val="24"/>
+        </w:rPr>
+        <w:t>servidorzinho”que</w:t>
+      </w:r>
+      <w:proofErr w:type="spellEnd"/>
+      <w:proofErr w:type="gramEnd"/>
+      <w:r>
+        <w:rPr>
+          <w:rFonts w:ascii="Calibri" w:hAnsi="Calibri" w:cs="Calibri"/>
+          <w:sz w:val="24"/>
+          <w:szCs w:val="24"/>
+        </w:rPr>
+        <w:t xml:space="preserve"> consume menos de 10MB. Com ele você pode ter uma visão mais ampliada de todas suas fiscalizações em andamento, desde que elas estejam na pasta “Documentos &gt;&gt; AFT &gt;&gt; OS ATIVAS”. Pode ser uma mão na roda para quem trabalha em dupla e não gosta da poluição e bagunça do SFITWEB e DET e quer ter uma visão em cards de suas auditorias. </w:t>
+      </w:r>
+    </w:p>
+    <w:p>
+      <w:pPr>
+        <w:pStyle w:val="Ttulo2"/>
+        <w:rPr>
+          <w:rFonts w:ascii="Calibri" w:hAnsi="Calibri" w:cs="Calibri"/>
+          <w:color w:val="C55A11"/>
+          <w:sz w:val="24"/>
+          <w:szCs w:val="24"/>
+        </w:rPr>
+      </w:pPr>
+    </w:p>
+    <w:p>
+      <w:pPr>
+        <w:pStyle w:val="Ttulo2"/>
+        <w:rPr>
+          <w:rFonts w:ascii="Calibri" w:hAnsi="Calibri" w:cs="Calibri"/>
+          <w:color w:val="C55A11"/>
+          <w:sz w:val="24"/>
+          <w:szCs w:val="24"/>
+        </w:rPr>
+      </w:pPr>
+      <w:r>
+        <w:rPr>
+          <w:rFonts w:ascii="Calibri" w:hAnsi="Calibri" w:cs="Calibri"/>
+          <w:noProof/>
+          <w:color w:val="C55A11"/>
+          <w:sz w:val="24"/>
+          <w:szCs w:val="24"/>
+        </w:rPr>
+        <w:drawing>
+          <wp:inline distT="0" distB="0" distL="0" distR="0" wp14:anchorId="6B0D18E8" wp14:editId="70815D03">
+            <wp:extent cx="6645910" cy="3750310"/>
+            <wp:effectExtent l="0" t="0" r="0" b="0"/>
+            <wp:docPr id="1887839236" name="Imagem 1" descr="Interface gráfica do usuário, Aplicativo&#10;&#10;O conteúdo gerado por IA pode estar incorreto."/>
+            <wp:cNvGraphicFramePr>
+              <a:graphicFrameLocks xmlns:a="http://schemas.openxmlformats.org/drawingml/2006/main" noChangeAspect="1"/>
+            </wp:cNvGraphicFramePr>
+            <a:graphic xmlns:a="http://schemas.openxmlformats.org/drawingml/2006/main">
+              <a:graphicData uri="http://schemas.openxmlformats.org/drawingml/2006/picture">
+                <pic:pic xmlns:pic="http://schemas.openxmlformats.org/drawingml/2006/picture">
+                  <pic:nvPicPr>
+                    <pic:cNvPr id="1887839236" name="Imagem 1" descr="Interface gráfica do usuário, Aplicativo&#10;&#10;O conteúdo gerado por IA pode estar incorreto."/>
+                    <pic:cNvPicPr/>
+                  </pic:nvPicPr>
+                  <pic:blipFill>
+                    <a:blip r:embed="rId24" cstate="print">
+                      <a:extLst>
+                        <a:ext uri="{28A0092B-C50C-407E-A947-70E740481C1C}">
+                          <a14:useLocalDpi xmlns:a14="http://schemas.microsoft.com/office/drawing/2010/main" val="0"/>
+                        </a:ext>
+                      </a:extLst>
+                    </a:blip>
+                    <a:stretch>
+                      <a:fillRect/>
+                    </a:stretch>
+                  </pic:blipFill>
+                  <pic:spPr>
+                    <a:xfrm>
+                      <a:off x="0" y="0"/>
+                      <a:ext cx="6645910" cy="3750310"/>
+                    </a:xfrm>
+                    <a:prstGeom prst="rect">
+                      <a:avLst/>
+                    </a:prstGeom>
+                  </pic:spPr>
+                </pic:pic>
+              </a:graphicData>
+            </a:graphic>
+          </wp:inline>
+        </w:drawing>
+      </w:r>
+    </w:p>
+    <w:p>
+      <w:pPr>
+        <w:spacing w:after="120"/>
+        <w:jc w:val="both"/>
+        <w:rPr>
+          <w:rFonts w:ascii="Calibri" w:hAnsi="Calibri" w:cs="Calibri"/>
+          <w:sz w:val="24"/>
+          <w:szCs w:val="24"/>
+        </w:rPr>
+      </w:pPr>
+      <w:r>
+        <w:rPr>
+          <w:rFonts w:ascii="Calibri" w:hAnsi="Calibri" w:cs="Calibri"/>
+          <w:b/>
+          <w:bCs/>
+          <w:sz w:val="24"/>
+          <w:szCs w:val="24"/>
+        </w:rPr>
+        <w:br/>
+      </w:r>
+      <w:r>
+        <w:rPr>
+          <w:rFonts w:ascii="Calibri" w:hAnsi="Calibri" w:cs="Calibri"/>
+          <w:b/>
+          <w:bCs/>
+          <w:sz w:val="24"/>
+          <w:szCs w:val="24"/>
+        </w:rPr>
+        <w:br/>
+      </w:r>
+      <w:r>
+        <w:rPr>
+          <w:rFonts w:ascii="Calibri" w:hAnsi="Calibri" w:cs="Calibri"/>
+          <w:sz w:val="24"/>
+          <w:szCs w:val="24"/>
+        </w:rPr>
+        <w:t>Esse painel pode ser melhor ainda: desenvolvi uma extensão que funciona no Chrome e Edge que faz captura das informações do nosso DET, logado, e joga essas informações para a memória de cada fiscalização, refletindo nesse painel. Coisas como número da notificação, data de lavratura, ciência, entregas. É instalável em 15 segundos. Juro, 15 segundos.</w:t>
+      </w:r>
+    </w:p>
+    <w:p>
+      <w:pPr>
+        <w:spacing w:after="120"/>
+        <w:jc w:val="both"/>
+        <w:rPr>
+          <w:rFonts w:ascii="Calibri" w:hAnsi="Calibri" w:cs="Calibri"/>
+          <w:sz w:val="24"/>
+          <w:szCs w:val="24"/>
+        </w:rPr>
+      </w:pPr>
+      <w:r>
+        <w:rPr>
+          <w:rFonts w:ascii="Calibri" w:hAnsi="Calibri" w:cs="Calibri"/>
+          <w:b/>
+          <w:bCs/>
+          <w:sz w:val="24"/>
+          <w:szCs w:val="24"/>
+        </w:rPr>
+        <w:br/>
+        <w:t xml:space="preserve">O que é. </w:t>
+      </w:r>
+      <w:r>
+        <w:rPr>
+          <w:rFonts w:ascii="Calibri" w:hAnsi="Calibri" w:cs="Calibri"/>
+          <w:sz w:val="24"/>
+          <w:szCs w:val="24"/>
+        </w:rPr>
+        <w:t xml:space="preserve">A </w:t>
+      </w:r>
+      <w:r>
+        <w:rPr>
+          <w:rFonts w:ascii="Calibri" w:hAnsi="Calibri" w:cs="Calibri"/>
+          <w:b/>
+          <w:bCs/>
+          <w:sz w:val="24"/>
+          <w:szCs w:val="24"/>
+        </w:rPr>
+        <w:t>Sync DET</w:t>
+      </w:r>
+      <w:r>
+        <w:rPr>
+          <w:rFonts w:ascii="Calibri" w:hAnsi="Calibri" w:cs="Calibri"/>
+          <w:sz w:val="24"/>
+          <w:szCs w:val="24"/>
+        </w:rPr>
+        <w:t xml:space="preserve"> é uma extensão gratuita para o navegador (Chrome e Edge) que conversa com o painel do toolkit. Ela resolve uma das tarefas mais repetitivas da fiscalização: copiar, notificação por notificação, o código e o prazo de entrega do DET para a ficha de cada auditoria. Com ela, isso vira um clique: as notificações confirmadas caem direto na ficha (memory.md) da OS certa, e o painel passa a acompanhar os vencimentos sozinho.</w:t>
+      </w:r>
+    </w:p>
+    <w:p>
+      <w:pPr>
+        <w:spacing w:after="120"/>
+        <w:jc w:val="both"/>
+        <w:rPr>
+          <w:rFonts w:ascii="Calibri" w:hAnsi="Calibri" w:cs="Calibri"/>
+          <w:sz w:val="24"/>
+          <w:szCs w:val="24"/>
+        </w:rPr>
+      </w:pPr>
+      <w:r>
+        <w:rPr>
+          <w:rFonts w:ascii="Calibri" w:hAnsi="Calibri" w:cs="Calibri"/>
+          <w:b/>
+          <w:bCs/>
+          <w:sz w:val="24"/>
+          <w:szCs w:val="24"/>
+        </w:rPr>
+        <w:t xml:space="preserve">Antes de começar, um pré-requisito: </w:t>
+      </w:r>
+      <w:r>
+        <w:rPr>
+          <w:rFonts w:ascii="Calibri" w:hAnsi="Calibri" w:cs="Calibri"/>
+          <w:sz w:val="24"/>
+          <w:szCs w:val="24"/>
+        </w:rPr>
+        <w:t>o servidor do painel precisa estar ligado na sua máquina. Se você fez a instalação pelo /</w:t>
+      </w:r>
+      <w:proofErr w:type="spellStart"/>
+      <w:r>
+        <w:rPr>
+          <w:rFonts w:ascii="Calibri" w:hAnsi="Calibri" w:cs="Calibri"/>
+          <w:sz w:val="24"/>
+          <w:szCs w:val="24"/>
+        </w:rPr>
+        <w:t>aft</w:t>
+      </w:r>
+      <w:proofErr w:type="spellEnd"/>
+      <w:r>
+        <w:rPr>
+          <w:rFonts w:ascii="Calibri" w:hAnsi="Calibri" w:cs="Calibri"/>
+          <w:sz w:val="24"/>
+          <w:szCs w:val="24"/>
+        </w:rPr>
+        <w:t>-setup, ele já fica sempre ligado (sobe sozinho quando você entra no Windows). Na dúvida, rode /</w:t>
+      </w:r>
+      <w:proofErr w:type="spellStart"/>
+      <w:r>
+        <w:rPr>
+          <w:rFonts w:ascii="Calibri" w:hAnsi="Calibri" w:cs="Calibri"/>
+          <w:sz w:val="24"/>
+          <w:szCs w:val="24"/>
+        </w:rPr>
+        <w:t>aft-doctor</w:t>
+      </w:r>
+      <w:proofErr w:type="spellEnd"/>
+      <w:r>
+        <w:rPr>
+          <w:rFonts w:ascii="Calibri" w:hAnsi="Calibri" w:cs="Calibri"/>
+          <w:sz w:val="24"/>
+          <w:szCs w:val="24"/>
+        </w:rPr>
+        <w:t xml:space="preserve"> — ele confere e explica como resolver.</w:t>
+      </w:r>
+    </w:p>
+    <w:p>
+      <w:pPr>
+        <w:spacing w:after="120"/>
+        <w:jc w:val="both"/>
+        <w:rPr>
+          <w:rFonts w:ascii="Calibri" w:hAnsi="Calibri" w:cs="Calibri"/>
+          <w:sz w:val="24"/>
+          <w:szCs w:val="24"/>
+        </w:rPr>
+      </w:pPr>
+      <w:r>
+        <w:rPr>
+          <w:rFonts w:ascii="Calibri" w:hAnsi="Calibri" w:cs="Calibri"/>
+          <w:b/>
+          <w:bCs/>
+          <w:sz w:val="24"/>
+          <w:szCs w:val="24"/>
+        </w:rPr>
+        <w:t>Instalando a extensão (uma vez só):</w:t>
+      </w:r>
     </w:p>
     <w:p>
       <w:pPr>
@@ -20626,20 +20738,68 @@
       <w:r>
         <w:rPr>
           <w:rFonts w:ascii="Calibri" w:hAnsi="Calibri" w:cs="Calibri"/>
+          <w:sz w:val="24"/>
+          <w:szCs w:val="24"/>
+        </w:rPr>
+        <w:lastRenderedPageBreak/>
+        <w:t xml:space="preserve">Abra a página da extensão na loja do Chrome — </w:t>
+      </w:r>
+      <w:hyperlink r:id="rId25" w:history="1">
+        <w:r>
+          <w:rPr>
+            <w:rStyle w:val="Hyperlink"/>
+            <w:rFonts w:ascii="Calibri" w:hAnsi="Calibri" w:cs="Calibri"/>
+            <w:sz w:val="24"/>
+            <w:szCs w:val="24"/>
+          </w:rPr>
+          <w:t xml:space="preserve">Sync DET — </w:t>
+        </w:r>
+        <w:proofErr w:type="spellStart"/>
+        <w:r>
+          <w:rPr>
+            <w:rStyle w:val="Hyperlink"/>
+            <w:rFonts w:ascii="Calibri" w:hAnsi="Calibri" w:cs="Calibri"/>
+            <w:sz w:val="24"/>
+            <w:szCs w:val="24"/>
+          </w:rPr>
+          <w:t>SisOS</w:t>
+        </w:r>
+        <w:proofErr w:type="spellEnd"/>
+        <w:r>
+          <w:rPr>
+            <w:rStyle w:val="Hyperlink"/>
+            <w:rFonts w:ascii="Calibri" w:hAnsi="Calibri" w:cs="Calibri"/>
+            <w:sz w:val="24"/>
+            <w:szCs w:val="24"/>
+          </w:rPr>
+          <w:t xml:space="preserve"> / AFT Toolkit</w:t>
+        </w:r>
+      </w:hyperlink>
+      <w:r>
+        <w:rPr>
+          <w:rFonts w:ascii="Calibri" w:hAnsi="Calibri" w:cs="Calibri"/>
+          <w:sz w:val="24"/>
+          <w:szCs w:val="24"/>
+        </w:rPr>
+        <w:t xml:space="preserve"> — e clique em </w:t>
+      </w:r>
+      <w:r>
+        <w:rPr>
+          <w:rFonts w:ascii="Calibri" w:hAnsi="Calibri" w:cs="Calibri"/>
           <w:b/>
           <w:bCs/>
           <w:sz w:val="24"/>
           <w:szCs w:val="24"/>
         </w:rPr>
-        <w:t xml:space="preserve">Revise sempre. </w:t>
-      </w:r>
-      <w:r>
-        <w:rPr>
-          <w:rFonts w:ascii="Calibri" w:hAnsi="Calibri" w:cs="Calibri"/>
-          <w:sz w:val="24"/>
-          <w:szCs w:val="24"/>
-        </w:rPr>
-        <w:t>A IA é apoio à redação e organização. O conteúdo jurídico de cada auto, termo e relatório é responsabilidade do Auditor. Confira o código da ementa no ementário oficial antes de transmitir.</w:t>
+        <w:t>Usar no Chrome</w:t>
+      </w:r>
+      <w:r>
+        <w:rPr>
+          <w:rFonts w:ascii="Calibri" w:hAnsi="Calibri" w:cs="Calibri"/>
+          <w:sz w:val="24"/>
+          <w:szCs w:val="24"/>
+        </w:rPr>
+        <w:t>. No Microsoft Edge o caminho é o mesmo: a loja pede só uma confirmação a mais (“Permitir extensões de outras lojas”) e o botão vira “Instalar”.</w:t>
       </w:r>
     </w:p>
     <w:p>
@@ -20659,20 +20819,10 @@
       <w:r>
         <w:rPr>
           <w:rFonts w:ascii="Calibri" w:hAnsi="Calibri" w:cs="Calibri"/>
-          <w:b/>
-          <w:bCs/>
-          <w:sz w:val="24"/>
-          <w:szCs w:val="24"/>
-        </w:rPr>
-        <w:t xml:space="preserve">Nada de serviços online com documentos da fiscalização. </w:t>
-      </w:r>
-      <w:r>
-        <w:rPr>
-          <w:rFonts w:ascii="Calibri" w:hAnsi="Calibri" w:cs="Calibri"/>
-          <w:sz w:val="24"/>
-          <w:szCs w:val="24"/>
-        </w:rPr>
-        <w:t>Compressão de PDF, conversão de fotos e validação de arquivos são feitas por scripts locais do toolkit. Nunca use compressores ou conversores de site.</w:t>
+          <w:sz w:val="24"/>
+          <w:szCs w:val="24"/>
+        </w:rPr>
+        <w:t>Fixe a extensão na barra do navegador: clique no ícone de quebra-cabeça (🧩) e depois no alfinete ao lado de “Sync DET”. Assim ela fica sempre à vista.</w:t>
       </w:r>
     </w:p>
     <w:p>
@@ -20692,14 +20842,29 @@
       <w:r>
         <w:rPr>
           <w:rFonts w:ascii="Calibri" w:hAnsi="Calibri" w:cs="Calibri"/>
+          <w:sz w:val="24"/>
+          <w:szCs w:val="24"/>
+        </w:rPr>
+        <w:t xml:space="preserve">Clique no ícone da extensão. Na primeira abertura aparece a tela de configuração: marque a caixa </w:t>
+      </w:r>
+      <w:r>
+        <w:rPr>
+          <w:rFonts w:ascii="Calibri" w:hAnsi="Calibri" w:cs="Calibri"/>
           <w:b/>
           <w:bCs/>
           <w:sz w:val="24"/>
           <w:szCs w:val="24"/>
         </w:rPr>
-        <w:t xml:space="preserve">O </w:t>
-      </w:r>
-      <w:proofErr w:type="gramStart"/>
+        <w:t>PAINEL LOCAL (AFT TOOLKIT)</w:t>
+      </w:r>
+      <w:r>
+        <w:rPr>
+          <w:rFonts w:ascii="Calibri" w:hAnsi="Calibri" w:cs="Calibri"/>
+          <w:sz w:val="24"/>
+          <w:szCs w:val="24"/>
+        </w:rPr>
+        <w:t xml:space="preserve"> e clique em </w:t>
+      </w:r>
       <w:r>
         <w:rPr>
           <w:rFonts w:ascii="Calibri" w:hAnsi="Calibri" w:cs="Calibri"/>
@@ -20708,26 +20873,15 @@
           <w:sz w:val="24"/>
           <w:szCs w:val="24"/>
         </w:rPr>
-        <w:t>arquivo .depara</w:t>
-      </w:r>
-      <w:proofErr w:type="gramEnd"/>
-      <w:r>
-        <w:rPr>
-          <w:rFonts w:ascii="Calibri" w:hAnsi="Calibri" w:cs="Calibri"/>
-          <w:b/>
-          <w:bCs/>
-          <w:sz w:val="24"/>
-          <w:szCs w:val="24"/>
-        </w:rPr>
-        <w:t xml:space="preserve"> é sensível. </w:t>
-      </w:r>
-      <w:r>
-        <w:rPr>
-          <w:rFonts w:ascii="Calibri" w:hAnsi="Calibri" w:cs="Calibri"/>
-          <w:sz w:val="24"/>
-          <w:szCs w:val="24"/>
-        </w:rPr>
-        <w:t>Ele liga os códigos aos dados reais. Não compartilhe, não envie por e-mail, não suba para nuvem.</w:t>
+        <w:t>Salvar</w:t>
+      </w:r>
+      <w:r>
+        <w:rPr>
+          <w:rFonts w:ascii="Calibri" w:hAnsi="Calibri" w:cs="Calibri"/>
+          <w:sz w:val="24"/>
+          <w:szCs w:val="24"/>
+        </w:rPr>
+        <w:t>. Pronto — é a única configuração necessária.</w:t>
       </w:r>
     </w:p>
     <w:p>
@@ -20747,42 +20901,147 @@
       <w:r>
         <w:rPr>
           <w:rFonts w:ascii="Calibri" w:hAnsi="Calibri" w:cs="Calibri"/>
+          <w:sz w:val="24"/>
+          <w:szCs w:val="24"/>
+        </w:rPr>
+        <w:t xml:space="preserve">Os campos “URL do </w:t>
+      </w:r>
+      <w:proofErr w:type="spellStart"/>
+      <w:r>
+        <w:rPr>
+          <w:rFonts w:ascii="Calibri" w:hAnsi="Calibri" w:cs="Calibri"/>
+          <w:sz w:val="24"/>
+          <w:szCs w:val="24"/>
+        </w:rPr>
+        <w:t>SisOS</w:t>
+      </w:r>
+      <w:proofErr w:type="spellEnd"/>
+      <w:r>
+        <w:rPr>
+          <w:rFonts w:ascii="Calibri" w:hAnsi="Calibri" w:cs="Calibri"/>
+          <w:sz w:val="24"/>
+          <w:szCs w:val="24"/>
+        </w:rPr>
+        <w:t xml:space="preserve">” e “Token de acesso” podem ficar em branco: eles pertencem a outro modo de uso (o </w:t>
+      </w:r>
+      <w:proofErr w:type="spellStart"/>
+      <w:r>
+        <w:rPr>
+          <w:rFonts w:ascii="Calibri" w:hAnsi="Calibri" w:cs="Calibri"/>
+          <w:sz w:val="24"/>
+          <w:szCs w:val="24"/>
+        </w:rPr>
+        <w:t>SisOS</w:t>
+      </w:r>
+      <w:proofErr w:type="spellEnd"/>
+      <w:r>
+        <w:rPr>
+          <w:rFonts w:ascii="Calibri" w:hAnsi="Calibri" w:cs="Calibri"/>
+          <w:sz w:val="24"/>
+          <w:szCs w:val="24"/>
+        </w:rPr>
+        <w:t>, um sistema na nuvem) e não são necessários com o painel local. O endereço http://127.0.0.1:8347 que aparece no campo do painel já é o padrão — não precisa mexer.</w:t>
+      </w:r>
+    </w:p>
+    <w:p>
+      <w:pPr>
+        <w:spacing w:after="80"/>
+        <w:rPr>
+          <w:rFonts w:ascii="Calibri" w:hAnsi="Calibri" w:cs="Calibri"/>
+          <w:sz w:val="24"/>
+          <w:szCs w:val="24"/>
+        </w:rPr>
+      </w:pPr>
+    </w:p>
+    <w:p>
+      <w:pPr>
+        <w:spacing w:after="80"/>
+        <w:jc w:val="center"/>
+        <w:rPr>
+          <w:rFonts w:ascii="Calibri" w:hAnsi="Calibri" w:cs="Calibri"/>
+          <w:sz w:val="24"/>
+          <w:szCs w:val="24"/>
+        </w:rPr>
+      </w:pPr>
+      <w:r>
+        <w:rPr>
+          <w:rFonts w:ascii="Calibri" w:hAnsi="Calibri" w:cs="Calibri"/>
+          <w:noProof/>
+          <w:sz w:val="24"/>
+          <w:szCs w:val="24"/>
+        </w:rPr>
+        <w:drawing>
+          <wp:inline distT="0" distB="0" distL="0" distR="0" wp14:anchorId="2DDA291D" wp14:editId="2567FC1A">
+            <wp:extent cx="3217333" cy="4739975"/>
+            <wp:effectExtent l="0" t="0" r="0" b="0"/>
+            <wp:docPr id="1593862050" name="Imagem 1" descr="Interface gráfica do usuário, Texto, Aplicativo, Email&#10;&#10;O conteúdo gerado por IA pode estar incorreto."/>
+            <wp:cNvGraphicFramePr>
+              <a:graphicFrameLocks xmlns:a="http://schemas.openxmlformats.org/drawingml/2006/main" noChangeAspect="1"/>
+            </wp:cNvGraphicFramePr>
+            <a:graphic xmlns:a="http://schemas.openxmlformats.org/drawingml/2006/main">
+              <a:graphicData uri="http://schemas.openxmlformats.org/drawingml/2006/picture">
+                <pic:pic xmlns:pic="http://schemas.openxmlformats.org/drawingml/2006/picture">
+                  <pic:nvPicPr>
+                    <pic:cNvPr id="1593862050" name="Imagem 1" descr="Interface gráfica do usuário, Texto, Aplicativo, Email&#10;&#10;O conteúdo gerado por IA pode estar incorreto."/>
+                    <pic:cNvPicPr/>
+                  </pic:nvPicPr>
+                  <pic:blipFill>
+                    <a:blip r:embed="rId26">
+                      <a:extLst>
+                        <a:ext uri="{28A0092B-C50C-407E-A947-70E740481C1C}">
+                          <a14:useLocalDpi xmlns:a14="http://schemas.microsoft.com/office/drawing/2010/main" val="0"/>
+                        </a:ext>
+                      </a:extLst>
+                    </a:blip>
+                    <a:stretch>
+                      <a:fillRect/>
+                    </a:stretch>
+                  </pic:blipFill>
+                  <pic:spPr>
+                    <a:xfrm>
+                      <a:off x="0" y="0"/>
+                      <a:ext cx="3231965" cy="4761532"/>
+                    </a:xfrm>
+                    <a:prstGeom prst="rect">
+                      <a:avLst/>
+                    </a:prstGeom>
+                  </pic:spPr>
+                </pic:pic>
+              </a:graphicData>
+            </a:graphic>
+          </wp:inline>
+        </w:drawing>
+      </w:r>
+    </w:p>
+    <w:p>
+      <w:pPr>
+        <w:spacing w:after="120"/>
+        <w:rPr>
+          <w:rFonts w:ascii="Calibri" w:hAnsi="Calibri" w:cs="Calibri"/>
+          <w:sz w:val="24"/>
+          <w:szCs w:val="24"/>
+        </w:rPr>
+      </w:pPr>
+    </w:p>
+    <w:p>
+      <w:pPr>
+        <w:spacing w:after="120"/>
+        <w:jc w:val="both"/>
+        <w:rPr>
+          <w:rFonts w:ascii="Calibri" w:hAnsi="Calibri" w:cs="Calibri"/>
+          <w:sz w:val="24"/>
+          <w:szCs w:val="24"/>
+        </w:rPr>
+      </w:pPr>
+      <w:r>
+        <w:rPr>
+          <w:rFonts w:ascii="Calibri" w:hAnsi="Calibri" w:cs="Calibri"/>
           <w:b/>
           <w:bCs/>
           <w:sz w:val="24"/>
           <w:szCs w:val="24"/>
         </w:rPr>
-        <w:t xml:space="preserve">A </w:t>
-      </w:r>
-      <w:proofErr w:type="gramStart"/>
-      <w:r>
-        <w:rPr>
-          <w:rFonts w:ascii="Calibri" w:hAnsi="Calibri" w:cs="Calibri"/>
-          <w:b/>
-          <w:bCs/>
-          <w:sz w:val="24"/>
-          <w:szCs w:val="24"/>
-        </w:rPr>
-        <w:t>cópia .</w:t>
-      </w:r>
-      <w:proofErr w:type="gramEnd"/>
-      <w:r>
-        <w:rPr>
-          <w:rFonts w:ascii="Calibri" w:hAnsi="Calibri" w:cs="Calibri"/>
-          <w:b/>
-          <w:bCs/>
-          <w:sz w:val="24"/>
-          <w:szCs w:val="24"/>
-        </w:rPr>
-        <w:t>tokenized.txt é a versão segura para compartilhar</w:t>
-      </w:r>
-      <w:r>
-        <w:rPr>
-          <w:rFonts w:ascii="Calibri" w:hAnsi="Calibri" w:cs="Calibri"/>
-          <w:sz w:val="24"/>
-          <w:szCs w:val="24"/>
-        </w:rPr>
-        <w:t xml:space="preserve"> com colegas (não contém nome nem CPF de trabalhador).</w:t>
+        <w:t>Usando no dia a dia:</w:t>
       </w:r>
     </w:p>
     <w:p>
@@ -20807,6 +21066,938 @@
           <w:sz w:val="24"/>
           <w:szCs w:val="24"/>
         </w:rPr>
+        <w:t>Entre no DET normalmente</w:t>
+      </w:r>
+      <w:r>
+        <w:rPr>
+          <w:rFonts w:ascii="Calibri" w:hAnsi="Calibri" w:cs="Calibri"/>
+          <w:sz w:val="24"/>
+          <w:szCs w:val="24"/>
+        </w:rPr>
+        <w:t xml:space="preserve"> (auditor-det.sit.trabalho.gov.br), com o seu login gov.br. Só de você navegar logado, a extensão captura sozinha a chave de sessão que o próprio site já usa — pense nela como o crachá que o DET te entrega na entrada. Você não copia, não cola e não digita senha nenhuma na extensão.</w:t>
+      </w:r>
+    </w:p>
+    <w:p>
+      <w:pPr>
+        <w:pStyle w:val="PargrafodaLista"/>
+        <w:numPr>
+          <w:ilvl w:val="0"/>
+          <w:numId w:val="2"/>
+        </w:numPr>
+        <w:spacing w:after="80"/>
+        <w:rPr>
+          <w:rFonts w:ascii="Calibri" w:hAnsi="Calibri" w:cs="Calibri"/>
+          <w:sz w:val="24"/>
+          <w:szCs w:val="24"/>
+        </w:rPr>
+      </w:pPr>
+      <w:r>
+        <w:rPr>
+          <w:rFonts w:ascii="Calibri" w:hAnsi="Calibri" w:cs="Calibri"/>
+          <w:b/>
+          <w:bCs/>
+          <w:sz w:val="24"/>
+          <w:szCs w:val="24"/>
+        </w:rPr>
+        <w:t xml:space="preserve">Clique no botão flutuante Sincronizar, </w:t>
+      </w:r>
+      <w:r>
+        <w:rPr>
+          <w:rFonts w:ascii="Calibri" w:hAnsi="Calibri" w:cs="Calibri"/>
+          <w:sz w:val="24"/>
+          <w:szCs w:val="24"/>
+        </w:rPr>
+        <w:t>no final da página, no canto direito da sua tela, que a extensão acrescenta no canto da página do DET. É ele que dispara a mágica.</w:t>
+      </w:r>
+    </w:p>
+    <w:p>
+      <w:pPr>
+        <w:spacing w:after="80"/>
+        <w:rPr>
+          <w:rFonts w:ascii="Calibri" w:hAnsi="Calibri" w:cs="Calibri"/>
+          <w:sz w:val="24"/>
+          <w:szCs w:val="24"/>
+        </w:rPr>
+      </w:pPr>
+    </w:p>
+    <w:p>
+      <w:pPr>
+        <w:spacing w:after="80"/>
+        <w:jc w:val="center"/>
+        <w:rPr>
+          <w:rFonts w:ascii="Calibri" w:hAnsi="Calibri" w:cs="Calibri"/>
+          <w:sz w:val="24"/>
+          <w:szCs w:val="24"/>
+        </w:rPr>
+      </w:pPr>
+      <w:r>
+        <w:rPr>
+          <w:rFonts w:ascii="Calibri" w:hAnsi="Calibri" w:cs="Calibri"/>
+          <w:noProof/>
+          <w:sz w:val="24"/>
+          <w:szCs w:val="24"/>
+        </w:rPr>
+        <w:lastRenderedPageBreak/>
+        <w:drawing>
+          <wp:inline distT="0" distB="0" distL="0" distR="0" wp14:anchorId="213F3EA0" wp14:editId="28559FFA">
+            <wp:extent cx="3707553" cy="2077307"/>
+            <wp:effectExtent l="0" t="0" r="1270" b="5715"/>
+            <wp:docPr id="248311817" name="Imagem 3" descr="Interface gráfica do usuário, Texto, Aplicativo&#10;&#10;O conteúdo gerado por IA pode estar incorreto."/>
+            <wp:cNvGraphicFramePr>
+              <a:graphicFrameLocks xmlns:a="http://schemas.openxmlformats.org/drawingml/2006/main" noChangeAspect="1"/>
+            </wp:cNvGraphicFramePr>
+            <a:graphic xmlns:a="http://schemas.openxmlformats.org/drawingml/2006/main">
+              <a:graphicData uri="http://schemas.openxmlformats.org/drawingml/2006/picture">
+                <pic:pic xmlns:pic="http://schemas.openxmlformats.org/drawingml/2006/picture">
+                  <pic:nvPicPr>
+                    <pic:cNvPr id="248311817" name="Imagem 3" descr="Interface gráfica do usuário, Texto, Aplicativo&#10;&#10;O conteúdo gerado por IA pode estar incorreto."/>
+                    <pic:cNvPicPr/>
+                  </pic:nvPicPr>
+                  <pic:blipFill>
+                    <a:blip r:embed="rId27" cstate="print">
+                      <a:extLst>
+                        <a:ext uri="{28A0092B-C50C-407E-A947-70E740481C1C}">
+                          <a14:useLocalDpi xmlns:a14="http://schemas.microsoft.com/office/drawing/2010/main" val="0"/>
+                        </a:ext>
+                      </a:extLst>
+                    </a:blip>
+                    <a:stretch>
+                      <a:fillRect/>
+                    </a:stretch>
+                  </pic:blipFill>
+                  <pic:spPr>
+                    <a:xfrm>
+                      <a:off x="0" y="0"/>
+                      <a:ext cx="3738419" cy="2094601"/>
+                    </a:xfrm>
+                    <a:prstGeom prst="rect">
+                      <a:avLst/>
+                    </a:prstGeom>
+                  </pic:spPr>
+                </pic:pic>
+              </a:graphicData>
+            </a:graphic>
+          </wp:inline>
+        </w:drawing>
+      </w:r>
+    </w:p>
+    <w:p>
+      <w:pPr>
+        <w:spacing w:after="80"/>
+        <w:rPr>
+          <w:rFonts w:ascii="Calibri" w:hAnsi="Calibri" w:cs="Calibri"/>
+          <w:sz w:val="24"/>
+          <w:szCs w:val="24"/>
+        </w:rPr>
+      </w:pPr>
+    </w:p>
+    <w:p>
+      <w:pPr>
+        <w:pStyle w:val="PargrafodaLista"/>
+        <w:numPr>
+          <w:ilvl w:val="0"/>
+          <w:numId w:val="2"/>
+        </w:numPr>
+        <w:spacing w:after="80"/>
+        <w:rPr>
+          <w:rFonts w:ascii="Calibri" w:hAnsi="Calibri" w:cs="Calibri"/>
+          <w:sz w:val="24"/>
+          <w:szCs w:val="24"/>
+        </w:rPr>
+      </w:pPr>
+      <w:r>
+        <w:rPr>
+          <w:rFonts w:ascii="Calibri" w:hAnsi="Calibri" w:cs="Calibri"/>
+          <w:sz w:val="24"/>
+          <w:szCs w:val="24"/>
+        </w:rPr>
+        <w:t xml:space="preserve">A extensão entrega informações para o painel local na sua máquina para cada OS de OS ATIVAS/ que tenha CNPJ na ficha e atualiza o memory.md — notificação nova entra como “- </w:t>
+      </w:r>
+      <w:proofErr w:type="gramStart"/>
+      <w:r>
+        <w:rPr>
+          <w:rFonts w:ascii="Calibri" w:hAnsi="Calibri" w:cs="Calibri"/>
+          <w:sz w:val="24"/>
+          <w:szCs w:val="24"/>
+        </w:rPr>
+        <w:t>[ ]</w:t>
+      </w:r>
+      <w:proofErr w:type="gramEnd"/>
+      <w:r>
+        <w:rPr>
+          <w:rFonts w:ascii="Calibri" w:hAnsi="Calibri" w:cs="Calibri"/>
+          <w:sz w:val="24"/>
+          <w:szCs w:val="24"/>
+        </w:rPr>
+        <w:t xml:space="preserve"> CÓDIGO — prazo </w:t>
+      </w:r>
+      <w:proofErr w:type="spellStart"/>
+      <w:r>
+        <w:rPr>
+          <w:rFonts w:ascii="Calibri" w:hAnsi="Calibri" w:cs="Calibri"/>
+          <w:sz w:val="24"/>
+          <w:szCs w:val="24"/>
+        </w:rPr>
+        <w:t>dd</w:t>
+      </w:r>
+      <w:proofErr w:type="spellEnd"/>
+      <w:r>
+        <w:rPr>
+          <w:rFonts w:ascii="Calibri" w:hAnsi="Calibri" w:cs="Calibri"/>
+          <w:sz w:val="24"/>
+          <w:szCs w:val="24"/>
+        </w:rPr>
+        <w:t>/mm/</w:t>
+      </w:r>
+      <w:proofErr w:type="spellStart"/>
+      <w:r>
+        <w:rPr>
+          <w:rFonts w:ascii="Calibri" w:hAnsi="Calibri" w:cs="Calibri"/>
+          <w:sz w:val="24"/>
+          <w:szCs w:val="24"/>
+        </w:rPr>
+        <w:t>aaaa</w:t>
+      </w:r>
+      <w:proofErr w:type="spellEnd"/>
+      <w:r>
+        <w:rPr>
+          <w:rFonts w:ascii="Calibri" w:hAnsi="Calibri" w:cs="Calibri"/>
+          <w:sz w:val="24"/>
+          <w:szCs w:val="24"/>
+        </w:rPr>
+        <w:t>”; prazo que mudou no DET é corrigido na linha existente.</w:t>
+      </w:r>
+    </w:p>
+    <w:p>
+      <w:pPr>
+        <w:pStyle w:val="PargrafodaLista"/>
+        <w:numPr>
+          <w:ilvl w:val="0"/>
+          <w:numId w:val="2"/>
+        </w:numPr>
+        <w:spacing w:after="80"/>
+        <w:rPr>
+          <w:rFonts w:ascii="Calibri" w:hAnsi="Calibri" w:cs="Calibri"/>
+          <w:sz w:val="24"/>
+          <w:szCs w:val="24"/>
+        </w:rPr>
+      </w:pPr>
+      <w:r>
+        <w:rPr>
+          <w:rFonts w:ascii="Calibri" w:hAnsi="Calibri" w:cs="Calibri"/>
+          <w:sz w:val="24"/>
+          <w:szCs w:val="24"/>
+        </w:rPr>
+        <w:t>O resultado aparece num aviso na própria página: “✅ Local: 2 importada(s) · 1 prazo(s) atualizado(s)”. Se o DET devolver notificações de outra fiscalização do mesmo empregador (de um colega, ou uma ação antiga), elas não entram — e o aviso conta quantas foram ignoradas, para você saber que existem.</w:t>
+      </w:r>
+    </w:p>
+    <w:p>
+      <w:pPr>
+        <w:pStyle w:val="PargrafodaLista"/>
+        <w:numPr>
+          <w:ilvl w:val="0"/>
+          <w:numId w:val="2"/>
+        </w:numPr>
+        <w:spacing w:after="80"/>
+        <w:rPr>
+          <w:rFonts w:ascii="Calibri" w:hAnsi="Calibri" w:cs="Calibri"/>
+          <w:sz w:val="24"/>
+          <w:szCs w:val="24"/>
+        </w:rPr>
+      </w:pPr>
+      <w:r>
+        <w:rPr>
+          <w:rFonts w:ascii="Calibri" w:hAnsi="Calibri" w:cs="Calibri"/>
+          <w:sz w:val="24"/>
+          <w:szCs w:val="24"/>
+        </w:rPr>
+        <w:t xml:space="preserve">O resultado é ótimo no painel é ótimo. </w:t>
+      </w:r>
+      <w:proofErr w:type="gramStart"/>
+      <w:r>
+        <w:rPr>
+          <w:rFonts w:ascii="Calibri" w:hAnsi="Calibri" w:cs="Calibri"/>
+          <w:sz w:val="24"/>
+          <w:szCs w:val="24"/>
+        </w:rPr>
+        <w:t>Pra</w:t>
+      </w:r>
+      <w:proofErr w:type="gramEnd"/>
+      <w:r>
+        <w:rPr>
+          <w:rFonts w:ascii="Calibri" w:hAnsi="Calibri" w:cs="Calibri"/>
+          <w:sz w:val="24"/>
+          <w:szCs w:val="24"/>
+        </w:rPr>
+        <w:t xml:space="preserve"> quem trabalha em dupla e quer visualizar só suas </w:t>
+      </w:r>
+      <w:proofErr w:type="spellStart"/>
+      <w:r>
+        <w:rPr>
+          <w:rFonts w:ascii="Calibri" w:hAnsi="Calibri" w:cs="Calibri"/>
+          <w:sz w:val="24"/>
+          <w:szCs w:val="24"/>
+        </w:rPr>
+        <w:t>infos</w:t>
+      </w:r>
+      <w:proofErr w:type="spellEnd"/>
+      <w:r>
+        <w:rPr>
+          <w:rFonts w:ascii="Calibri" w:hAnsi="Calibri" w:cs="Calibri"/>
+          <w:sz w:val="24"/>
+          <w:szCs w:val="24"/>
+        </w:rPr>
+        <w:t xml:space="preserve">, é interessante essa funcionalidade. </w:t>
+      </w:r>
+    </w:p>
+    <w:p>
+      <w:pPr>
+        <w:pStyle w:val="PargrafodaLista"/>
+        <w:spacing w:after="80"/>
+        <w:ind w:left="720"/>
+        <w:rPr>
+          <w:rFonts w:ascii="Calibri" w:hAnsi="Calibri" w:cs="Calibri"/>
+          <w:sz w:val="24"/>
+          <w:szCs w:val="24"/>
+        </w:rPr>
+      </w:pPr>
+    </w:p>
+    <w:p>
+      <w:pPr>
+        <w:pStyle w:val="PargrafodaLista"/>
+        <w:spacing w:after="80"/>
+        <w:ind w:left="720"/>
+        <w:jc w:val="center"/>
+        <w:rPr>
+          <w:rFonts w:ascii="Calibri" w:hAnsi="Calibri" w:cs="Calibri"/>
+          <w:sz w:val="24"/>
+          <w:szCs w:val="24"/>
+        </w:rPr>
+      </w:pPr>
+      <w:r>
+        <w:rPr>
+          <w:rFonts w:ascii="Calibri" w:hAnsi="Calibri" w:cs="Calibri"/>
+          <w:noProof/>
+          <w:sz w:val="24"/>
+          <w:szCs w:val="24"/>
+        </w:rPr>
+        <w:drawing>
+          <wp:inline distT="0" distB="0" distL="0" distR="0" wp14:anchorId="7716A6AA" wp14:editId="592CD78A">
+            <wp:extent cx="4732443" cy="3287750"/>
+            <wp:effectExtent l="0" t="0" r="5080" b="1905"/>
+            <wp:docPr id="1676791193" name="Imagem 4" descr="Interface gráfica do usuário, Texto, Aplicativo, Email&#10;&#10;O conteúdo gerado por IA pode estar incorreto."/>
+            <wp:cNvGraphicFramePr>
+              <a:graphicFrameLocks xmlns:a="http://schemas.openxmlformats.org/drawingml/2006/main" noChangeAspect="1"/>
+            </wp:cNvGraphicFramePr>
+            <a:graphic xmlns:a="http://schemas.openxmlformats.org/drawingml/2006/main">
+              <a:graphicData uri="http://schemas.openxmlformats.org/drawingml/2006/picture">
+                <pic:pic xmlns:pic="http://schemas.openxmlformats.org/drawingml/2006/picture">
+                  <pic:nvPicPr>
+                    <pic:cNvPr id="1676791193" name="Imagem 4" descr="Interface gráfica do usuário, Texto, Aplicativo, Email&#10;&#10;O conteúdo gerado por IA pode estar incorreto."/>
+                    <pic:cNvPicPr/>
+                  </pic:nvPicPr>
+                  <pic:blipFill>
+                    <a:blip r:embed="rId28" cstate="print">
+                      <a:extLst>
+                        <a:ext uri="{28A0092B-C50C-407E-A947-70E740481C1C}">
+                          <a14:useLocalDpi xmlns:a14="http://schemas.microsoft.com/office/drawing/2010/main" val="0"/>
+                        </a:ext>
+                      </a:extLst>
+                    </a:blip>
+                    <a:stretch>
+                      <a:fillRect/>
+                    </a:stretch>
+                  </pic:blipFill>
+                  <pic:spPr>
+                    <a:xfrm>
+                      <a:off x="0" y="0"/>
+                      <a:ext cx="4756154" cy="3304223"/>
+                    </a:xfrm>
+                    <a:prstGeom prst="rect">
+                      <a:avLst/>
+                    </a:prstGeom>
+                  </pic:spPr>
+                </pic:pic>
+              </a:graphicData>
+            </a:graphic>
+          </wp:inline>
+        </w:drawing>
+      </w:r>
+    </w:p>
+    <w:p>
+      <w:pPr>
+        <w:spacing w:after="80"/>
+        <w:rPr>
+          <w:rFonts w:ascii="Calibri" w:hAnsi="Calibri" w:cs="Calibri"/>
+          <w:sz w:val="24"/>
+          <w:szCs w:val="24"/>
+        </w:rPr>
+      </w:pPr>
+    </w:p>
+    <w:p>
+      <w:pPr>
+        <w:spacing w:after="80"/>
+        <w:rPr>
+          <w:rFonts w:ascii="Calibri" w:hAnsi="Calibri" w:cs="Calibri"/>
+          <w:sz w:val="24"/>
+          <w:szCs w:val="24"/>
+        </w:rPr>
+      </w:pPr>
+    </w:p>
+    <w:p>
+      <w:pPr>
+        <w:spacing w:after="120"/>
+        <w:rPr>
+          <w:rFonts w:ascii="Calibri" w:hAnsi="Calibri" w:cs="Calibri"/>
+          <w:sz w:val="24"/>
+          <w:szCs w:val="24"/>
+        </w:rPr>
+      </w:pPr>
+    </w:p>
+    <w:p>
+      <w:pPr>
+        <w:spacing w:after="120"/>
+        <w:jc w:val="both"/>
+        <w:rPr>
+          <w:rFonts w:ascii="Calibri" w:hAnsi="Calibri" w:cs="Calibri"/>
+          <w:sz w:val="24"/>
+          <w:szCs w:val="24"/>
+        </w:rPr>
+      </w:pPr>
+      <w:r>
+        <w:rPr>
+          <w:rFonts w:ascii="Calibri" w:hAnsi="Calibri" w:cs="Calibri"/>
+          <w:b/>
+          <w:bCs/>
+          <w:sz w:val="24"/>
+          <w:szCs w:val="24"/>
+        </w:rPr>
+        <w:t xml:space="preserve">O que a extensão nunca faz. </w:t>
+      </w:r>
+      <w:r>
+        <w:rPr>
+          <w:rFonts w:ascii="Calibri" w:hAnsi="Calibri" w:cs="Calibri"/>
+          <w:sz w:val="24"/>
+          <w:szCs w:val="24"/>
+        </w:rPr>
+        <w:t xml:space="preserve">Ela não marca notificação como respondida (o </w:t>
+      </w:r>
+      <w:proofErr w:type="spellStart"/>
+      <w:r>
+        <w:rPr>
+          <w:rFonts w:ascii="Calibri" w:hAnsi="Calibri" w:cs="Calibri"/>
+          <w:sz w:val="24"/>
+          <w:szCs w:val="24"/>
+        </w:rPr>
+        <w:t>checkbox</w:t>
+      </w:r>
+      <w:proofErr w:type="spellEnd"/>
+      <w:r>
+        <w:rPr>
+          <w:rFonts w:ascii="Calibri" w:hAnsi="Calibri" w:cs="Calibri"/>
+          <w:sz w:val="24"/>
+          <w:szCs w:val="24"/>
+        </w:rPr>
+        <w:t xml:space="preserve"> da ficha é decisão sua, no painel), não altera o que você já escreveu no memory.md (cada arquivo alterado recebe backup antes) e não manda nada para a internet: a conversa entre extensão e painel acontece inteira dentro do seu computador (127.0.0.1 é o endereço da própria máquina). A chave de sessão vive só na memória, expira sozinha em cerca de 30 minutos e não é gravada em arquivo.</w:t>
+      </w:r>
+    </w:p>
+    <w:p>
+      <w:pPr>
+        <w:spacing w:after="120"/>
+        <w:jc w:val="both"/>
+        <w:rPr>
+          <w:rFonts w:ascii="Calibri" w:hAnsi="Calibri" w:cs="Calibri"/>
+          <w:sz w:val="24"/>
+          <w:szCs w:val="24"/>
+        </w:rPr>
+      </w:pPr>
+      <w:r>
+        <w:rPr>
+          <w:rFonts w:ascii="Calibri" w:hAnsi="Calibri" w:cs="Calibri"/>
+          <w:b/>
+          <w:bCs/>
+          <w:sz w:val="24"/>
+          <w:szCs w:val="24"/>
+        </w:rPr>
+        <w:lastRenderedPageBreak/>
+        <w:t>Se algo não funcionar:</w:t>
+      </w:r>
+    </w:p>
+    <w:p>
+      <w:pPr>
+        <w:pStyle w:val="PargrafodaLista"/>
+        <w:numPr>
+          <w:ilvl w:val="0"/>
+          <w:numId w:val="2"/>
+        </w:numPr>
+        <w:spacing w:after="80"/>
+        <w:rPr>
+          <w:rFonts w:ascii="Calibri" w:hAnsi="Calibri" w:cs="Calibri"/>
+          <w:sz w:val="24"/>
+          <w:szCs w:val="24"/>
+        </w:rPr>
+      </w:pPr>
+      <w:r>
+        <w:rPr>
+          <w:rFonts w:ascii="Calibri" w:hAnsi="Calibri" w:cs="Calibri"/>
+          <w:b/>
+          <w:bCs/>
+          <w:sz w:val="24"/>
+          <w:szCs w:val="24"/>
+        </w:rPr>
+        <w:t>“Painel não está no ar”</w:t>
+      </w:r>
+      <w:r>
+        <w:rPr>
+          <w:rFonts w:ascii="Calibri" w:hAnsi="Calibri" w:cs="Calibri"/>
+          <w:sz w:val="24"/>
+          <w:szCs w:val="24"/>
+        </w:rPr>
+        <w:t xml:space="preserve"> — o servidor local não está rodando. Peça ao Claude: /painel (ou rode /</w:t>
+      </w:r>
+      <w:proofErr w:type="spellStart"/>
+      <w:r>
+        <w:rPr>
+          <w:rFonts w:ascii="Calibri" w:hAnsi="Calibri" w:cs="Calibri"/>
+          <w:sz w:val="24"/>
+          <w:szCs w:val="24"/>
+        </w:rPr>
+        <w:t>aft-doctor</w:t>
+      </w:r>
+      <w:proofErr w:type="spellEnd"/>
+      <w:r>
+        <w:rPr>
+          <w:rFonts w:ascii="Calibri" w:hAnsi="Calibri" w:cs="Calibri"/>
+          <w:sz w:val="24"/>
+          <w:szCs w:val="24"/>
+        </w:rPr>
+        <w:t xml:space="preserve"> para diagnosticar).</w:t>
+      </w:r>
+    </w:p>
+    <w:p>
+      <w:pPr>
+        <w:pStyle w:val="PargrafodaLista"/>
+        <w:numPr>
+          <w:ilvl w:val="0"/>
+          <w:numId w:val="2"/>
+        </w:numPr>
+        <w:spacing w:after="80"/>
+        <w:rPr>
+          <w:rFonts w:ascii="Calibri" w:hAnsi="Calibri" w:cs="Calibri"/>
+          <w:sz w:val="24"/>
+          <w:szCs w:val="24"/>
+        </w:rPr>
+      </w:pPr>
+      <w:r>
+        <w:rPr>
+          <w:rFonts w:ascii="Calibri" w:hAnsi="Calibri" w:cs="Calibri"/>
+          <w:b/>
+          <w:bCs/>
+          <w:sz w:val="24"/>
+          <w:szCs w:val="24"/>
+        </w:rPr>
+        <w:t>“Token DET não capturado”</w:t>
+      </w:r>
+      <w:r>
+        <w:rPr>
+          <w:rFonts w:ascii="Calibri" w:hAnsi="Calibri" w:cs="Calibri"/>
+          <w:sz w:val="24"/>
+          <w:szCs w:val="24"/>
+        </w:rPr>
+        <w:t xml:space="preserve"> — a extensão ainda não viu você navegar logado. Abra qualquer página interna do DET (a lista de notificações, por exemplo) e clique em Sincronizar de novo.</w:t>
+      </w:r>
+    </w:p>
+    <w:p>
+      <w:pPr>
+        <w:pStyle w:val="PargrafodaLista"/>
+        <w:numPr>
+          <w:ilvl w:val="0"/>
+          <w:numId w:val="2"/>
+        </w:numPr>
+        <w:spacing w:after="80"/>
+        <w:rPr>
+          <w:rFonts w:ascii="Calibri" w:hAnsi="Calibri" w:cs="Calibri"/>
+          <w:sz w:val="24"/>
+          <w:szCs w:val="24"/>
+        </w:rPr>
+      </w:pPr>
+      <w:proofErr w:type="gramStart"/>
+      <w:r>
+        <w:rPr>
+          <w:rFonts w:ascii="Calibri" w:hAnsi="Calibri" w:cs="Calibri"/>
+          <w:b/>
+          <w:bCs/>
+          <w:sz w:val="24"/>
+          <w:szCs w:val="24"/>
+        </w:rPr>
+        <w:t>Sincronizou</w:t>
+      </w:r>
+      <w:proofErr w:type="gramEnd"/>
+      <w:r>
+        <w:rPr>
+          <w:rFonts w:ascii="Calibri" w:hAnsi="Calibri" w:cs="Calibri"/>
+          <w:b/>
+          <w:bCs/>
+          <w:sz w:val="24"/>
+          <w:szCs w:val="24"/>
+        </w:rPr>
+        <w:t xml:space="preserve"> mas a notificação não apareceu</w:t>
+      </w:r>
+      <w:r>
+        <w:rPr>
+          <w:rFonts w:ascii="Calibri" w:hAnsi="Calibri" w:cs="Calibri"/>
+          <w:sz w:val="24"/>
+          <w:szCs w:val="24"/>
+        </w:rPr>
+        <w:t xml:space="preserve"> — confira se a OS tem o CNPJ (ou CPF) no memory.md: sem ele o painel não sabe qual empregador consultar no DET.</w:t>
+      </w:r>
+    </w:p>
+    <w:p>
+      <w:pPr>
+        <w:spacing w:after="120"/>
+        <w:rPr>
+          <w:rFonts w:ascii="Calibri" w:hAnsi="Calibri" w:cs="Calibri"/>
+          <w:sz w:val="24"/>
+          <w:szCs w:val="24"/>
+        </w:rPr>
+      </w:pPr>
+      <w:r>
+        <w:rPr>
+          <w:rFonts w:ascii="Calibri" w:hAnsi="Calibri" w:cs="Calibri"/>
+          <w:sz w:val="24"/>
+          <w:szCs w:val="24"/>
+        </w:rPr>
+        <w:t xml:space="preserve">O mesmo link </w:t>
+      </w:r>
+      <w:hyperlink r:id="rId29" w:history="1">
+        <w:r>
+          <w:rPr>
+            <w:rStyle w:val="Hyperlink"/>
+            <w:rFonts w:ascii="Calibri" w:hAnsi="Calibri" w:cs="Calibri"/>
+            <w:sz w:val="24"/>
+            <w:szCs w:val="24"/>
+          </w:rPr>
+          <w:t>https://chromewebstore.google.com/detail/sync-det-%E2%80%94-sisos-aft-tool/khmecjbidgcndmgmkbpfncjgmmfehiem</w:t>
+        </w:r>
+      </w:hyperlink>
+      <w:r>
+        <w:rPr>
+          <w:rFonts w:ascii="Calibri" w:hAnsi="Calibri" w:cs="Calibri"/>
+          <w:sz w:val="24"/>
+          <w:szCs w:val="24"/>
+        </w:rPr>
+        <w:t xml:space="preserve">  também instala no navegador Edge</w:t>
+      </w:r>
+    </w:p>
+    <w:p>
+      <w:pPr>
+        <w:spacing w:after="120"/>
+        <w:rPr>
+          <w:rFonts w:ascii="Calibri" w:hAnsi="Calibri" w:cs="Calibri"/>
+          <w:sz w:val="24"/>
+          <w:szCs w:val="24"/>
+        </w:rPr>
+      </w:pPr>
+    </w:p>
+    <w:p>
+      <w:pPr>
+        <w:spacing w:after="120"/>
+        <w:jc w:val="center"/>
+        <w:rPr>
+          <w:rFonts w:ascii="Calibri" w:hAnsi="Calibri" w:cs="Calibri"/>
+          <w:sz w:val="24"/>
+          <w:szCs w:val="24"/>
+        </w:rPr>
+      </w:pPr>
+      <w:r>
+        <w:rPr>
+          <w:rFonts w:ascii="Calibri" w:hAnsi="Calibri" w:cs="Calibri"/>
+          <w:noProof/>
+          <w:sz w:val="24"/>
+          <w:szCs w:val="24"/>
+        </w:rPr>
+        <w:drawing>
+          <wp:inline distT="0" distB="0" distL="0" distR="0" wp14:anchorId="41BCF703" wp14:editId="6D1852C9">
+            <wp:extent cx="5409777" cy="3931987"/>
+            <wp:effectExtent l="0" t="0" r="635" b="5080"/>
+            <wp:docPr id="1581436987" name="Imagem 1" descr="Interface gráfica do usuário, Texto, Aplicativo, chat ou mensagem de texto, Email&#10;&#10;O conteúdo gerado por IA pode estar incorreto."/>
+            <wp:cNvGraphicFramePr>
+              <a:graphicFrameLocks xmlns:a="http://schemas.openxmlformats.org/drawingml/2006/main" noChangeAspect="1"/>
+            </wp:cNvGraphicFramePr>
+            <a:graphic xmlns:a="http://schemas.openxmlformats.org/drawingml/2006/main">
+              <a:graphicData uri="http://schemas.openxmlformats.org/drawingml/2006/picture">
+                <pic:pic xmlns:pic="http://schemas.openxmlformats.org/drawingml/2006/picture">
+                  <pic:nvPicPr>
+                    <pic:cNvPr id="1581436987" name="Imagem 1" descr="Interface gráfica do usuário, Texto, Aplicativo, chat ou mensagem de texto, Email&#10;&#10;O conteúdo gerado por IA pode estar incorreto."/>
+                    <pic:cNvPicPr/>
+                  </pic:nvPicPr>
+                  <pic:blipFill>
+                    <a:blip r:embed="rId30" cstate="print">
+                      <a:extLst>
+                        <a:ext uri="{28A0092B-C50C-407E-A947-70E740481C1C}">
+                          <a14:useLocalDpi xmlns:a14="http://schemas.microsoft.com/office/drawing/2010/main" val="0"/>
+                        </a:ext>
+                      </a:extLst>
+                    </a:blip>
+                    <a:stretch>
+                      <a:fillRect/>
+                    </a:stretch>
+                  </pic:blipFill>
+                  <pic:spPr>
+                    <a:xfrm>
+                      <a:off x="0" y="0"/>
+                      <a:ext cx="5429008" cy="3945964"/>
+                    </a:xfrm>
+                    <a:prstGeom prst="rect">
+                      <a:avLst/>
+                    </a:prstGeom>
+                  </pic:spPr>
+                </pic:pic>
+              </a:graphicData>
+            </a:graphic>
+          </wp:inline>
+        </w:drawing>
+      </w:r>
+    </w:p>
+    <w:p>
+      <w:pPr>
+        <w:rPr>
+          <w:rFonts w:ascii="Calibri" w:hAnsi="Calibri" w:cs="Calibri"/>
+          <w:sz w:val="24"/>
+          <w:szCs w:val="24"/>
+        </w:rPr>
+      </w:pPr>
+    </w:p>
+    <w:p>
+      <w:pPr>
+        <w:rPr>
+          <w:rFonts w:ascii="Calibri" w:hAnsi="Calibri" w:cs="Calibri"/>
+          <w:sz w:val="24"/>
+          <w:szCs w:val="24"/>
+        </w:rPr>
+      </w:pPr>
+    </w:p>
+    <w:p>
+      <w:pPr>
+        <w:pStyle w:val="Ttulo1"/>
+        <w:rPr>
+          <w:rFonts w:ascii="Calibri" w:hAnsi="Calibri" w:cs="Calibri"/>
+          <w:color w:val="E97132"/>
+          <w:sz w:val="24"/>
+          <w:szCs w:val="24"/>
+        </w:rPr>
+      </w:pPr>
+      <w:bookmarkStart w:id="21" w:name="_Toc233441480"/>
+      <w:r>
+        <w:rPr>
+          <w:rFonts w:ascii="Calibri" w:hAnsi="Calibri" w:cs="Calibri"/>
+          <w:color w:val="E97132"/>
+          <w:sz w:val="24"/>
+          <w:szCs w:val="24"/>
+        </w:rPr>
+        <w:t>6. Boas práticas e segurança</w:t>
+      </w:r>
+      <w:bookmarkEnd w:id="21"/>
+    </w:p>
+    <w:p>
+      <w:pPr>
+        <w:pStyle w:val="PargrafodaLista"/>
+        <w:numPr>
+          <w:ilvl w:val="0"/>
+          <w:numId w:val="2"/>
+        </w:numPr>
+        <w:spacing w:after="80"/>
+        <w:rPr>
+          <w:rFonts w:ascii="Calibri" w:hAnsi="Calibri" w:cs="Calibri"/>
+          <w:sz w:val="24"/>
+          <w:szCs w:val="24"/>
+        </w:rPr>
+      </w:pPr>
+      <w:r>
+        <w:rPr>
+          <w:rFonts w:ascii="Calibri" w:hAnsi="Calibri" w:cs="Calibri"/>
+          <w:b/>
+          <w:bCs/>
+          <w:sz w:val="24"/>
+          <w:szCs w:val="24"/>
+        </w:rPr>
+        <w:t xml:space="preserve">Revise sempre. </w:t>
+      </w:r>
+      <w:r>
+        <w:rPr>
+          <w:rFonts w:ascii="Calibri" w:hAnsi="Calibri" w:cs="Calibri"/>
+          <w:sz w:val="24"/>
+          <w:szCs w:val="24"/>
+        </w:rPr>
+        <w:t>A IA é apoio à redação e organização. O conteúdo jurídico de cada auto, termo e relatório é responsabilidade do Auditor. Confira o código da ementa no ementário oficial antes de transmitir.</w:t>
+      </w:r>
+    </w:p>
+    <w:p>
+      <w:pPr>
+        <w:pStyle w:val="PargrafodaLista"/>
+        <w:numPr>
+          <w:ilvl w:val="0"/>
+          <w:numId w:val="2"/>
+        </w:numPr>
+        <w:spacing w:after="80"/>
+        <w:rPr>
+          <w:rFonts w:ascii="Calibri" w:hAnsi="Calibri" w:cs="Calibri"/>
+          <w:sz w:val="24"/>
+          <w:szCs w:val="24"/>
+        </w:rPr>
+      </w:pPr>
+      <w:r>
+        <w:rPr>
+          <w:rFonts w:ascii="Calibri" w:hAnsi="Calibri" w:cs="Calibri"/>
+          <w:b/>
+          <w:bCs/>
+          <w:sz w:val="24"/>
+          <w:szCs w:val="24"/>
+        </w:rPr>
+        <w:t xml:space="preserve">Nada de serviços online com documentos da fiscalização. </w:t>
+      </w:r>
+      <w:r>
+        <w:rPr>
+          <w:rFonts w:ascii="Calibri" w:hAnsi="Calibri" w:cs="Calibri"/>
+          <w:sz w:val="24"/>
+          <w:szCs w:val="24"/>
+        </w:rPr>
+        <w:t>Compressão de PDF, conversão de fotos e validação de arquivos são feitas por scripts locais do toolkit. Nunca use compressores ou conversores de site.</w:t>
+      </w:r>
+    </w:p>
+    <w:p>
+      <w:pPr>
+        <w:pStyle w:val="PargrafodaLista"/>
+        <w:numPr>
+          <w:ilvl w:val="0"/>
+          <w:numId w:val="2"/>
+        </w:numPr>
+        <w:spacing w:after="80"/>
+        <w:rPr>
+          <w:rFonts w:ascii="Calibri" w:hAnsi="Calibri" w:cs="Calibri"/>
+          <w:sz w:val="24"/>
+          <w:szCs w:val="24"/>
+        </w:rPr>
+      </w:pPr>
+      <w:r>
+        <w:rPr>
+          <w:rFonts w:ascii="Calibri" w:hAnsi="Calibri" w:cs="Calibri"/>
+          <w:b/>
+          <w:bCs/>
+          <w:sz w:val="24"/>
+          <w:szCs w:val="24"/>
+        </w:rPr>
+        <w:t xml:space="preserve">O </w:t>
+      </w:r>
+      <w:proofErr w:type="gramStart"/>
+      <w:r>
+        <w:rPr>
+          <w:rFonts w:ascii="Calibri" w:hAnsi="Calibri" w:cs="Calibri"/>
+          <w:b/>
+          <w:bCs/>
+          <w:sz w:val="24"/>
+          <w:szCs w:val="24"/>
+        </w:rPr>
+        <w:t>arquivo .depara</w:t>
+      </w:r>
+      <w:proofErr w:type="gramEnd"/>
+      <w:r>
+        <w:rPr>
+          <w:rFonts w:ascii="Calibri" w:hAnsi="Calibri" w:cs="Calibri"/>
+          <w:b/>
+          <w:bCs/>
+          <w:sz w:val="24"/>
+          <w:szCs w:val="24"/>
+        </w:rPr>
+        <w:t xml:space="preserve"> é sensível. </w:t>
+      </w:r>
+      <w:r>
+        <w:rPr>
+          <w:rFonts w:ascii="Calibri" w:hAnsi="Calibri" w:cs="Calibri"/>
+          <w:sz w:val="24"/>
+          <w:szCs w:val="24"/>
+        </w:rPr>
+        <w:t>Ele liga os códigos aos dados reais. Não compartilhe, não envie por e-mail, não suba para nuvem.</w:t>
+      </w:r>
+    </w:p>
+    <w:p>
+      <w:pPr>
+        <w:pStyle w:val="PargrafodaLista"/>
+        <w:numPr>
+          <w:ilvl w:val="0"/>
+          <w:numId w:val="2"/>
+        </w:numPr>
+        <w:spacing w:after="80"/>
+        <w:rPr>
+          <w:rFonts w:ascii="Calibri" w:hAnsi="Calibri" w:cs="Calibri"/>
+          <w:sz w:val="24"/>
+          <w:szCs w:val="24"/>
+        </w:rPr>
+      </w:pPr>
+      <w:r>
+        <w:rPr>
+          <w:rFonts w:ascii="Calibri" w:hAnsi="Calibri" w:cs="Calibri"/>
+          <w:b/>
+          <w:bCs/>
+          <w:sz w:val="24"/>
+          <w:szCs w:val="24"/>
+        </w:rPr>
+        <w:t xml:space="preserve">A </w:t>
+      </w:r>
+      <w:proofErr w:type="gramStart"/>
+      <w:r>
+        <w:rPr>
+          <w:rFonts w:ascii="Calibri" w:hAnsi="Calibri" w:cs="Calibri"/>
+          <w:b/>
+          <w:bCs/>
+          <w:sz w:val="24"/>
+          <w:szCs w:val="24"/>
+        </w:rPr>
+        <w:t>cópia .</w:t>
+      </w:r>
+      <w:proofErr w:type="gramEnd"/>
+      <w:r>
+        <w:rPr>
+          <w:rFonts w:ascii="Calibri" w:hAnsi="Calibri" w:cs="Calibri"/>
+          <w:b/>
+          <w:bCs/>
+          <w:sz w:val="24"/>
+          <w:szCs w:val="24"/>
+        </w:rPr>
+        <w:t>tokenized.txt é a versão segura para compartilhar</w:t>
+      </w:r>
+      <w:r>
+        <w:rPr>
+          <w:rFonts w:ascii="Calibri" w:hAnsi="Calibri" w:cs="Calibri"/>
+          <w:sz w:val="24"/>
+          <w:szCs w:val="24"/>
+        </w:rPr>
+        <w:t xml:space="preserve"> com colegas (não contém nome nem CPF de trabalhador).</w:t>
+      </w:r>
+    </w:p>
+    <w:p>
+      <w:pPr>
+        <w:pStyle w:val="PargrafodaLista"/>
+        <w:numPr>
+          <w:ilvl w:val="0"/>
+          <w:numId w:val="2"/>
+        </w:numPr>
+        <w:spacing w:after="80"/>
+        <w:rPr>
+          <w:rFonts w:ascii="Calibri" w:hAnsi="Calibri" w:cs="Calibri"/>
+          <w:sz w:val="24"/>
+          <w:szCs w:val="24"/>
+        </w:rPr>
+      </w:pPr>
+      <w:r>
+        <w:rPr>
+          <w:rFonts w:ascii="Calibri" w:hAnsi="Calibri" w:cs="Calibri"/>
+          <w:b/>
+          <w:bCs/>
+          <w:sz w:val="24"/>
+          <w:szCs w:val="24"/>
+        </w:rPr>
+        <w:lastRenderedPageBreak/>
         <w:t xml:space="preserve">Consultas ao </w:t>
       </w:r>
       <w:proofErr w:type="spellStart"/>
@@ -21787,7 +22978,6 @@
                 <w:sz w:val="24"/>
                 <w:szCs w:val="24"/>
               </w:rPr>
-              <w:lastRenderedPageBreak/>
               <w:t>Skill /</w:t>
             </w:r>
             <w:proofErr w:type="spellStart"/>
@@ -22258,6 +23448,7 @@
           <w:sz w:val="24"/>
           <w:szCs w:val="24"/>
         </w:rPr>
+        <w:lastRenderedPageBreak/>
         <w:t xml:space="preserve">Dúvidas, sugestões de novas skills ou problemas: fale com o mantenedor — </w:t>
       </w:r>
       <w:r>
@@ -22296,7 +23487,7 @@
         </w:rPr>
         <w:t xml:space="preserve"> em </w:t>
       </w:r>
-      <w:hyperlink r:id="rId28" w:history="1">
+      <w:hyperlink r:id="rId31" w:history="1">
         <w:r>
           <w:rPr>
             <w:rStyle w:val="Hyperlink"/>
@@ -22364,12 +23555,12 @@
       </w:r>
     </w:p>
     <w:sectPr>
-      <w:headerReference w:type="even" r:id="rId29"/>
-      <w:headerReference w:type="default" r:id="rId30"/>
-      <w:footerReference w:type="even" r:id="rId31"/>
-      <w:footerReference w:type="default" r:id="rId32"/>
-      <w:headerReference w:type="first" r:id="rId33"/>
-      <w:footerReference w:type="first" r:id="rId34"/>
+      <w:headerReference w:type="even" r:id="rId32"/>
+      <w:headerReference w:type="default" r:id="rId33"/>
+      <w:footerReference w:type="even" r:id="rId34"/>
+      <w:footerReference w:type="default" r:id="rId35"/>
+      <w:headerReference w:type="first" r:id="rId36"/>
+      <w:footerReference w:type="first" r:id="rId37"/>
       <w:pgSz w:w="11906" w:h="16838"/>
       <w:pgMar w:top="720" w:right="720" w:bottom="720" w:left="720" w:header="708" w:footer="708" w:gutter="0"/>
       <w:cols w:space="720"/>

</xml_diff>